<commit_message>
Added "rasterization vs raytracing" subsection to "rendering pipeline" section
</commit_message>
<xml_diff>
--- a/Paper/GW2425_Demaecker_Daan_NL_Paper.docx
+++ b/Paper/GW2425_Demaecker_Daan_NL_Paper.docx
@@ -166,8 +166,13 @@
       <w:r>
         <w:t xml:space="preserve">Supervisor: </w:t>
       </w:r>
-      <w:r>
-        <w:t>Deweppe Alexander</w:t>
+      <w:proofErr w:type="spellStart"/>
+      <w:r>
+        <w:t>Deweppe</w:t>
+      </w:r>
+      <w:proofErr w:type="spellEnd"/>
+      <w:r>
+        <w:t xml:space="preserve"> Alexander</w:t>
       </w:r>
     </w:p>
     <w:p>
@@ -177,8 +182,13 @@
       <w:r>
         <w:t xml:space="preserve">Coach: </w:t>
       </w:r>
-      <w:r>
-        <w:t>Verspecht Marijn</w:t>
+      <w:proofErr w:type="spellStart"/>
+      <w:r>
+        <w:t>Verspecht</w:t>
+      </w:r>
+      <w:proofErr w:type="spellEnd"/>
+      <w:r>
+        <w:t xml:space="preserve"> Marijn</w:t>
       </w:r>
     </w:p>
     <w:p>
@@ -3241,16 +3251,38 @@
           <w:lang w:val="nl-BE"/>
         </w:rPr>
       </w:pPr>
+      <w:proofErr w:type="spellStart"/>
       <w:r>
         <w:rPr>
           <w:lang w:val="nl-BE"/>
         </w:rPr>
-        <w:t>Ambient occlusion is een globale verlichti</w:t>
-      </w:r>
+        <w:t>Ambient</w:t>
+      </w:r>
+      <w:proofErr w:type="spellEnd"/>
       <w:r>
         <w:rPr>
           <w:lang w:val="nl-BE"/>
         </w:rPr>
+        <w:t xml:space="preserve"> </w:t>
+      </w:r>
+      <w:proofErr w:type="spellStart"/>
+      <w:r>
+        <w:rPr>
+          <w:lang w:val="nl-BE"/>
+        </w:rPr>
+        <w:t>occlusion</w:t>
+      </w:r>
+      <w:proofErr w:type="spellEnd"/>
+      <w:r>
+        <w:rPr>
+          <w:lang w:val="nl-BE"/>
+        </w:rPr>
+        <w:t xml:space="preserve"> is een globale verlichti</w:t>
+      </w:r>
+      <w:r>
+        <w:rPr>
+          <w:lang w:val="nl-BE"/>
+        </w:rPr>
         <w:t xml:space="preserve">ngsmethode en een belangrijke stap in renderen om de wereld meer realistisch te laten lijken door de harde CGI look wat  zachter te maken. In pre-renderen is kan dit redelijk </w:t>
       </w:r>
       <w:r>
@@ -3269,7 +3301,77 @@
         <w:rPr>
           <w:lang w:val="nl-BE"/>
         </w:rPr>
-        <w:t>aan worden omdat tijd een minder groot probleem is, maar in real-time renderen is dit een ander verhaal. In real-time renderen moet de ambient occlusion elk frame opnieuw berekend worden, dus zullen we een paar hoeken moeten afsnijden. In deze paper zal ik het hebben over 3 verschillende types real-time ambient occlusion. Ik zal bespreken hoe je ze kan implementeren in C++, Vulkan en welke je best kiest, gegeven de keuze.</w:t>
+        <w:t xml:space="preserve">aan worden omdat tijd een minder groot probleem is, maar in real-time renderen is dit een ander verhaal. In real-time renderen moet de </w:t>
+      </w:r>
+      <w:proofErr w:type="spellStart"/>
+      <w:r>
+        <w:rPr>
+          <w:lang w:val="nl-BE"/>
+        </w:rPr>
+        <w:t>ambient</w:t>
+      </w:r>
+      <w:proofErr w:type="spellEnd"/>
+      <w:r>
+        <w:rPr>
+          <w:lang w:val="nl-BE"/>
+        </w:rPr>
+        <w:t xml:space="preserve"> </w:t>
+      </w:r>
+      <w:proofErr w:type="spellStart"/>
+      <w:r>
+        <w:rPr>
+          <w:lang w:val="nl-BE"/>
+        </w:rPr>
+        <w:t>occlusion</w:t>
+      </w:r>
+      <w:proofErr w:type="spellEnd"/>
+      <w:r>
+        <w:rPr>
+          <w:lang w:val="nl-BE"/>
+        </w:rPr>
+        <w:t xml:space="preserve"> elk frame opnieuw berekend worden, dus zullen we een paar hoeken moeten afsnijden. In deze paper zal ik het hebben over 3 verschillende types real-time </w:t>
+      </w:r>
+      <w:proofErr w:type="spellStart"/>
+      <w:r>
+        <w:rPr>
+          <w:lang w:val="nl-BE"/>
+        </w:rPr>
+        <w:t>ambient</w:t>
+      </w:r>
+      <w:proofErr w:type="spellEnd"/>
+      <w:r>
+        <w:rPr>
+          <w:lang w:val="nl-BE"/>
+        </w:rPr>
+        <w:t xml:space="preserve"> </w:t>
+      </w:r>
+      <w:proofErr w:type="spellStart"/>
+      <w:r>
+        <w:rPr>
+          <w:lang w:val="nl-BE"/>
+        </w:rPr>
+        <w:t>occlusion</w:t>
+      </w:r>
+      <w:proofErr w:type="spellEnd"/>
+      <w:r>
+        <w:rPr>
+          <w:lang w:val="nl-BE"/>
+        </w:rPr>
+        <w:t xml:space="preserve">. Ik zal bespreken hoe je ze kan implementeren in C++, </w:t>
+      </w:r>
+      <w:proofErr w:type="spellStart"/>
+      <w:r>
+        <w:rPr>
+          <w:lang w:val="nl-BE"/>
+        </w:rPr>
+        <w:t>Vulkan</w:t>
+      </w:r>
+      <w:proofErr w:type="spellEnd"/>
+      <w:r>
+        <w:rPr>
+          <w:lang w:val="nl-BE"/>
+        </w:rPr>
+        <w:t xml:space="preserve"> en welke je best kiest, gegeven de keuze.</w:t>
       </w:r>
       <w:r>
         <w:rPr>
@@ -3291,7 +3393,15 @@
     </w:p>
     <w:p>
       <w:r>
-        <w:t>During my studies at Howest – Digital Arts and Entertainment (DAE), I was introduced to graphics programming through our course that is aptly named Graphics Programming 1. In this course</w:t>
+        <w:t xml:space="preserve">During my studies at </w:t>
+      </w:r>
+      <w:proofErr w:type="spellStart"/>
+      <w:r>
+        <w:t>Howest</w:t>
+      </w:r>
+      <w:proofErr w:type="spellEnd"/>
+      <w:r>
+        <w:t xml:space="preserve"> – Digital Arts and Entertainment (DAE), I was introduced to graphics programming through our course that is aptly named Graphics Programming 1. In this course</w:t>
       </w:r>
       <w:r>
         <w:t>,</w:t>
@@ -3784,7 +3894,15 @@
         <w:t>Vulkan has 2 types of devices, logical and physical. Physical devices are often part of the system in the form of a graphics card, accelerator, DSP, or other component.</w:t>
       </w:r>
       <w:r>
-        <w:t xml:space="preserve"> There is a fixed number of physical devices, and it is up to the user to choose which one is the most optimal. After choosing the desired physical device, a handle to it is stored in a variable of type VkPhysicalDevice. Using the physical device, a logical device can be created. The logical device will be the object that is mainly used in the application to “talk” to the GPU.</w:t>
+        <w:t xml:space="preserve"> There is a fixed number of physical devices, and it is up to the user to choose which one is the most optimal. After choosing the desired physical device, a handle to it is stored in a variable of type </w:t>
+      </w:r>
+      <w:proofErr w:type="spellStart"/>
+      <w:r>
+        <w:t>VkPhysicalDevice</w:t>
+      </w:r>
+      <w:proofErr w:type="spellEnd"/>
+      <w:r>
+        <w:t>. Using the physical device, a logical device can be created. The logical device will be the object that is mainly used in the application to “talk” to the GPU.</w:t>
       </w:r>
     </w:p>
     <w:p>
@@ -4240,7 +4358,19 @@
         <w:rPr>
           <w:lang w:val="en-GB"/>
         </w:rPr>
-        <w:t>is called the frambuffer.</w:t>
+        <w:t xml:space="preserve">is called the </w:t>
+      </w:r>
+      <w:r>
+        <w:rPr>
+          <w:lang w:val="en-GB"/>
+        </w:rPr>
+        <w:t>framebuffer</w:t>
+      </w:r>
+      <w:r>
+        <w:rPr>
+          <w:lang w:val="en-GB"/>
+        </w:rPr>
+        <w:t>.</w:t>
       </w:r>
     </w:p>
     <w:p>
@@ -4270,6 +4400,193 @@
         <w:t>Rendering pipeline</w:t>
       </w:r>
       <w:bookmarkEnd w:id="8"/>
+    </w:p>
+    <w:p>
+      <w:r>
+        <w:t xml:space="preserve">Now that we are familiar with the necessary Vulkan terms, I will provide a more detailed explanation </w:t>
+      </w:r>
+      <w:r>
+        <w:t>of the rendering pipeline we will be using.</w:t>
+      </w:r>
+    </w:p>
+    <w:p>
+      <w:pPr>
+        <w:pStyle w:val="Heading3"/>
+        <w:rPr>
+          <w:lang w:val="en-GB"/>
+        </w:rPr>
+      </w:pPr>
+      <w:r>
+        <w:rPr>
+          <w:lang w:val="en-GB"/>
+        </w:rPr>
+        <w:lastRenderedPageBreak/>
+        <w:t>2.1 Rasterization vs raytracing</w:t>
+      </w:r>
+      <w:r>
+        <w:rPr>
+          <w:lang w:val="en-GB"/>
+        </w:rPr>
+        <w:t xml:space="preserve"> [5]</w:t>
+      </w:r>
+    </w:p>
+    <w:p>
+      <w:pPr>
+        <w:rPr>
+          <w:lang w:val="en-GB"/>
+        </w:rPr>
+      </w:pPr>
+      <w:r>
+        <w:rPr>
+          <w:lang w:val="en-GB"/>
+        </w:rPr>
+        <w:t>In real-time rendering, there are 2 main types of rendering, we have rasterization and raytracing.</w:t>
+      </w:r>
+    </w:p>
+    <w:p>
+      <w:pPr>
+        <w:rPr>
+          <w:lang w:val="en-GB"/>
+        </w:rPr>
+      </w:pPr>
+      <w:r>
+        <w:rPr>
+          <w:lang w:val="en-GB"/>
+        </w:rPr>
+        <w:t>In raytracing, we shoot a ray into the scene for every pixel of the screen. When hitting an object in the scene, we get information about the material it is made of</w:t>
+      </w:r>
+      <w:r>
+        <w:rPr>
+          <w:lang w:val="en-GB"/>
+        </w:rPr>
+        <w:t>. T</w:t>
+      </w:r>
+      <w:r>
+        <w:rPr>
+          <w:lang w:val="en-GB"/>
+        </w:rPr>
+        <w:t>his material can then give us the information on how to proceed with shading. You can shoot more rays from that point to account for reflections, lights, shadows etc.</w:t>
+      </w:r>
+    </w:p>
+    <w:p>
+      <w:pPr>
+        <w:rPr>
+          <w:lang w:val="en-GB"/>
+        </w:rPr>
+      </w:pPr>
+      <w:r>
+        <w:rPr>
+          <w:lang w:val="en-GB"/>
+        </w:rPr>
+        <w:t>In rasterization however, we render objects by projecting</w:t>
+      </w:r>
+      <w:r>
+        <w:rPr>
+          <w:lang w:val="en-GB"/>
+        </w:rPr>
+        <w:t xml:space="preserve"> the triangles of a 3D mesh </w:t>
+      </w:r>
+      <w:r>
+        <w:rPr>
+          <w:lang w:val="en-GB"/>
+        </w:rPr>
+        <w:t xml:space="preserve">on a 2D </w:t>
+      </w:r>
+      <w:r>
+        <w:rPr>
+          <w:lang w:val="en-GB"/>
+        </w:rPr>
+        <w:t>raster. A raster or bitmap image is a dot matrix data structure that represents a generally rectangular grid of pixels, viewable via a monitor or other display medium.</w:t>
+      </w:r>
+    </w:p>
+    <w:p>
+      <w:pPr>
+        <w:rPr>
+          <w:lang w:val="en-GB"/>
+        </w:rPr>
+      </w:pPr>
+      <w:r>
+        <w:rPr>
+          <w:noProof/>
+        </w:rPr>
+        <w:drawing>
+          <wp:anchor distT="0" distB="0" distL="114300" distR="114300" simplePos="0" relativeHeight="251699200" behindDoc="0" locked="0" layoutInCell="1" allowOverlap="1" wp14:anchorId="3C86F89B" wp14:editId="2A338F6F">
+            <wp:simplePos x="0" y="0"/>
+            <wp:positionH relativeFrom="margin">
+              <wp:align>center</wp:align>
+            </wp:positionH>
+            <wp:positionV relativeFrom="paragraph">
+              <wp:posOffset>454660</wp:posOffset>
+            </wp:positionV>
+            <wp:extent cx="4297680" cy="2750820"/>
+            <wp:effectExtent l="0" t="0" r="7620" b="0"/>
+            <wp:wrapTopAndBottom/>
+            <wp:docPr id="3" name="Picture 3" descr="A graphic design process of teacups&#10;&#10;Description automatically generated"/>
+            <wp:cNvGraphicFramePr>
+              <a:graphicFrameLocks xmlns:a="http://schemas.openxmlformats.org/drawingml/2006/main" noChangeAspect="1"/>
+            </wp:cNvGraphicFramePr>
+            <a:graphic xmlns:a="http://schemas.openxmlformats.org/drawingml/2006/main">
+              <a:graphicData uri="http://schemas.openxmlformats.org/drawingml/2006/picture">
+                <pic:pic xmlns:pic="http://schemas.openxmlformats.org/drawingml/2006/picture">
+                  <pic:nvPicPr>
+                    <pic:cNvPr id="3" name="Picture 3" descr="A graphic design process of teacups&#10;&#10;Description automatically generated"/>
+                    <pic:cNvPicPr>
+                      <a:picLocks noChangeAspect="1" noChangeArrowheads="1"/>
+                    </pic:cNvPicPr>
+                  </pic:nvPicPr>
+                  <pic:blipFill>
+                    <a:blip r:embed="rId14">
+                      <a:extLst>
+                        <a:ext uri="{28A0092B-C50C-407E-A947-70E740481C1C}">
+                          <a14:useLocalDpi xmlns:a14="http://schemas.microsoft.com/office/drawing/2010/main" val="0"/>
+                        </a:ext>
+                      </a:extLst>
+                    </a:blip>
+                    <a:srcRect/>
+                    <a:stretch>
+                      <a:fillRect/>
+                    </a:stretch>
+                  </pic:blipFill>
+                  <pic:spPr bwMode="auto">
+                    <a:xfrm>
+                      <a:off x="0" y="0"/>
+                      <a:ext cx="4297680" cy="2750820"/>
+                    </a:xfrm>
+                    <a:prstGeom prst="rect">
+                      <a:avLst/>
+                    </a:prstGeom>
+                    <a:noFill/>
+                    <a:ln>
+                      <a:noFill/>
+                    </a:ln>
+                  </pic:spPr>
+                </pic:pic>
+              </a:graphicData>
+            </a:graphic>
+          </wp:anchor>
+        </w:drawing>
+      </w:r>
+    </w:p>
+    <w:p>
+      <w:pPr>
+        <w:rPr>
+          <w:lang w:val="en-GB"/>
+        </w:rPr>
+      </w:pPr>
+    </w:p>
+    <w:p>
+      <w:pPr>
+        <w:pStyle w:val="Heading3"/>
+        <w:rPr>
+          <w:lang w:val="en-GB"/>
+        </w:rPr>
+      </w:pPr>
+      <w:r>
+        <w:rPr>
+          <w:lang w:val="en-GB"/>
+        </w:rPr>
+        <w:t>2.2 Forward vs deferred rendering</w:t>
+      </w:r>
     </w:p>
     <w:p>
       <w:r>
@@ -4303,7 +4620,7 @@
                     </pic:cNvPicPr>
                   </pic:nvPicPr>
                   <pic:blipFill>
-                    <a:blip r:embed="rId14" cstate="print">
+                    <a:blip r:embed="rId15" cstate="print">
                       <a:extLst>
                         <a:ext uri="{28A0092B-C50C-407E-A947-70E740481C1C}">
                           <a14:useLocalDpi xmlns:a14="http://schemas.microsoft.com/office/drawing/2010/main" val="0"/>
@@ -4368,7 +4685,7 @@
                     <pic:cNvPicPr/>
                   </pic:nvPicPr>
                   <pic:blipFill>
-                    <a:blip r:embed="rId15" cstate="print">
+                    <a:blip r:embed="rId16" cstate="print">
                       <a:extLst>
                         <a:ext uri="{28A0092B-C50C-407E-A947-70E740481C1C}">
                           <a14:useLocalDpi xmlns:a14="http://schemas.microsoft.com/office/drawing/2010/main" val="0"/>
@@ -4401,13 +4718,7 @@
         </w:drawing>
       </w:r>
       <w:r>
-        <w:t xml:space="preserve">Now that we </w:t>
-      </w:r>
-      <w:r>
-        <w:t>are familiar with the necessary Vulkan terms, I will provide a more detailed explanation of</w:t>
-      </w:r>
-      <w:r>
-        <w:t xml:space="preserve"> deferred rendering</w:t>
+        <w:t xml:space="preserve"> </w:t>
       </w:r>
       <w:r>
         <w:t>[1]</w:t>
@@ -4438,7 +4749,15 @@
         <w:t xml:space="preserve">. This buffer will </w:t>
       </w:r>
       <w:r>
-        <w:t>store information such as normal, albedo color, position, specular value, metalness value, roughness value, and any other desired data</w:t>
+        <w:t xml:space="preserve">store information such as normal, albedo color, position, specular value, </w:t>
+      </w:r>
+      <w:proofErr w:type="spellStart"/>
+      <w:r>
+        <w:t>metalness</w:t>
+      </w:r>
+      <w:proofErr w:type="spellEnd"/>
+      <w:r>
+        <w:t xml:space="preserve"> value, roughness value, and any other desired data</w:t>
       </w:r>
       <w:r>
         <w:t>.</w:t>
@@ -4556,7 +4875,7 @@
                     <pic:cNvPicPr/>
                   </pic:nvPicPr>
                   <pic:blipFill>
-                    <a:blip r:embed="rId16" cstate="print">
+                    <a:blip r:embed="rId17" cstate="print">
                       <a:extLst>
                         <a:ext uri="{28A0092B-C50C-407E-A947-70E740481C1C}">
                           <a14:useLocalDpi xmlns:a14="http://schemas.microsoft.com/office/drawing/2010/main" val="0"/>
@@ -4634,7 +4953,7 @@
                     <pic:cNvPicPr/>
                   </pic:nvPicPr>
                   <pic:blipFill>
-                    <a:blip r:embed="rId17" cstate="print">
+                    <a:blip r:embed="rId18" cstate="print">
                       <a:extLst>
                         <a:ext uri="{28A0092B-C50C-407E-A947-70E740481C1C}">
                           <a14:useLocalDpi xmlns:a14="http://schemas.microsoft.com/office/drawing/2010/main" val="0"/>
@@ -4765,7 +5084,7 @@
                     </pic:cNvPicPr>
                   </pic:nvPicPr>
                   <pic:blipFill>
-                    <a:blip r:embed="rId18">
+                    <a:blip r:embed="rId19">
                       <a:extLst>
                         <a:ext uri="{28A0092B-C50C-407E-A947-70E740481C1C}">
                           <a14:useLocalDpi xmlns:a14="http://schemas.microsoft.com/office/drawing/2010/main" val="0"/>
@@ -4892,7 +5211,23 @@
     </w:p>
     <w:p>
       <w:r>
-        <w:t xml:space="preserve">SSAO needs 2 main things to make the correct calculations: the view space position and the view space normals. View space means that it is relevant to the camera; the view space position of the camera would be (0,0,0), the view space position of an object 1 unit in front of the camera would be (0,0,1), etc. The same is true of view space normals. A normal facing towards </w:t>
+        <w:t xml:space="preserve">SSAO needs 2 main things to make the correct calculations: the view space position and the view space </w:t>
+      </w:r>
+      <w:proofErr w:type="spellStart"/>
+      <w:r>
+        <w:t>normals</w:t>
+      </w:r>
+      <w:proofErr w:type="spellEnd"/>
+      <w:r>
+        <w:t xml:space="preserve">. View space means that it is relevant to the camera; the view space position of the camera would be (0,0,0), the view space position of an object 1 unit in front of the camera would be (0,0,1), etc. The same is true of view space </w:t>
+      </w:r>
+      <w:proofErr w:type="spellStart"/>
+      <w:r>
+        <w:t>normals</w:t>
+      </w:r>
+      <w:proofErr w:type="spellEnd"/>
+      <w:r>
+        <w:t xml:space="preserve">. A normal facing towards </w:t>
       </w:r>
       <w:r>
         <w:lastRenderedPageBreak/>
@@ -4920,7 +5255,7 @@
                     <pic:cNvPicPr/>
                   </pic:nvPicPr>
                   <pic:blipFill>
-                    <a:blip r:embed="rId19"/>
+                    <a:blip r:embed="rId20"/>
                     <a:stretch>
                       <a:fillRect/>
                     </a:stretch>
@@ -4966,7 +5301,7 @@
                     <pic:cNvPicPr/>
                   </pic:nvPicPr>
                   <pic:blipFill>
-                    <a:blip r:embed="rId20"/>
+                    <a:blip r:embed="rId21"/>
                     <a:stretch>
                       <a:fillRect/>
                     </a:stretch>
@@ -5043,7 +5378,7 @@
                     <pic:cNvPicPr/>
                   </pic:nvPicPr>
                   <pic:blipFill>
-                    <a:blip r:embed="rId21" cstate="print">
+                    <a:blip r:embed="rId22" cstate="print">
                       <a:extLst>
                         <a:ext uri="{28A0092B-C50C-407E-A947-70E740481C1C}">
                           <a14:useLocalDpi xmlns:a14="http://schemas.microsoft.com/office/drawing/2010/main" val="0"/>
@@ -5103,7 +5438,7 @@
                     <pic:cNvPicPr/>
                   </pic:nvPicPr>
                   <pic:blipFill>
-                    <a:blip r:embed="rId22" cstate="print">
+                    <a:blip r:embed="rId23" cstate="print">
                       <a:extLst>
                         <a:ext uri="{28A0092B-C50C-407E-A947-70E740481C1C}">
                           <a14:useLocalDpi xmlns:a14="http://schemas.microsoft.com/office/drawing/2010/main" val="0"/>
@@ -5157,7 +5492,15 @@
         <w:t>The original SSAO is simply called SSAO</w:t>
       </w:r>
       <w:r>
-        <w:t>[5]. It was developed by Vladimir Kajalin and was used for the first time in 2007 by the game Crysis, developed by Crytek.</w:t>
+        <w:t xml:space="preserve">[5]. It was developed by Vladimir </w:t>
+      </w:r>
+      <w:proofErr w:type="spellStart"/>
+      <w:r>
+        <w:t>Kajalin</w:t>
+      </w:r>
+      <w:proofErr w:type="spellEnd"/>
+      <w:r>
+        <w:t xml:space="preserve"> and was used for the first time in 2007 by the game Crysis, developed by Crytek.</w:t>
       </w:r>
       <w:r>
         <w:br/>
@@ -5186,7 +5529,7 @@
                     <pic:cNvPicPr/>
                   </pic:nvPicPr>
                   <pic:blipFill>
-                    <a:blip r:embed="rId23"/>
+                    <a:blip r:embed="rId24"/>
                     <a:stretch>
                       <a:fillRect/>
                     </a:stretch>
@@ -5271,7 +5614,7 @@
                     <pic:cNvPicPr/>
                   </pic:nvPicPr>
                   <pic:blipFill>
-                    <a:blip r:embed="rId24">
+                    <a:blip r:embed="rId25">
                       <a:extLst>
                         <a:ext uri="{28A0092B-C50C-407E-A947-70E740481C1C}">
                           <a14:useLocalDpi xmlns:a14="http://schemas.microsoft.com/office/drawing/2010/main" val="0"/>
@@ -5327,7 +5670,7 @@
                     <pic:cNvPicPr/>
                   </pic:nvPicPr>
                   <pic:blipFill>
-                    <a:blip r:embed="rId25">
+                    <a:blip r:embed="rId26">
                       <a:extLst>
                         <a:ext uri="{28A0092B-C50C-407E-A947-70E740481C1C}">
                           <a14:useLocalDpi xmlns:a14="http://schemas.microsoft.com/office/drawing/2010/main" val="0"/>
@@ -5386,7 +5729,7 @@
                     <pic:cNvPicPr/>
                   </pic:nvPicPr>
                   <pic:blipFill>
-                    <a:blip r:embed="rId26">
+                    <a:blip r:embed="rId27">
                       <a:extLst>
                         <a:ext uri="{28A0092B-C50C-407E-A947-70E740481C1C}">
                           <a14:useLocalDpi xmlns:a14="http://schemas.microsoft.com/office/drawing/2010/main" val="0"/>
@@ -5468,7 +5811,7 @@
                     </pic:cNvPicPr>
                   </pic:nvPicPr>
                   <pic:blipFill>
-                    <a:blip r:embed="rId27" cstate="print">
+                    <a:blip r:embed="rId28" cstate="print">
                       <a:extLst>
                         <a:ext uri="{28A0092B-C50C-407E-A947-70E740481C1C}">
                           <a14:useLocalDpi xmlns:a14="http://schemas.microsoft.com/office/drawing/2010/main" val="0"/>
@@ -5545,7 +5888,7 @@
                     <pic:cNvPicPr/>
                   </pic:nvPicPr>
                   <pic:blipFill>
-                    <a:blip r:embed="rId28" cstate="print">
+                    <a:blip r:embed="rId29" cstate="print">
                       <a:extLst>
                         <a:ext uri="{28A0092B-C50C-407E-A947-70E740481C1C}">
                           <a14:useLocalDpi xmlns:a14="http://schemas.microsoft.com/office/drawing/2010/main" val="0"/>
@@ -5624,7 +5967,7 @@
                     <pic:cNvPicPr/>
                   </pic:nvPicPr>
                   <pic:blipFill>
-                    <a:blip r:embed="rId29" cstate="print">
+                    <a:blip r:embed="rId30" cstate="print">
                       <a:extLst>
                         <a:ext uri="{28A0092B-C50C-407E-A947-70E740481C1C}">
                           <a14:useLocalDpi xmlns:a14="http://schemas.microsoft.com/office/drawing/2010/main" val="0"/>
@@ -5684,7 +6027,7 @@
                     <pic:cNvPicPr/>
                   </pic:nvPicPr>
                   <pic:blipFill>
-                    <a:blip r:embed="rId30" cstate="print">
+                    <a:blip r:embed="rId31" cstate="print">
                       <a:extLst>
                         <a:ext uri="{28A0092B-C50C-407E-A947-70E740481C1C}">
                           <a14:useLocalDpi xmlns:a14="http://schemas.microsoft.com/office/drawing/2010/main" val="0"/>
@@ -5773,7 +6116,7 @@
                     </pic:cNvPicPr>
                   </pic:nvPicPr>
                   <pic:blipFill>
-                    <a:blip r:embed="rId31">
+                    <a:blip r:embed="rId32">
                       <a:extLst>
                         <a:ext uri="{28A0092B-C50C-407E-A947-70E740481C1C}">
                           <a14:useLocalDpi xmlns:a14="http://schemas.microsoft.com/office/drawing/2010/main" val="0"/>
@@ -5851,7 +6194,7 @@
                     </pic:cNvPicPr>
                   </pic:nvPicPr>
                   <pic:blipFill>
-                    <a:blip r:embed="rId32">
+                    <a:blip r:embed="rId33">
                       <a:extLst>
                         <a:ext uri="{28A0092B-C50C-407E-A947-70E740481C1C}">
                           <a14:useLocalDpi xmlns:a14="http://schemas.microsoft.com/office/drawing/2010/main" val="0"/>
@@ -5883,7 +6226,15 @@
         </w:drawing>
       </w:r>
       <w:r>
-        <w:t>Calculate and normalize the cross product of the so-called “leftDirection” and the normal, which will give us a vector perpendicular to the curve at point P, also called the Tangent.</w:t>
+        <w:t>Calculate and normalize the cross product of the so-called “</w:t>
+      </w:r>
+      <w:proofErr w:type="spellStart"/>
+      <w:r>
+        <w:t>leftDirection</w:t>
+      </w:r>
+      <w:proofErr w:type="spellEnd"/>
+      <w:r>
+        <w:t>” and the normal, which will give us a vector perpendicular to the curve at point P, also called the Tangent.</w:t>
       </w:r>
     </w:p>
     <w:p>
@@ -5929,7 +6280,7 @@
                     </pic:cNvPicPr>
                   </pic:nvPicPr>
                   <pic:blipFill>
-                    <a:blip r:embed="rId33">
+                    <a:blip r:embed="rId34">
                       <a:extLst>
                         <a:ext uri="{28A0092B-C50C-407E-A947-70E740481C1C}">
                           <a14:useLocalDpi xmlns:a14="http://schemas.microsoft.com/office/drawing/2010/main" val="0"/>
@@ -5995,7 +6346,7 @@
                     </pic:cNvPicPr>
                   </pic:nvPicPr>
                   <pic:blipFill>
-                    <a:blip r:embed="rId34">
+                    <a:blip r:embed="rId35">
                       <a:extLst>
                         <a:ext uri="{28A0092B-C50C-407E-A947-70E740481C1C}">
                           <a14:useLocalDpi xmlns:a14="http://schemas.microsoft.com/office/drawing/2010/main" val="0"/>
@@ -6088,7 +6439,7 @@
                     <pic:cNvPicPr/>
                   </pic:nvPicPr>
                   <pic:blipFill>
-                    <a:blip r:embed="rId35" cstate="print">
+                    <a:blip r:embed="rId36" cstate="print">
                       <a:extLst>
                         <a:ext uri="{28A0092B-C50C-407E-A947-70E740481C1C}">
                           <a14:useLocalDpi xmlns:a14="http://schemas.microsoft.com/office/drawing/2010/main" val="0"/>
@@ -6142,7 +6493,7 @@
                     <pic:cNvPicPr/>
                   </pic:nvPicPr>
                   <pic:blipFill>
-                    <a:blip r:embed="rId36" cstate="print">
+                    <a:blip r:embed="rId37" cstate="print">
                       <a:extLst>
                         <a:ext uri="{28A0092B-C50C-407E-A947-70E740481C1C}">
                           <a14:useLocalDpi xmlns:a14="http://schemas.microsoft.com/office/drawing/2010/main" val="0"/>
@@ -6231,7 +6582,7 @@
                     <pic:cNvPicPr/>
                   </pic:nvPicPr>
                   <pic:blipFill>
-                    <a:blip r:embed="rId35" cstate="print">
+                    <a:blip r:embed="rId36" cstate="print">
                       <a:extLst>
                         <a:ext uri="{28A0092B-C50C-407E-A947-70E740481C1C}">
                           <a14:useLocalDpi xmlns:a14="http://schemas.microsoft.com/office/drawing/2010/main" val="0"/>
@@ -6285,7 +6636,7 @@
                     <pic:cNvPicPr/>
                   </pic:nvPicPr>
                   <pic:blipFill>
-                    <a:blip r:embed="rId37" cstate="print">
+                    <a:blip r:embed="rId38" cstate="print">
                       <a:extLst>
                         <a:ext uri="{28A0092B-C50C-407E-A947-70E740481C1C}">
                           <a14:useLocalDpi xmlns:a14="http://schemas.microsoft.com/office/drawing/2010/main" val="0"/>
@@ -6364,7 +6715,7 @@
                     <pic:cNvPicPr/>
                   </pic:nvPicPr>
                   <pic:blipFill>
-                    <a:blip r:embed="rId35" cstate="print">
+                    <a:blip r:embed="rId36" cstate="print">
                       <a:extLst>
                         <a:ext uri="{28A0092B-C50C-407E-A947-70E740481C1C}">
                           <a14:useLocalDpi xmlns:a14="http://schemas.microsoft.com/office/drawing/2010/main" val="0"/>
@@ -6418,7 +6769,7 @@
                     <pic:cNvPicPr/>
                   </pic:nvPicPr>
                   <pic:blipFill>
-                    <a:blip r:embed="rId38" cstate="print">
+                    <a:blip r:embed="rId39" cstate="print">
                       <a:extLst>
                         <a:ext uri="{28A0092B-C50C-407E-A947-70E740481C1C}">
                           <a14:useLocalDpi xmlns:a14="http://schemas.microsoft.com/office/drawing/2010/main" val="0"/>
@@ -7253,55 +7604,1171 @@
         </w:rPr>
       </w:pPr>
       <w:r>
-        <w:t xml:space="preserve">Lorem ipsum dolor sit amet, consectetur adipiscing elit. </w:t>
-      </w:r>
+        <w:t xml:space="preserve">Lorem ipsum dolor sit </w:t>
+      </w:r>
+      <w:proofErr w:type="spellStart"/>
+      <w:r>
+        <w:t>amet</w:t>
+      </w:r>
+      <w:proofErr w:type="spellEnd"/>
+      <w:r>
+        <w:t xml:space="preserve">, </w:t>
+      </w:r>
+      <w:proofErr w:type="spellStart"/>
+      <w:r>
+        <w:t>consectetur</w:t>
+      </w:r>
+      <w:proofErr w:type="spellEnd"/>
+      <w:r>
+        <w:t xml:space="preserve"> </w:t>
+      </w:r>
+      <w:proofErr w:type="spellStart"/>
+      <w:r>
+        <w:t>adipiscing</w:t>
+      </w:r>
+      <w:proofErr w:type="spellEnd"/>
+      <w:r>
+        <w:t xml:space="preserve"> </w:t>
+      </w:r>
+      <w:proofErr w:type="spellStart"/>
+      <w:r>
+        <w:t>elit</w:t>
+      </w:r>
+      <w:proofErr w:type="spellEnd"/>
+      <w:r>
+        <w:t xml:space="preserve">. </w:t>
+      </w:r>
+      <w:proofErr w:type="spellStart"/>
       <w:r>
         <w:rPr>
           <w:lang w:val="it-IT"/>
         </w:rPr>
-        <w:t xml:space="preserve">Vestibulum ac quam nec arcu semper dignissim. </w:t>
-      </w:r>
+        <w:t>Vestibulum</w:t>
+      </w:r>
+      <w:proofErr w:type="spellEnd"/>
+      <w:r>
+        <w:rPr>
+          <w:lang w:val="it-IT"/>
+        </w:rPr>
+        <w:t xml:space="preserve"> </w:t>
+      </w:r>
+      <w:proofErr w:type="spellStart"/>
+      <w:r>
+        <w:rPr>
+          <w:lang w:val="it-IT"/>
+        </w:rPr>
+        <w:t>ac</w:t>
+      </w:r>
+      <w:proofErr w:type="spellEnd"/>
+      <w:r>
+        <w:rPr>
+          <w:lang w:val="it-IT"/>
+        </w:rPr>
+        <w:t xml:space="preserve"> </w:t>
+      </w:r>
+      <w:proofErr w:type="spellStart"/>
+      <w:r>
+        <w:rPr>
+          <w:lang w:val="it-IT"/>
+        </w:rPr>
+        <w:t>quam</w:t>
+      </w:r>
+      <w:proofErr w:type="spellEnd"/>
+      <w:r>
+        <w:rPr>
+          <w:lang w:val="it-IT"/>
+        </w:rPr>
+        <w:t xml:space="preserve"> </w:t>
+      </w:r>
+      <w:proofErr w:type="spellStart"/>
+      <w:r>
+        <w:rPr>
+          <w:lang w:val="it-IT"/>
+        </w:rPr>
+        <w:t>nec</w:t>
+      </w:r>
+      <w:proofErr w:type="spellEnd"/>
+      <w:r>
+        <w:rPr>
+          <w:lang w:val="it-IT"/>
+        </w:rPr>
+        <w:t xml:space="preserve"> </w:t>
+      </w:r>
+      <w:proofErr w:type="spellStart"/>
+      <w:r>
+        <w:rPr>
+          <w:lang w:val="it-IT"/>
+        </w:rPr>
+        <w:t>arcu</w:t>
+      </w:r>
+      <w:proofErr w:type="spellEnd"/>
+      <w:r>
+        <w:rPr>
+          <w:lang w:val="it-IT"/>
+        </w:rPr>
+        <w:t xml:space="preserve"> </w:t>
+      </w:r>
+      <w:proofErr w:type="spellStart"/>
+      <w:r>
+        <w:rPr>
+          <w:lang w:val="it-IT"/>
+        </w:rPr>
+        <w:t>semper</w:t>
+      </w:r>
+      <w:proofErr w:type="spellEnd"/>
+      <w:r>
+        <w:rPr>
+          <w:lang w:val="it-IT"/>
+        </w:rPr>
+        <w:t xml:space="preserve"> </w:t>
+      </w:r>
+      <w:proofErr w:type="spellStart"/>
+      <w:r>
+        <w:rPr>
+          <w:lang w:val="it-IT"/>
+        </w:rPr>
+        <w:t>dignissim</w:t>
+      </w:r>
+      <w:proofErr w:type="spellEnd"/>
+      <w:r>
+        <w:rPr>
+          <w:lang w:val="it-IT"/>
+        </w:rPr>
+        <w:t xml:space="preserve">. </w:t>
+      </w:r>
+      <w:proofErr w:type="spellStart"/>
       <w:r>
         <w:rPr>
           <w:lang w:val="fr-BE"/>
         </w:rPr>
-        <w:t>Nulla quam magna, varius sit amet pharetra et, dictum quis elit. Pellentesque habitant morbi tristique senectus et netus et malesuada fames ac turpis egestas.</w:t>
-      </w:r>
-    </w:p>
-    <w:p>
-      <w:pPr>
+        <w:t>Nulla</w:t>
+      </w:r>
+      <w:proofErr w:type="spellEnd"/>
+      <w:r>
         <w:rPr>
           <w:lang w:val="fr-BE"/>
         </w:rPr>
-      </w:pPr>
+        <w:t xml:space="preserve"> </w:t>
+      </w:r>
+      <w:proofErr w:type="spellStart"/>
       <w:r>
         <w:rPr>
           <w:lang w:val="fr-BE"/>
         </w:rPr>
-        <w:t xml:space="preserve">Proin ullamcorper, ipsum sit amet scelerisque rhoncus, leo quam rhoncus elit, sit amet ullamcorper tellus nisi eget sapien. </w:t>
-      </w:r>
+        <w:t>quam</w:t>
+      </w:r>
+      <w:proofErr w:type="spellEnd"/>
+      <w:r>
+        <w:rPr>
+          <w:lang w:val="fr-BE"/>
+        </w:rPr>
+        <w:t xml:space="preserve"> magna, </w:t>
+      </w:r>
+      <w:proofErr w:type="spellStart"/>
+      <w:r>
+        <w:rPr>
+          <w:lang w:val="fr-BE"/>
+        </w:rPr>
+        <w:t>varius</w:t>
+      </w:r>
+      <w:proofErr w:type="spellEnd"/>
+      <w:r>
+        <w:rPr>
+          <w:lang w:val="fr-BE"/>
+        </w:rPr>
+        <w:t xml:space="preserve"> </w:t>
+      </w:r>
+      <w:proofErr w:type="spellStart"/>
+      <w:r>
+        <w:rPr>
+          <w:lang w:val="fr-BE"/>
+        </w:rPr>
+        <w:t>sit</w:t>
+      </w:r>
+      <w:proofErr w:type="spellEnd"/>
+      <w:r>
+        <w:rPr>
+          <w:lang w:val="fr-BE"/>
+        </w:rPr>
+        <w:t xml:space="preserve"> </w:t>
+      </w:r>
+      <w:proofErr w:type="spellStart"/>
+      <w:r>
+        <w:rPr>
+          <w:lang w:val="fr-BE"/>
+        </w:rPr>
+        <w:t>amet</w:t>
+      </w:r>
+      <w:proofErr w:type="spellEnd"/>
+      <w:r>
+        <w:rPr>
+          <w:lang w:val="fr-BE"/>
+        </w:rPr>
+        <w:t xml:space="preserve"> </w:t>
+      </w:r>
+      <w:proofErr w:type="spellStart"/>
+      <w:r>
+        <w:rPr>
+          <w:lang w:val="fr-BE"/>
+        </w:rPr>
+        <w:t>pharetra</w:t>
+      </w:r>
+      <w:proofErr w:type="spellEnd"/>
+      <w:r>
+        <w:rPr>
+          <w:lang w:val="fr-BE"/>
+        </w:rPr>
+        <w:t xml:space="preserve"> et, dictum </w:t>
+      </w:r>
+      <w:proofErr w:type="spellStart"/>
+      <w:r>
+        <w:rPr>
+          <w:lang w:val="fr-BE"/>
+        </w:rPr>
+        <w:t>quis</w:t>
+      </w:r>
+      <w:proofErr w:type="spellEnd"/>
+      <w:r>
+        <w:rPr>
+          <w:lang w:val="fr-BE"/>
+        </w:rPr>
+        <w:t xml:space="preserve"> </w:t>
+      </w:r>
+      <w:proofErr w:type="spellStart"/>
+      <w:r>
+        <w:rPr>
+          <w:lang w:val="fr-BE"/>
+        </w:rPr>
+        <w:t>elit</w:t>
+      </w:r>
+      <w:proofErr w:type="spellEnd"/>
+      <w:r>
+        <w:rPr>
+          <w:lang w:val="fr-BE"/>
+        </w:rPr>
+        <w:t xml:space="preserve">. </w:t>
+      </w:r>
+      <w:proofErr w:type="spellStart"/>
+      <w:r>
+        <w:rPr>
+          <w:lang w:val="fr-BE"/>
+        </w:rPr>
+        <w:t>Pellentesque</w:t>
+      </w:r>
+      <w:proofErr w:type="spellEnd"/>
+      <w:r>
+        <w:rPr>
+          <w:lang w:val="fr-BE"/>
+        </w:rPr>
+        <w:t xml:space="preserve"> habitant morbi tristique </w:t>
+      </w:r>
+      <w:proofErr w:type="spellStart"/>
+      <w:r>
+        <w:rPr>
+          <w:lang w:val="fr-BE"/>
+        </w:rPr>
+        <w:t>senectus</w:t>
+      </w:r>
+      <w:proofErr w:type="spellEnd"/>
+      <w:r>
+        <w:rPr>
+          <w:lang w:val="fr-BE"/>
+        </w:rPr>
+        <w:t xml:space="preserve"> et </w:t>
+      </w:r>
+      <w:proofErr w:type="spellStart"/>
+      <w:r>
+        <w:rPr>
+          <w:lang w:val="fr-BE"/>
+        </w:rPr>
+        <w:t>netus</w:t>
+      </w:r>
+      <w:proofErr w:type="spellEnd"/>
+      <w:r>
+        <w:rPr>
+          <w:lang w:val="fr-BE"/>
+        </w:rPr>
+        <w:t xml:space="preserve"> et </w:t>
+      </w:r>
+      <w:proofErr w:type="spellStart"/>
+      <w:r>
+        <w:rPr>
+          <w:lang w:val="fr-BE"/>
+        </w:rPr>
+        <w:t>malesuada</w:t>
+      </w:r>
+      <w:proofErr w:type="spellEnd"/>
+      <w:r>
+        <w:rPr>
+          <w:lang w:val="fr-BE"/>
+        </w:rPr>
+        <w:t xml:space="preserve"> </w:t>
+      </w:r>
+      <w:proofErr w:type="spellStart"/>
+      <w:r>
+        <w:rPr>
+          <w:lang w:val="fr-BE"/>
+        </w:rPr>
+        <w:t>fames</w:t>
+      </w:r>
+      <w:proofErr w:type="spellEnd"/>
+      <w:r>
+        <w:rPr>
+          <w:lang w:val="fr-BE"/>
+        </w:rPr>
+        <w:t xml:space="preserve"> </w:t>
+      </w:r>
+      <w:proofErr w:type="spellStart"/>
+      <w:r>
+        <w:rPr>
+          <w:lang w:val="fr-BE"/>
+        </w:rPr>
+        <w:t>ac</w:t>
+      </w:r>
+      <w:proofErr w:type="spellEnd"/>
+      <w:r>
+        <w:rPr>
+          <w:lang w:val="fr-BE"/>
+        </w:rPr>
+        <w:t xml:space="preserve"> </w:t>
+      </w:r>
+      <w:proofErr w:type="spellStart"/>
+      <w:r>
+        <w:rPr>
+          <w:lang w:val="fr-BE"/>
+        </w:rPr>
+        <w:t>turpis</w:t>
+      </w:r>
+      <w:proofErr w:type="spellEnd"/>
+      <w:r>
+        <w:rPr>
+          <w:lang w:val="fr-BE"/>
+        </w:rPr>
+        <w:t xml:space="preserve"> </w:t>
+      </w:r>
+      <w:proofErr w:type="spellStart"/>
+      <w:r>
+        <w:rPr>
+          <w:lang w:val="fr-BE"/>
+        </w:rPr>
+        <w:t>egestas</w:t>
+      </w:r>
+      <w:proofErr w:type="spellEnd"/>
+      <w:r>
+        <w:rPr>
+          <w:lang w:val="fr-BE"/>
+        </w:rPr>
+        <w:t>.</w:t>
+      </w:r>
+    </w:p>
+    <w:p>
+      <w:pPr>
+        <w:rPr>
+          <w:lang w:val="fr-BE"/>
+        </w:rPr>
+      </w:pPr>
+      <w:proofErr w:type="spellStart"/>
+      <w:r>
+        <w:rPr>
+          <w:lang w:val="fr-BE"/>
+        </w:rPr>
+        <w:t>Proin</w:t>
+      </w:r>
+      <w:proofErr w:type="spellEnd"/>
+      <w:r>
+        <w:rPr>
+          <w:lang w:val="fr-BE"/>
+        </w:rPr>
+        <w:t xml:space="preserve"> </w:t>
+      </w:r>
+      <w:proofErr w:type="spellStart"/>
+      <w:r>
+        <w:rPr>
+          <w:lang w:val="fr-BE"/>
+        </w:rPr>
+        <w:t>ullamcorper</w:t>
+      </w:r>
+      <w:proofErr w:type="spellEnd"/>
+      <w:r>
+        <w:rPr>
+          <w:lang w:val="fr-BE"/>
+        </w:rPr>
+        <w:t xml:space="preserve">, ipsum </w:t>
+      </w:r>
+      <w:proofErr w:type="spellStart"/>
+      <w:r>
+        <w:rPr>
+          <w:lang w:val="fr-BE"/>
+        </w:rPr>
+        <w:t>sit</w:t>
+      </w:r>
+      <w:proofErr w:type="spellEnd"/>
+      <w:r>
+        <w:rPr>
+          <w:lang w:val="fr-BE"/>
+        </w:rPr>
+        <w:t xml:space="preserve"> </w:t>
+      </w:r>
+      <w:proofErr w:type="spellStart"/>
+      <w:r>
+        <w:rPr>
+          <w:lang w:val="fr-BE"/>
+        </w:rPr>
+        <w:t>amet</w:t>
+      </w:r>
+      <w:proofErr w:type="spellEnd"/>
+      <w:r>
+        <w:rPr>
+          <w:lang w:val="fr-BE"/>
+        </w:rPr>
+        <w:t xml:space="preserve"> </w:t>
+      </w:r>
+      <w:proofErr w:type="spellStart"/>
+      <w:r>
+        <w:rPr>
+          <w:lang w:val="fr-BE"/>
+        </w:rPr>
+        <w:t>scelerisque</w:t>
+      </w:r>
+      <w:proofErr w:type="spellEnd"/>
+      <w:r>
+        <w:rPr>
+          <w:lang w:val="fr-BE"/>
+        </w:rPr>
+        <w:t xml:space="preserve"> rhoncus, </w:t>
+      </w:r>
+      <w:proofErr w:type="spellStart"/>
+      <w:r>
+        <w:rPr>
+          <w:lang w:val="fr-BE"/>
+        </w:rPr>
+        <w:t>leo</w:t>
+      </w:r>
+      <w:proofErr w:type="spellEnd"/>
+      <w:r>
+        <w:rPr>
+          <w:lang w:val="fr-BE"/>
+        </w:rPr>
+        <w:t xml:space="preserve"> </w:t>
+      </w:r>
+      <w:proofErr w:type="spellStart"/>
+      <w:r>
+        <w:rPr>
+          <w:lang w:val="fr-BE"/>
+        </w:rPr>
+        <w:t>quam</w:t>
+      </w:r>
+      <w:proofErr w:type="spellEnd"/>
+      <w:r>
+        <w:rPr>
+          <w:lang w:val="fr-BE"/>
+        </w:rPr>
+        <w:t xml:space="preserve"> rhoncus </w:t>
+      </w:r>
+      <w:proofErr w:type="spellStart"/>
+      <w:r>
+        <w:rPr>
+          <w:lang w:val="fr-BE"/>
+        </w:rPr>
+        <w:t>elit</w:t>
+      </w:r>
+      <w:proofErr w:type="spellEnd"/>
+      <w:r>
+        <w:rPr>
+          <w:lang w:val="fr-BE"/>
+        </w:rPr>
+        <w:t xml:space="preserve">, </w:t>
+      </w:r>
+      <w:proofErr w:type="spellStart"/>
+      <w:r>
+        <w:rPr>
+          <w:lang w:val="fr-BE"/>
+        </w:rPr>
+        <w:t>sit</w:t>
+      </w:r>
+      <w:proofErr w:type="spellEnd"/>
+      <w:r>
+        <w:rPr>
+          <w:lang w:val="fr-BE"/>
+        </w:rPr>
+        <w:t xml:space="preserve"> </w:t>
+      </w:r>
+      <w:proofErr w:type="spellStart"/>
+      <w:r>
+        <w:rPr>
+          <w:lang w:val="fr-BE"/>
+        </w:rPr>
+        <w:t>amet</w:t>
+      </w:r>
+      <w:proofErr w:type="spellEnd"/>
+      <w:r>
+        <w:rPr>
+          <w:lang w:val="fr-BE"/>
+        </w:rPr>
+        <w:t xml:space="preserve"> </w:t>
+      </w:r>
+      <w:proofErr w:type="spellStart"/>
+      <w:r>
+        <w:rPr>
+          <w:lang w:val="fr-BE"/>
+        </w:rPr>
+        <w:t>ullamcorper</w:t>
+      </w:r>
+      <w:proofErr w:type="spellEnd"/>
+      <w:r>
+        <w:rPr>
+          <w:lang w:val="fr-BE"/>
+        </w:rPr>
+        <w:t xml:space="preserve"> </w:t>
+      </w:r>
+      <w:proofErr w:type="spellStart"/>
+      <w:r>
+        <w:rPr>
+          <w:lang w:val="fr-BE"/>
+        </w:rPr>
+        <w:t>tellus</w:t>
+      </w:r>
+      <w:proofErr w:type="spellEnd"/>
+      <w:r>
+        <w:rPr>
+          <w:lang w:val="fr-BE"/>
+        </w:rPr>
+        <w:t xml:space="preserve"> </w:t>
+      </w:r>
+      <w:proofErr w:type="spellStart"/>
+      <w:r>
+        <w:rPr>
+          <w:lang w:val="fr-BE"/>
+        </w:rPr>
+        <w:t>nisi</w:t>
+      </w:r>
+      <w:proofErr w:type="spellEnd"/>
+      <w:r>
+        <w:rPr>
+          <w:lang w:val="fr-BE"/>
+        </w:rPr>
+        <w:t xml:space="preserve"> </w:t>
+      </w:r>
+      <w:proofErr w:type="spellStart"/>
+      <w:r>
+        <w:rPr>
+          <w:lang w:val="fr-BE"/>
+        </w:rPr>
+        <w:t>eget</w:t>
+      </w:r>
+      <w:proofErr w:type="spellEnd"/>
+      <w:r>
+        <w:rPr>
+          <w:lang w:val="fr-BE"/>
+        </w:rPr>
+        <w:t xml:space="preserve"> </w:t>
+      </w:r>
+      <w:proofErr w:type="spellStart"/>
+      <w:r>
+        <w:rPr>
+          <w:lang w:val="fr-BE"/>
+        </w:rPr>
+        <w:t>sapien</w:t>
+      </w:r>
+      <w:proofErr w:type="spellEnd"/>
+      <w:r>
+        <w:rPr>
+          <w:lang w:val="fr-BE"/>
+        </w:rPr>
+        <w:t xml:space="preserve">. </w:t>
+      </w:r>
+      <w:proofErr w:type="spellStart"/>
       <w:r>
         <w:rPr>
           <w:lang w:val="it-IT"/>
         </w:rPr>
-        <w:t xml:space="preserve">Suspendisse potenti. Ut non justo viverra, tempus felis vitae, elementum mi. </w:t>
+        <w:t>Suspendisse</w:t>
+      </w:r>
+      <w:proofErr w:type="spellEnd"/>
+      <w:r>
+        <w:rPr>
+          <w:lang w:val="it-IT"/>
+        </w:rPr>
+        <w:t xml:space="preserve"> potenti. Ut non </w:t>
+      </w:r>
+      <w:proofErr w:type="spellStart"/>
+      <w:r>
+        <w:rPr>
+          <w:lang w:val="it-IT"/>
+        </w:rPr>
+        <w:t>justo</w:t>
+      </w:r>
+      <w:proofErr w:type="spellEnd"/>
+      <w:r>
+        <w:rPr>
+          <w:lang w:val="it-IT"/>
+        </w:rPr>
+        <w:t xml:space="preserve"> viverra, tempus </w:t>
+      </w:r>
+      <w:proofErr w:type="spellStart"/>
+      <w:r>
+        <w:rPr>
+          <w:lang w:val="it-IT"/>
+        </w:rPr>
+        <w:t>felis</w:t>
+      </w:r>
+      <w:proofErr w:type="spellEnd"/>
+      <w:r>
+        <w:rPr>
+          <w:lang w:val="it-IT"/>
+        </w:rPr>
+        <w:t xml:space="preserve"> vitae, </w:t>
+      </w:r>
+      <w:proofErr w:type="spellStart"/>
+      <w:r>
+        <w:rPr>
+          <w:lang w:val="it-IT"/>
+        </w:rPr>
+        <w:t>elementum</w:t>
+      </w:r>
+      <w:proofErr w:type="spellEnd"/>
+      <w:r>
+        <w:rPr>
+          <w:lang w:val="it-IT"/>
+        </w:rPr>
+        <w:t xml:space="preserve"> mi. </w:t>
       </w:r>
       <w:r>
         <w:rPr>
           <w:lang w:val="fr-BE"/>
         </w:rPr>
-        <w:t>Morbi at dui sed lacus fringilla condimentum. Duis non odio ac arcu volutpat vehicula eu et turpis.</w:t>
-      </w:r>
-    </w:p>
-    <w:p>
+        <w:t xml:space="preserve">Morbi at </w:t>
+      </w:r>
+      <w:proofErr w:type="spellStart"/>
+      <w:r>
+        <w:rPr>
+          <w:lang w:val="fr-BE"/>
+        </w:rPr>
+        <w:t>dui</w:t>
+      </w:r>
+      <w:proofErr w:type="spellEnd"/>
+      <w:r>
+        <w:rPr>
+          <w:lang w:val="fr-BE"/>
+        </w:rPr>
+        <w:t xml:space="preserve"> </w:t>
+      </w:r>
+      <w:proofErr w:type="spellStart"/>
+      <w:r>
+        <w:rPr>
+          <w:lang w:val="fr-BE"/>
+        </w:rPr>
+        <w:t>sed</w:t>
+      </w:r>
+      <w:proofErr w:type="spellEnd"/>
+      <w:r>
+        <w:rPr>
+          <w:lang w:val="fr-BE"/>
+        </w:rPr>
+        <w:t xml:space="preserve"> </w:t>
+      </w:r>
+      <w:proofErr w:type="spellStart"/>
+      <w:r>
+        <w:rPr>
+          <w:lang w:val="fr-BE"/>
+        </w:rPr>
+        <w:t>lacus</w:t>
+      </w:r>
+      <w:proofErr w:type="spellEnd"/>
+      <w:r>
+        <w:rPr>
+          <w:lang w:val="fr-BE"/>
+        </w:rPr>
+        <w:t xml:space="preserve"> </w:t>
+      </w:r>
+      <w:proofErr w:type="spellStart"/>
+      <w:r>
+        <w:rPr>
+          <w:lang w:val="fr-BE"/>
+        </w:rPr>
+        <w:t>fringilla</w:t>
+      </w:r>
+      <w:proofErr w:type="spellEnd"/>
+      <w:r>
+        <w:rPr>
+          <w:lang w:val="fr-BE"/>
+        </w:rPr>
+        <w:t xml:space="preserve"> </w:t>
+      </w:r>
+      <w:proofErr w:type="spellStart"/>
+      <w:r>
+        <w:rPr>
+          <w:lang w:val="fr-BE"/>
+        </w:rPr>
+        <w:t>condimentum</w:t>
+      </w:r>
+      <w:proofErr w:type="spellEnd"/>
+      <w:r>
+        <w:rPr>
+          <w:lang w:val="fr-BE"/>
+        </w:rPr>
+        <w:t xml:space="preserve">. Duis non </w:t>
+      </w:r>
+      <w:proofErr w:type="spellStart"/>
+      <w:r>
+        <w:rPr>
+          <w:lang w:val="fr-BE"/>
+        </w:rPr>
+        <w:t>odio</w:t>
+      </w:r>
+      <w:proofErr w:type="spellEnd"/>
+      <w:r>
+        <w:rPr>
+          <w:lang w:val="fr-BE"/>
+        </w:rPr>
+        <w:t xml:space="preserve"> </w:t>
+      </w:r>
+      <w:proofErr w:type="spellStart"/>
+      <w:r>
+        <w:rPr>
+          <w:lang w:val="fr-BE"/>
+        </w:rPr>
+        <w:t>ac</w:t>
+      </w:r>
+      <w:proofErr w:type="spellEnd"/>
+      <w:r>
+        <w:rPr>
+          <w:lang w:val="fr-BE"/>
+        </w:rPr>
+        <w:t xml:space="preserve"> </w:t>
+      </w:r>
+      <w:proofErr w:type="spellStart"/>
+      <w:r>
+        <w:rPr>
+          <w:lang w:val="fr-BE"/>
+        </w:rPr>
+        <w:t>arcu</w:t>
+      </w:r>
+      <w:proofErr w:type="spellEnd"/>
+      <w:r>
+        <w:rPr>
+          <w:lang w:val="fr-BE"/>
+        </w:rPr>
+        <w:t xml:space="preserve"> </w:t>
+      </w:r>
+      <w:proofErr w:type="spellStart"/>
+      <w:r>
+        <w:rPr>
+          <w:lang w:val="fr-BE"/>
+        </w:rPr>
+        <w:t>volutpat</w:t>
+      </w:r>
+      <w:proofErr w:type="spellEnd"/>
+      <w:r>
+        <w:rPr>
+          <w:lang w:val="fr-BE"/>
+        </w:rPr>
+        <w:t xml:space="preserve"> </w:t>
+      </w:r>
+      <w:proofErr w:type="spellStart"/>
+      <w:r>
+        <w:rPr>
+          <w:lang w:val="fr-BE"/>
+        </w:rPr>
+        <w:t>vehicula</w:t>
+      </w:r>
+      <w:proofErr w:type="spellEnd"/>
+      <w:r>
+        <w:rPr>
+          <w:lang w:val="fr-BE"/>
+        </w:rPr>
+        <w:t xml:space="preserve"> eu et </w:t>
+      </w:r>
+      <w:proofErr w:type="spellStart"/>
+      <w:r>
+        <w:rPr>
+          <w:lang w:val="fr-BE"/>
+        </w:rPr>
+        <w:t>turpis</w:t>
+      </w:r>
+      <w:proofErr w:type="spellEnd"/>
+      <w:r>
+        <w:rPr>
+          <w:lang w:val="fr-BE"/>
+        </w:rPr>
+        <w:t>.</w:t>
+      </w:r>
+    </w:p>
+    <w:p>
+      <w:proofErr w:type="spellStart"/>
       <w:r>
         <w:rPr>
           <w:lang w:val="it-IT"/>
         </w:rPr>
-        <w:t xml:space="preserve">Praesent vitae magna ante. Nulla in orci lacus. Donec quis vestibulum mi. Sed ipsum sapien, pretium maximus purus sed, bibendum consequat lectus. Aliquam porttitor dolor eu gravida vulputate. </w:t>
-      </w:r>
-      <w:r>
-        <w:t>Vestibulum ut urna eget massa tincidunt ultricies. Morbi hendrerit sapien at diam tincidunt semper. Aliquam ut quam dictum quam maximus tempor sed at felis.</w:t>
+        <w:t>Praesent</w:t>
+      </w:r>
+      <w:proofErr w:type="spellEnd"/>
+      <w:r>
+        <w:rPr>
+          <w:lang w:val="it-IT"/>
+        </w:rPr>
+        <w:t xml:space="preserve"> vitae magna ante. Nulla in orci </w:t>
+      </w:r>
+      <w:proofErr w:type="spellStart"/>
+      <w:r>
+        <w:rPr>
+          <w:lang w:val="it-IT"/>
+        </w:rPr>
+        <w:t>lacus</w:t>
+      </w:r>
+      <w:proofErr w:type="spellEnd"/>
+      <w:r>
+        <w:rPr>
+          <w:lang w:val="it-IT"/>
+        </w:rPr>
+        <w:t xml:space="preserve">. </w:t>
+      </w:r>
+      <w:proofErr w:type="spellStart"/>
+      <w:r>
+        <w:rPr>
+          <w:lang w:val="it-IT"/>
+        </w:rPr>
+        <w:t>Donec</w:t>
+      </w:r>
+      <w:proofErr w:type="spellEnd"/>
+      <w:r>
+        <w:rPr>
+          <w:lang w:val="it-IT"/>
+        </w:rPr>
+        <w:t xml:space="preserve"> </w:t>
+      </w:r>
+      <w:proofErr w:type="spellStart"/>
+      <w:r>
+        <w:rPr>
+          <w:lang w:val="it-IT"/>
+        </w:rPr>
+        <w:t>quis</w:t>
+      </w:r>
+      <w:proofErr w:type="spellEnd"/>
+      <w:r>
+        <w:rPr>
+          <w:lang w:val="it-IT"/>
+        </w:rPr>
+        <w:t xml:space="preserve"> </w:t>
+      </w:r>
+      <w:proofErr w:type="spellStart"/>
+      <w:r>
+        <w:rPr>
+          <w:lang w:val="it-IT"/>
+        </w:rPr>
+        <w:t>vestibulum</w:t>
+      </w:r>
+      <w:proofErr w:type="spellEnd"/>
+      <w:r>
+        <w:rPr>
+          <w:lang w:val="it-IT"/>
+        </w:rPr>
+        <w:t xml:space="preserve"> mi. Sed </w:t>
+      </w:r>
+      <w:proofErr w:type="spellStart"/>
+      <w:r>
+        <w:rPr>
+          <w:lang w:val="it-IT"/>
+        </w:rPr>
+        <w:t>ipsum</w:t>
+      </w:r>
+      <w:proofErr w:type="spellEnd"/>
+      <w:r>
+        <w:rPr>
+          <w:lang w:val="it-IT"/>
+        </w:rPr>
+        <w:t xml:space="preserve"> </w:t>
+      </w:r>
+      <w:proofErr w:type="spellStart"/>
+      <w:r>
+        <w:rPr>
+          <w:lang w:val="it-IT"/>
+        </w:rPr>
+        <w:t>sapien</w:t>
+      </w:r>
+      <w:proofErr w:type="spellEnd"/>
+      <w:r>
+        <w:rPr>
+          <w:lang w:val="it-IT"/>
+        </w:rPr>
+        <w:t xml:space="preserve">, </w:t>
+      </w:r>
+      <w:proofErr w:type="spellStart"/>
+      <w:r>
+        <w:rPr>
+          <w:lang w:val="it-IT"/>
+        </w:rPr>
+        <w:t>pretium</w:t>
+      </w:r>
+      <w:proofErr w:type="spellEnd"/>
+      <w:r>
+        <w:rPr>
+          <w:lang w:val="it-IT"/>
+        </w:rPr>
+        <w:t xml:space="preserve"> </w:t>
+      </w:r>
+      <w:proofErr w:type="spellStart"/>
+      <w:r>
+        <w:rPr>
+          <w:lang w:val="it-IT"/>
+        </w:rPr>
+        <w:t>maximus</w:t>
+      </w:r>
+      <w:proofErr w:type="spellEnd"/>
+      <w:r>
+        <w:rPr>
+          <w:lang w:val="it-IT"/>
+        </w:rPr>
+        <w:t xml:space="preserve"> </w:t>
+      </w:r>
+      <w:proofErr w:type="spellStart"/>
+      <w:r>
+        <w:rPr>
+          <w:lang w:val="it-IT"/>
+        </w:rPr>
+        <w:t>purus</w:t>
+      </w:r>
+      <w:proofErr w:type="spellEnd"/>
+      <w:r>
+        <w:rPr>
+          <w:lang w:val="it-IT"/>
+        </w:rPr>
+        <w:t xml:space="preserve"> sed, </w:t>
+      </w:r>
+      <w:proofErr w:type="spellStart"/>
+      <w:r>
+        <w:rPr>
+          <w:lang w:val="it-IT"/>
+        </w:rPr>
+        <w:t>bibendum</w:t>
+      </w:r>
+      <w:proofErr w:type="spellEnd"/>
+      <w:r>
+        <w:rPr>
+          <w:lang w:val="it-IT"/>
+        </w:rPr>
+        <w:t xml:space="preserve"> </w:t>
+      </w:r>
+      <w:proofErr w:type="spellStart"/>
+      <w:r>
+        <w:rPr>
+          <w:lang w:val="it-IT"/>
+        </w:rPr>
+        <w:t>consequat</w:t>
+      </w:r>
+      <w:proofErr w:type="spellEnd"/>
+      <w:r>
+        <w:rPr>
+          <w:lang w:val="it-IT"/>
+        </w:rPr>
+        <w:t xml:space="preserve"> </w:t>
+      </w:r>
+      <w:proofErr w:type="spellStart"/>
+      <w:r>
+        <w:rPr>
+          <w:lang w:val="it-IT"/>
+        </w:rPr>
+        <w:t>lectus</w:t>
+      </w:r>
+      <w:proofErr w:type="spellEnd"/>
+      <w:r>
+        <w:rPr>
+          <w:lang w:val="it-IT"/>
+        </w:rPr>
+        <w:t xml:space="preserve">. </w:t>
+      </w:r>
+      <w:proofErr w:type="spellStart"/>
+      <w:r>
+        <w:rPr>
+          <w:lang w:val="it-IT"/>
+        </w:rPr>
+        <w:t>Aliquam</w:t>
+      </w:r>
+      <w:proofErr w:type="spellEnd"/>
+      <w:r>
+        <w:rPr>
+          <w:lang w:val="it-IT"/>
+        </w:rPr>
+        <w:t xml:space="preserve"> </w:t>
+      </w:r>
+      <w:proofErr w:type="spellStart"/>
+      <w:r>
+        <w:rPr>
+          <w:lang w:val="it-IT"/>
+        </w:rPr>
+        <w:t>porttitor</w:t>
+      </w:r>
+      <w:proofErr w:type="spellEnd"/>
+      <w:r>
+        <w:rPr>
+          <w:lang w:val="it-IT"/>
+        </w:rPr>
+        <w:t xml:space="preserve"> </w:t>
+      </w:r>
+      <w:proofErr w:type="spellStart"/>
+      <w:r>
+        <w:rPr>
+          <w:lang w:val="it-IT"/>
+        </w:rPr>
+        <w:t>dolor</w:t>
+      </w:r>
+      <w:proofErr w:type="spellEnd"/>
+      <w:r>
+        <w:rPr>
+          <w:lang w:val="it-IT"/>
+        </w:rPr>
+        <w:t xml:space="preserve"> </w:t>
+      </w:r>
+      <w:proofErr w:type="spellStart"/>
+      <w:r>
+        <w:rPr>
+          <w:lang w:val="it-IT"/>
+        </w:rPr>
+        <w:t>eu</w:t>
+      </w:r>
+      <w:proofErr w:type="spellEnd"/>
+      <w:r>
+        <w:rPr>
+          <w:lang w:val="it-IT"/>
+        </w:rPr>
+        <w:t xml:space="preserve"> gravida </w:t>
+      </w:r>
+      <w:proofErr w:type="spellStart"/>
+      <w:r>
+        <w:rPr>
+          <w:lang w:val="it-IT"/>
+        </w:rPr>
+        <w:t>vulputate</w:t>
+      </w:r>
+      <w:proofErr w:type="spellEnd"/>
+      <w:r>
+        <w:rPr>
+          <w:lang w:val="it-IT"/>
+        </w:rPr>
+        <w:t xml:space="preserve">. </w:t>
+      </w:r>
+      <w:r>
+        <w:t xml:space="preserve">Vestibulum </w:t>
+      </w:r>
+      <w:proofErr w:type="spellStart"/>
+      <w:r>
+        <w:t>ut</w:t>
+      </w:r>
+      <w:proofErr w:type="spellEnd"/>
+      <w:r>
+        <w:t xml:space="preserve"> </w:t>
+      </w:r>
+      <w:proofErr w:type="spellStart"/>
+      <w:r>
+        <w:t>urna</w:t>
+      </w:r>
+      <w:proofErr w:type="spellEnd"/>
+      <w:r>
+        <w:t xml:space="preserve"> </w:t>
+      </w:r>
+      <w:proofErr w:type="spellStart"/>
+      <w:r>
+        <w:t>eget</w:t>
+      </w:r>
+      <w:proofErr w:type="spellEnd"/>
+      <w:r>
+        <w:t xml:space="preserve"> </w:t>
+      </w:r>
+      <w:proofErr w:type="spellStart"/>
+      <w:r>
+        <w:t>massa</w:t>
+      </w:r>
+      <w:proofErr w:type="spellEnd"/>
+      <w:r>
+        <w:t xml:space="preserve"> </w:t>
+      </w:r>
+      <w:proofErr w:type="spellStart"/>
+      <w:r>
+        <w:t>tincidunt</w:t>
+      </w:r>
+      <w:proofErr w:type="spellEnd"/>
+      <w:r>
+        <w:t xml:space="preserve"> </w:t>
+      </w:r>
+      <w:proofErr w:type="spellStart"/>
+      <w:r>
+        <w:t>ultricies</w:t>
+      </w:r>
+      <w:proofErr w:type="spellEnd"/>
+      <w:r>
+        <w:t xml:space="preserve">. Morbi </w:t>
+      </w:r>
+      <w:proofErr w:type="spellStart"/>
+      <w:r>
+        <w:t>hendrerit</w:t>
+      </w:r>
+      <w:proofErr w:type="spellEnd"/>
+      <w:r>
+        <w:t xml:space="preserve"> </w:t>
+      </w:r>
+      <w:proofErr w:type="spellStart"/>
+      <w:r>
+        <w:t>sapien</w:t>
+      </w:r>
+      <w:proofErr w:type="spellEnd"/>
+      <w:r>
+        <w:t xml:space="preserve"> at diam </w:t>
+      </w:r>
+      <w:proofErr w:type="spellStart"/>
+      <w:r>
+        <w:t>tincidunt</w:t>
+      </w:r>
+      <w:proofErr w:type="spellEnd"/>
+      <w:r>
+        <w:t xml:space="preserve"> semper. </w:t>
+      </w:r>
+      <w:proofErr w:type="spellStart"/>
+      <w:r>
+        <w:t>Aliquam</w:t>
+      </w:r>
+      <w:proofErr w:type="spellEnd"/>
+      <w:r>
+        <w:t xml:space="preserve"> </w:t>
+      </w:r>
+      <w:proofErr w:type="spellStart"/>
+      <w:r>
+        <w:t>ut</w:t>
+      </w:r>
+      <w:proofErr w:type="spellEnd"/>
+      <w:r>
+        <w:t xml:space="preserve"> </w:t>
+      </w:r>
+      <w:proofErr w:type="spellStart"/>
+      <w:r>
+        <w:t>quam</w:t>
+      </w:r>
+      <w:proofErr w:type="spellEnd"/>
+      <w:r>
+        <w:t xml:space="preserve"> dictum </w:t>
+      </w:r>
+      <w:proofErr w:type="spellStart"/>
+      <w:r>
+        <w:t>quam</w:t>
+      </w:r>
+      <w:proofErr w:type="spellEnd"/>
+      <w:r>
+        <w:t xml:space="preserve"> maximus </w:t>
+      </w:r>
+      <w:proofErr w:type="spellStart"/>
+      <w:r>
+        <w:t>tempor</w:t>
+      </w:r>
+      <w:proofErr w:type="spellEnd"/>
+      <w:r>
+        <w:t xml:space="preserve"> sed at </w:t>
+      </w:r>
+      <w:proofErr w:type="spellStart"/>
+      <w:r>
+        <w:t>felis</w:t>
+      </w:r>
+      <w:proofErr w:type="spellEnd"/>
+      <w:r>
+        <w:t>.</w:t>
       </w:r>
     </w:p>
     <w:p/>
@@ -7398,9 +8865,23 @@
         <w:rPr>
           <w:lang w:val="fr-BE"/>
         </w:rPr>
-        <w:t xml:space="preserve">[Online]. Available: </w:t>
-      </w:r>
-      <w:hyperlink r:id="rId39" w:history="1">
+        <w:t xml:space="preserve">[Online]. </w:t>
+      </w:r>
+      <w:proofErr w:type="spellStart"/>
+      <w:r>
+        <w:rPr>
+          <w:lang w:val="fr-BE"/>
+        </w:rPr>
+        <w:t>Available</w:t>
+      </w:r>
+      <w:proofErr w:type="spellEnd"/>
+      <w:r>
+        <w:rPr>
+          <w:lang w:val="fr-BE"/>
+        </w:rPr>
+        <w:t xml:space="preserve">: </w:t>
+      </w:r>
+      <w:hyperlink r:id="rId40" w:history="1">
         <w:r>
           <w:rPr>
             <w:rStyle w:val="Hyperlink"/>
@@ -7435,9 +8916,23 @@
         <w:rPr>
           <w:lang w:val="fr-BE"/>
         </w:rPr>
-        <w:t xml:space="preserve">[Online]. Available: </w:t>
-      </w:r>
-      <w:hyperlink r:id="rId40" w:history="1">
+        <w:t xml:space="preserve">[Online]. </w:t>
+      </w:r>
+      <w:proofErr w:type="spellStart"/>
+      <w:r>
+        <w:rPr>
+          <w:lang w:val="fr-BE"/>
+        </w:rPr>
+        <w:t>Available</w:t>
+      </w:r>
+      <w:proofErr w:type="spellEnd"/>
+      <w:r>
+        <w:rPr>
+          <w:lang w:val="fr-BE"/>
+        </w:rPr>
+        <w:t xml:space="preserve">: </w:t>
+      </w:r>
+      <w:hyperlink r:id="rId41" w:history="1">
         <w:r>
           <w:rPr>
             <w:rStyle w:val="Hyperlink"/>
@@ -7516,10 +9011,7 @@
     <w:p>
       <w:pPr>
         <w:rPr>
-          <w:rStyle w:val="SubtleEmphasis"/>
-          <w:i w:val="0"/>
-          <w:iCs w:val="0"/>
-          <w:color w:val="auto"/>
+          <w:rStyle w:val="Hyperlink"/>
           <w:lang w:val="fr-BE"/>
         </w:rPr>
       </w:pPr>
@@ -7530,9 +9022,23 @@
         <w:rPr>
           <w:lang w:val="fr-BE"/>
         </w:rPr>
-        <w:t xml:space="preserve">[Online]. Available: </w:t>
-      </w:r>
-      <w:hyperlink r:id="rId41" w:history="1">
+        <w:t xml:space="preserve">[Online]. </w:t>
+      </w:r>
+      <w:proofErr w:type="spellStart"/>
+      <w:r>
+        <w:rPr>
+          <w:lang w:val="fr-BE"/>
+        </w:rPr>
+        <w:t>Available</w:t>
+      </w:r>
+      <w:proofErr w:type="spellEnd"/>
+      <w:r>
+        <w:rPr>
+          <w:lang w:val="fr-BE"/>
+        </w:rPr>
+        <w:t xml:space="preserve">: </w:t>
+      </w:r>
+      <w:hyperlink r:id="rId42" w:history="1">
         <w:r>
           <w:rPr>
             <w:rStyle w:val="Hyperlink"/>
@@ -7563,19 +9069,84 @@
           <w:i w:val="0"/>
           <w:iCs w:val="0"/>
           <w:color w:val="auto"/>
+        </w:rPr>
+      </w:pPr>
+      <w:r>
+        <w:t xml:space="preserve">‘What’s the Difference Between Ray Casting, Ray Tracing, Path Tracing and Rasterization? Physical light tracing… – </w:t>
+      </w:r>
+      <w:proofErr w:type="spellStart"/>
+      <w:r>
+        <w:t>pIXELsHAM</w:t>
+      </w:r>
+      <w:proofErr w:type="spellEnd"/>
+      <w:r>
+        <w:t xml:space="preserve">’. Accessed: Aug. 17, 2025. [Online]. Available: </w:t>
+      </w:r>
+      <w:hyperlink r:id="rId43" w:history="1">
+        <w:r>
+          <w:rPr>
+            <w:rStyle w:val="Hyperlink"/>
+          </w:rPr>
+          <w:t>https://www.pixelsham.com/2019/10/24/whats-the-difference-between-ray-tracing-and-rasterization/</w:t>
+        </w:r>
+      </w:hyperlink>
+    </w:p>
+    <w:p>
+      <w:pPr>
+        <w:jc w:val="right"/>
+      </w:pPr>
+      <w:r>
+        <w:t>[</w:t>
+      </w:r>
+      <w:r>
+        <w:t>6</w:t>
+      </w:r>
+      <w:r>
+        <w:t>]</w:t>
+      </w:r>
+    </w:p>
+    <w:p>
+      <w:pPr>
+        <w:rPr>
+          <w:rStyle w:val="SubtleEmphasis"/>
+          <w:i w:val="0"/>
+          <w:iCs w:val="0"/>
+          <w:color w:val="auto"/>
           <w:lang w:val="fr-BE"/>
         </w:rPr>
       </w:pPr>
       <w:r>
-        <w:t xml:space="preserve">‘LearnOpenGL - Deferred Shading’. Accessed: Aug. 15, 2025. </w:t>
+        <w:t>‘</w:t>
+      </w:r>
+      <w:proofErr w:type="spellStart"/>
+      <w:r>
+        <w:t>LearnOpenGL</w:t>
+      </w:r>
+      <w:proofErr w:type="spellEnd"/>
+      <w:r>
+        <w:t xml:space="preserve"> - Deferred Shading’. Accessed: Aug. 15, 2025. </w:t>
       </w:r>
       <w:r>
         <w:rPr>
           <w:lang w:val="fr-BE"/>
         </w:rPr>
-        <w:t xml:space="preserve">[Online]. Available: </w:t>
-      </w:r>
-      <w:hyperlink r:id="rId42" w:history="1">
+        <w:t xml:space="preserve">[Online]. </w:t>
+      </w:r>
+      <w:proofErr w:type="spellStart"/>
+      <w:r>
+        <w:rPr>
+          <w:lang w:val="fr-BE"/>
+        </w:rPr>
+        <w:t>Available</w:t>
+      </w:r>
+      <w:proofErr w:type="spellEnd"/>
+      <w:r>
+        <w:rPr>
+          <w:lang w:val="fr-BE"/>
+        </w:rPr>
+        <w:t xml:space="preserve">: </w:t>
+      </w:r>
+      <w:hyperlink r:id="rId44" w:history="1">
         <w:r>
           <w:rPr>
             <w:rStyle w:val="Hyperlink"/>
@@ -7593,7 +9164,7 @@
         <w:t>[</w:t>
       </w:r>
       <w:r>
-        <w:t>6</w:t>
+        <w:t>7</w:t>
       </w:r>
       <w:r>
         <w:t>]</w:t>
@@ -7626,9 +9197,23 @@
         <w:rPr>
           <w:lang w:val="fr-BE"/>
         </w:rPr>
-        <w:t xml:space="preserve">[Online]. Available: </w:t>
-      </w:r>
-      <w:hyperlink r:id="rId43" w:history="1">
+        <w:t xml:space="preserve">[Online]. </w:t>
+      </w:r>
+      <w:proofErr w:type="spellStart"/>
+      <w:r>
+        <w:rPr>
+          <w:lang w:val="fr-BE"/>
+        </w:rPr>
+        <w:t>Available</w:t>
+      </w:r>
+      <w:proofErr w:type="spellEnd"/>
+      <w:r>
+        <w:rPr>
+          <w:lang w:val="fr-BE"/>
+        </w:rPr>
+        <w:t xml:space="preserve">: </w:t>
+      </w:r>
+      <w:hyperlink r:id="rId45" w:history="1">
         <w:r>
           <w:rPr>
             <w:rStyle w:val="Hyperlink"/>
@@ -7655,7 +9240,7 @@
         <w:rPr>
           <w:lang w:val="fr-BE"/>
         </w:rPr>
-        <w:t>7</w:t>
+        <w:t>8</w:t>
       </w:r>
       <w:r>
         <w:rPr>
@@ -7674,12 +9259,27 @@
         <w:rPr>
           <w:lang w:val="fr-BE"/>
         </w:rPr>
-        <w:t xml:space="preserve">[Online]. Available: </w:t>
-      </w:r>
+        <w:lastRenderedPageBreak/>
+        <w:t xml:space="preserve">[Online]. </w:t>
+      </w:r>
+      <w:proofErr w:type="spellStart"/>
       <w:r>
         <w:rPr>
           <w:lang w:val="fr-BE"/>
         </w:rPr>
+        <w:t>Available</w:t>
+      </w:r>
+      <w:proofErr w:type="spellEnd"/>
+      <w:r>
+        <w:rPr>
+          <w:lang w:val="fr-BE"/>
+        </w:rPr>
+        <w:t xml:space="preserve">: </w:t>
+      </w:r>
+      <w:r>
+        <w:rPr>
+          <w:lang w:val="fr-BE"/>
+        </w:rPr>
         <w:t xml:space="preserve">https://citeseerx.ist.psu.edu/document?repid=rep1&amp;type=pdf&amp;doi=393a84a1eb9c1c5605a5944f909ff86eb3eb0eac#page=41 </w:t>
       </w:r>
     </w:p>
@@ -7700,7 +9300,7 @@
         <w:rPr>
           <w:lang w:val="en-GB"/>
         </w:rPr>
-        <w:t>8</w:t>
+        <w:t>9</w:t>
       </w:r>
       <w:r>
         <w:rPr>
@@ -7716,7 +9316,6 @@
         </w:rPr>
       </w:pPr>
       <w:r>
-        <w:lastRenderedPageBreak/>
         <w:t xml:space="preserve">‘Ambient occlusion’, </w:t>
       </w:r>
       <w:r>
@@ -7729,13 +9328,21 @@
       <w:r>
         <w:t xml:space="preserve">. May 23, 2025. Accessed: Aug. 05, 2025. [Online]. </w:t>
       </w:r>
+      <w:proofErr w:type="spellStart"/>
       <w:r>
         <w:rPr>
           <w:lang w:val="fr-BE"/>
         </w:rPr>
-        <w:t xml:space="preserve">Available: </w:t>
-      </w:r>
-      <w:hyperlink r:id="rId44" w:anchor="cite_note-6" w:history="1">
+        <w:t>Available</w:t>
+      </w:r>
+      <w:proofErr w:type="spellEnd"/>
+      <w:r>
+        <w:rPr>
+          <w:lang w:val="fr-BE"/>
+        </w:rPr>
+        <w:t xml:space="preserve">: </w:t>
+      </w:r>
+      <w:hyperlink r:id="rId46" w:anchor="cite_note-6" w:history="1">
         <w:r>
           <w:rPr>
             <w:rStyle w:val="Hyperlink"/>
@@ -7753,7 +9360,7 @@
         <w:t>[</w:t>
       </w:r>
       <w:r>
-        <w:t>9</w:t>
+        <w:t>10</w:t>
       </w:r>
       <w:r>
         <w:t>]</w:t>
@@ -7763,7 +9370,7 @@
       <w:r>
         <w:t xml:space="preserve">‘Figure 4: Comparison of the soft shadow mapping problem to the...’, ResearchGate. Accessed: Aug. 15, 2025. [Online]. Available: </w:t>
       </w:r>
-      <w:hyperlink r:id="rId45" w:history="1">
+      <w:hyperlink r:id="rId47" w:history="1">
         <w:r>
           <w:rPr>
             <w:rStyle w:val="Hyperlink"/>
@@ -7789,12 +9396,18 @@
         <w:rPr>
           <w:lang w:val="it-IT"/>
         </w:rPr>
-        <w:t>10</w:t>
+        <w:t>1</w:t>
       </w:r>
       <w:r>
         <w:rPr>
           <w:lang w:val="it-IT"/>
         </w:rPr>
+        <w:t>1</w:t>
+      </w:r>
+      <w:r>
+        <w:rPr>
+          <w:lang w:val="it-IT"/>
+        </w:rPr>
         <w:t>]</w:t>
       </w:r>
     </w:p>
@@ -7803,7 +9416,35 @@
         <w:rPr>
           <w:lang w:val="it-IT"/>
         </w:rPr>
-        <w:t xml:space="preserve">‘Screen space ambient occlusion’, </w:t>
+        <w:t xml:space="preserve">‘Screen </w:t>
+      </w:r>
+      <w:proofErr w:type="spellStart"/>
+      <w:r>
+        <w:rPr>
+          <w:lang w:val="it-IT"/>
+        </w:rPr>
+        <w:t>space</w:t>
+      </w:r>
+      <w:proofErr w:type="spellEnd"/>
+      <w:r>
+        <w:rPr>
+          <w:lang w:val="it-IT"/>
+        </w:rPr>
+        <w:t xml:space="preserve"> ambient </w:t>
+      </w:r>
+      <w:proofErr w:type="spellStart"/>
+      <w:r>
+        <w:rPr>
+          <w:lang w:val="it-IT"/>
+        </w:rPr>
+        <w:t>occlusion</w:t>
+      </w:r>
+      <w:proofErr w:type="spellEnd"/>
+      <w:r>
+        <w:rPr>
+          <w:lang w:val="it-IT"/>
+        </w:rPr>
+        <w:t xml:space="preserve">’, </w:t>
       </w:r>
       <w:r>
         <w:rPr>
@@ -7822,7 +9463,7 @@
       <w:r>
         <w:t xml:space="preserve">Apr. 14, 2025. Accessed: Aug. 15, 2025. [Online]. Available: </w:t>
       </w:r>
-      <w:hyperlink r:id="rId46" w:history="1">
+      <w:hyperlink r:id="rId48" w:history="1">
         <w:r>
           <w:rPr>
             <w:rStyle w:val="Hyperlink"/>
@@ -7967,7 +9608,7 @@
         </w:rPr>
         <w:br/>
       </w:r>
-      <w:hyperlink r:id="rId47" w:history="1">
+      <w:hyperlink r:id="rId49" w:history="1">
         <w:r>
           <w:rPr>
             <w:rStyle w:val="Hyperlink"/>
@@ -7981,8 +9622,8 @@
     <w:p/>
     <w:p/>
     <w:sectPr>
-      <w:headerReference w:type="default" r:id="rId48"/>
-      <w:footerReference w:type="default" r:id="rId49"/>
+      <w:headerReference w:type="default" r:id="rId50"/>
+      <w:footerReference w:type="default" r:id="rId51"/>
       <w:pgSz w:w="12240" w:h="15840"/>
       <w:pgMar w:top="1440" w:right="1440" w:bottom="1440" w:left="1440" w:header="720" w:footer="720" w:gutter="0"/>
       <w:pgNumType w:start="0"/>
@@ -12392,6 +14033,7 @@
     <w:rsid w:val="00BF7836"/>
     <w:rsid w:val="00C6699E"/>
     <w:rsid w:val="00C857E2"/>
+    <w:rsid w:val="00D869C4"/>
     <w:rsid w:val="00E14E7D"/>
     <w:rsid w:val="00E842E1"/>
     <w:rsid w:val="00E86D88"/>
@@ -13127,34 +14769,10 @@
 </file>
 
 <file path=customXml/item1.xml><?xml version="1.0" encoding="utf-8"?>
-<?mso-contentType ?>
-<FormTemplates xmlns="http://schemas.microsoft.com/sharepoint/v3/contenttype/forms">
-  <Display>DocumentLibraryForm</Display>
-  <Edit>DocumentLibraryForm</Edit>
-  <New>DocumentLibraryForm</New>
-</FormTemplates>
+<b:Sources xmlns:b="http://schemas.openxmlformats.org/officeDocument/2006/bibliography" xmlns="http://schemas.openxmlformats.org/officeDocument/2006/bibliography" SelectedStyle="\APASixthEditionOfficeOnline.xsl" StyleName="APA" Version="6"/>
 </file>
 
 <file path=customXml/item2.xml><?xml version="1.0" encoding="utf-8"?>
-<b:Sources xmlns:b="http://schemas.openxmlformats.org/officeDocument/2006/bibliography" xmlns="http://schemas.openxmlformats.org/officeDocument/2006/bibliography" SelectedStyle="\APASixthEditionOfficeOnline.xsl" StyleName="APA" Version="6"/>
-</file>
-
-<file path=customXml/item3.xml><?xml version="1.0" encoding="utf-8"?>
-<p:properties xmlns:p="http://schemas.microsoft.com/office/2006/metadata/properties" xmlns:xsi="http://www.w3.org/2001/XMLSchema-instance" xmlns:pc="http://schemas.microsoft.com/office/infopath/2007/PartnerControls">
-  <documentManagement>
-    <IconOverlay xmlns="http://schemas.microsoft.com/sharepoint/v4" xsi:nil="true"/>
-    <TaxCatchAll xmlns="128482ec-0431-40d5-ab26-89ea2a4f3ccd" xsi:nil="true"/>
-    <m99485b88215436a82099f8287cba0b0 xmlns="128482ec-0431-40d5-ab26-89ea2a4f3ccd">
-      <Terms xmlns="http://schemas.microsoft.com/office/infopath/2007/PartnerControls"/>
-    </m99485b88215436a82099f8287cba0b0>
-    <lcf76f155ced4ddcb4097134ff3c332f xmlns="60eb0cf4-ae2a-4762-800a-cb593b869ecb">
-      <Terms xmlns="http://schemas.microsoft.com/office/infopath/2007/PartnerControls"/>
-    </lcf76f155ced4ddcb4097134ff3c332f>
-  </documentManagement>
-</p:properties>
-</file>
-
-<file path=customXml/item4.xml><?xml version="1.0" encoding="utf-8"?>
 <ct:contentTypeSchema xmlns:ct="http://schemas.microsoft.com/office/2006/metadata/contentType" xmlns:ma="http://schemas.microsoft.com/office/2006/metadata/properties/metaAttributes" ct:_="" ma:_="" ma:contentTypeName="Document" ma:contentTypeID="0x010100723942CCEB3A674D8F1F6472CCEFB38E" ma:contentTypeVersion="11" ma:contentTypeDescription="Create a new document." ma:contentTypeScope="" ma:versionID="e4de40d148e029d40e3aaddc8bf68a5e">
   <xsd:schema xmlns:xsd="http://www.w3.org/2001/XMLSchema" xmlns:xs="http://www.w3.org/2001/XMLSchema" xmlns:p="http://schemas.microsoft.com/office/2006/metadata/properties" xmlns:ns2="128482ec-0431-40d5-ab26-89ea2a4f3ccd" xmlns:ns3="60eb0cf4-ae2a-4762-800a-cb593b869ecb" xmlns:ns4="http://schemas.microsoft.com/sharepoint/v4" xmlns:ns5="a2e691a9-fcfc-4d85-a390-1894fe98bd9e" targetNamespace="http://schemas.microsoft.com/office/2006/metadata/properties" ma:root="true" ma:fieldsID="fce8e8bd091658f3fe51b22d57dec109" ns2:_="" ns3:_="" ns4:_="" ns5:_="">
     <xsd:import namespace="128482ec-0431-40d5-ab26-89ea2a4f3ccd"/>
@@ -13427,15 +15045,31 @@
 </ct:contentTypeSchema>
 </file>
 
-<file path=customXml/itemProps1.xml><?xml version="1.0" encoding="utf-8"?>
-<ds:datastoreItem xmlns:ds="http://schemas.openxmlformats.org/officeDocument/2006/customXml" ds:itemID="{5EBBBFF2-2B1E-4E2A-81ED-02FB13488392}">
-  <ds:schemaRefs>
-    <ds:schemaRef ds:uri="http://schemas.microsoft.com/sharepoint/v3/contenttype/forms"/>
-  </ds:schemaRefs>
-</ds:datastoreItem>
+<file path=customXml/item3.xml><?xml version="1.0" encoding="utf-8"?>
+<p:properties xmlns:p="http://schemas.microsoft.com/office/2006/metadata/properties" xmlns:xsi="http://www.w3.org/2001/XMLSchema-instance" xmlns:pc="http://schemas.microsoft.com/office/infopath/2007/PartnerControls">
+  <documentManagement>
+    <IconOverlay xmlns="http://schemas.microsoft.com/sharepoint/v4" xsi:nil="true"/>
+    <TaxCatchAll xmlns="128482ec-0431-40d5-ab26-89ea2a4f3ccd" xsi:nil="true"/>
+    <m99485b88215436a82099f8287cba0b0 xmlns="128482ec-0431-40d5-ab26-89ea2a4f3ccd">
+      <Terms xmlns="http://schemas.microsoft.com/office/infopath/2007/PartnerControls"/>
+    </m99485b88215436a82099f8287cba0b0>
+    <lcf76f155ced4ddcb4097134ff3c332f xmlns="60eb0cf4-ae2a-4762-800a-cb593b869ecb">
+      <Terms xmlns="http://schemas.microsoft.com/office/infopath/2007/PartnerControls"/>
+    </lcf76f155ced4ddcb4097134ff3c332f>
+  </documentManagement>
+</p:properties>
 </file>
 
-<file path=customXml/itemProps2.xml><?xml version="1.0" encoding="utf-8"?>
+<file path=customXml/item4.xml><?xml version="1.0" encoding="utf-8"?>
+<?mso-contentType ?>
+<FormTemplates xmlns="http://schemas.microsoft.com/sharepoint/v3/contenttype/forms">
+  <Display>DocumentLibraryForm</Display>
+  <Edit>DocumentLibraryForm</Edit>
+  <New>DocumentLibraryForm</New>
+</FormTemplates>
+</file>
+
+<file path=customXml/itemProps1.xml><?xml version="1.0" encoding="utf-8"?>
 <ds:datastoreItem xmlns:ds="http://schemas.openxmlformats.org/officeDocument/2006/customXml" ds:itemID="{9FB24B6F-1995-495D-B4E9-64B4DC9866CE}">
   <ds:schemaRefs>
     <ds:schemaRef ds:uri="http://schemas.openxmlformats.org/officeDocument/2006/bibliography"/>
@@ -13443,19 +15077,7 @@
 </ds:datastoreItem>
 </file>
 
-<file path=customXml/itemProps3.xml><?xml version="1.0" encoding="utf-8"?>
-<ds:datastoreItem xmlns:ds="http://schemas.openxmlformats.org/officeDocument/2006/customXml" ds:itemID="{0744C301-BA8E-4358-811D-299431B59409}">
-  <ds:schemaRefs>
-    <ds:schemaRef ds:uri="http://schemas.microsoft.com/office/2006/metadata/properties"/>
-    <ds:schemaRef ds:uri="http://schemas.microsoft.com/office/infopath/2007/PartnerControls"/>
-    <ds:schemaRef ds:uri="http://schemas.microsoft.com/sharepoint/v4"/>
-    <ds:schemaRef ds:uri="128482ec-0431-40d5-ab26-89ea2a4f3ccd"/>
-    <ds:schemaRef ds:uri="60eb0cf4-ae2a-4762-800a-cb593b869ecb"/>
-  </ds:schemaRefs>
-</ds:datastoreItem>
-</file>
-
-<file path=customXml/itemProps4.xml><?xml version="1.0" encoding="utf-8"?>
+<file path=customXml/itemProps2.xml><?xml version="1.0" encoding="utf-8"?>
 <ds:datastoreItem xmlns:ds="http://schemas.openxmlformats.org/officeDocument/2006/customXml" ds:itemID="{6AD6E667-9FE3-44F6-AA83-894C6D5E44A5}">
   <ds:schemaRefs>
     <ds:schemaRef ds:uri="http://schemas.microsoft.com/office/2006/metadata/contentType"/>
@@ -13474,4 +15096,24 @@
     <ds:schemaRef ds:uri="http://schemas.microsoft.com/internal/obd"/>
   </ds:schemaRefs>
 </ds:datastoreItem>
+</file>
+
+<file path=customXml/itemProps3.xml><?xml version="1.0" encoding="utf-8"?>
+<ds:datastoreItem xmlns:ds="http://schemas.openxmlformats.org/officeDocument/2006/customXml" ds:itemID="{0744C301-BA8E-4358-811D-299431B59409}">
+  <ds:schemaRefs>
+    <ds:schemaRef ds:uri="http://schemas.microsoft.com/office/2006/metadata/properties"/>
+    <ds:schemaRef ds:uri="http://schemas.microsoft.com/office/infopath/2007/PartnerControls"/>
+    <ds:schemaRef ds:uri="http://schemas.microsoft.com/sharepoint/v4"/>
+    <ds:schemaRef ds:uri="128482ec-0431-40d5-ab26-89ea2a4f3ccd"/>
+    <ds:schemaRef ds:uri="60eb0cf4-ae2a-4762-800a-cb593b869ecb"/>
+  </ds:schemaRefs>
+</ds:datastoreItem>
+</file>
+
+<file path=customXml/itemProps4.xml><?xml version="1.0" encoding="utf-8"?>
+<ds:datastoreItem xmlns:ds="http://schemas.openxmlformats.org/officeDocument/2006/customXml" ds:itemID="{5EBBBFF2-2B1E-4E2A-81ED-02FB13488392}">
+  <ds:schemaRefs>
+    <ds:schemaRef ds:uri="http://schemas.microsoft.com/sharepoint/v3/contenttype/forms"/>
+  </ds:schemaRefs>
+</ds:datastoreItem>
 </file>
</xml_diff>

<commit_message>
Added "future work" section
</commit_message>
<xml_diff>
--- a/Paper/GW2425_Demaecker_Daan_NL_Paper.docx
+++ b/Paper/GW2425_Demaecker_Daan_NL_Paper.docx
@@ -4403,10 +4403,7 @@
     </w:p>
     <w:p>
       <w:r>
-        <w:t xml:space="preserve">Now that we are familiar with the necessary Vulkan terms, I will provide a more detailed explanation </w:t>
-      </w:r>
-      <w:r>
-        <w:t>of the rendering pipeline we will be using.</w:t>
+        <w:t>Now that we are familiar with the necessary Vulkan terms, I will provide a more detailed explanation of the rendering pipeline we will be using.</w:t>
       </w:r>
     </w:p>
     <w:p>
@@ -4590,18 +4587,86 @@
     </w:p>
     <w:p>
       <w:r>
+        <w:t xml:space="preserve"> </w:t>
+      </w:r>
+      <w:r>
+        <w:t>In rasterization, there are 2 types of rendering, forward and deferred.</w:t>
+      </w:r>
+    </w:p>
+    <w:p>
+      <w:r>
         <w:rPr>
           <w:noProof/>
         </w:rPr>
         <w:lastRenderedPageBreak/>
         <w:drawing>
-          <wp:anchor distT="0" distB="0" distL="114300" distR="114300" simplePos="0" relativeHeight="251671552" behindDoc="0" locked="0" layoutInCell="1" allowOverlap="1" wp14:anchorId="77586F00" wp14:editId="51B8FDAB">
+          <wp:anchor distT="0" distB="0" distL="114300" distR="114300" simplePos="0" relativeHeight="251697152" behindDoc="0" locked="0" layoutInCell="1" allowOverlap="1" wp14:anchorId="51901B0D" wp14:editId="0AD05360">
+            <wp:simplePos x="0" y="0"/>
+            <wp:positionH relativeFrom="margin">
+              <wp:posOffset>2804160</wp:posOffset>
+            </wp:positionH>
+            <wp:positionV relativeFrom="paragraph">
+              <wp:posOffset>2531745</wp:posOffset>
+            </wp:positionV>
+            <wp:extent cx="2781300" cy="2091690"/>
+            <wp:effectExtent l="0" t="0" r="0" b="3810"/>
+            <wp:wrapTopAndBottom/>
+            <wp:docPr id="35" name="Picture 35" descr="A collage of images of different types of objects&#10;&#10;Description automatically generated"/>
+            <wp:cNvGraphicFramePr>
+              <a:graphicFrameLocks xmlns:a="http://schemas.openxmlformats.org/drawingml/2006/main" noChangeAspect="1"/>
+            </wp:cNvGraphicFramePr>
+            <a:graphic xmlns:a="http://schemas.openxmlformats.org/drawingml/2006/main">
+              <a:graphicData uri="http://schemas.openxmlformats.org/drawingml/2006/picture">
+                <pic:pic xmlns:pic="http://schemas.openxmlformats.org/drawingml/2006/picture">
+                  <pic:nvPicPr>
+                    <pic:cNvPr id="35" name="Picture 35" descr="A collage of images of different types of objects&#10;&#10;Description automatically generated"/>
+                    <pic:cNvPicPr/>
+                  </pic:nvPicPr>
+                  <pic:blipFill>
+                    <a:blip r:embed="rId15" cstate="print">
+                      <a:extLst>
+                        <a:ext uri="{28A0092B-C50C-407E-A947-70E740481C1C}">
+                          <a14:useLocalDpi xmlns:a14="http://schemas.microsoft.com/office/drawing/2010/main" val="0"/>
+                        </a:ext>
+                      </a:extLst>
+                    </a:blip>
+                    <a:stretch>
+                      <a:fillRect/>
+                    </a:stretch>
+                  </pic:blipFill>
+                  <pic:spPr>
+                    <a:xfrm>
+                      <a:off x="0" y="0"/>
+                      <a:ext cx="2781300" cy="2091690"/>
+                    </a:xfrm>
+                    <a:prstGeom prst="rect">
+                      <a:avLst/>
+                    </a:prstGeom>
+                  </pic:spPr>
+                </pic:pic>
+              </a:graphicData>
+            </a:graphic>
+            <wp14:sizeRelH relativeFrom="margin">
+              <wp14:pctWidth>0</wp14:pctWidth>
+            </wp14:sizeRelH>
+            <wp14:sizeRelV relativeFrom="margin">
+              <wp14:pctHeight>0</wp14:pctHeight>
+            </wp14:sizeRelV>
+          </wp:anchor>
+        </w:drawing>
+      </w:r>
+      <w:r>
+        <w:rPr>
+          <w:noProof/>
+        </w:rPr>
+        <w:drawing>
+          <wp:anchor distT="0" distB="0" distL="114300" distR="114300" simplePos="0" relativeHeight="251671552" behindDoc="0" locked="0" layoutInCell="1" allowOverlap="1" wp14:anchorId="77586F00" wp14:editId="7B50248E">
             <wp:simplePos x="0" y="0"/>
             <wp:positionH relativeFrom="margin">
               <wp:align>left</wp:align>
             </wp:positionH>
             <wp:positionV relativeFrom="paragraph">
-              <wp:posOffset>3188970</wp:posOffset>
+              <wp:posOffset>2566035</wp:posOffset>
             </wp:positionV>
             <wp:extent cx="2743835" cy="2057400"/>
             <wp:effectExtent l="0" t="0" r="0" b="0"/>
@@ -4620,7 +4685,7 @@
                     </pic:cNvPicPr>
                   </pic:nvPicPr>
                   <pic:blipFill>
-                    <a:blip r:embed="rId15" cstate="print">
+                    <a:blip r:embed="rId16" cstate="print">
                       <a:extLst>
                         <a:ext uri="{28A0092B-C50C-407E-A947-70E740481C1C}">
                           <a14:useLocalDpi xmlns:a14="http://schemas.microsoft.com/office/drawing/2010/main" val="0"/>
@@ -4658,79 +4723,10 @@
         </w:drawing>
       </w:r>
       <w:r>
-        <w:rPr>
-          <w:noProof/>
-        </w:rPr>
-        <w:drawing>
-          <wp:anchor distT="0" distB="0" distL="114300" distR="114300" simplePos="0" relativeHeight="251697152" behindDoc="0" locked="0" layoutInCell="1" allowOverlap="1" wp14:anchorId="51901B0D" wp14:editId="60D494BB">
-            <wp:simplePos x="0" y="0"/>
-            <wp:positionH relativeFrom="margin">
-              <wp:posOffset>2827020</wp:posOffset>
-            </wp:positionH>
-            <wp:positionV relativeFrom="paragraph">
-              <wp:posOffset>3173730</wp:posOffset>
-            </wp:positionV>
-            <wp:extent cx="2781300" cy="2091690"/>
-            <wp:effectExtent l="0" t="0" r="0" b="3810"/>
-            <wp:wrapTopAndBottom/>
-            <wp:docPr id="35" name="Picture 35" descr="A collage of images of different types of objects&#10;&#10;Description automatically generated"/>
-            <wp:cNvGraphicFramePr>
-              <a:graphicFrameLocks xmlns:a="http://schemas.openxmlformats.org/drawingml/2006/main" noChangeAspect="1"/>
-            </wp:cNvGraphicFramePr>
-            <a:graphic xmlns:a="http://schemas.openxmlformats.org/drawingml/2006/main">
-              <a:graphicData uri="http://schemas.openxmlformats.org/drawingml/2006/picture">
-                <pic:pic xmlns:pic="http://schemas.openxmlformats.org/drawingml/2006/picture">
-                  <pic:nvPicPr>
-                    <pic:cNvPr id="35" name="Picture 35" descr="A collage of images of different types of objects&#10;&#10;Description automatically generated"/>
-                    <pic:cNvPicPr/>
-                  </pic:nvPicPr>
-                  <pic:blipFill>
-                    <a:blip r:embed="rId16" cstate="print">
-                      <a:extLst>
-                        <a:ext uri="{28A0092B-C50C-407E-A947-70E740481C1C}">
-                          <a14:useLocalDpi xmlns:a14="http://schemas.microsoft.com/office/drawing/2010/main" val="0"/>
-                        </a:ext>
-                      </a:extLst>
-                    </a:blip>
-                    <a:stretch>
-                      <a:fillRect/>
-                    </a:stretch>
-                  </pic:blipFill>
-                  <pic:spPr>
-                    <a:xfrm>
-                      <a:off x="0" y="0"/>
-                      <a:ext cx="2781300" cy="2091690"/>
-                    </a:xfrm>
-                    <a:prstGeom prst="rect">
-                      <a:avLst/>
-                    </a:prstGeom>
-                  </pic:spPr>
-                </pic:pic>
-              </a:graphicData>
-            </a:graphic>
-            <wp14:sizeRelH relativeFrom="margin">
-              <wp14:pctWidth>0</wp14:pctWidth>
-            </wp14:sizeRelH>
-            <wp14:sizeRelV relativeFrom="margin">
-              <wp14:pctHeight>0</wp14:pctHeight>
-            </wp14:sizeRelV>
-          </wp:anchor>
-        </w:drawing>
+        <w:t>In forward rendering, each model is rendered one by one, and the lighting is calculated for each pixel.</w:t>
       </w:r>
       <w:r>
         <w:t xml:space="preserve"> </w:t>
-      </w:r>
-      <w:r>
-        <w:t>[1]</w:t>
-      </w:r>
-      <w:r>
-        <w:t>.</w:t>
-      </w:r>
-      <w:r>
-        <w:t xml:space="preserve"> In rasterization, there are 2 types of rendering, forward and deferred. In forward rendering, each model is rendered one by one, and the lighting is calculated for each pixel.</w:t>
-      </w:r>
-      <w:r>
-        <w:br/>
       </w:r>
       <w:r>
         <w:t>This is very straightforward, but it brings up one big issue. Calculating lighting is not a cheap operation, and sometimes, a pixel is rendered, the lighting for it is calculated, only for another pixel to be rendered on top of it, and the lighting calculations have to be done all over again. This is a big waste of resources.</w:t>
@@ -7407,59 +7403,35 @@
     </w:p>
     <w:p/>
     <w:p>
-      <w:pPr>
-        <w:rPr>
-          <w:rStyle w:val="SubtleEmphasis"/>
-          <w:b/>
-          <w:color w:val="auto"/>
-        </w:rPr>
-      </w:pPr>
-      <w:r>
-        <w:rPr>
-          <w:rStyle w:val="SubtleEmphasis"/>
-          <w:b/>
-          <w:color w:val="auto"/>
-          <w:highlight w:val="yellow"/>
-        </w:rPr>
-        <w:t>T</w:t>
-      </w:r>
-      <w:r>
-        <w:rPr>
-          <w:rStyle w:val="SubtleEmphasis"/>
-          <w:b/>
-          <w:color w:val="auto"/>
-          <w:highlight w:val="yellow"/>
-        </w:rPr>
-        <w:t>his section</w:t>
-      </w:r>
-      <w:r>
-        <w:rPr>
-          <w:rStyle w:val="SubtleEmphasis"/>
-          <w:b/>
-          <w:color w:val="auto"/>
-          <w:highlight w:val="yellow"/>
-        </w:rPr>
-        <w:t xml:space="preserve"> is sometimes standalone, sometimes incorporated in the conclusion. It looks at the shortcomings of the study, alternative strategies, and what could be the next course of action in the research field. </w:t>
-      </w:r>
-      <w:r>
-        <w:rPr>
-          <w:rStyle w:val="SubtleEmphasis"/>
-          <w:b/>
-          <w:color w:val="auto"/>
-          <w:highlight w:val="yellow"/>
-        </w:rPr>
-        <w:t>This is typically not a very long section</w:t>
-      </w:r>
-      <w:r>
-        <w:rPr>
-          <w:rStyle w:val="SubtleEmphasis"/>
-          <w:b/>
-          <w:color w:val="auto"/>
-        </w:rPr>
-        <w:t>.</w:t>
-      </w:r>
-    </w:p>
-    <w:p/>
+      <w:r>
+        <w:t>Programming ambient occlusion can be done in many different ways, even if you try to accomplish the same thing, different people will have different ways to get there. Because of this, there is no one true way of programming something and the tiniest difference can have an impact on performance. This means that my code is most likely not as optimized as it can be and this will have an impact on the results of the experiment.</w:t>
+      </w:r>
+    </w:p>
+    <w:p>
+      <w:r>
+        <w:t>A lot can still be done in terms of ambient occlusion, there are still many types out there I haven’t touched on yet, like:</w:t>
+      </w:r>
+    </w:p>
+    <w:p>
+      <w:r>
+        <w:t>-HBAO+: An advanced version of HBAO proposed by NVIDIA</w:t>
+      </w:r>
+    </w:p>
+    <w:p>
+      <w:r>
+        <w:t>-RTAO: Ambient occlusion that uses ray tracing</w:t>
+      </w:r>
+    </w:p>
+    <w:p>
+      <w:r>
+        <w:t>-SSDO: An advanced version of SSAO</w:t>
+      </w:r>
+    </w:p>
+    <w:p>
+      <w:r>
+        <w:t>-SEAO: A unique take on ambient occlusion from the book GPU Gems 2</w:t>
+      </w:r>
+    </w:p>
     <w:p/>
     <w:p>
       <w:pPr>
@@ -9053,13 +9025,7 @@
         <w:jc w:val="right"/>
       </w:pPr>
       <w:r>
-        <w:t>[</w:t>
-      </w:r>
-      <w:r>
-        <w:t>5</w:t>
-      </w:r>
-      <w:r>
-        <w:t>]</w:t>
+        <w:t>[5]</w:t>
       </w:r>
     </w:p>
     <w:p>
@@ -9108,10 +9074,7 @@
     <w:p>
       <w:pPr>
         <w:rPr>
-          <w:rStyle w:val="SubtleEmphasis"/>
-          <w:i w:val="0"/>
-          <w:iCs w:val="0"/>
-          <w:color w:val="auto"/>
+          <w:rStyle w:val="Hyperlink"/>
           <w:lang w:val="fr-BE"/>
         </w:rPr>
       </w:pPr>
@@ -9152,7 +9115,21 @@
             <w:rStyle w:val="Hyperlink"/>
             <w:lang w:val="fr-BE"/>
           </w:rPr>
-          <w:t>https://learnopengl.com/Advanced-Lighting/Deferred-Shading</w:t>
+          <w:t>https://learnopengl.com/Advanced-Lighting</w:t>
+        </w:r>
+        <w:r>
+          <w:rPr>
+            <w:rStyle w:val="Hyperlink"/>
+            <w:lang w:val="fr-BE"/>
+          </w:rPr>
+          <w:t>/</w:t>
+        </w:r>
+        <w:r>
+          <w:rPr>
+            <w:rStyle w:val="Hyperlink"/>
+            <w:lang w:val="fr-BE"/>
+          </w:rPr>
+          <w:t>Deferred-Shading</w:t>
         </w:r>
       </w:hyperlink>
     </w:p>
@@ -9165,6 +9142,51 @@
       </w:r>
       <w:r>
         <w:t>7</w:t>
+      </w:r>
+      <w:r>
+        <w:t>]</w:t>
+      </w:r>
+    </w:p>
+    <w:p>
+      <w:r>
+        <w:t xml:space="preserve">D. </w:t>
+      </w:r>
+      <w:proofErr w:type="spellStart"/>
+      <w:r>
+        <w:t>Lettier</w:t>
+      </w:r>
+      <w:proofErr w:type="spellEnd"/>
+      <w:r>
+        <w:t xml:space="preserve">, ‘Deferred Rendering | 3D Game Shaders For Beginners’. Accessed: Aug. 17, 2025. [Online]. Available: </w:t>
+      </w:r>
+      <w:hyperlink r:id="rId45" w:history="1">
+        <w:r>
+          <w:rPr>
+            <w:rStyle w:val="Hyperlink"/>
+          </w:rPr>
+          <w:t>https://lettier.github.io/3d-game-shaders-for-beginners/deferred-rendering.html</w:t>
+        </w:r>
+      </w:hyperlink>
+    </w:p>
+    <w:p>
+      <w:pPr>
+        <w:rPr>
+          <w:rStyle w:val="SubtleEmphasis"/>
+          <w:i w:val="0"/>
+          <w:iCs w:val="0"/>
+          <w:color w:val="auto"/>
+        </w:rPr>
+      </w:pPr>
+    </w:p>
+    <w:p>
+      <w:pPr>
+        <w:jc w:val="right"/>
+      </w:pPr>
+      <w:r>
+        <w:t>[</w:t>
+      </w:r>
+      <w:r>
+        <w:t>8</w:t>
       </w:r>
       <w:r>
         <w:t>]</w:t>
@@ -9213,7 +9235,7 @@
         </w:rPr>
         <w:t xml:space="preserve">: </w:t>
       </w:r>
-      <w:hyperlink r:id="rId45" w:history="1">
+      <w:hyperlink r:id="rId46" w:history="1">
         <w:r>
           <w:rPr>
             <w:rStyle w:val="Hyperlink"/>
@@ -9240,7 +9262,7 @@
         <w:rPr>
           <w:lang w:val="fr-BE"/>
         </w:rPr>
-        <w:t>8</w:t>
+        <w:t>9</w:t>
       </w:r>
       <w:r>
         <w:rPr>
@@ -9259,7 +9281,6 @@
         <w:rPr>
           <w:lang w:val="fr-BE"/>
         </w:rPr>
-        <w:lastRenderedPageBreak/>
         <w:t xml:space="preserve">[Online]. </w:t>
       </w:r>
       <w:proofErr w:type="spellStart"/>
@@ -9300,7 +9321,7 @@
         <w:rPr>
           <w:lang w:val="en-GB"/>
         </w:rPr>
-        <w:t>9</w:t>
+        <w:t>10</w:t>
       </w:r>
       <w:r>
         <w:rPr>
@@ -9342,7 +9363,7 @@
         </w:rPr>
         <w:t xml:space="preserve">: </w:t>
       </w:r>
-      <w:hyperlink r:id="rId46" w:anchor="cite_note-6" w:history="1">
+      <w:hyperlink r:id="rId47" w:anchor="cite_note-6" w:history="1">
         <w:r>
           <w:rPr>
             <w:rStyle w:val="Hyperlink"/>
@@ -9360,7 +9381,10 @@
         <w:t>[</w:t>
       </w:r>
       <w:r>
-        <w:t>10</w:t>
+        <w:t>1</w:t>
+      </w:r>
+      <w:r>
+        <w:t>1</w:t>
       </w:r>
       <w:r>
         <w:t>]</w:t>
@@ -9370,7 +9394,7 @@
       <w:r>
         <w:t xml:space="preserve">‘Figure 4: Comparison of the soft shadow mapping problem to the...’, ResearchGate. Accessed: Aug. 15, 2025. [Online]. Available: </w:t>
       </w:r>
-      <w:hyperlink r:id="rId47" w:history="1">
+      <w:hyperlink r:id="rId48" w:history="1">
         <w:r>
           <w:rPr>
             <w:rStyle w:val="Hyperlink"/>
@@ -9402,7 +9426,7 @@
         <w:rPr>
           <w:lang w:val="it-IT"/>
         </w:rPr>
-        <w:t>1</w:t>
+        <w:t>2</w:t>
       </w:r>
       <w:r>
         <w:rPr>
@@ -9463,7 +9487,7 @@
       <w:r>
         <w:t xml:space="preserve">Apr. 14, 2025. Accessed: Aug. 15, 2025. [Online]. Available: </w:t>
       </w:r>
-      <w:hyperlink r:id="rId48" w:history="1">
+      <w:hyperlink r:id="rId49" w:history="1">
         <w:r>
           <w:rPr>
             <w:rStyle w:val="Hyperlink"/>
@@ -9564,6 +9588,9 @@
         </w:rPr>
       </w:pPr>
       <w:r>
+        <w:t>I would like to thank my friend Matthias Ooms for proofreading my paper.</w:t>
+      </w:r>
+      <w:r>
         <w:br w:type="page"/>
       </w:r>
     </w:p>
@@ -9608,7 +9635,7 @@
         </w:rPr>
         <w:br/>
       </w:r>
-      <w:hyperlink r:id="rId49" w:history="1">
+      <w:hyperlink r:id="rId50" w:history="1">
         <w:r>
           <w:rPr>
             <w:rStyle w:val="Hyperlink"/>
@@ -9622,8 +9649,8 @@
     <w:p/>
     <w:p/>
     <w:sectPr>
-      <w:headerReference w:type="default" r:id="rId50"/>
-      <w:footerReference w:type="default" r:id="rId51"/>
+      <w:headerReference w:type="default" r:id="rId51"/>
+      <w:footerReference w:type="default" r:id="rId52"/>
       <w:pgSz w:w="12240" w:h="15840"/>
       <w:pgMar w:top="1440" w:right="1440" w:bottom="1440" w:left="1440" w:header="720" w:footer="720" w:gutter="0"/>
       <w:pgNumType w:start="0"/>
@@ -14034,6 +14061,7 @@
     <w:rsid w:val="00C6699E"/>
     <w:rsid w:val="00C857E2"/>
     <w:rsid w:val="00D869C4"/>
+    <w:rsid w:val="00E019B4"/>
     <w:rsid w:val="00E14E7D"/>
     <w:rsid w:val="00E842E1"/>
     <w:rsid w:val="00E86D88"/>
@@ -14769,10 +14797,6 @@
 </file>
 
 <file path=customXml/item1.xml><?xml version="1.0" encoding="utf-8"?>
-<b:Sources xmlns:b="http://schemas.openxmlformats.org/officeDocument/2006/bibliography" xmlns="http://schemas.openxmlformats.org/officeDocument/2006/bibliography" SelectedStyle="\APASixthEditionOfficeOnline.xsl" StyleName="APA" Version="6"/>
-</file>
-
-<file path=customXml/item2.xml><?xml version="1.0" encoding="utf-8"?>
 <ct:contentTypeSchema xmlns:ct="http://schemas.microsoft.com/office/2006/metadata/contentType" xmlns:ma="http://schemas.microsoft.com/office/2006/metadata/properties/metaAttributes" ct:_="" ma:_="" ma:contentTypeName="Document" ma:contentTypeID="0x010100723942CCEB3A674D8F1F6472CCEFB38E" ma:contentTypeVersion="11" ma:contentTypeDescription="Create a new document." ma:contentTypeScope="" ma:versionID="e4de40d148e029d40e3aaddc8bf68a5e">
   <xsd:schema xmlns:xsd="http://www.w3.org/2001/XMLSchema" xmlns:xs="http://www.w3.org/2001/XMLSchema" xmlns:p="http://schemas.microsoft.com/office/2006/metadata/properties" xmlns:ns2="128482ec-0431-40d5-ab26-89ea2a4f3ccd" xmlns:ns3="60eb0cf4-ae2a-4762-800a-cb593b869ecb" xmlns:ns4="http://schemas.microsoft.com/sharepoint/v4" xmlns:ns5="a2e691a9-fcfc-4d85-a390-1894fe98bd9e" targetNamespace="http://schemas.microsoft.com/office/2006/metadata/properties" ma:root="true" ma:fieldsID="fce8e8bd091658f3fe51b22d57dec109" ns2:_="" ns3:_="" ns4:_="" ns5:_="">
     <xsd:import namespace="128482ec-0431-40d5-ab26-89ea2a4f3ccd"/>
@@ -15045,6 +15069,15 @@
 </ct:contentTypeSchema>
 </file>
 
+<file path=customXml/item2.xml><?xml version="1.0" encoding="utf-8"?>
+<?mso-contentType ?>
+<FormTemplates xmlns="http://schemas.microsoft.com/sharepoint/v3/contenttype/forms">
+  <Display>DocumentLibraryForm</Display>
+  <Edit>DocumentLibraryForm</Edit>
+  <New>DocumentLibraryForm</New>
+</FormTemplates>
+</file>
+
 <file path=customXml/item3.xml><?xml version="1.0" encoding="utf-8"?>
 <p:properties xmlns:p="http://schemas.microsoft.com/office/2006/metadata/properties" xmlns:xsi="http://www.w3.org/2001/XMLSchema-instance" xmlns:pc="http://schemas.microsoft.com/office/infopath/2007/PartnerControls">
   <documentManagement>
@@ -15061,23 +15094,10 @@
 </file>
 
 <file path=customXml/item4.xml><?xml version="1.0" encoding="utf-8"?>
-<?mso-contentType ?>
-<FormTemplates xmlns="http://schemas.microsoft.com/sharepoint/v3/contenttype/forms">
-  <Display>DocumentLibraryForm</Display>
-  <Edit>DocumentLibraryForm</Edit>
-  <New>DocumentLibraryForm</New>
-</FormTemplates>
+<b:Sources xmlns:b="http://schemas.openxmlformats.org/officeDocument/2006/bibliography" xmlns="http://schemas.openxmlformats.org/officeDocument/2006/bibliography" SelectedStyle="\APASixthEditionOfficeOnline.xsl" StyleName="APA" Version="6"/>
 </file>
 
 <file path=customXml/itemProps1.xml><?xml version="1.0" encoding="utf-8"?>
-<ds:datastoreItem xmlns:ds="http://schemas.openxmlformats.org/officeDocument/2006/customXml" ds:itemID="{9FB24B6F-1995-495D-B4E9-64B4DC9866CE}">
-  <ds:schemaRefs>
-    <ds:schemaRef ds:uri="http://schemas.openxmlformats.org/officeDocument/2006/bibliography"/>
-  </ds:schemaRefs>
-</ds:datastoreItem>
-</file>
-
-<file path=customXml/itemProps2.xml><?xml version="1.0" encoding="utf-8"?>
 <ds:datastoreItem xmlns:ds="http://schemas.openxmlformats.org/officeDocument/2006/customXml" ds:itemID="{6AD6E667-9FE3-44F6-AA83-894C6D5E44A5}">
   <ds:schemaRefs>
     <ds:schemaRef ds:uri="http://schemas.microsoft.com/office/2006/metadata/contentType"/>
@@ -15098,6 +15118,14 @@
 </ds:datastoreItem>
 </file>
 
+<file path=customXml/itemProps2.xml><?xml version="1.0" encoding="utf-8"?>
+<ds:datastoreItem xmlns:ds="http://schemas.openxmlformats.org/officeDocument/2006/customXml" ds:itemID="{5EBBBFF2-2B1E-4E2A-81ED-02FB13488392}">
+  <ds:schemaRefs>
+    <ds:schemaRef ds:uri="http://schemas.microsoft.com/sharepoint/v3/contenttype/forms"/>
+  </ds:schemaRefs>
+</ds:datastoreItem>
+</file>
+
 <file path=customXml/itemProps3.xml><?xml version="1.0" encoding="utf-8"?>
 <ds:datastoreItem xmlns:ds="http://schemas.openxmlformats.org/officeDocument/2006/customXml" ds:itemID="{0744C301-BA8E-4358-811D-299431B59409}">
   <ds:schemaRefs>
@@ -15111,9 +15139,9 @@
 </file>
 
 <file path=customXml/itemProps4.xml><?xml version="1.0" encoding="utf-8"?>
-<ds:datastoreItem xmlns:ds="http://schemas.openxmlformats.org/officeDocument/2006/customXml" ds:itemID="{5EBBBFF2-2B1E-4E2A-81ED-02FB13488392}">
+<ds:datastoreItem xmlns:ds="http://schemas.openxmlformats.org/officeDocument/2006/customXml" ds:itemID="{9FB24B6F-1995-495D-B4E9-64B4DC9866CE}">
   <ds:schemaRefs>
-    <ds:schemaRef ds:uri="http://schemas.microsoft.com/sharepoint/v3/contenttype/forms"/>
+    <ds:schemaRef ds:uri="http://schemas.openxmlformats.org/officeDocument/2006/bibliography"/>
   </ds:schemaRefs>
 </ds:datastoreItem>
 </file>
</xml_diff>

<commit_message>
Added depth prepass subsection
</commit_message>
<xml_diff>
--- a/Paper/GW2425_Demaecker_Daan_NL_Paper.docx
+++ b/Paper/GW2425_Demaecker_Daan_NL_Paper.docx
@@ -166,13 +166,8 @@
       <w:r>
         <w:t xml:space="preserve">Supervisor: </w:t>
       </w:r>
-      <w:proofErr w:type="spellStart"/>
-      <w:r>
-        <w:t>Deweppe</w:t>
-      </w:r>
-      <w:proofErr w:type="spellEnd"/>
-      <w:r>
-        <w:t xml:space="preserve"> Alexander</w:t>
+      <w:r>
+        <w:t>Deweppe Alexander</w:t>
       </w:r>
     </w:p>
     <w:p>
@@ -182,13 +177,8 @@
       <w:r>
         <w:t xml:space="preserve">Coach: </w:t>
       </w:r>
-      <w:proofErr w:type="spellStart"/>
-      <w:r>
-        <w:t>Verspecht</w:t>
-      </w:r>
-      <w:proofErr w:type="spellEnd"/>
-      <w:r>
-        <w:t xml:space="preserve"> Marijn</w:t>
+      <w:r>
+        <w:t>Verspecht Marijn</w:t>
       </w:r>
     </w:p>
     <w:p>
@@ -3251,127 +3241,35 @@
           <w:lang w:val="nl-BE"/>
         </w:rPr>
       </w:pPr>
-      <w:proofErr w:type="spellStart"/>
       <w:r>
         <w:rPr>
           <w:lang w:val="nl-BE"/>
         </w:rPr>
-        <w:t>Ambient</w:t>
-      </w:r>
-      <w:proofErr w:type="spellEnd"/>
+        <w:t>Ambient occlusion is een globale verlichti</w:t>
+      </w:r>
       <w:r>
         <w:rPr>
           <w:lang w:val="nl-BE"/>
         </w:rPr>
-        <w:t xml:space="preserve"> </w:t>
-      </w:r>
-      <w:proofErr w:type="spellStart"/>
+        <w:t xml:space="preserve">ngsmethode en een belangrijke stap in renderen om de wereld meer realistisch te laten lijken door de harde CGI look wat  zachter te maken. In pre-renderen is kan dit redelijk </w:t>
+      </w:r>
       <w:r>
         <w:rPr>
           <w:lang w:val="nl-BE"/>
         </w:rPr>
-        <w:t>occlusion</w:t>
-      </w:r>
-      <w:proofErr w:type="spellEnd"/>
+        <w:t>accuraat</w:t>
+      </w:r>
       <w:r>
         <w:rPr>
           <w:lang w:val="nl-BE"/>
         </w:rPr>
-        <w:t xml:space="preserve"> is een globale verlichti</w:t>
+        <w:t xml:space="preserve"> ged</w:t>
       </w:r>
       <w:r>
         <w:rPr>
           <w:lang w:val="nl-BE"/>
         </w:rPr>
-        <w:t xml:space="preserve">ngsmethode en een belangrijke stap in renderen om de wereld meer realistisch te laten lijken door de harde CGI look wat  zachter te maken. In pre-renderen is kan dit redelijk </w:t>
-      </w:r>
-      <w:r>
-        <w:rPr>
-          <w:lang w:val="nl-BE"/>
-        </w:rPr>
-        <w:t>accuraat</w:t>
-      </w:r>
-      <w:r>
-        <w:rPr>
-          <w:lang w:val="nl-BE"/>
-        </w:rPr>
-        <w:t xml:space="preserve"> ged</w:t>
-      </w:r>
-      <w:r>
-        <w:rPr>
-          <w:lang w:val="nl-BE"/>
-        </w:rPr>
-        <w:t xml:space="preserve">aan worden omdat tijd een minder groot probleem is, maar in real-time renderen is dit een ander verhaal. In real-time renderen moet de </w:t>
-      </w:r>
-      <w:proofErr w:type="spellStart"/>
-      <w:r>
-        <w:rPr>
-          <w:lang w:val="nl-BE"/>
-        </w:rPr>
-        <w:t>ambient</w:t>
-      </w:r>
-      <w:proofErr w:type="spellEnd"/>
-      <w:r>
-        <w:rPr>
-          <w:lang w:val="nl-BE"/>
-        </w:rPr>
-        <w:t xml:space="preserve"> </w:t>
-      </w:r>
-      <w:proofErr w:type="spellStart"/>
-      <w:r>
-        <w:rPr>
-          <w:lang w:val="nl-BE"/>
-        </w:rPr>
-        <w:t>occlusion</w:t>
-      </w:r>
-      <w:proofErr w:type="spellEnd"/>
-      <w:r>
-        <w:rPr>
-          <w:lang w:val="nl-BE"/>
-        </w:rPr>
-        <w:t xml:space="preserve"> elk frame opnieuw berekend worden, dus zullen we een paar hoeken moeten afsnijden. In deze paper zal ik het hebben over 3 verschillende types real-time </w:t>
-      </w:r>
-      <w:proofErr w:type="spellStart"/>
-      <w:r>
-        <w:rPr>
-          <w:lang w:val="nl-BE"/>
-        </w:rPr>
-        <w:t>ambient</w:t>
-      </w:r>
-      <w:proofErr w:type="spellEnd"/>
-      <w:r>
-        <w:rPr>
-          <w:lang w:val="nl-BE"/>
-        </w:rPr>
-        <w:t xml:space="preserve"> </w:t>
-      </w:r>
-      <w:proofErr w:type="spellStart"/>
-      <w:r>
-        <w:rPr>
-          <w:lang w:val="nl-BE"/>
-        </w:rPr>
-        <w:t>occlusion</w:t>
-      </w:r>
-      <w:proofErr w:type="spellEnd"/>
-      <w:r>
-        <w:rPr>
-          <w:lang w:val="nl-BE"/>
-        </w:rPr>
-        <w:t xml:space="preserve">. Ik zal bespreken hoe je ze kan implementeren in C++, </w:t>
-      </w:r>
-      <w:proofErr w:type="spellStart"/>
-      <w:r>
-        <w:rPr>
-          <w:lang w:val="nl-BE"/>
-        </w:rPr>
-        <w:t>Vulkan</w:t>
-      </w:r>
-      <w:proofErr w:type="spellEnd"/>
-      <w:r>
-        <w:rPr>
-          <w:lang w:val="nl-BE"/>
-        </w:rPr>
-        <w:t xml:space="preserve"> en welke je best kiest, gegeven de keuze.</w:t>
+        <w:t>aan worden omdat tijd een minder groot probleem is, maar in real-time renderen is dit een ander verhaal. In real-time renderen moet de ambient occlusion elk frame opnieuw berekend worden, dus zullen we een paar hoeken moeten afsnijden. In deze paper zal ik het hebben over 3 verschillende types real-time ambient occlusion. Ik zal bespreken hoe je ze kan implementeren in C++, Vulkan en welke je best kiest, gegeven de keuze.</w:t>
       </w:r>
       <w:r>
         <w:rPr>
@@ -3393,15 +3291,7 @@
     </w:p>
     <w:p>
       <w:r>
-        <w:t xml:space="preserve">During my studies at </w:t>
-      </w:r>
-      <w:proofErr w:type="spellStart"/>
-      <w:r>
-        <w:t>Howest</w:t>
-      </w:r>
-      <w:proofErr w:type="spellEnd"/>
-      <w:r>
-        <w:t xml:space="preserve"> – Digital Arts and Entertainment (DAE), I was introduced to graphics programming through our course that is aptly named Graphics Programming 1. In this course</w:t>
+        <w:t>During my studies at Howest – Digital Arts and Entertainment (DAE), I was introduced to graphics programming through our course that is aptly named Graphics Programming 1. In this course</w:t>
       </w:r>
       <w:r>
         <w:t>,</w:t>
@@ -3894,15 +3784,7 @@
         <w:t>Vulkan has 2 types of devices, logical and physical. Physical devices are often part of the system in the form of a graphics card, accelerator, DSP, or other component.</w:t>
       </w:r>
       <w:r>
-        <w:t xml:space="preserve"> There is a fixed number of physical devices, and it is up to the user to choose which one is the most optimal. After choosing the desired physical device, a handle to it is stored in a variable of type </w:t>
-      </w:r>
-      <w:proofErr w:type="spellStart"/>
-      <w:r>
-        <w:t>VkPhysicalDevice</w:t>
-      </w:r>
-      <w:proofErr w:type="spellEnd"/>
-      <w:r>
-        <w:t>. Using the physical device, a logical device can be created. The logical device will be the object that is mainly used in the application to “talk” to the GPU.</w:t>
+        <w:t xml:space="preserve"> There is a fixed number of physical devices, and it is up to the user to choose which one is the most optimal. After choosing the desired physical device, a handle to it is stored in a variable of type VkPhysicalDevice. Using the physical device, a logical device can be created. The logical device will be the object that is mainly used in the application to “talk” to the GPU.</w:t>
       </w:r>
     </w:p>
     <w:p>
@@ -3910,51 +3792,28 @@
         <w:pStyle w:val="Heading3"/>
       </w:pPr>
       <w:bookmarkStart w:id="7" w:name="_Toc206280101"/>
-      <w:r>
-        <w:t xml:space="preserve">1.2 </w:t>
-      </w:r>
-      <w:r>
-        <w:t>Shader stages</w:t>
-      </w:r>
-      <w:bookmarkEnd w:id="7"/>
-      <w:r>
-        <w:t xml:space="preserve"> [4]</w:t>
-      </w:r>
-      <w:r>
-        <w:rPr>
-          <w:lang w:val="en-GB"/>
-        </w:rPr>
-        <w:t xml:space="preserve"> </w:t>
-      </w:r>
-    </w:p>
-    <w:p>
-      <w:pPr>
-        <w:rPr>
-          <w:lang w:val="en-GB"/>
-        </w:rPr>
-      </w:pPr>
       <w:r>
         <w:rPr>
           <w:noProof/>
           <w:lang w:val="en-GB"/>
         </w:rPr>
         <w:drawing>
-          <wp:anchor distT="0" distB="0" distL="114300" distR="114300" simplePos="0" relativeHeight="251698176" behindDoc="1" locked="0" layoutInCell="1" allowOverlap="1" wp14:anchorId="1A282744" wp14:editId="3AA8AF18">
+          <wp:anchor distT="0" distB="0" distL="114300" distR="114300" simplePos="0" relativeHeight="251698176" behindDoc="1" locked="0" layoutInCell="1" allowOverlap="1" wp14:anchorId="1A282744" wp14:editId="3F4D2349">
             <wp:simplePos x="0" y="0"/>
             <wp:positionH relativeFrom="column">
-              <wp:posOffset>4897120</wp:posOffset>
+              <wp:posOffset>4892040</wp:posOffset>
             </wp:positionH>
             <wp:positionV relativeFrom="paragraph">
-              <wp:posOffset>11430</wp:posOffset>
+              <wp:posOffset>250825</wp:posOffset>
             </wp:positionV>
-            <wp:extent cx="1548130" cy="3802380"/>
+            <wp:extent cx="1493520" cy="3669030"/>
             <wp:effectExtent l="0" t="0" r="0" b="7620"/>
             <wp:wrapTight wrapText="bothSides">
               <wp:wrapPolygon edited="0">
                 <wp:start x="0" y="0"/>
-                <wp:lineTo x="0" y="21535"/>
-                <wp:lineTo x="21263" y="21535"/>
-                <wp:lineTo x="21263" y="0"/>
+                <wp:lineTo x="0" y="21533"/>
+                <wp:lineTo x="21214" y="21533"/>
+                <wp:lineTo x="21214" y="0"/>
                 <wp:lineTo x="0" y="0"/>
               </wp:wrapPolygon>
             </wp:wrapTight>
@@ -3984,7 +3843,7 @@
                   <pic:spPr>
                     <a:xfrm>
                       <a:off x="0" y="0"/>
-                      <a:ext cx="1548130" cy="3802380"/>
+                      <a:ext cx="1493520" cy="3669030"/>
                     </a:xfrm>
                     <a:prstGeom prst="rect">
                       <a:avLst/>
@@ -4003,6 +3862,29 @@
         </w:drawing>
       </w:r>
       <w:r>
+        <w:t xml:space="preserve">1.2 </w:t>
+      </w:r>
+      <w:r>
+        <w:t>Shader stages</w:t>
+      </w:r>
+      <w:bookmarkEnd w:id="7"/>
+      <w:r>
+        <w:t xml:space="preserve"> [4]</w:t>
+      </w:r>
+      <w:r>
+        <w:rPr>
+          <w:lang w:val="en-GB"/>
+        </w:rPr>
+        <w:t xml:space="preserve"> </w:t>
+      </w:r>
+    </w:p>
+    <w:p>
+      <w:pPr>
+        <w:rPr>
+          <w:lang w:val="en-GB"/>
+        </w:rPr>
+      </w:pPr>
+      <w:r>
         <w:rPr>
           <w:lang w:val="en-GB"/>
         </w:rPr>
@@ -4170,6 +4052,127 @@
           <w:lang w:val="en-GB"/>
         </w:rPr>
       </w:pPr>
+      <w:r>
+        <w:rPr>
+          <w:noProof/>
+        </w:rPr>
+        <mc:AlternateContent>
+          <mc:Choice Requires="wps">
+            <w:drawing>
+              <wp:anchor distT="0" distB="0" distL="114300" distR="114300" simplePos="0" relativeHeight="251701248" behindDoc="1" locked="0" layoutInCell="1" allowOverlap="1" wp14:anchorId="373183D1" wp14:editId="3CA186FA">
+                <wp:simplePos x="0" y="0"/>
+                <wp:positionH relativeFrom="column">
+                  <wp:posOffset>5011420</wp:posOffset>
+                </wp:positionH>
+                <wp:positionV relativeFrom="paragraph">
+                  <wp:posOffset>184785</wp:posOffset>
+                </wp:positionV>
+                <wp:extent cx="1548130" cy="635"/>
+                <wp:effectExtent l="0" t="0" r="0" b="0"/>
+                <wp:wrapTight wrapText="bothSides">
+                  <wp:wrapPolygon edited="0">
+                    <wp:start x="0" y="0"/>
+                    <wp:lineTo x="0" y="21600"/>
+                    <wp:lineTo x="21600" y="21600"/>
+                    <wp:lineTo x="21600" y="0"/>
+                  </wp:wrapPolygon>
+                </wp:wrapTight>
+                <wp:docPr id="4" name="Text Box 4"/>
+                <wp:cNvGraphicFramePr/>
+                <a:graphic xmlns:a="http://schemas.openxmlformats.org/drawingml/2006/main">
+                  <a:graphicData uri="http://schemas.microsoft.com/office/word/2010/wordprocessingShape">
+                    <wps:wsp>
+                      <wps:cNvSpPr txBox="1"/>
+                      <wps:spPr>
+                        <a:xfrm>
+                          <a:off x="0" y="0"/>
+                          <a:ext cx="1548130" cy="635"/>
+                        </a:xfrm>
+                        <a:prstGeom prst="rect">
+                          <a:avLst/>
+                        </a:prstGeom>
+                        <a:solidFill>
+                          <a:prstClr val="white"/>
+                        </a:solidFill>
+                        <a:ln>
+                          <a:noFill/>
+                        </a:ln>
+                      </wps:spPr>
+                      <wps:txbx>
+                        <w:txbxContent>
+                          <w:p>
+                            <w:pPr>
+                              <w:pStyle w:val="Caption"/>
+                              <w:rPr>
+                                <w:noProof/>
+                                <w:sz w:val="24"/>
+                                <w:szCs w:val="20"/>
+                              </w:rPr>
+                            </w:pPr>
+                            <w:r>
+                              <w:t xml:space="preserve">Figure </w:t>
+                            </w:r>
+                            <w:fldSimple w:instr=" SEQ Figure \* ARABIC ">
+                              <w:r>
+                                <w:rPr>
+                                  <w:noProof/>
+                                </w:rPr>
+                                <w:t>1</w:t>
+                              </w:r>
+                            </w:fldSimple>
+                          </w:p>
+                        </w:txbxContent>
+                      </wps:txbx>
+                      <wps:bodyPr rot="0" spcFirstLastPara="0" vertOverflow="overflow" horzOverflow="overflow" vert="horz" wrap="square" lIns="0" tIns="0" rIns="0" bIns="0" numCol="1" spcCol="0" rtlCol="0" fromWordArt="0" anchor="t" anchorCtr="0" forceAA="0" compatLnSpc="1">
+                        <a:prstTxWarp prst="textNoShape">
+                          <a:avLst/>
+                        </a:prstTxWarp>
+                        <a:spAutoFit/>
+                      </wps:bodyPr>
+                    </wps:wsp>
+                  </a:graphicData>
+                </a:graphic>
+              </wp:anchor>
+            </w:drawing>
+          </mc:Choice>
+          <mc:Fallback>
+            <w:pict>
+              <v:shapetype w14:anchorId="373183D1" id="_x0000_t202" coordsize="21600,21600" o:spt="202" path="m,l,21600r21600,l21600,xe">
+                <v:stroke joinstyle="miter"/>
+                <v:path gradientshapeok="t" o:connecttype="rect"/>
+              </v:shapetype>
+              <v:shape id="Text Box 4" o:spid="_x0000_s1026" type="#_x0000_t202" style="position:absolute;left:0;text-align:left;margin-left:394.6pt;margin-top:14.55pt;width:121.9pt;height:.05pt;z-index:-251615232;visibility:visible;mso-wrap-style:square;mso-wrap-distance-left:9pt;mso-wrap-distance-top:0;mso-wrap-distance-right:9pt;mso-wrap-distance-bottom:0;mso-position-horizontal:absolute;mso-position-horizontal-relative:text;mso-position-vertical:absolute;mso-position-vertical-relative:text;v-text-anchor:top" o:gfxdata="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" stroked="f">
+                <v:textbox style="mso-fit-shape-to-text:t" inset="0,0,0,0">
+                  <w:txbxContent>
+                    <w:p>
+                      <w:pPr>
+                        <w:pStyle w:val="Caption"/>
+                        <w:rPr>
+                          <w:noProof/>
+                          <w:sz w:val="24"/>
+                          <w:szCs w:val="20"/>
+                        </w:rPr>
+                      </w:pPr>
+                      <w:r>
+                        <w:t xml:space="preserve">Figure </w:t>
+                      </w:r>
+                      <w:fldSimple w:instr=" SEQ Figure \* ARABIC ">
+                        <w:r>
+                          <w:rPr>
+                            <w:noProof/>
+                          </w:rPr>
+                          <w:t>1</w:t>
+                        </w:r>
+                      </w:fldSimple>
+                    </w:p>
+                  </w:txbxContent>
+                </v:textbox>
+                <w10:wrap type="tight"/>
+              </v:shape>
+            </w:pict>
+          </mc:Fallback>
+        </mc:AlternateContent>
+      </w:r>
       <w:r>
         <w:rPr>
           <w:lang w:val="en-GB"/>
@@ -4729,10 +4732,17 @@
         <w:t xml:space="preserve"> </w:t>
       </w:r>
       <w:r>
-        <w:t>This is very straightforward, but it brings up one big issue. Calculating lighting is not a cheap operation, and sometimes, a pixel is rendered, the lighting for it is calculated, only for another pixel to be rendered on top of it, and the lighting calculations have to be done all over again. This is a big waste of resources.</w:t>
-      </w:r>
-      <w:r>
-        <w:br/>
+        <w:t>This is very straightforward, but it brings up one big issue. Calculating lighting is not a cheap operation, and sometimes, a pixel is rendered, the lighting for it is calculated, only for another pixel to be rendered on top of it, and the lighting calculations have to be done all over again. This is a big waste of resources</w:t>
+      </w:r>
+      <w:r>
+        <w:t xml:space="preserve"> and we call this overdraw</w:t>
+      </w:r>
+      <w:r>
+        <w:t>.</w:t>
+      </w:r>
+    </w:p>
+    <w:p>
+      <w:r>
         <w:t>The solution to this problem is deferred rendering or deferred shading. In deferred rendering</w:t>
       </w:r>
       <w:r>
@@ -4745,15 +4755,7 @@
         <w:t xml:space="preserve">. This buffer will </w:t>
       </w:r>
       <w:r>
-        <w:t xml:space="preserve">store information such as normal, albedo color, position, specular value, </w:t>
-      </w:r>
-      <w:proofErr w:type="spellStart"/>
-      <w:r>
-        <w:t>metalness</w:t>
-      </w:r>
-      <w:proofErr w:type="spellEnd"/>
-      <w:r>
-        <w:t xml:space="preserve"> value, roughness value, and any other desired data</w:t>
+        <w:t>store information such as normal, albedo color, position, specular value, metalness value, roughness value, and any other desired data</w:t>
       </w:r>
       <w:r>
         <w:t>.</w:t>
@@ -4770,6 +4772,27 @@
       </w:r>
     </w:p>
     <w:p/>
+    <w:p>
+      <w:pPr>
+        <w:pStyle w:val="Heading3"/>
+      </w:pPr>
+      <w:r>
+        <w:t>2.3 Depth prepass</w:t>
+      </w:r>
+      <w:r>
+        <w:t xml:space="preserve"> [8]</w:t>
+      </w:r>
+    </w:p>
+    <w:p>
+      <w:r>
+        <w:t>While deferred shading works great, we still have some overdraw. When a triangle is rendered, it renders to the G-buffer, but if another triangle is rendered on top of it, it renders to the same part of the G-buffer, this is still overdraw, even if it is a lesser version of it. To avoid this overdraw, we use what’s called a depth prepass.</w:t>
+      </w:r>
+    </w:p>
+    <w:p>
+      <w:r>
+        <w:t>A depth prepass renders the entire scene to a depth buffer first. Because writing to the depth buffer happens in the rasterization stage. This means that we only need a vertex shader for this subpass, saving a lot of time. After our depth pass is done, we render the scene like usual, by using the previously rendered to depth buffer. This causes all the pixels that are not on the top layer of the depth buffer to be discarded in the rasterization stage.</w:t>
+      </w:r>
+    </w:p>
     <w:p/>
     <w:p>
       <w:pPr>
@@ -4777,6 +4800,7 @@
       </w:pPr>
       <w:bookmarkStart w:id="9" w:name="_Toc206280103"/>
       <w:r>
+        <w:lastRenderedPageBreak/>
         <w:t>3</w:t>
       </w:r>
       <w:r>
@@ -4846,7 +4870,6 @@
         <w:rPr>
           <w:noProof/>
         </w:rPr>
-        <w:lastRenderedPageBreak/>
         <w:drawing>
           <wp:anchor distT="0" distB="0" distL="114300" distR="114300" simplePos="0" relativeHeight="251665408" behindDoc="1" locked="0" layoutInCell="1" allowOverlap="1" wp14:anchorId="4DFB6262" wp14:editId="092E14CF">
             <wp:simplePos x="0" y="0"/>
@@ -5003,6 +5026,7 @@
     </w:p>
     <w:p>
       <w:r>
+        <w:lastRenderedPageBreak/>
         <w:t>The idea behind ambient occlusion is that in a 3D scene, some geometry will stop the light from reaching other geometry</w:t>
       </w:r>
       <w:r>
@@ -5031,11 +5055,7 @@
         <w:t>In ambient occlusion, the area around a point in the world is checked for occluding geometry nearby, the filter region is often quite small</w:t>
       </w:r>
       <w:r>
-        <w:t xml:space="preserve"> and in the shape of a dome around the point, in the </w:t>
-      </w:r>
-      <w:r>
-        <w:lastRenderedPageBreak/>
-        <w:t>direction of the normal</w:t>
+        <w:t xml:space="preserve"> and in the shape of a dome around the point, in the direction of the normal</w:t>
       </w:r>
       <w:r>
         <w:t>.</w:t>
@@ -5193,6 +5213,7 @@
     </w:p>
     <w:p>
       <w:r>
+        <w:lastRenderedPageBreak/>
         <w:t>Because 3D environments are often quite big and complicated, it is impossible to check every single point in the world for surrounding and occluding geometry, this is where Screen Space Ambient Occlusion(SSAO) comes in the works. Instead of checking all the points in the world, it checks all the pixels visible on the screen</w:t>
       </w:r>
       <w:r>
@@ -5207,27 +5228,7 @@
     </w:p>
     <w:p>
       <w:r>
-        <w:t xml:space="preserve">SSAO needs 2 main things to make the correct calculations: the view space position and the view space </w:t>
-      </w:r>
-      <w:proofErr w:type="spellStart"/>
-      <w:r>
-        <w:t>normals</w:t>
-      </w:r>
-      <w:proofErr w:type="spellEnd"/>
-      <w:r>
-        <w:t xml:space="preserve">. View space means that it is relevant to the camera; the view space position of the camera would be (0,0,0), the view space position of an object 1 unit in front of the camera would be (0,0,1), etc. The same is true of view space </w:t>
-      </w:r>
-      <w:proofErr w:type="spellStart"/>
-      <w:r>
-        <w:t>normals</w:t>
-      </w:r>
-      <w:proofErr w:type="spellEnd"/>
-      <w:r>
-        <w:t xml:space="preserve">. A normal facing towards </w:t>
-      </w:r>
-      <w:r>
-        <w:lastRenderedPageBreak/>
-        <w:t>the camera would hold a value of (0,0,-1), while a normal facing away from the camera would hold a value of (0,0,1).</w:t>
+        <w:t>SSAO needs 2 main things to make the correct calculations: the view space position and the view space normals. View space means that it is relevant to the camera; the view space position of the camera would be (0,0,0), the view space position of an object 1 unit in front of the camera would be (0,0,1), etc. The same is true of view space normals. A normal facing towards the camera would hold a value of (0,0,-1), while a normal facing away from the camera would hold a value of (0,0,1).</w:t>
       </w:r>
     </w:p>
     <w:p>
@@ -5350,6 +5351,7 @@
         <w:rPr>
           <w:noProof/>
         </w:rPr>
+        <w:lastRenderedPageBreak/>
         <w:drawing>
           <wp:anchor distT="0" distB="0" distL="114300" distR="114300" simplePos="0" relativeHeight="251677696" behindDoc="0" locked="0" layoutInCell="1" allowOverlap="1" wp14:anchorId="027E9CF9" wp14:editId="1469EF34">
             <wp:simplePos x="0" y="0"/>
@@ -5488,15 +5490,7 @@
         <w:t>The original SSAO is simply called SSAO</w:t>
       </w:r>
       <w:r>
-        <w:t xml:space="preserve">[5]. It was developed by Vladimir </w:t>
-      </w:r>
-      <w:proofErr w:type="spellStart"/>
-      <w:r>
-        <w:t>Kajalin</w:t>
-      </w:r>
-      <w:proofErr w:type="spellEnd"/>
-      <w:r>
-        <w:t xml:space="preserve"> and was used for the first time in 2007 by the game Crysis, developed by Crytek.</w:t>
+        <w:t>[5]. It was developed by Vladimir Kajalin and was used for the first time in 2007 by the game Crysis, developed by Crytek.</w:t>
       </w:r>
       <w:r>
         <w:br/>
@@ -5508,7 +5502,6 @@
         <w:rPr>
           <w:noProof/>
         </w:rPr>
-        <w:lastRenderedPageBreak/>
         <w:drawing>
           <wp:inline distT="0" distB="0" distL="0" distR="0" wp14:anchorId="563F1A1F" wp14:editId="7C24F6DF">
             <wp:extent cx="4789552" cy="2403475"/>
@@ -5569,7 +5562,11 @@
     </w:p>
     <w:p>
       <w:r>
-        <w:t>We start by picking several sample directions; more directions will make the ambient occlusion crisper, but will also have an effect on performance. It is up to the user to find the golden ratio between performance and quality. For each sample direction</w:t>
+        <w:t xml:space="preserve">We start by picking several sample directions; more directions will make the ambient occlusion crisper, but will also have an effect on performance. It is up to the user to find the golden ratio </w:t>
+      </w:r>
+      <w:r>
+        <w:lastRenderedPageBreak/>
+        <w:t>between performance and quality. For each sample direction</w:t>
       </w:r>
       <w:r>
         <w:t>,</w:t>
@@ -5780,7 +5777,6 @@
         <w:rPr>
           <w:noProof/>
         </w:rPr>
-        <w:lastRenderedPageBreak/>
         <w:drawing>
           <wp:anchor distT="0" distB="0" distL="114300" distR="114300" simplePos="0" relativeHeight="251678720" behindDoc="0" locked="0" layoutInCell="1" allowOverlap="1" wp14:anchorId="517BD431" wp14:editId="38FC97AA">
             <wp:simplePos x="0" y="0"/>
@@ -5860,6 +5856,7 @@
           <w:noProof/>
           <w:lang w:val="en-GB"/>
         </w:rPr>
+        <w:lastRenderedPageBreak/>
         <w:drawing>
           <wp:anchor distT="0" distB="0" distL="114300" distR="114300" simplePos="0" relativeHeight="251679744" behindDoc="0" locked="0" layoutInCell="1" allowOverlap="1" wp14:anchorId="7E49CF5A" wp14:editId="610F9DAD">
             <wp:simplePos x="0" y="0"/>
@@ -5938,7 +5935,6 @@
         <w:rPr>
           <w:noProof/>
         </w:rPr>
-        <w:lastRenderedPageBreak/>
         <w:drawing>
           <wp:anchor distT="0" distB="0" distL="114300" distR="114300" simplePos="0" relativeHeight="251680768" behindDoc="0" locked="0" layoutInCell="1" allowOverlap="1" wp14:anchorId="3024C60D" wp14:editId="2B532BF9">
             <wp:simplePos x="0" y="0"/>
@@ -6222,15 +6218,7 @@
         </w:drawing>
       </w:r>
       <w:r>
-        <w:t>Calculate and normalize the cross product of the so-called “</w:t>
-      </w:r>
-      <w:proofErr w:type="spellStart"/>
-      <w:r>
-        <w:t>leftDirection</w:t>
-      </w:r>
-      <w:proofErr w:type="spellEnd"/>
-      <w:r>
-        <w:t>” and the normal, which will give us a vector perpendicular to the curve at point P, also called the Tangent.</w:t>
+        <w:t>Calculate and normalize the cross product of the so-called “leftDirection” and the normal, which will give us a vector perpendicular to the curve at point P, also called the Tangent.</w:t>
       </w:r>
     </w:p>
     <w:p>
@@ -6410,7 +6398,6 @@
         <w:rPr>
           <w:noProof/>
         </w:rPr>
-        <w:lastRenderedPageBreak/>
         <w:drawing>
           <wp:anchor distT="0" distB="0" distL="114300" distR="114300" simplePos="0" relativeHeight="251689984" behindDoc="0" locked="0" layoutInCell="1" allowOverlap="1" wp14:anchorId="0021B6D3" wp14:editId="590CE4D1">
             <wp:simplePos x="0" y="0"/>
@@ -6687,6 +6674,7 @@
         <w:rPr>
           <w:noProof/>
         </w:rPr>
+        <w:lastRenderedPageBreak/>
         <w:drawing>
           <wp:anchor distT="0" distB="0" distL="114300" distR="114300" simplePos="0" relativeHeight="251696128" behindDoc="0" locked="0" layoutInCell="1" allowOverlap="1" wp14:anchorId="4FE50E8B" wp14:editId="249F9135">
             <wp:simplePos x="0" y="0"/>
@@ -7576,1171 +7564,55 @@
         </w:rPr>
       </w:pPr>
       <w:r>
-        <w:t xml:space="preserve">Lorem ipsum dolor sit </w:t>
-      </w:r>
-      <w:proofErr w:type="spellStart"/>
-      <w:r>
-        <w:t>amet</w:t>
-      </w:r>
-      <w:proofErr w:type="spellEnd"/>
-      <w:r>
-        <w:t xml:space="preserve">, </w:t>
-      </w:r>
-      <w:proofErr w:type="spellStart"/>
-      <w:r>
-        <w:t>consectetur</w:t>
-      </w:r>
-      <w:proofErr w:type="spellEnd"/>
-      <w:r>
-        <w:t xml:space="preserve"> </w:t>
-      </w:r>
-      <w:proofErr w:type="spellStart"/>
-      <w:r>
-        <w:t>adipiscing</w:t>
-      </w:r>
-      <w:proofErr w:type="spellEnd"/>
-      <w:r>
-        <w:t xml:space="preserve"> </w:t>
-      </w:r>
-      <w:proofErr w:type="spellStart"/>
-      <w:r>
-        <w:t>elit</w:t>
-      </w:r>
-      <w:proofErr w:type="spellEnd"/>
-      <w:r>
-        <w:t xml:space="preserve">. </w:t>
-      </w:r>
-      <w:proofErr w:type="spellStart"/>
+        <w:t xml:space="preserve">Lorem ipsum dolor sit amet, consectetur adipiscing elit. </w:t>
+      </w:r>
       <w:r>
         <w:rPr>
           <w:lang w:val="it-IT"/>
         </w:rPr>
-        <w:t>Vestibulum</w:t>
-      </w:r>
-      <w:proofErr w:type="spellEnd"/>
+        <w:t xml:space="preserve">Vestibulum ac quam nec arcu semper dignissim. </w:t>
+      </w:r>
+      <w:r>
+        <w:rPr>
+          <w:lang w:val="fr-BE"/>
+        </w:rPr>
+        <w:t>Nulla quam magna, varius sit amet pharetra et, dictum quis elit. Pellentesque habitant morbi tristique senectus et netus et malesuada fames ac turpis egestas.</w:t>
+      </w:r>
+    </w:p>
+    <w:p>
+      <w:pPr>
+        <w:rPr>
+          <w:lang w:val="fr-BE"/>
+        </w:rPr>
+      </w:pPr>
+      <w:r>
+        <w:rPr>
+          <w:lang w:val="fr-BE"/>
+        </w:rPr>
+        <w:t xml:space="preserve">Proin ullamcorper, ipsum sit amet scelerisque rhoncus, leo quam rhoncus elit, sit amet ullamcorper tellus nisi eget sapien. </w:t>
+      </w:r>
       <w:r>
         <w:rPr>
           <w:lang w:val="it-IT"/>
         </w:rPr>
-        <w:t xml:space="preserve"> </w:t>
-      </w:r>
-      <w:proofErr w:type="spellStart"/>
+        <w:t xml:space="preserve">Suspendisse potenti. Ut non justo viverra, tempus felis vitae, elementum mi. </w:t>
+      </w:r>
+      <w:r>
+        <w:rPr>
+          <w:lang w:val="fr-BE"/>
+        </w:rPr>
+        <w:t>Morbi at dui sed lacus fringilla condimentum. Duis non odio ac arcu volutpat vehicula eu et turpis.</w:t>
+      </w:r>
+    </w:p>
+    <w:p>
       <w:r>
         <w:rPr>
           <w:lang w:val="it-IT"/>
         </w:rPr>
-        <w:t>ac</w:t>
-      </w:r>
-      <w:proofErr w:type="spellEnd"/>
-      <w:r>
-        <w:rPr>
-          <w:lang w:val="it-IT"/>
-        </w:rPr>
-        <w:t xml:space="preserve"> </w:t>
-      </w:r>
-      <w:proofErr w:type="spellStart"/>
-      <w:r>
-        <w:rPr>
-          <w:lang w:val="it-IT"/>
-        </w:rPr>
-        <w:t>quam</w:t>
-      </w:r>
-      <w:proofErr w:type="spellEnd"/>
-      <w:r>
-        <w:rPr>
-          <w:lang w:val="it-IT"/>
-        </w:rPr>
-        <w:t xml:space="preserve"> </w:t>
-      </w:r>
-      <w:proofErr w:type="spellStart"/>
-      <w:r>
-        <w:rPr>
-          <w:lang w:val="it-IT"/>
-        </w:rPr>
-        <w:t>nec</w:t>
-      </w:r>
-      <w:proofErr w:type="spellEnd"/>
-      <w:r>
-        <w:rPr>
-          <w:lang w:val="it-IT"/>
-        </w:rPr>
-        <w:t xml:space="preserve"> </w:t>
-      </w:r>
-      <w:proofErr w:type="spellStart"/>
-      <w:r>
-        <w:rPr>
-          <w:lang w:val="it-IT"/>
-        </w:rPr>
-        <w:t>arcu</w:t>
-      </w:r>
-      <w:proofErr w:type="spellEnd"/>
-      <w:r>
-        <w:rPr>
-          <w:lang w:val="it-IT"/>
-        </w:rPr>
-        <w:t xml:space="preserve"> </w:t>
-      </w:r>
-      <w:proofErr w:type="spellStart"/>
-      <w:r>
-        <w:rPr>
-          <w:lang w:val="it-IT"/>
-        </w:rPr>
-        <w:t>semper</w:t>
-      </w:r>
-      <w:proofErr w:type="spellEnd"/>
-      <w:r>
-        <w:rPr>
-          <w:lang w:val="it-IT"/>
-        </w:rPr>
-        <w:t xml:space="preserve"> </w:t>
-      </w:r>
-      <w:proofErr w:type="spellStart"/>
-      <w:r>
-        <w:rPr>
-          <w:lang w:val="it-IT"/>
-        </w:rPr>
-        <w:t>dignissim</w:t>
-      </w:r>
-      <w:proofErr w:type="spellEnd"/>
-      <w:r>
-        <w:rPr>
-          <w:lang w:val="it-IT"/>
-        </w:rPr>
-        <w:t xml:space="preserve">. </w:t>
-      </w:r>
-      <w:proofErr w:type="spellStart"/>
-      <w:r>
-        <w:rPr>
-          <w:lang w:val="fr-BE"/>
-        </w:rPr>
-        <w:t>Nulla</w:t>
-      </w:r>
-      <w:proofErr w:type="spellEnd"/>
-      <w:r>
-        <w:rPr>
-          <w:lang w:val="fr-BE"/>
-        </w:rPr>
-        <w:t xml:space="preserve"> </w:t>
-      </w:r>
-      <w:proofErr w:type="spellStart"/>
-      <w:r>
-        <w:rPr>
-          <w:lang w:val="fr-BE"/>
-        </w:rPr>
-        <w:t>quam</w:t>
-      </w:r>
-      <w:proofErr w:type="spellEnd"/>
-      <w:r>
-        <w:rPr>
-          <w:lang w:val="fr-BE"/>
-        </w:rPr>
-        <w:t xml:space="preserve"> magna, </w:t>
-      </w:r>
-      <w:proofErr w:type="spellStart"/>
-      <w:r>
-        <w:rPr>
-          <w:lang w:val="fr-BE"/>
-        </w:rPr>
-        <w:t>varius</w:t>
-      </w:r>
-      <w:proofErr w:type="spellEnd"/>
-      <w:r>
-        <w:rPr>
-          <w:lang w:val="fr-BE"/>
-        </w:rPr>
-        <w:t xml:space="preserve"> </w:t>
-      </w:r>
-      <w:proofErr w:type="spellStart"/>
-      <w:r>
-        <w:rPr>
-          <w:lang w:val="fr-BE"/>
-        </w:rPr>
-        <w:t>sit</w:t>
-      </w:r>
-      <w:proofErr w:type="spellEnd"/>
-      <w:r>
-        <w:rPr>
-          <w:lang w:val="fr-BE"/>
-        </w:rPr>
-        <w:t xml:space="preserve"> </w:t>
-      </w:r>
-      <w:proofErr w:type="spellStart"/>
-      <w:r>
-        <w:rPr>
-          <w:lang w:val="fr-BE"/>
-        </w:rPr>
-        <w:t>amet</w:t>
-      </w:r>
-      <w:proofErr w:type="spellEnd"/>
-      <w:r>
-        <w:rPr>
-          <w:lang w:val="fr-BE"/>
-        </w:rPr>
-        <w:t xml:space="preserve"> </w:t>
-      </w:r>
-      <w:proofErr w:type="spellStart"/>
-      <w:r>
-        <w:rPr>
-          <w:lang w:val="fr-BE"/>
-        </w:rPr>
-        <w:t>pharetra</w:t>
-      </w:r>
-      <w:proofErr w:type="spellEnd"/>
-      <w:r>
-        <w:rPr>
-          <w:lang w:val="fr-BE"/>
-        </w:rPr>
-        <w:t xml:space="preserve"> et, dictum </w:t>
-      </w:r>
-      <w:proofErr w:type="spellStart"/>
-      <w:r>
-        <w:rPr>
-          <w:lang w:val="fr-BE"/>
-        </w:rPr>
-        <w:t>quis</w:t>
-      </w:r>
-      <w:proofErr w:type="spellEnd"/>
-      <w:r>
-        <w:rPr>
-          <w:lang w:val="fr-BE"/>
-        </w:rPr>
-        <w:t xml:space="preserve"> </w:t>
-      </w:r>
-      <w:proofErr w:type="spellStart"/>
-      <w:r>
-        <w:rPr>
-          <w:lang w:val="fr-BE"/>
-        </w:rPr>
-        <w:t>elit</w:t>
-      </w:r>
-      <w:proofErr w:type="spellEnd"/>
-      <w:r>
-        <w:rPr>
-          <w:lang w:val="fr-BE"/>
-        </w:rPr>
-        <w:t xml:space="preserve">. </w:t>
-      </w:r>
-      <w:proofErr w:type="spellStart"/>
-      <w:r>
-        <w:rPr>
-          <w:lang w:val="fr-BE"/>
-        </w:rPr>
-        <w:t>Pellentesque</w:t>
-      </w:r>
-      <w:proofErr w:type="spellEnd"/>
-      <w:r>
-        <w:rPr>
-          <w:lang w:val="fr-BE"/>
-        </w:rPr>
-        <w:t xml:space="preserve"> habitant morbi tristique </w:t>
-      </w:r>
-      <w:proofErr w:type="spellStart"/>
-      <w:r>
-        <w:rPr>
-          <w:lang w:val="fr-BE"/>
-        </w:rPr>
-        <w:t>senectus</w:t>
-      </w:r>
-      <w:proofErr w:type="spellEnd"/>
-      <w:r>
-        <w:rPr>
-          <w:lang w:val="fr-BE"/>
-        </w:rPr>
-        <w:t xml:space="preserve"> et </w:t>
-      </w:r>
-      <w:proofErr w:type="spellStart"/>
-      <w:r>
-        <w:rPr>
-          <w:lang w:val="fr-BE"/>
-        </w:rPr>
-        <w:t>netus</w:t>
-      </w:r>
-      <w:proofErr w:type="spellEnd"/>
-      <w:r>
-        <w:rPr>
-          <w:lang w:val="fr-BE"/>
-        </w:rPr>
-        <w:t xml:space="preserve"> et </w:t>
-      </w:r>
-      <w:proofErr w:type="spellStart"/>
-      <w:r>
-        <w:rPr>
-          <w:lang w:val="fr-BE"/>
-        </w:rPr>
-        <w:t>malesuada</w:t>
-      </w:r>
-      <w:proofErr w:type="spellEnd"/>
-      <w:r>
-        <w:rPr>
-          <w:lang w:val="fr-BE"/>
-        </w:rPr>
-        <w:t xml:space="preserve"> </w:t>
-      </w:r>
-      <w:proofErr w:type="spellStart"/>
-      <w:r>
-        <w:rPr>
-          <w:lang w:val="fr-BE"/>
-        </w:rPr>
-        <w:t>fames</w:t>
-      </w:r>
-      <w:proofErr w:type="spellEnd"/>
-      <w:r>
-        <w:rPr>
-          <w:lang w:val="fr-BE"/>
-        </w:rPr>
-        <w:t xml:space="preserve"> </w:t>
-      </w:r>
-      <w:proofErr w:type="spellStart"/>
-      <w:r>
-        <w:rPr>
-          <w:lang w:val="fr-BE"/>
-        </w:rPr>
-        <w:t>ac</w:t>
-      </w:r>
-      <w:proofErr w:type="spellEnd"/>
-      <w:r>
-        <w:rPr>
-          <w:lang w:val="fr-BE"/>
-        </w:rPr>
-        <w:t xml:space="preserve"> </w:t>
-      </w:r>
-      <w:proofErr w:type="spellStart"/>
-      <w:r>
-        <w:rPr>
-          <w:lang w:val="fr-BE"/>
-        </w:rPr>
-        <w:t>turpis</w:t>
-      </w:r>
-      <w:proofErr w:type="spellEnd"/>
-      <w:r>
-        <w:rPr>
-          <w:lang w:val="fr-BE"/>
-        </w:rPr>
-        <w:t xml:space="preserve"> </w:t>
-      </w:r>
-      <w:proofErr w:type="spellStart"/>
-      <w:r>
-        <w:rPr>
-          <w:lang w:val="fr-BE"/>
-        </w:rPr>
-        <w:t>egestas</w:t>
-      </w:r>
-      <w:proofErr w:type="spellEnd"/>
-      <w:r>
-        <w:rPr>
-          <w:lang w:val="fr-BE"/>
-        </w:rPr>
-        <w:t>.</w:t>
-      </w:r>
-    </w:p>
-    <w:p>
-      <w:pPr>
-        <w:rPr>
-          <w:lang w:val="fr-BE"/>
-        </w:rPr>
-      </w:pPr>
-      <w:proofErr w:type="spellStart"/>
-      <w:r>
-        <w:rPr>
-          <w:lang w:val="fr-BE"/>
-        </w:rPr>
-        <w:t>Proin</w:t>
-      </w:r>
-      <w:proofErr w:type="spellEnd"/>
-      <w:r>
-        <w:rPr>
-          <w:lang w:val="fr-BE"/>
-        </w:rPr>
-        <w:t xml:space="preserve"> </w:t>
-      </w:r>
-      <w:proofErr w:type="spellStart"/>
-      <w:r>
-        <w:rPr>
-          <w:lang w:val="fr-BE"/>
-        </w:rPr>
-        <w:t>ullamcorper</w:t>
-      </w:r>
-      <w:proofErr w:type="spellEnd"/>
-      <w:r>
-        <w:rPr>
-          <w:lang w:val="fr-BE"/>
-        </w:rPr>
-        <w:t xml:space="preserve">, ipsum </w:t>
-      </w:r>
-      <w:proofErr w:type="spellStart"/>
-      <w:r>
-        <w:rPr>
-          <w:lang w:val="fr-BE"/>
-        </w:rPr>
-        <w:t>sit</w:t>
-      </w:r>
-      <w:proofErr w:type="spellEnd"/>
-      <w:r>
-        <w:rPr>
-          <w:lang w:val="fr-BE"/>
-        </w:rPr>
-        <w:t xml:space="preserve"> </w:t>
-      </w:r>
-      <w:proofErr w:type="spellStart"/>
-      <w:r>
-        <w:rPr>
-          <w:lang w:val="fr-BE"/>
-        </w:rPr>
-        <w:t>amet</w:t>
-      </w:r>
-      <w:proofErr w:type="spellEnd"/>
-      <w:r>
-        <w:rPr>
-          <w:lang w:val="fr-BE"/>
-        </w:rPr>
-        <w:t xml:space="preserve"> </w:t>
-      </w:r>
-      <w:proofErr w:type="spellStart"/>
-      <w:r>
-        <w:rPr>
-          <w:lang w:val="fr-BE"/>
-        </w:rPr>
-        <w:t>scelerisque</w:t>
-      </w:r>
-      <w:proofErr w:type="spellEnd"/>
-      <w:r>
-        <w:rPr>
-          <w:lang w:val="fr-BE"/>
-        </w:rPr>
-        <w:t xml:space="preserve"> rhoncus, </w:t>
-      </w:r>
-      <w:proofErr w:type="spellStart"/>
-      <w:r>
-        <w:rPr>
-          <w:lang w:val="fr-BE"/>
-        </w:rPr>
-        <w:t>leo</w:t>
-      </w:r>
-      <w:proofErr w:type="spellEnd"/>
-      <w:r>
-        <w:rPr>
-          <w:lang w:val="fr-BE"/>
-        </w:rPr>
-        <w:t xml:space="preserve"> </w:t>
-      </w:r>
-      <w:proofErr w:type="spellStart"/>
-      <w:r>
-        <w:rPr>
-          <w:lang w:val="fr-BE"/>
-        </w:rPr>
-        <w:t>quam</w:t>
-      </w:r>
-      <w:proofErr w:type="spellEnd"/>
-      <w:r>
-        <w:rPr>
-          <w:lang w:val="fr-BE"/>
-        </w:rPr>
-        <w:t xml:space="preserve"> rhoncus </w:t>
-      </w:r>
-      <w:proofErr w:type="spellStart"/>
-      <w:r>
-        <w:rPr>
-          <w:lang w:val="fr-BE"/>
-        </w:rPr>
-        <w:t>elit</w:t>
-      </w:r>
-      <w:proofErr w:type="spellEnd"/>
-      <w:r>
-        <w:rPr>
-          <w:lang w:val="fr-BE"/>
-        </w:rPr>
-        <w:t xml:space="preserve">, </w:t>
-      </w:r>
-      <w:proofErr w:type="spellStart"/>
-      <w:r>
-        <w:rPr>
-          <w:lang w:val="fr-BE"/>
-        </w:rPr>
-        <w:t>sit</w:t>
-      </w:r>
-      <w:proofErr w:type="spellEnd"/>
-      <w:r>
-        <w:rPr>
-          <w:lang w:val="fr-BE"/>
-        </w:rPr>
-        <w:t xml:space="preserve"> </w:t>
-      </w:r>
-      <w:proofErr w:type="spellStart"/>
-      <w:r>
-        <w:rPr>
-          <w:lang w:val="fr-BE"/>
-        </w:rPr>
-        <w:t>amet</w:t>
-      </w:r>
-      <w:proofErr w:type="spellEnd"/>
-      <w:r>
-        <w:rPr>
-          <w:lang w:val="fr-BE"/>
-        </w:rPr>
-        <w:t xml:space="preserve"> </w:t>
-      </w:r>
-      <w:proofErr w:type="spellStart"/>
-      <w:r>
-        <w:rPr>
-          <w:lang w:val="fr-BE"/>
-        </w:rPr>
-        <w:t>ullamcorper</w:t>
-      </w:r>
-      <w:proofErr w:type="spellEnd"/>
-      <w:r>
-        <w:rPr>
-          <w:lang w:val="fr-BE"/>
-        </w:rPr>
-        <w:t xml:space="preserve"> </w:t>
-      </w:r>
-      <w:proofErr w:type="spellStart"/>
-      <w:r>
-        <w:rPr>
-          <w:lang w:val="fr-BE"/>
-        </w:rPr>
-        <w:t>tellus</w:t>
-      </w:r>
-      <w:proofErr w:type="spellEnd"/>
-      <w:r>
-        <w:rPr>
-          <w:lang w:val="fr-BE"/>
-        </w:rPr>
-        <w:t xml:space="preserve"> </w:t>
-      </w:r>
-      <w:proofErr w:type="spellStart"/>
-      <w:r>
-        <w:rPr>
-          <w:lang w:val="fr-BE"/>
-        </w:rPr>
-        <w:t>nisi</w:t>
-      </w:r>
-      <w:proofErr w:type="spellEnd"/>
-      <w:r>
-        <w:rPr>
-          <w:lang w:val="fr-BE"/>
-        </w:rPr>
-        <w:t xml:space="preserve"> </w:t>
-      </w:r>
-      <w:proofErr w:type="spellStart"/>
-      <w:r>
-        <w:rPr>
-          <w:lang w:val="fr-BE"/>
-        </w:rPr>
-        <w:t>eget</w:t>
-      </w:r>
-      <w:proofErr w:type="spellEnd"/>
-      <w:r>
-        <w:rPr>
-          <w:lang w:val="fr-BE"/>
-        </w:rPr>
-        <w:t xml:space="preserve"> </w:t>
-      </w:r>
-      <w:proofErr w:type="spellStart"/>
-      <w:r>
-        <w:rPr>
-          <w:lang w:val="fr-BE"/>
-        </w:rPr>
-        <w:t>sapien</w:t>
-      </w:r>
-      <w:proofErr w:type="spellEnd"/>
-      <w:r>
-        <w:rPr>
-          <w:lang w:val="fr-BE"/>
-        </w:rPr>
-        <w:t xml:space="preserve">. </w:t>
-      </w:r>
-      <w:proofErr w:type="spellStart"/>
-      <w:r>
-        <w:rPr>
-          <w:lang w:val="it-IT"/>
-        </w:rPr>
-        <w:t>Suspendisse</w:t>
-      </w:r>
-      <w:proofErr w:type="spellEnd"/>
-      <w:r>
-        <w:rPr>
-          <w:lang w:val="it-IT"/>
-        </w:rPr>
-        <w:t xml:space="preserve"> potenti. Ut non </w:t>
-      </w:r>
-      <w:proofErr w:type="spellStart"/>
-      <w:r>
-        <w:rPr>
-          <w:lang w:val="it-IT"/>
-        </w:rPr>
-        <w:t>justo</w:t>
-      </w:r>
-      <w:proofErr w:type="spellEnd"/>
-      <w:r>
-        <w:rPr>
-          <w:lang w:val="it-IT"/>
-        </w:rPr>
-        <w:t xml:space="preserve"> viverra, tempus </w:t>
-      </w:r>
-      <w:proofErr w:type="spellStart"/>
-      <w:r>
-        <w:rPr>
-          <w:lang w:val="it-IT"/>
-        </w:rPr>
-        <w:t>felis</w:t>
-      </w:r>
-      <w:proofErr w:type="spellEnd"/>
-      <w:r>
-        <w:rPr>
-          <w:lang w:val="it-IT"/>
-        </w:rPr>
-        <w:t xml:space="preserve"> vitae, </w:t>
-      </w:r>
-      <w:proofErr w:type="spellStart"/>
-      <w:r>
-        <w:rPr>
-          <w:lang w:val="it-IT"/>
-        </w:rPr>
-        <w:t>elementum</w:t>
-      </w:r>
-      <w:proofErr w:type="spellEnd"/>
-      <w:r>
-        <w:rPr>
-          <w:lang w:val="it-IT"/>
-        </w:rPr>
-        <w:t xml:space="preserve"> mi. </w:t>
-      </w:r>
-      <w:r>
-        <w:rPr>
-          <w:lang w:val="fr-BE"/>
-        </w:rPr>
-        <w:t xml:space="preserve">Morbi at </w:t>
-      </w:r>
-      <w:proofErr w:type="spellStart"/>
-      <w:r>
-        <w:rPr>
-          <w:lang w:val="fr-BE"/>
-        </w:rPr>
-        <w:t>dui</w:t>
-      </w:r>
-      <w:proofErr w:type="spellEnd"/>
-      <w:r>
-        <w:rPr>
-          <w:lang w:val="fr-BE"/>
-        </w:rPr>
-        <w:t xml:space="preserve"> </w:t>
-      </w:r>
-      <w:proofErr w:type="spellStart"/>
-      <w:r>
-        <w:rPr>
-          <w:lang w:val="fr-BE"/>
-        </w:rPr>
-        <w:t>sed</w:t>
-      </w:r>
-      <w:proofErr w:type="spellEnd"/>
-      <w:r>
-        <w:rPr>
-          <w:lang w:val="fr-BE"/>
-        </w:rPr>
-        <w:t xml:space="preserve"> </w:t>
-      </w:r>
-      <w:proofErr w:type="spellStart"/>
-      <w:r>
-        <w:rPr>
-          <w:lang w:val="fr-BE"/>
-        </w:rPr>
-        <w:t>lacus</w:t>
-      </w:r>
-      <w:proofErr w:type="spellEnd"/>
-      <w:r>
-        <w:rPr>
-          <w:lang w:val="fr-BE"/>
-        </w:rPr>
-        <w:t xml:space="preserve"> </w:t>
-      </w:r>
-      <w:proofErr w:type="spellStart"/>
-      <w:r>
-        <w:rPr>
-          <w:lang w:val="fr-BE"/>
-        </w:rPr>
-        <w:t>fringilla</w:t>
-      </w:r>
-      <w:proofErr w:type="spellEnd"/>
-      <w:r>
-        <w:rPr>
-          <w:lang w:val="fr-BE"/>
-        </w:rPr>
-        <w:t xml:space="preserve"> </w:t>
-      </w:r>
-      <w:proofErr w:type="spellStart"/>
-      <w:r>
-        <w:rPr>
-          <w:lang w:val="fr-BE"/>
-        </w:rPr>
-        <w:t>condimentum</w:t>
-      </w:r>
-      <w:proofErr w:type="spellEnd"/>
-      <w:r>
-        <w:rPr>
-          <w:lang w:val="fr-BE"/>
-        </w:rPr>
-        <w:t xml:space="preserve">. Duis non </w:t>
-      </w:r>
-      <w:proofErr w:type="spellStart"/>
-      <w:r>
-        <w:rPr>
-          <w:lang w:val="fr-BE"/>
-        </w:rPr>
-        <w:t>odio</w:t>
-      </w:r>
-      <w:proofErr w:type="spellEnd"/>
-      <w:r>
-        <w:rPr>
-          <w:lang w:val="fr-BE"/>
-        </w:rPr>
-        <w:t xml:space="preserve"> </w:t>
-      </w:r>
-      <w:proofErr w:type="spellStart"/>
-      <w:r>
-        <w:rPr>
-          <w:lang w:val="fr-BE"/>
-        </w:rPr>
-        <w:t>ac</w:t>
-      </w:r>
-      <w:proofErr w:type="spellEnd"/>
-      <w:r>
-        <w:rPr>
-          <w:lang w:val="fr-BE"/>
-        </w:rPr>
-        <w:t xml:space="preserve"> </w:t>
-      </w:r>
-      <w:proofErr w:type="spellStart"/>
-      <w:r>
-        <w:rPr>
-          <w:lang w:val="fr-BE"/>
-        </w:rPr>
-        <w:t>arcu</w:t>
-      </w:r>
-      <w:proofErr w:type="spellEnd"/>
-      <w:r>
-        <w:rPr>
-          <w:lang w:val="fr-BE"/>
-        </w:rPr>
-        <w:t xml:space="preserve"> </w:t>
-      </w:r>
-      <w:proofErr w:type="spellStart"/>
-      <w:r>
-        <w:rPr>
-          <w:lang w:val="fr-BE"/>
-        </w:rPr>
-        <w:t>volutpat</w:t>
-      </w:r>
-      <w:proofErr w:type="spellEnd"/>
-      <w:r>
-        <w:rPr>
-          <w:lang w:val="fr-BE"/>
-        </w:rPr>
-        <w:t xml:space="preserve"> </w:t>
-      </w:r>
-      <w:proofErr w:type="spellStart"/>
-      <w:r>
-        <w:rPr>
-          <w:lang w:val="fr-BE"/>
-        </w:rPr>
-        <w:t>vehicula</w:t>
-      </w:r>
-      <w:proofErr w:type="spellEnd"/>
-      <w:r>
-        <w:rPr>
-          <w:lang w:val="fr-BE"/>
-        </w:rPr>
-        <w:t xml:space="preserve"> eu et </w:t>
-      </w:r>
-      <w:proofErr w:type="spellStart"/>
-      <w:r>
-        <w:rPr>
-          <w:lang w:val="fr-BE"/>
-        </w:rPr>
-        <w:t>turpis</w:t>
-      </w:r>
-      <w:proofErr w:type="spellEnd"/>
-      <w:r>
-        <w:rPr>
-          <w:lang w:val="fr-BE"/>
-        </w:rPr>
-        <w:t>.</w:t>
-      </w:r>
-    </w:p>
-    <w:p>
-      <w:proofErr w:type="spellStart"/>
-      <w:r>
-        <w:rPr>
-          <w:lang w:val="it-IT"/>
-        </w:rPr>
-        <w:t>Praesent</w:t>
-      </w:r>
-      <w:proofErr w:type="spellEnd"/>
-      <w:r>
-        <w:rPr>
-          <w:lang w:val="it-IT"/>
-        </w:rPr>
-        <w:t xml:space="preserve"> vitae magna ante. Nulla in orci </w:t>
-      </w:r>
-      <w:proofErr w:type="spellStart"/>
-      <w:r>
-        <w:rPr>
-          <w:lang w:val="it-IT"/>
-        </w:rPr>
-        <w:t>lacus</w:t>
-      </w:r>
-      <w:proofErr w:type="spellEnd"/>
-      <w:r>
-        <w:rPr>
-          <w:lang w:val="it-IT"/>
-        </w:rPr>
-        <w:t xml:space="preserve">. </w:t>
-      </w:r>
-      <w:proofErr w:type="spellStart"/>
-      <w:r>
-        <w:rPr>
-          <w:lang w:val="it-IT"/>
-        </w:rPr>
-        <w:t>Donec</w:t>
-      </w:r>
-      <w:proofErr w:type="spellEnd"/>
-      <w:r>
-        <w:rPr>
-          <w:lang w:val="it-IT"/>
-        </w:rPr>
-        <w:t xml:space="preserve"> </w:t>
-      </w:r>
-      <w:proofErr w:type="spellStart"/>
-      <w:r>
-        <w:rPr>
-          <w:lang w:val="it-IT"/>
-        </w:rPr>
-        <w:t>quis</w:t>
-      </w:r>
-      <w:proofErr w:type="spellEnd"/>
-      <w:r>
-        <w:rPr>
-          <w:lang w:val="it-IT"/>
-        </w:rPr>
-        <w:t xml:space="preserve"> </w:t>
-      </w:r>
-      <w:proofErr w:type="spellStart"/>
-      <w:r>
-        <w:rPr>
-          <w:lang w:val="it-IT"/>
-        </w:rPr>
-        <w:t>vestibulum</w:t>
-      </w:r>
-      <w:proofErr w:type="spellEnd"/>
-      <w:r>
-        <w:rPr>
-          <w:lang w:val="it-IT"/>
-        </w:rPr>
-        <w:t xml:space="preserve"> mi. Sed </w:t>
-      </w:r>
-      <w:proofErr w:type="spellStart"/>
-      <w:r>
-        <w:rPr>
-          <w:lang w:val="it-IT"/>
-        </w:rPr>
-        <w:t>ipsum</w:t>
-      </w:r>
-      <w:proofErr w:type="spellEnd"/>
-      <w:r>
-        <w:rPr>
-          <w:lang w:val="it-IT"/>
-        </w:rPr>
-        <w:t xml:space="preserve"> </w:t>
-      </w:r>
-      <w:proofErr w:type="spellStart"/>
-      <w:r>
-        <w:rPr>
-          <w:lang w:val="it-IT"/>
-        </w:rPr>
-        <w:t>sapien</w:t>
-      </w:r>
-      <w:proofErr w:type="spellEnd"/>
-      <w:r>
-        <w:rPr>
-          <w:lang w:val="it-IT"/>
-        </w:rPr>
-        <w:t xml:space="preserve">, </w:t>
-      </w:r>
-      <w:proofErr w:type="spellStart"/>
-      <w:r>
-        <w:rPr>
-          <w:lang w:val="it-IT"/>
-        </w:rPr>
-        <w:t>pretium</w:t>
-      </w:r>
-      <w:proofErr w:type="spellEnd"/>
-      <w:r>
-        <w:rPr>
-          <w:lang w:val="it-IT"/>
-        </w:rPr>
-        <w:t xml:space="preserve"> </w:t>
-      </w:r>
-      <w:proofErr w:type="spellStart"/>
-      <w:r>
-        <w:rPr>
-          <w:lang w:val="it-IT"/>
-        </w:rPr>
-        <w:t>maximus</w:t>
-      </w:r>
-      <w:proofErr w:type="spellEnd"/>
-      <w:r>
-        <w:rPr>
-          <w:lang w:val="it-IT"/>
-        </w:rPr>
-        <w:t xml:space="preserve"> </w:t>
-      </w:r>
-      <w:proofErr w:type="spellStart"/>
-      <w:r>
-        <w:rPr>
-          <w:lang w:val="it-IT"/>
-        </w:rPr>
-        <w:t>purus</w:t>
-      </w:r>
-      <w:proofErr w:type="spellEnd"/>
-      <w:r>
-        <w:rPr>
-          <w:lang w:val="it-IT"/>
-        </w:rPr>
-        <w:t xml:space="preserve"> sed, </w:t>
-      </w:r>
-      <w:proofErr w:type="spellStart"/>
-      <w:r>
-        <w:rPr>
-          <w:lang w:val="it-IT"/>
-        </w:rPr>
-        <w:t>bibendum</w:t>
-      </w:r>
-      <w:proofErr w:type="spellEnd"/>
-      <w:r>
-        <w:rPr>
-          <w:lang w:val="it-IT"/>
-        </w:rPr>
-        <w:t xml:space="preserve"> </w:t>
-      </w:r>
-      <w:proofErr w:type="spellStart"/>
-      <w:r>
-        <w:rPr>
-          <w:lang w:val="it-IT"/>
-        </w:rPr>
-        <w:t>consequat</w:t>
-      </w:r>
-      <w:proofErr w:type="spellEnd"/>
-      <w:r>
-        <w:rPr>
-          <w:lang w:val="it-IT"/>
-        </w:rPr>
-        <w:t xml:space="preserve"> </w:t>
-      </w:r>
-      <w:proofErr w:type="spellStart"/>
-      <w:r>
-        <w:rPr>
-          <w:lang w:val="it-IT"/>
-        </w:rPr>
-        <w:t>lectus</w:t>
-      </w:r>
-      <w:proofErr w:type="spellEnd"/>
-      <w:r>
-        <w:rPr>
-          <w:lang w:val="it-IT"/>
-        </w:rPr>
-        <w:t xml:space="preserve">. </w:t>
-      </w:r>
-      <w:proofErr w:type="spellStart"/>
-      <w:r>
-        <w:rPr>
-          <w:lang w:val="it-IT"/>
-        </w:rPr>
-        <w:t>Aliquam</w:t>
-      </w:r>
-      <w:proofErr w:type="spellEnd"/>
-      <w:r>
-        <w:rPr>
-          <w:lang w:val="it-IT"/>
-        </w:rPr>
-        <w:t xml:space="preserve"> </w:t>
-      </w:r>
-      <w:proofErr w:type="spellStart"/>
-      <w:r>
-        <w:rPr>
-          <w:lang w:val="it-IT"/>
-        </w:rPr>
-        <w:t>porttitor</w:t>
-      </w:r>
-      <w:proofErr w:type="spellEnd"/>
-      <w:r>
-        <w:rPr>
-          <w:lang w:val="it-IT"/>
-        </w:rPr>
-        <w:t xml:space="preserve"> </w:t>
-      </w:r>
-      <w:proofErr w:type="spellStart"/>
-      <w:r>
-        <w:rPr>
-          <w:lang w:val="it-IT"/>
-        </w:rPr>
-        <w:t>dolor</w:t>
-      </w:r>
-      <w:proofErr w:type="spellEnd"/>
-      <w:r>
-        <w:rPr>
-          <w:lang w:val="it-IT"/>
-        </w:rPr>
-        <w:t xml:space="preserve"> </w:t>
-      </w:r>
-      <w:proofErr w:type="spellStart"/>
-      <w:r>
-        <w:rPr>
-          <w:lang w:val="it-IT"/>
-        </w:rPr>
-        <w:t>eu</w:t>
-      </w:r>
-      <w:proofErr w:type="spellEnd"/>
-      <w:r>
-        <w:rPr>
-          <w:lang w:val="it-IT"/>
-        </w:rPr>
-        <w:t xml:space="preserve"> gravida </w:t>
-      </w:r>
-      <w:proofErr w:type="spellStart"/>
-      <w:r>
-        <w:rPr>
-          <w:lang w:val="it-IT"/>
-        </w:rPr>
-        <w:t>vulputate</w:t>
-      </w:r>
-      <w:proofErr w:type="spellEnd"/>
-      <w:r>
-        <w:rPr>
-          <w:lang w:val="it-IT"/>
-        </w:rPr>
-        <w:t xml:space="preserve">. </w:t>
-      </w:r>
-      <w:r>
-        <w:t xml:space="preserve">Vestibulum </w:t>
-      </w:r>
-      <w:proofErr w:type="spellStart"/>
-      <w:r>
-        <w:t>ut</w:t>
-      </w:r>
-      <w:proofErr w:type="spellEnd"/>
-      <w:r>
-        <w:t xml:space="preserve"> </w:t>
-      </w:r>
-      <w:proofErr w:type="spellStart"/>
-      <w:r>
-        <w:t>urna</w:t>
-      </w:r>
-      <w:proofErr w:type="spellEnd"/>
-      <w:r>
-        <w:t xml:space="preserve"> </w:t>
-      </w:r>
-      <w:proofErr w:type="spellStart"/>
-      <w:r>
-        <w:t>eget</w:t>
-      </w:r>
-      <w:proofErr w:type="spellEnd"/>
-      <w:r>
-        <w:t xml:space="preserve"> </w:t>
-      </w:r>
-      <w:proofErr w:type="spellStart"/>
-      <w:r>
-        <w:t>massa</w:t>
-      </w:r>
-      <w:proofErr w:type="spellEnd"/>
-      <w:r>
-        <w:t xml:space="preserve"> </w:t>
-      </w:r>
-      <w:proofErr w:type="spellStart"/>
-      <w:r>
-        <w:t>tincidunt</w:t>
-      </w:r>
-      <w:proofErr w:type="spellEnd"/>
-      <w:r>
-        <w:t xml:space="preserve"> </w:t>
-      </w:r>
-      <w:proofErr w:type="spellStart"/>
-      <w:r>
-        <w:t>ultricies</w:t>
-      </w:r>
-      <w:proofErr w:type="spellEnd"/>
-      <w:r>
-        <w:t xml:space="preserve">. Morbi </w:t>
-      </w:r>
-      <w:proofErr w:type="spellStart"/>
-      <w:r>
-        <w:t>hendrerit</w:t>
-      </w:r>
-      <w:proofErr w:type="spellEnd"/>
-      <w:r>
-        <w:t xml:space="preserve"> </w:t>
-      </w:r>
-      <w:proofErr w:type="spellStart"/>
-      <w:r>
-        <w:t>sapien</w:t>
-      </w:r>
-      <w:proofErr w:type="spellEnd"/>
-      <w:r>
-        <w:t xml:space="preserve"> at diam </w:t>
-      </w:r>
-      <w:proofErr w:type="spellStart"/>
-      <w:r>
-        <w:t>tincidunt</w:t>
-      </w:r>
-      <w:proofErr w:type="spellEnd"/>
-      <w:r>
-        <w:t xml:space="preserve"> semper. </w:t>
-      </w:r>
-      <w:proofErr w:type="spellStart"/>
-      <w:r>
-        <w:t>Aliquam</w:t>
-      </w:r>
-      <w:proofErr w:type="spellEnd"/>
-      <w:r>
-        <w:t xml:space="preserve"> </w:t>
-      </w:r>
-      <w:proofErr w:type="spellStart"/>
-      <w:r>
-        <w:t>ut</w:t>
-      </w:r>
-      <w:proofErr w:type="spellEnd"/>
-      <w:r>
-        <w:t xml:space="preserve"> </w:t>
-      </w:r>
-      <w:proofErr w:type="spellStart"/>
-      <w:r>
-        <w:t>quam</w:t>
-      </w:r>
-      <w:proofErr w:type="spellEnd"/>
-      <w:r>
-        <w:t xml:space="preserve"> dictum </w:t>
-      </w:r>
-      <w:proofErr w:type="spellStart"/>
-      <w:r>
-        <w:t>quam</w:t>
-      </w:r>
-      <w:proofErr w:type="spellEnd"/>
-      <w:r>
-        <w:t xml:space="preserve"> maximus </w:t>
-      </w:r>
-      <w:proofErr w:type="spellStart"/>
-      <w:r>
-        <w:t>tempor</w:t>
-      </w:r>
-      <w:proofErr w:type="spellEnd"/>
-      <w:r>
-        <w:t xml:space="preserve"> sed at </w:t>
-      </w:r>
-      <w:proofErr w:type="spellStart"/>
-      <w:r>
-        <w:t>felis</w:t>
-      </w:r>
-      <w:proofErr w:type="spellEnd"/>
-      <w:r>
-        <w:t>.</w:t>
+        <w:t xml:space="preserve">Praesent vitae magna ante. Nulla in orci lacus. Donec quis vestibulum mi. Sed ipsum sapien, pretium maximus purus sed, bibendum consequat lectus. Aliquam porttitor dolor eu gravida vulputate. </w:t>
+      </w:r>
+      <w:r>
+        <w:t>Vestibulum ut urna eget massa tincidunt ultricies. Morbi hendrerit sapien at diam tincidunt semper. Aliquam ut quam dictum quam maximus tempor sed at felis.</w:t>
       </w:r>
     </w:p>
     <w:p/>
@@ -8837,21 +7709,7 @@
         <w:rPr>
           <w:lang w:val="fr-BE"/>
         </w:rPr>
-        <w:t xml:space="preserve">[Online]. </w:t>
-      </w:r>
-      <w:proofErr w:type="spellStart"/>
-      <w:r>
-        <w:rPr>
-          <w:lang w:val="fr-BE"/>
-        </w:rPr>
-        <w:t>Available</w:t>
-      </w:r>
-      <w:proofErr w:type="spellEnd"/>
-      <w:r>
-        <w:rPr>
-          <w:lang w:val="fr-BE"/>
-        </w:rPr>
-        <w:t xml:space="preserve">: </w:t>
+        <w:t xml:space="preserve">[Online]. Available: </w:t>
       </w:r>
       <w:hyperlink r:id="rId40" w:history="1">
         <w:r>
@@ -8888,21 +7746,7 @@
         <w:rPr>
           <w:lang w:val="fr-BE"/>
         </w:rPr>
-        <w:t xml:space="preserve">[Online]. </w:t>
-      </w:r>
-      <w:proofErr w:type="spellStart"/>
-      <w:r>
-        <w:rPr>
-          <w:lang w:val="fr-BE"/>
-        </w:rPr>
-        <w:t>Available</w:t>
-      </w:r>
-      <w:proofErr w:type="spellEnd"/>
-      <w:r>
-        <w:rPr>
-          <w:lang w:val="fr-BE"/>
-        </w:rPr>
-        <w:t xml:space="preserve">: </w:t>
+        <w:t xml:space="preserve">[Online]. Available: </w:t>
       </w:r>
       <w:hyperlink r:id="rId41" w:history="1">
         <w:r>
@@ -8994,21 +7838,7 @@
         <w:rPr>
           <w:lang w:val="fr-BE"/>
         </w:rPr>
-        <w:t xml:space="preserve">[Online]. </w:t>
-      </w:r>
-      <w:proofErr w:type="spellStart"/>
-      <w:r>
-        <w:rPr>
-          <w:lang w:val="fr-BE"/>
-        </w:rPr>
-        <w:t>Available</w:t>
-      </w:r>
-      <w:proofErr w:type="spellEnd"/>
-      <w:r>
-        <w:rPr>
-          <w:lang w:val="fr-BE"/>
-        </w:rPr>
-        <w:t xml:space="preserve">: </w:t>
+        <w:t xml:space="preserve">[Online]. Available: </w:t>
       </w:r>
       <w:hyperlink r:id="rId42" w:history="1">
         <w:r>
@@ -9038,15 +7868,7 @@
         </w:rPr>
       </w:pPr>
       <w:r>
-        <w:t xml:space="preserve">‘What’s the Difference Between Ray Casting, Ray Tracing, Path Tracing and Rasterization? Physical light tracing… – </w:t>
-      </w:r>
-      <w:proofErr w:type="spellStart"/>
-      <w:r>
-        <w:t>pIXELsHAM</w:t>
-      </w:r>
-      <w:proofErr w:type="spellEnd"/>
-      <w:r>
-        <w:t xml:space="preserve">’. Accessed: Aug. 17, 2025. [Online]. Available: </w:t>
+        <w:t xml:space="preserve">‘What’s the Difference Between Ray Casting, Ray Tracing, Path Tracing and Rasterization? Physical light tracing… – pIXELsHAM’. Accessed: Aug. 17, 2025. [Online]. Available: </w:t>
       </w:r>
       <w:hyperlink r:id="rId43" w:history="1">
         <w:r>
@@ -9079,35 +7901,13 @@
         </w:rPr>
       </w:pPr>
       <w:r>
-        <w:t>‘</w:t>
-      </w:r>
-      <w:proofErr w:type="spellStart"/>
-      <w:r>
-        <w:t>LearnOpenGL</w:t>
-      </w:r>
-      <w:proofErr w:type="spellEnd"/>
-      <w:r>
-        <w:t xml:space="preserve"> - Deferred Shading’. Accessed: Aug. 15, 2025. </w:t>
+        <w:t xml:space="preserve">‘LearnOpenGL - Deferred Shading’. Accessed: Aug. 15, 2025. </w:t>
       </w:r>
       <w:r>
         <w:rPr>
           <w:lang w:val="fr-BE"/>
         </w:rPr>
-        <w:t xml:space="preserve">[Online]. </w:t>
-      </w:r>
-      <w:proofErr w:type="spellStart"/>
-      <w:r>
-        <w:rPr>
-          <w:lang w:val="fr-BE"/>
-        </w:rPr>
-        <w:t>Available</w:t>
-      </w:r>
-      <w:proofErr w:type="spellEnd"/>
-      <w:r>
-        <w:rPr>
-          <w:lang w:val="fr-BE"/>
-        </w:rPr>
-        <w:t xml:space="preserve">: </w:t>
+        <w:t xml:space="preserve">[Online]. Available: </w:t>
       </w:r>
       <w:hyperlink r:id="rId44" w:history="1">
         <w:r>
@@ -9115,21 +7915,7 @@
             <w:rStyle w:val="Hyperlink"/>
             <w:lang w:val="fr-BE"/>
           </w:rPr>
-          <w:t>https://learnopengl.com/Advanced-Lighting</w:t>
-        </w:r>
-        <w:r>
-          <w:rPr>
-            <w:rStyle w:val="Hyperlink"/>
-            <w:lang w:val="fr-BE"/>
-          </w:rPr>
-          <w:t>/</w:t>
-        </w:r>
-        <w:r>
-          <w:rPr>
-            <w:rStyle w:val="Hyperlink"/>
-            <w:lang w:val="fr-BE"/>
-          </w:rPr>
-          <w:t>Deferred-Shading</w:t>
+          <w:t>https://learnopengl.com/Advanced-Lighting/Deferred-Shading</w:t>
         </w:r>
       </w:hyperlink>
     </w:p>
@@ -9138,26 +7924,12 @@
         <w:jc w:val="right"/>
       </w:pPr>
       <w:r>
-        <w:t>[</w:t>
-      </w:r>
-      <w:r>
-        <w:t>7</w:t>
-      </w:r>
-      <w:r>
-        <w:t>]</w:t>
-      </w:r>
-    </w:p>
-    <w:p>
-      <w:r>
-        <w:t xml:space="preserve">D. </w:t>
-      </w:r>
-      <w:proofErr w:type="spellStart"/>
-      <w:r>
-        <w:t>Lettier</w:t>
-      </w:r>
-      <w:proofErr w:type="spellEnd"/>
-      <w:r>
-        <w:t xml:space="preserve">, ‘Deferred Rendering | 3D Game Shaders For Beginners’. Accessed: Aug. 17, 2025. [Online]. Available: </w:t>
+        <w:t>[7]</w:t>
+      </w:r>
+    </w:p>
+    <w:p>
+      <w:r>
+        <w:t xml:space="preserve">D. Lettier, ‘Deferred Rendering | 3D Game Shaders For Beginners’. Accessed: Aug. 17, 2025. [Online]. Available: </w:t>
       </w:r>
       <w:hyperlink r:id="rId45" w:history="1">
         <w:r>
@@ -9170,6 +7942,21 @@
     </w:p>
     <w:p>
       <w:pPr>
+        <w:jc w:val="right"/>
+      </w:pPr>
+      <w:r>
+        <w:lastRenderedPageBreak/>
+        <w:t>[</w:t>
+      </w:r>
+      <w:r>
+        <w:t>8</w:t>
+      </w:r>
+      <w:r>
+        <w:t>]</w:t>
+      </w:r>
+    </w:p>
+    <w:p>
+      <w:pPr>
         <w:rPr>
           <w:rStyle w:val="SubtleEmphasis"/>
           <w:i w:val="0"/>
@@ -9177,6 +7964,27 @@
           <w:color w:val="auto"/>
         </w:rPr>
       </w:pPr>
+      <w:r>
+        <w:t xml:space="preserve">GetIntoGameDev, </w:t>
+      </w:r>
+      <w:r>
+        <w:rPr>
+          <w:i/>
+          <w:iCs/>
+        </w:rPr>
+        <w:t>What is a Z Prepass?</w:t>
+      </w:r>
+      <w:r>
+        <w:t xml:space="preserve">, (June 14, 2023). Accessed: Aug. 17, 2025. [Online Video]. Available: </w:t>
+      </w:r>
+      <w:hyperlink r:id="rId46" w:history="1">
+        <w:r>
+          <w:rPr>
+            <w:rStyle w:val="Hyperlink"/>
+          </w:rPr>
+          <w:t>https://www.youtube.com/watch?v=2ZK527cQbeo</w:t>
+        </w:r>
+      </w:hyperlink>
     </w:p>
     <w:p>
       <w:pPr>
@@ -9186,7 +7994,7 @@
         <w:t>[</w:t>
       </w:r>
       <w:r>
-        <w:t>8</w:t>
+        <w:t>9</w:t>
       </w:r>
       <w:r>
         <w:t>]</w:t>
@@ -9219,23 +8027,9 @@
         <w:rPr>
           <w:lang w:val="fr-BE"/>
         </w:rPr>
-        <w:t xml:space="preserve">[Online]. </w:t>
-      </w:r>
-      <w:proofErr w:type="spellStart"/>
-      <w:r>
-        <w:rPr>
-          <w:lang w:val="fr-BE"/>
-        </w:rPr>
-        <w:t>Available</w:t>
-      </w:r>
-      <w:proofErr w:type="spellEnd"/>
-      <w:r>
-        <w:rPr>
-          <w:lang w:val="fr-BE"/>
-        </w:rPr>
-        <w:t xml:space="preserve">: </w:t>
-      </w:r>
-      <w:hyperlink r:id="rId46" w:history="1">
+        <w:t xml:space="preserve">[Online]. Available: </w:t>
+      </w:r>
+      <w:hyperlink r:id="rId47" w:history="1">
         <w:r>
           <w:rPr>
             <w:rStyle w:val="Hyperlink"/>
@@ -9262,7 +8056,7 @@
         <w:rPr>
           <w:lang w:val="fr-BE"/>
         </w:rPr>
-        <w:t>9</w:t>
+        <w:t>10</w:t>
       </w:r>
       <w:r>
         <w:rPr>
@@ -9281,26 +8075,12 @@
         <w:rPr>
           <w:lang w:val="fr-BE"/>
         </w:rPr>
-        <w:t xml:space="preserve">[Online]. </w:t>
-      </w:r>
-      <w:proofErr w:type="spellStart"/>
+        <w:t xml:space="preserve">[Online]. Available: </w:t>
+      </w:r>
       <w:r>
         <w:rPr>
           <w:lang w:val="fr-BE"/>
         </w:rPr>
-        <w:t>Available</w:t>
-      </w:r>
-      <w:proofErr w:type="spellEnd"/>
-      <w:r>
-        <w:rPr>
-          <w:lang w:val="fr-BE"/>
-        </w:rPr>
-        <w:t xml:space="preserve">: </w:t>
-      </w:r>
-      <w:r>
-        <w:rPr>
-          <w:lang w:val="fr-BE"/>
-        </w:rPr>
         <w:t xml:space="preserve">https://citeseerx.ist.psu.edu/document?repid=rep1&amp;type=pdf&amp;doi=393a84a1eb9c1c5605a5944f909ff86eb3eb0eac#page=41 </w:t>
       </w:r>
     </w:p>
@@ -9321,7 +8101,13 @@
         <w:rPr>
           <w:lang w:val="en-GB"/>
         </w:rPr>
-        <w:t>10</w:t>
+        <w:t>1</w:t>
+      </w:r>
+      <w:r>
+        <w:rPr>
+          <w:lang w:val="en-GB"/>
+        </w:rPr>
+        <w:t>1</w:t>
       </w:r>
       <w:r>
         <w:rPr>
@@ -9349,21 +8135,13 @@
       <w:r>
         <w:t xml:space="preserve">. May 23, 2025. Accessed: Aug. 05, 2025. [Online]. </w:t>
       </w:r>
-      <w:proofErr w:type="spellStart"/>
       <w:r>
         <w:rPr>
           <w:lang w:val="fr-BE"/>
         </w:rPr>
-        <w:t>Available</w:t>
-      </w:r>
-      <w:proofErr w:type="spellEnd"/>
-      <w:r>
-        <w:rPr>
-          <w:lang w:val="fr-BE"/>
-        </w:rPr>
-        <w:t xml:space="preserve">: </w:t>
-      </w:r>
-      <w:hyperlink r:id="rId47" w:anchor="cite_note-6" w:history="1">
+        <w:t xml:space="preserve">Available: </w:t>
+      </w:r>
+      <w:hyperlink r:id="rId48" w:anchor="cite_note-6" w:history="1">
         <w:r>
           <w:rPr>
             <w:rStyle w:val="Hyperlink"/>
@@ -9384,7 +8162,7 @@
         <w:t>1</w:t>
       </w:r>
       <w:r>
-        <w:t>1</w:t>
+        <w:t>2</w:t>
       </w:r>
       <w:r>
         <w:t>]</w:t>
@@ -9394,7 +8172,7 @@
       <w:r>
         <w:t xml:space="preserve">‘Figure 4: Comparison of the soft shadow mapping problem to the...’, ResearchGate. Accessed: Aug. 15, 2025. [Online]. Available: </w:t>
       </w:r>
-      <w:hyperlink r:id="rId48" w:history="1">
+      <w:hyperlink r:id="rId49" w:history="1">
         <w:r>
           <w:rPr>
             <w:rStyle w:val="Hyperlink"/>
@@ -9426,7 +8204,7 @@
         <w:rPr>
           <w:lang w:val="it-IT"/>
         </w:rPr>
-        <w:t>2</w:t>
+        <w:t>3</w:t>
       </w:r>
       <w:r>
         <w:rPr>
@@ -9440,35 +8218,7 @@
         <w:rPr>
           <w:lang w:val="it-IT"/>
         </w:rPr>
-        <w:t xml:space="preserve">‘Screen </w:t>
-      </w:r>
-      <w:proofErr w:type="spellStart"/>
-      <w:r>
-        <w:rPr>
-          <w:lang w:val="it-IT"/>
-        </w:rPr>
-        <w:t>space</w:t>
-      </w:r>
-      <w:proofErr w:type="spellEnd"/>
-      <w:r>
-        <w:rPr>
-          <w:lang w:val="it-IT"/>
-        </w:rPr>
-        <w:t xml:space="preserve"> ambient </w:t>
-      </w:r>
-      <w:proofErr w:type="spellStart"/>
-      <w:r>
-        <w:rPr>
-          <w:lang w:val="it-IT"/>
-        </w:rPr>
-        <w:t>occlusion</w:t>
-      </w:r>
-      <w:proofErr w:type="spellEnd"/>
-      <w:r>
-        <w:rPr>
-          <w:lang w:val="it-IT"/>
-        </w:rPr>
-        <w:t xml:space="preserve">’, </w:t>
+        <w:t xml:space="preserve">‘Screen space ambient occlusion’, </w:t>
       </w:r>
       <w:r>
         <w:rPr>
@@ -9487,7 +8237,7 @@
       <w:r>
         <w:t xml:space="preserve">Apr. 14, 2025. Accessed: Aug. 15, 2025. [Online]. Available: </w:t>
       </w:r>
-      <w:hyperlink r:id="rId49" w:history="1">
+      <w:hyperlink r:id="rId50" w:history="1">
         <w:r>
           <w:rPr>
             <w:rStyle w:val="Hyperlink"/>
@@ -9635,7 +8385,7 @@
         </w:rPr>
         <w:br/>
       </w:r>
-      <w:hyperlink r:id="rId50" w:history="1">
+      <w:hyperlink r:id="rId51" w:history="1">
         <w:r>
           <w:rPr>
             <w:rStyle w:val="Hyperlink"/>
@@ -9649,8 +8399,8 @@
     <w:p/>
     <w:p/>
     <w:sectPr>
-      <w:headerReference w:type="default" r:id="rId51"/>
-      <w:footerReference w:type="default" r:id="rId52"/>
+      <w:headerReference w:type="default" r:id="rId52"/>
+      <w:footerReference w:type="default" r:id="rId53"/>
       <w:pgSz w:w="12240" w:h="15840"/>
       <w:pgMar w:top="1440" w:right="1440" w:bottom="1440" w:left="1440" w:header="720" w:footer="720" w:gutter="0"/>
       <w:pgNumType w:start="0"/>
@@ -9700,13 +8450,13 @@
       <w:t>202</w:t>
     </w:r>
     <w:r>
-      <w:t>3</w:t>
+      <w:t>4</w:t>
     </w:r>
     <w:r>
       <w:t>-202</w:t>
     </w:r>
     <w:r>
-      <w:t>4</w:t>
+      <w:t>5</w:t>
     </w:r>
     <w:r>
       <w:tab/>
@@ -14058,6 +12808,7 @@
     <w:rsid w:val="00A6705E"/>
     <w:rsid w:val="00B509FF"/>
     <w:rsid w:val="00BF7836"/>
+    <w:rsid w:val="00C46E45"/>
     <w:rsid w:val="00C6699E"/>
     <w:rsid w:val="00C857E2"/>
     <w:rsid w:val="00D869C4"/>
@@ -14797,6 +13548,34 @@
 </file>
 
 <file path=customXml/item1.xml><?xml version="1.0" encoding="utf-8"?>
+<?mso-contentType ?>
+<FormTemplates xmlns="http://schemas.microsoft.com/sharepoint/v3/contenttype/forms">
+  <Display>DocumentLibraryForm</Display>
+  <Edit>DocumentLibraryForm</Edit>
+  <New>DocumentLibraryForm</New>
+</FormTemplates>
+</file>
+
+<file path=customXml/item2.xml><?xml version="1.0" encoding="utf-8"?>
+<b:Sources xmlns:b="http://schemas.openxmlformats.org/officeDocument/2006/bibliography" xmlns="http://schemas.openxmlformats.org/officeDocument/2006/bibliography" SelectedStyle="\APASixthEditionOfficeOnline.xsl" StyleName="APA" Version="6"/>
+</file>
+
+<file path=customXml/item3.xml><?xml version="1.0" encoding="utf-8"?>
+<p:properties xmlns:p="http://schemas.microsoft.com/office/2006/metadata/properties" xmlns:xsi="http://www.w3.org/2001/XMLSchema-instance" xmlns:pc="http://schemas.microsoft.com/office/infopath/2007/PartnerControls">
+  <documentManagement>
+    <IconOverlay xmlns="http://schemas.microsoft.com/sharepoint/v4" xsi:nil="true"/>
+    <TaxCatchAll xmlns="128482ec-0431-40d5-ab26-89ea2a4f3ccd" xsi:nil="true"/>
+    <m99485b88215436a82099f8287cba0b0 xmlns="128482ec-0431-40d5-ab26-89ea2a4f3ccd">
+      <Terms xmlns="http://schemas.microsoft.com/office/infopath/2007/PartnerControls"/>
+    </m99485b88215436a82099f8287cba0b0>
+    <lcf76f155ced4ddcb4097134ff3c332f xmlns="60eb0cf4-ae2a-4762-800a-cb593b869ecb">
+      <Terms xmlns="http://schemas.microsoft.com/office/infopath/2007/PartnerControls"/>
+    </lcf76f155ced4ddcb4097134ff3c332f>
+  </documentManagement>
+</p:properties>
+</file>
+
+<file path=customXml/item4.xml><?xml version="1.0" encoding="utf-8"?>
 <ct:contentTypeSchema xmlns:ct="http://schemas.microsoft.com/office/2006/metadata/contentType" xmlns:ma="http://schemas.microsoft.com/office/2006/metadata/properties/metaAttributes" ct:_="" ma:_="" ma:contentTypeName="Document" ma:contentTypeID="0x010100723942CCEB3A674D8F1F6472CCEFB38E" ma:contentTypeVersion="11" ma:contentTypeDescription="Create a new document." ma:contentTypeScope="" ma:versionID="e4de40d148e029d40e3aaddc8bf68a5e">
   <xsd:schema xmlns:xsd="http://www.w3.org/2001/XMLSchema" xmlns:xs="http://www.w3.org/2001/XMLSchema" xmlns:p="http://schemas.microsoft.com/office/2006/metadata/properties" xmlns:ns2="128482ec-0431-40d5-ab26-89ea2a4f3ccd" xmlns:ns3="60eb0cf4-ae2a-4762-800a-cb593b869ecb" xmlns:ns4="http://schemas.microsoft.com/sharepoint/v4" xmlns:ns5="a2e691a9-fcfc-4d85-a390-1894fe98bd9e" targetNamespace="http://schemas.microsoft.com/office/2006/metadata/properties" ma:root="true" ma:fieldsID="fce8e8bd091658f3fe51b22d57dec109" ns2:_="" ns3:_="" ns4:_="" ns5:_="">
     <xsd:import namespace="128482ec-0431-40d5-ab26-89ea2a4f3ccd"/>
@@ -15069,35 +13848,35 @@
 </ct:contentTypeSchema>
 </file>
 
-<file path=customXml/item2.xml><?xml version="1.0" encoding="utf-8"?>
-<?mso-contentType ?>
-<FormTemplates xmlns="http://schemas.microsoft.com/sharepoint/v3/contenttype/forms">
-  <Display>DocumentLibraryForm</Display>
-  <Edit>DocumentLibraryForm</Edit>
-  <New>DocumentLibraryForm</New>
-</FormTemplates>
+<file path=customXml/itemProps1.xml><?xml version="1.0" encoding="utf-8"?>
+<ds:datastoreItem xmlns:ds="http://schemas.openxmlformats.org/officeDocument/2006/customXml" ds:itemID="{5EBBBFF2-2B1E-4E2A-81ED-02FB13488392}">
+  <ds:schemaRefs>
+    <ds:schemaRef ds:uri="http://schemas.microsoft.com/sharepoint/v3/contenttype/forms"/>
+  </ds:schemaRefs>
+</ds:datastoreItem>
 </file>
 
-<file path=customXml/item3.xml><?xml version="1.0" encoding="utf-8"?>
-<p:properties xmlns:p="http://schemas.microsoft.com/office/2006/metadata/properties" xmlns:xsi="http://www.w3.org/2001/XMLSchema-instance" xmlns:pc="http://schemas.microsoft.com/office/infopath/2007/PartnerControls">
-  <documentManagement>
-    <IconOverlay xmlns="http://schemas.microsoft.com/sharepoint/v4" xsi:nil="true"/>
-    <TaxCatchAll xmlns="128482ec-0431-40d5-ab26-89ea2a4f3ccd" xsi:nil="true"/>
-    <m99485b88215436a82099f8287cba0b0 xmlns="128482ec-0431-40d5-ab26-89ea2a4f3ccd">
-      <Terms xmlns="http://schemas.microsoft.com/office/infopath/2007/PartnerControls"/>
-    </m99485b88215436a82099f8287cba0b0>
-    <lcf76f155ced4ddcb4097134ff3c332f xmlns="60eb0cf4-ae2a-4762-800a-cb593b869ecb">
-      <Terms xmlns="http://schemas.microsoft.com/office/infopath/2007/PartnerControls"/>
-    </lcf76f155ced4ddcb4097134ff3c332f>
-  </documentManagement>
-</p:properties>
+<file path=customXml/itemProps2.xml><?xml version="1.0" encoding="utf-8"?>
+<ds:datastoreItem xmlns:ds="http://schemas.openxmlformats.org/officeDocument/2006/customXml" ds:itemID="{9FB24B6F-1995-495D-B4E9-64B4DC9866CE}">
+  <ds:schemaRefs>
+    <ds:schemaRef ds:uri="http://schemas.openxmlformats.org/officeDocument/2006/bibliography"/>
+  </ds:schemaRefs>
+</ds:datastoreItem>
 </file>
 
-<file path=customXml/item4.xml><?xml version="1.0" encoding="utf-8"?>
-<b:Sources xmlns:b="http://schemas.openxmlformats.org/officeDocument/2006/bibliography" xmlns="http://schemas.openxmlformats.org/officeDocument/2006/bibliography" SelectedStyle="\APASixthEditionOfficeOnline.xsl" StyleName="APA" Version="6"/>
+<file path=customXml/itemProps3.xml><?xml version="1.0" encoding="utf-8"?>
+<ds:datastoreItem xmlns:ds="http://schemas.openxmlformats.org/officeDocument/2006/customXml" ds:itemID="{0744C301-BA8E-4358-811D-299431B59409}">
+  <ds:schemaRefs>
+    <ds:schemaRef ds:uri="http://schemas.microsoft.com/office/2006/metadata/properties"/>
+    <ds:schemaRef ds:uri="http://schemas.microsoft.com/office/infopath/2007/PartnerControls"/>
+    <ds:schemaRef ds:uri="http://schemas.microsoft.com/sharepoint/v4"/>
+    <ds:schemaRef ds:uri="128482ec-0431-40d5-ab26-89ea2a4f3ccd"/>
+    <ds:schemaRef ds:uri="60eb0cf4-ae2a-4762-800a-cb593b869ecb"/>
+  </ds:schemaRefs>
+</ds:datastoreItem>
 </file>
 
-<file path=customXml/itemProps1.xml><?xml version="1.0" encoding="utf-8"?>
+<file path=customXml/itemProps4.xml><?xml version="1.0" encoding="utf-8"?>
 <ds:datastoreItem xmlns:ds="http://schemas.openxmlformats.org/officeDocument/2006/customXml" ds:itemID="{6AD6E667-9FE3-44F6-AA83-894C6D5E44A5}">
   <ds:schemaRefs>
     <ds:schemaRef ds:uri="http://schemas.microsoft.com/office/2006/metadata/contentType"/>
@@ -15116,32 +13895,4 @@
     <ds:schemaRef ds:uri="http://schemas.microsoft.com/internal/obd"/>
   </ds:schemaRefs>
 </ds:datastoreItem>
-</file>
-
-<file path=customXml/itemProps2.xml><?xml version="1.0" encoding="utf-8"?>
-<ds:datastoreItem xmlns:ds="http://schemas.openxmlformats.org/officeDocument/2006/customXml" ds:itemID="{5EBBBFF2-2B1E-4E2A-81ED-02FB13488392}">
-  <ds:schemaRefs>
-    <ds:schemaRef ds:uri="http://schemas.microsoft.com/sharepoint/v3/contenttype/forms"/>
-  </ds:schemaRefs>
-</ds:datastoreItem>
-</file>
-
-<file path=customXml/itemProps3.xml><?xml version="1.0" encoding="utf-8"?>
-<ds:datastoreItem xmlns:ds="http://schemas.openxmlformats.org/officeDocument/2006/customXml" ds:itemID="{0744C301-BA8E-4358-811D-299431B59409}">
-  <ds:schemaRefs>
-    <ds:schemaRef ds:uri="http://schemas.microsoft.com/office/2006/metadata/properties"/>
-    <ds:schemaRef ds:uri="http://schemas.microsoft.com/office/infopath/2007/PartnerControls"/>
-    <ds:schemaRef ds:uri="http://schemas.microsoft.com/sharepoint/v4"/>
-    <ds:schemaRef ds:uri="128482ec-0431-40d5-ab26-89ea2a4f3ccd"/>
-    <ds:schemaRef ds:uri="60eb0cf4-ae2a-4762-800a-cb593b869ecb"/>
-  </ds:schemaRefs>
-</ds:datastoreItem>
-</file>
-
-<file path=customXml/itemProps4.xml><?xml version="1.0" encoding="utf-8"?>
-<ds:datastoreItem xmlns:ds="http://schemas.openxmlformats.org/officeDocument/2006/customXml" ds:itemID="{9FB24B6F-1995-495D-B4E9-64B4DC9866CE}">
-  <ds:schemaRefs>
-    <ds:schemaRef ds:uri="http://schemas.openxmlformats.org/officeDocument/2006/bibliography"/>
-  </ds:schemaRefs>
-</ds:datastoreItem>
 </file>
</xml_diff>

<commit_message>
Added full pipeline section
</commit_message>
<xml_diff>
--- a/Paper/GW2425_Demaecker_Daan_NL_Paper.docx
+++ b/Paper/GW2425_Demaecker_Daan_NL_Paper.docx
@@ -166,8 +166,13 @@
       <w:r>
         <w:t xml:space="preserve">Supervisor: </w:t>
       </w:r>
-      <w:r>
-        <w:t>Deweppe Alexander</w:t>
+      <w:proofErr w:type="spellStart"/>
+      <w:r>
+        <w:t>Deweppe</w:t>
+      </w:r>
+      <w:proofErr w:type="spellEnd"/>
+      <w:r>
+        <w:t xml:space="preserve"> Alexander</w:t>
       </w:r>
     </w:p>
     <w:p>
@@ -177,8 +182,13 @@
       <w:r>
         <w:t xml:space="preserve">Coach: </w:t>
       </w:r>
-      <w:r>
-        <w:t>Verspecht Marijn</w:t>
+      <w:proofErr w:type="spellStart"/>
+      <w:r>
+        <w:t>Verspecht</w:t>
+      </w:r>
+      <w:proofErr w:type="spellEnd"/>
+      <w:r>
+        <w:t xml:space="preserve"> Marijn</w:t>
       </w:r>
     </w:p>
     <w:p>
@@ -3241,16 +3251,38 @@
           <w:lang w:val="nl-BE"/>
         </w:rPr>
       </w:pPr>
+      <w:proofErr w:type="spellStart"/>
       <w:r>
         <w:rPr>
           <w:lang w:val="nl-BE"/>
         </w:rPr>
-        <w:t>Ambient occlusion is een globale verlichti</w:t>
-      </w:r>
+        <w:t>Ambient</w:t>
+      </w:r>
+      <w:proofErr w:type="spellEnd"/>
       <w:r>
         <w:rPr>
           <w:lang w:val="nl-BE"/>
         </w:rPr>
+        <w:t xml:space="preserve"> </w:t>
+      </w:r>
+      <w:proofErr w:type="spellStart"/>
+      <w:r>
+        <w:rPr>
+          <w:lang w:val="nl-BE"/>
+        </w:rPr>
+        <w:t>occlusion</w:t>
+      </w:r>
+      <w:proofErr w:type="spellEnd"/>
+      <w:r>
+        <w:rPr>
+          <w:lang w:val="nl-BE"/>
+        </w:rPr>
+        <w:t xml:space="preserve"> is een globale verlichti</w:t>
+      </w:r>
+      <w:r>
+        <w:rPr>
+          <w:lang w:val="nl-BE"/>
+        </w:rPr>
         <w:t xml:space="preserve">ngsmethode en een belangrijke stap in renderen om de wereld meer realistisch te laten lijken door de harde CGI look wat  zachter te maken. In pre-renderen is kan dit redelijk </w:t>
       </w:r>
       <w:r>
@@ -3269,7 +3301,77 @@
         <w:rPr>
           <w:lang w:val="nl-BE"/>
         </w:rPr>
-        <w:t>aan worden omdat tijd een minder groot probleem is, maar in real-time renderen is dit een ander verhaal. In real-time renderen moet de ambient occlusion elk frame opnieuw berekend worden, dus zullen we een paar hoeken moeten afsnijden. In deze paper zal ik het hebben over 3 verschillende types real-time ambient occlusion. Ik zal bespreken hoe je ze kan implementeren in C++, Vulkan en welke je best kiest, gegeven de keuze.</w:t>
+        <w:t xml:space="preserve">aan worden omdat tijd een minder groot probleem is, maar in real-time renderen is dit een ander verhaal. In real-time renderen moet de </w:t>
+      </w:r>
+      <w:proofErr w:type="spellStart"/>
+      <w:r>
+        <w:rPr>
+          <w:lang w:val="nl-BE"/>
+        </w:rPr>
+        <w:t>ambient</w:t>
+      </w:r>
+      <w:proofErr w:type="spellEnd"/>
+      <w:r>
+        <w:rPr>
+          <w:lang w:val="nl-BE"/>
+        </w:rPr>
+        <w:t xml:space="preserve"> </w:t>
+      </w:r>
+      <w:proofErr w:type="spellStart"/>
+      <w:r>
+        <w:rPr>
+          <w:lang w:val="nl-BE"/>
+        </w:rPr>
+        <w:t>occlusion</w:t>
+      </w:r>
+      <w:proofErr w:type="spellEnd"/>
+      <w:r>
+        <w:rPr>
+          <w:lang w:val="nl-BE"/>
+        </w:rPr>
+        <w:t xml:space="preserve"> elk frame opnieuw berekend worden, dus zullen we een paar hoeken moeten afsnijden. In deze paper zal ik het hebben over 3 verschillende types real-time </w:t>
+      </w:r>
+      <w:proofErr w:type="spellStart"/>
+      <w:r>
+        <w:rPr>
+          <w:lang w:val="nl-BE"/>
+        </w:rPr>
+        <w:t>ambient</w:t>
+      </w:r>
+      <w:proofErr w:type="spellEnd"/>
+      <w:r>
+        <w:rPr>
+          <w:lang w:val="nl-BE"/>
+        </w:rPr>
+        <w:t xml:space="preserve"> </w:t>
+      </w:r>
+      <w:proofErr w:type="spellStart"/>
+      <w:r>
+        <w:rPr>
+          <w:lang w:val="nl-BE"/>
+        </w:rPr>
+        <w:t>occlusion</w:t>
+      </w:r>
+      <w:proofErr w:type="spellEnd"/>
+      <w:r>
+        <w:rPr>
+          <w:lang w:val="nl-BE"/>
+        </w:rPr>
+        <w:t xml:space="preserve">. Ik zal bespreken hoe je ze kan implementeren in C++, </w:t>
+      </w:r>
+      <w:proofErr w:type="spellStart"/>
+      <w:r>
+        <w:rPr>
+          <w:lang w:val="nl-BE"/>
+        </w:rPr>
+        <w:t>Vulkan</w:t>
+      </w:r>
+      <w:proofErr w:type="spellEnd"/>
+      <w:r>
+        <w:rPr>
+          <w:lang w:val="nl-BE"/>
+        </w:rPr>
+        <w:t xml:space="preserve"> en welke je best kiest, gegeven de keuze.</w:t>
       </w:r>
       <w:r>
         <w:rPr>
@@ -3291,7 +3393,15 @@
     </w:p>
     <w:p>
       <w:r>
-        <w:t>During my studies at Howest – Digital Arts and Entertainment (DAE), I was introduced to graphics programming through our course that is aptly named Graphics Programming 1. In this course</w:t>
+        <w:t xml:space="preserve">During my studies at </w:t>
+      </w:r>
+      <w:proofErr w:type="spellStart"/>
+      <w:r>
+        <w:t>Howest</w:t>
+      </w:r>
+      <w:proofErr w:type="spellEnd"/>
+      <w:r>
+        <w:t xml:space="preserve"> – Digital Arts and Entertainment (DAE), I was introduced to graphics programming through our course that is aptly named Graphics Programming 1. In this course</w:t>
       </w:r>
       <w:r>
         <w:t>,</w:t>
@@ -3784,7 +3894,15 @@
         <w:t>Vulkan has 2 types of devices, logical and physical. Physical devices are often part of the system in the form of a graphics card, accelerator, DSP, or other component.</w:t>
       </w:r>
       <w:r>
-        <w:t xml:space="preserve"> There is a fixed number of physical devices, and it is up to the user to choose which one is the most optimal. After choosing the desired physical device, a handle to it is stored in a variable of type VkPhysicalDevice. Using the physical device, a logical device can be created. The logical device will be the object that is mainly used in the application to “talk” to the GPU.</w:t>
+        <w:t xml:space="preserve"> There is a fixed number of physical devices, and it is up to the user to choose which one is the most optimal. After choosing the desired physical device, a handle to it is stored in a variable of type </w:t>
+      </w:r>
+      <w:proofErr w:type="spellStart"/>
+      <w:r>
+        <w:t>VkPhysicalDevice</w:t>
+      </w:r>
+      <w:proofErr w:type="spellEnd"/>
+      <w:r>
+        <w:t>. Using the physical device, a logical device can be created. The logical device will be the object that is mainly used in the application to “talk” to the GPU.</w:t>
       </w:r>
     </w:p>
     <w:p>
@@ -4112,14 +4230,27 @@
                             <w:r>
                               <w:t xml:space="preserve">Figure </w:t>
                             </w:r>
-                            <w:fldSimple w:instr=" SEQ Figure \* ARABIC ">
-                              <w:r>
-                                <w:rPr>
-                                  <w:noProof/>
-                                </w:rPr>
-                                <w:t>1</w:t>
-                              </w:r>
-                            </w:fldSimple>
+                            <w:r>
+                              <w:fldChar w:fldCharType="begin"/>
+                            </w:r>
+                            <w:r>
+                              <w:instrText xml:space="preserve"> SEQ Figure \* ARABIC </w:instrText>
+                            </w:r>
+                            <w:r>
+                              <w:fldChar w:fldCharType="separate"/>
+                            </w:r>
+                            <w:r>
+                              <w:rPr>
+                                <w:noProof/>
+                              </w:rPr>
+                              <w:t>1</w:t>
+                            </w:r>
+                            <w:r>
+                              <w:rPr>
+                                <w:noProof/>
+                              </w:rPr>
+                              <w:fldChar w:fldCharType="end"/>
+                            </w:r>
                           </w:p>
                         </w:txbxContent>
                       </wps:txbx>
@@ -4301,7 +4432,19 @@
         <w:rPr>
           <w:lang w:val="en-GB"/>
         </w:rPr>
-        <w:t>In complex graphics applications, an image is built over a series of different passes, where each pass is responsible for a different part of the scene such as the rendering of the scene, Post-processing effects, composition, etc.</w:t>
+        <w:t>In complex graphics applications, an image is built over a series of different passes, where each pass is responsible for a different part of the scene</w:t>
+      </w:r>
+      <w:r>
+        <w:rPr>
+          <w:lang w:val="en-GB"/>
+        </w:rPr>
+        <w:t>,</w:t>
+      </w:r>
+      <w:r>
+        <w:rPr>
+          <w:lang w:val="en-GB"/>
+        </w:rPr>
+        <w:t xml:space="preserve"> such as the rendering of the scene, Post-processing effects, composition, etc.</w:t>
       </w:r>
       <w:r>
         <w:rPr>
@@ -4321,7 +4464,43 @@
           <w:lang w:val="en-GB"/>
         </w:rPr>
         <w:br/>
-        <w:t>All drawing must be contained within a renderpass. Before setting up a graphics pipeline, you must create a renderpass since the pipeline must know where they’re rendering to.</w:t>
+        <w:t xml:space="preserve">All </w:t>
+      </w:r>
+      <w:r>
+        <w:rPr>
+          <w:lang w:val="en-GB"/>
+        </w:rPr>
+        <w:t>drawings</w:t>
+      </w:r>
+      <w:r>
+        <w:rPr>
+          <w:lang w:val="en-GB"/>
+        </w:rPr>
+        <w:t xml:space="preserve"> must be contained within a renderpass. Before setting up a graphics pipeline, you must create a </w:t>
+      </w:r>
+      <w:r>
+        <w:rPr>
+          <w:lang w:val="en-GB"/>
+        </w:rPr>
+        <w:t>renderpass</w:t>
+      </w:r>
+      <w:r>
+        <w:rPr>
+          <w:lang w:val="en-GB"/>
+        </w:rPr>
+        <w:t xml:space="preserve"> since the pipeline must know where </w:t>
+      </w:r>
+      <w:r>
+        <w:rPr>
+          <w:lang w:val="en-GB"/>
+        </w:rPr>
+        <w:t>it’s</w:t>
+      </w:r>
+      <w:r>
+        <w:rPr>
+          <w:lang w:val="en-GB"/>
+        </w:rPr>
+        <w:t xml:space="preserve"> rendering to.</w:t>
       </w:r>
     </w:p>
     <w:p>
@@ -4348,7 +4527,19 @@
         <w:rPr>
           <w:lang w:val="en-GB"/>
         </w:rPr>
-        <w:t>An attachment is an image associated with a renderpass that can be used as an input or output of one or more of its subpasses. This means that you can render to an image in one subpass and then sample from that image in a next pass. Every subpass needs a reference to all the attachments it will need and in what format they have to be. To avoid undefined behaviour when you have a complicated structure of subpasses and attachments, dependencies are set up so that some subpasses are only executed after others are completed.</w:t>
+        <w:t xml:space="preserve">An attachment is an image associated with a renderpass that can be used as an input or output of one or more of its subpasses. This means that you can render to an image in one subpass and then sample from that image in </w:t>
+      </w:r>
+      <w:r>
+        <w:rPr>
+          <w:lang w:val="en-GB"/>
+        </w:rPr>
+        <w:t>the</w:t>
+      </w:r>
+      <w:r>
+        <w:rPr>
+          <w:lang w:val="en-GB"/>
+        </w:rPr>
+        <w:t xml:space="preserve"> next pass. Every subpass needs a reference to all the attachments it will need and in what format they have to be. To avoid undefined behaviour when you have a complicated structure of subpasses and attachments, dependencies are set up so that some subpasses are only executed after others are completed.</w:t>
       </w:r>
       <w:r>
         <w:rPr>
@@ -4735,7 +4926,10 @@
         <w:t>This is very straightforward, but it brings up one big issue. Calculating lighting is not a cheap operation, and sometimes, a pixel is rendered, the lighting for it is calculated, only for another pixel to be rendered on top of it, and the lighting calculations have to be done all over again. This is a big waste of resources</w:t>
       </w:r>
       <w:r>
-        <w:t xml:space="preserve"> and we call this overdraw</w:t>
+        <w:t xml:space="preserve"> called </w:t>
+      </w:r>
+      <w:r>
+        <w:t>overdraw</w:t>
       </w:r>
       <w:r>
         <w:t>.</w:t>
@@ -4785,22 +4979,123 @@
     </w:p>
     <w:p>
       <w:r>
-        <w:t>While deferred shading works great, we still have some overdraw. When a triangle is rendered, it renders to the G-buffer, but if another triangle is rendered on top of it, it renders to the same part of the G-buffer, this is still overdraw, even if it is a lesser version of it. To avoid this overdraw, we use what’s called a depth prepass.</w:t>
-      </w:r>
-    </w:p>
-    <w:p>
-      <w:r>
-        <w:t>A depth prepass renders the entire scene to a depth buffer first. Because writing to the depth buffer happens in the rasterization stage. This means that we only need a vertex shader for this subpass, saving a lot of time. After our depth pass is done, we render the scene like usual, by using the previously rendered to depth buffer. This causes all the pixels that are not on the top layer of the depth buffer to be discarded in the rasterization stage.</w:t>
+        <w:t>While deferred shading works great, we still have some overdraw. When a triangle is rendered, it renders to the G-buffer, but if another triangle is rendered on top of it, it renders to the same part of the G-buffer</w:t>
+      </w:r>
+      <w:r>
+        <w:t>;</w:t>
+      </w:r>
+      <w:r>
+        <w:t xml:space="preserve"> this is still overdraw, even if it is a lesser version of it. To avoid this overdraw, we use what’s called a depth prepass.</w:t>
+      </w:r>
+    </w:p>
+    <w:p>
+      <w:r>
+        <w:t>A depth prepass renders the entire scene to a depth buffer first. Because writing to the depth buffer happens in the rasterization stage. This means that we only need a vertex shader for this subpass, saving a lot of time. After our depth pass is done, we render the scene like usual, by using the previously rendered depth buffer. This causes all the pixels that are not on the top layer of the depth buffer to be discarded in the rasterization stage.</w:t>
+      </w:r>
+    </w:p>
+    <w:p>
+      <w:pPr>
+        <w:pStyle w:val="Heading3"/>
+      </w:pPr>
+      <w:r>
+        <w:t xml:space="preserve">2.4 </w:t>
+      </w:r>
+      <w:r>
+        <w:t>Transparency</w:t>
+      </w:r>
+      <w:r>
+        <w:t xml:space="preserve"> pass</w:t>
       </w:r>
     </w:p>
     <w:p/>
     <w:p>
       <w:pPr>
+        <w:pStyle w:val="Heading3"/>
+      </w:pPr>
+      <w:r>
+        <w:t>2.5 Full pipeline</w:t>
+      </w:r>
+    </w:p>
+    <w:p>
+      <w:r>
+        <w:t>Now that we have covered all this, we only need 2 more pieces of the puzzle</w:t>
+      </w:r>
+      <w:r>
+        <w:t>, the ambient occlusion map generation and the ambient occlusion map blur</w:t>
+      </w:r>
+      <w:r>
+        <w:t>, but I will delve deeper into those later. Right no</w:t>
+      </w:r>
+      <w:r>
+        <w:t>w, this is our overview of the pipeline.</w:t>
+      </w:r>
+    </w:p>
+    <w:p>
+      <w:r>
+        <w:rPr>
+          <w:noProof/>
+        </w:rPr>
+        <w:drawing>
+          <wp:inline distT="0" distB="0" distL="0" distR="0" wp14:anchorId="638DC8C7" wp14:editId="65A463FA">
+            <wp:extent cx="5455920" cy="2476148"/>
+            <wp:effectExtent l="0" t="0" r="0" b="635"/>
+            <wp:docPr id="8" name="Picture 8"/>
+            <wp:cNvGraphicFramePr>
+              <a:graphicFrameLocks xmlns:a="http://schemas.openxmlformats.org/drawingml/2006/main" noChangeAspect="1"/>
+            </wp:cNvGraphicFramePr>
+            <a:graphic xmlns:a="http://schemas.openxmlformats.org/drawingml/2006/main">
+              <a:graphicData uri="http://schemas.openxmlformats.org/drawingml/2006/picture">
+                <pic:pic xmlns:pic="http://schemas.openxmlformats.org/drawingml/2006/picture">
+                  <pic:nvPicPr>
+                    <pic:cNvPr id="0" name="Picture 1"/>
+                    <pic:cNvPicPr>
+                      <a:picLocks noChangeAspect="1" noChangeArrowheads="1"/>
+                    </pic:cNvPicPr>
+                  </pic:nvPicPr>
+                  <pic:blipFill>
+                    <a:blip r:embed="rId17" cstate="print">
+                      <a:extLst>
+                        <a:ext uri="{28A0092B-C50C-407E-A947-70E740481C1C}">
+                          <a14:useLocalDpi xmlns:a14="http://schemas.microsoft.com/office/drawing/2010/main" val="0"/>
+                        </a:ext>
+                      </a:extLst>
+                    </a:blip>
+                    <a:srcRect/>
+                    <a:stretch>
+                      <a:fillRect/>
+                    </a:stretch>
+                  </pic:blipFill>
+                  <pic:spPr bwMode="auto">
+                    <a:xfrm>
+                      <a:off x="0" y="0"/>
+                      <a:ext cx="5463487" cy="2479582"/>
+                    </a:xfrm>
+                    <a:prstGeom prst="rect">
+                      <a:avLst/>
+                    </a:prstGeom>
+                    <a:noFill/>
+                    <a:ln>
+                      <a:noFill/>
+                    </a:ln>
+                  </pic:spPr>
+                </pic:pic>
+              </a:graphicData>
+            </a:graphic>
+          </wp:inline>
+        </w:drawing>
+      </w:r>
+    </w:p>
+    <w:p>
+      <w:r>
+        <w:t>This is a representation of our renderpass with the following subpasses: the depth prepass, the G-buffer pass, the ao generation pass, the ao blur pass, the lighting pass, and finally the translucency pass. These will all communicate with each other through the following attachments: depth buffer, g-buffer, which consists of the position attachment, the normal attachment, the albedo attachment, and the specular-metalness-roughness attachment. Next, we have the ambient occlusion map, blurred ambient occlusion map, and finally, everything will be rendered to the framebuffer that will be shown on screen.</w:t>
+      </w:r>
+    </w:p>
+    <w:p>
+      <w:pPr>
         <w:pStyle w:val="Heading2"/>
       </w:pPr>
       <w:bookmarkStart w:id="9" w:name="_Toc206280103"/>
       <w:r>
-        <w:lastRenderedPageBreak/>
         <w:t>3</w:t>
       </w:r>
       <w:r>
@@ -4870,6 +5165,7 @@
         <w:rPr>
           <w:noProof/>
         </w:rPr>
+        <w:lastRenderedPageBreak/>
         <w:drawing>
           <wp:anchor distT="0" distB="0" distL="114300" distR="114300" simplePos="0" relativeHeight="251665408" behindDoc="1" locked="0" layoutInCell="1" allowOverlap="1" wp14:anchorId="4DFB6262" wp14:editId="092E14CF">
             <wp:simplePos x="0" y="0"/>
@@ -4894,7 +5190,7 @@
                     <pic:cNvPicPr/>
                   </pic:nvPicPr>
                   <pic:blipFill>
-                    <a:blip r:embed="rId17" cstate="print">
+                    <a:blip r:embed="rId18" cstate="print">
                       <a:extLst>
                         <a:ext uri="{28A0092B-C50C-407E-A947-70E740481C1C}">
                           <a14:useLocalDpi xmlns:a14="http://schemas.microsoft.com/office/drawing/2010/main" val="0"/>
@@ -4972,7 +5268,7 @@
                     <pic:cNvPicPr/>
                   </pic:nvPicPr>
                   <pic:blipFill>
-                    <a:blip r:embed="rId18" cstate="print">
+                    <a:blip r:embed="rId19" cstate="print">
                       <a:extLst>
                         <a:ext uri="{28A0092B-C50C-407E-A947-70E740481C1C}">
                           <a14:useLocalDpi xmlns:a14="http://schemas.microsoft.com/office/drawing/2010/main" val="0"/>
@@ -5026,36 +5322,39 @@
     </w:p>
     <w:p>
       <w:r>
+        <w:t>The idea behind ambient occlusion is that in a 3D scene, some geometry will stop the light from reaching other geometry</w:t>
+      </w:r>
+      <w:r>
+        <w:t>, making corners, creases</w:t>
+      </w:r>
+      <w:r>
+        <w:t>,</w:t>
+      </w:r>
+      <w:r>
+        <w:t xml:space="preserve"> and points surrounded by a lot of other geometry darker</w:t>
+      </w:r>
+      <w:r>
+        <w:t xml:space="preserve">. This might sound like I am talking about regular shadow mapping, </w:t>
+      </w:r>
+      <w:r>
+        <w:t>but there are some stark differences.</w:t>
+      </w:r>
+    </w:p>
+    <w:p>
+      <w:r>
+        <w:t>Shadow mapping uses direct light sources and checks if any objects are occluding a receiving point from the light, no matter the distance, it will be darkened.</w:t>
+      </w:r>
+    </w:p>
+    <w:p>
+      <w:r>
+        <w:t>In ambient occlusion, the area around a point in the world is checked for occluding geometry nearby, the filter region is often quite small</w:t>
+      </w:r>
+      <w:r>
+        <w:t xml:space="preserve"> and in the shape of a dome around the point, in the </w:t>
+      </w:r>
+      <w:r>
         <w:lastRenderedPageBreak/>
-        <w:t>The idea behind ambient occlusion is that in a 3D scene, some geometry will stop the light from reaching other geometry</w:t>
-      </w:r>
-      <w:r>
-        <w:t>, making corners, creases</w:t>
-      </w:r>
-      <w:r>
-        <w:t>,</w:t>
-      </w:r>
-      <w:r>
-        <w:t xml:space="preserve"> and points surrounded by a lot of other geometry darker</w:t>
-      </w:r>
-      <w:r>
-        <w:t xml:space="preserve">. This might sound like I am talking about regular shadow mapping, </w:t>
-      </w:r>
-      <w:r>
-        <w:t>but there are some stark differences.</w:t>
-      </w:r>
-    </w:p>
-    <w:p>
-      <w:r>
-        <w:t>Shadow mapping uses direct light sources and checks if any objects are occluding a receiving point from the light, no matter the distance, it will be darkened.</w:t>
-      </w:r>
-    </w:p>
-    <w:p>
-      <w:r>
-        <w:t>In ambient occlusion, the area around a point in the world is checked for occluding geometry nearby, the filter region is often quite small</w:t>
-      </w:r>
-      <w:r>
-        <w:t xml:space="preserve"> and in the shape of a dome around the point, in the direction of the normal</w:t>
+        <w:t>direction of the normal</w:t>
       </w:r>
       <w:r>
         <w:t>.</w:t>
@@ -5100,7 +5399,7 @@
                     </pic:cNvPicPr>
                   </pic:nvPicPr>
                   <pic:blipFill>
-                    <a:blip r:embed="rId19">
+                    <a:blip r:embed="rId20">
                       <a:extLst>
                         <a:ext uri="{28A0092B-C50C-407E-A947-70E740481C1C}">
                           <a14:useLocalDpi xmlns:a14="http://schemas.microsoft.com/office/drawing/2010/main" val="0"/>
@@ -5213,22 +5512,41 @@
     </w:p>
     <w:p>
       <w:r>
+        <w:t>Because 3D environments are often quite big and complicated, it is impossible to check every single point in the world for surrounding and occluding geometry, this is where Screen Space Ambient Occlusion(SSAO) comes in the works. Instead of checking all the points in the world, it checks all the pixels visible on the screen</w:t>
+      </w:r>
+      <w:r>
+        <w:t>, this is where the name Screen-Space comes from. The pixels on screen are compared to</w:t>
+      </w:r>
+      <w:r>
+        <w:t xml:space="preserve"> surrounding pixels to see how much the original pixel should be shaded. This makes SSAO a post-processing effect.</w:t>
+      </w:r>
+      <w:r>
+        <w:t xml:space="preserve"> </w:t>
+      </w:r>
+    </w:p>
+    <w:p>
+      <w:r>
+        <w:t xml:space="preserve">SSAO needs 2 main things to make the correct calculations: the view space position and the view space </w:t>
+      </w:r>
+      <w:proofErr w:type="spellStart"/>
+      <w:r>
+        <w:t>normals</w:t>
+      </w:r>
+      <w:proofErr w:type="spellEnd"/>
+      <w:r>
+        <w:t xml:space="preserve">. View space means that it is relevant to the camera; the view space position of the camera would be (0,0,0), the view space position of an object 1 unit in front of the camera would be (0,0,1), etc. The same is true of view space </w:t>
+      </w:r>
+      <w:proofErr w:type="spellStart"/>
+      <w:r>
+        <w:t>normals</w:t>
+      </w:r>
+      <w:proofErr w:type="spellEnd"/>
+      <w:r>
+        <w:t xml:space="preserve">. A normal facing towards </w:t>
+      </w:r>
+      <w:r>
         <w:lastRenderedPageBreak/>
-        <w:t>Because 3D environments are often quite big and complicated, it is impossible to check every single point in the world for surrounding and occluding geometry, this is where Screen Space Ambient Occlusion(SSAO) comes in the works. Instead of checking all the points in the world, it checks all the pixels visible on the screen</w:t>
-      </w:r>
-      <w:r>
-        <w:t>, this is where the name Screen-Space comes from. The pixels on screen are compared to</w:t>
-      </w:r>
-      <w:r>
-        <w:t xml:space="preserve"> surrounding pixels to see how much the original pixel should be shaded. This makes SSAO a post-processing effect.</w:t>
-      </w:r>
-      <w:r>
-        <w:t xml:space="preserve"> </w:t>
-      </w:r>
-    </w:p>
-    <w:p>
-      <w:r>
-        <w:t>SSAO needs 2 main things to make the correct calculations: the view space position and the view space normals. View space means that it is relevant to the camera; the view space position of the camera would be (0,0,0), the view space position of an object 1 unit in front of the camera would be (0,0,1), etc. The same is true of view space normals. A normal facing towards the camera would hold a value of (0,0,-1), while a normal facing away from the camera would hold a value of (0,0,1).</w:t>
+        <w:t>the camera would hold a value of (0,0,-1), while a normal facing away from the camera would hold a value of (0,0,1).</w:t>
       </w:r>
     </w:p>
     <w:p>
@@ -5252,7 +5570,7 @@
                     <pic:cNvPicPr/>
                   </pic:nvPicPr>
                   <pic:blipFill>
-                    <a:blip r:embed="rId20"/>
+                    <a:blip r:embed="rId21"/>
                     <a:stretch>
                       <a:fillRect/>
                     </a:stretch>
@@ -5298,7 +5616,7 @@
                     <pic:cNvPicPr/>
                   </pic:nvPicPr>
                   <pic:blipFill>
-                    <a:blip r:embed="rId21"/>
+                    <a:blip r:embed="rId22"/>
                     <a:stretch>
                       <a:fillRect/>
                     </a:stretch>
@@ -5351,7 +5669,6 @@
         <w:rPr>
           <w:noProof/>
         </w:rPr>
-        <w:lastRenderedPageBreak/>
         <w:drawing>
           <wp:anchor distT="0" distB="0" distL="114300" distR="114300" simplePos="0" relativeHeight="251677696" behindDoc="0" locked="0" layoutInCell="1" allowOverlap="1" wp14:anchorId="027E9CF9" wp14:editId="1469EF34">
             <wp:simplePos x="0" y="0"/>
@@ -5376,7 +5693,7 @@
                     <pic:cNvPicPr/>
                   </pic:nvPicPr>
                   <pic:blipFill>
-                    <a:blip r:embed="rId22" cstate="print">
+                    <a:blip r:embed="rId23" cstate="print">
                       <a:extLst>
                         <a:ext uri="{28A0092B-C50C-407E-A947-70E740481C1C}">
                           <a14:useLocalDpi xmlns:a14="http://schemas.microsoft.com/office/drawing/2010/main" val="0"/>
@@ -5436,7 +5753,7 @@
                     <pic:cNvPicPr/>
                   </pic:nvPicPr>
                   <pic:blipFill>
-                    <a:blip r:embed="rId23" cstate="print">
+                    <a:blip r:embed="rId24" cstate="print">
                       <a:extLst>
                         <a:ext uri="{28A0092B-C50C-407E-A947-70E740481C1C}">
                           <a14:useLocalDpi xmlns:a14="http://schemas.microsoft.com/office/drawing/2010/main" val="0"/>
@@ -5490,7 +5807,15 @@
         <w:t>The original SSAO is simply called SSAO</w:t>
       </w:r>
       <w:r>
-        <w:t>[5]. It was developed by Vladimir Kajalin and was used for the first time in 2007 by the game Crysis, developed by Crytek.</w:t>
+        <w:t xml:space="preserve">[5]. It was developed by Vladimir </w:t>
+      </w:r>
+      <w:proofErr w:type="spellStart"/>
+      <w:r>
+        <w:t>Kajalin</w:t>
+      </w:r>
+      <w:proofErr w:type="spellEnd"/>
+      <w:r>
+        <w:t xml:space="preserve"> and was used for the first time in 2007 by the game Crysis, developed by Crytek.</w:t>
       </w:r>
       <w:r>
         <w:br/>
@@ -5502,6 +5827,7 @@
         <w:rPr>
           <w:noProof/>
         </w:rPr>
+        <w:lastRenderedPageBreak/>
         <w:drawing>
           <wp:inline distT="0" distB="0" distL="0" distR="0" wp14:anchorId="563F1A1F" wp14:editId="7C24F6DF">
             <wp:extent cx="4789552" cy="2403475"/>
@@ -5518,7 +5844,7 @@
                     <pic:cNvPicPr/>
                   </pic:nvPicPr>
                   <pic:blipFill>
-                    <a:blip r:embed="rId24"/>
+                    <a:blip r:embed="rId25"/>
                     <a:stretch>
                       <a:fillRect/>
                     </a:stretch>
@@ -5562,11 +5888,7 @@
     </w:p>
     <w:p>
       <w:r>
-        <w:t xml:space="preserve">We start by picking several sample directions; more directions will make the ambient occlusion crisper, but will also have an effect on performance. It is up to the user to find the golden ratio </w:t>
-      </w:r>
-      <w:r>
-        <w:lastRenderedPageBreak/>
-        <w:t>between performance and quality. For each sample direction</w:t>
+        <w:t>We start by picking several sample directions; more directions will make the ambient occlusion crisper, but will also have an effect on performance. It is up to the user to find the golden ratio between performance and quality. For each sample direction</w:t>
       </w:r>
       <w:r>
         <w:t>,</w:t>
@@ -5607,7 +5929,7 @@
                     <pic:cNvPicPr/>
                   </pic:nvPicPr>
                   <pic:blipFill>
-                    <a:blip r:embed="rId25">
+                    <a:blip r:embed="rId26">
                       <a:extLst>
                         <a:ext uri="{28A0092B-C50C-407E-A947-70E740481C1C}">
                           <a14:useLocalDpi xmlns:a14="http://schemas.microsoft.com/office/drawing/2010/main" val="0"/>
@@ -5663,7 +5985,7 @@
                     <pic:cNvPicPr/>
                   </pic:nvPicPr>
                   <pic:blipFill>
-                    <a:blip r:embed="rId26">
+                    <a:blip r:embed="rId27">
                       <a:extLst>
                         <a:ext uri="{28A0092B-C50C-407E-A947-70E740481C1C}">
                           <a14:useLocalDpi xmlns:a14="http://schemas.microsoft.com/office/drawing/2010/main" val="0"/>
@@ -5722,7 +6044,7 @@
                     <pic:cNvPicPr/>
                   </pic:nvPicPr>
                   <pic:blipFill>
-                    <a:blip r:embed="rId27">
+                    <a:blip r:embed="rId28">
                       <a:extLst>
                         <a:ext uri="{28A0092B-C50C-407E-A947-70E740481C1C}">
                           <a14:useLocalDpi xmlns:a14="http://schemas.microsoft.com/office/drawing/2010/main" val="0"/>
@@ -5777,6 +6099,7 @@
         <w:rPr>
           <w:noProof/>
         </w:rPr>
+        <w:lastRenderedPageBreak/>
         <w:drawing>
           <wp:anchor distT="0" distB="0" distL="114300" distR="114300" simplePos="0" relativeHeight="251678720" behindDoc="0" locked="0" layoutInCell="1" allowOverlap="1" wp14:anchorId="517BD431" wp14:editId="38FC97AA">
             <wp:simplePos x="0" y="0"/>
@@ -5803,7 +6126,7 @@
                     </pic:cNvPicPr>
                   </pic:nvPicPr>
                   <pic:blipFill>
-                    <a:blip r:embed="rId28" cstate="print">
+                    <a:blip r:embed="rId29" cstate="print">
                       <a:extLst>
                         <a:ext uri="{28A0092B-C50C-407E-A947-70E740481C1C}">
                           <a14:useLocalDpi xmlns:a14="http://schemas.microsoft.com/office/drawing/2010/main" val="0"/>
@@ -5856,7 +6179,6 @@
           <w:noProof/>
           <w:lang w:val="en-GB"/>
         </w:rPr>
-        <w:lastRenderedPageBreak/>
         <w:drawing>
           <wp:anchor distT="0" distB="0" distL="114300" distR="114300" simplePos="0" relativeHeight="251679744" behindDoc="0" locked="0" layoutInCell="1" allowOverlap="1" wp14:anchorId="7E49CF5A" wp14:editId="610F9DAD">
             <wp:simplePos x="0" y="0"/>
@@ -5881,7 +6203,7 @@
                     <pic:cNvPicPr/>
                   </pic:nvPicPr>
                   <pic:blipFill>
-                    <a:blip r:embed="rId29" cstate="print">
+                    <a:blip r:embed="rId30" cstate="print">
                       <a:extLst>
                         <a:ext uri="{28A0092B-C50C-407E-A947-70E740481C1C}">
                           <a14:useLocalDpi xmlns:a14="http://schemas.microsoft.com/office/drawing/2010/main" val="0"/>
@@ -5935,6 +6257,7 @@
         <w:rPr>
           <w:noProof/>
         </w:rPr>
+        <w:lastRenderedPageBreak/>
         <w:drawing>
           <wp:anchor distT="0" distB="0" distL="114300" distR="114300" simplePos="0" relativeHeight="251680768" behindDoc="0" locked="0" layoutInCell="1" allowOverlap="1" wp14:anchorId="3024C60D" wp14:editId="2B532BF9">
             <wp:simplePos x="0" y="0"/>
@@ -5959,7 +6282,7 @@
                     <pic:cNvPicPr/>
                   </pic:nvPicPr>
                   <pic:blipFill>
-                    <a:blip r:embed="rId30" cstate="print">
+                    <a:blip r:embed="rId31" cstate="print">
                       <a:extLst>
                         <a:ext uri="{28A0092B-C50C-407E-A947-70E740481C1C}">
                           <a14:useLocalDpi xmlns:a14="http://schemas.microsoft.com/office/drawing/2010/main" val="0"/>
@@ -6019,7 +6342,7 @@
                     <pic:cNvPicPr/>
                   </pic:nvPicPr>
                   <pic:blipFill>
-                    <a:blip r:embed="rId31" cstate="print">
+                    <a:blip r:embed="rId32" cstate="print">
                       <a:extLst>
                         <a:ext uri="{28A0092B-C50C-407E-A947-70E740481C1C}">
                           <a14:useLocalDpi xmlns:a14="http://schemas.microsoft.com/office/drawing/2010/main" val="0"/>
@@ -6108,7 +6431,7 @@
                     </pic:cNvPicPr>
                   </pic:nvPicPr>
                   <pic:blipFill>
-                    <a:blip r:embed="rId32">
+                    <a:blip r:embed="rId33">
                       <a:extLst>
                         <a:ext uri="{28A0092B-C50C-407E-A947-70E740481C1C}">
                           <a14:useLocalDpi xmlns:a14="http://schemas.microsoft.com/office/drawing/2010/main" val="0"/>
@@ -6186,7 +6509,7 @@
                     </pic:cNvPicPr>
                   </pic:nvPicPr>
                   <pic:blipFill>
-                    <a:blip r:embed="rId33">
+                    <a:blip r:embed="rId34">
                       <a:extLst>
                         <a:ext uri="{28A0092B-C50C-407E-A947-70E740481C1C}">
                           <a14:useLocalDpi xmlns:a14="http://schemas.microsoft.com/office/drawing/2010/main" val="0"/>
@@ -6218,7 +6541,15 @@
         </w:drawing>
       </w:r>
       <w:r>
-        <w:t>Calculate and normalize the cross product of the so-called “leftDirection” and the normal, which will give us a vector perpendicular to the curve at point P, also called the Tangent.</w:t>
+        <w:t>Calculate and normalize the cross product of the so-called “</w:t>
+      </w:r>
+      <w:proofErr w:type="spellStart"/>
+      <w:r>
+        <w:t>leftDirection</w:t>
+      </w:r>
+      <w:proofErr w:type="spellEnd"/>
+      <w:r>
+        <w:t>” and the normal, which will give us a vector perpendicular to the curve at point P, also called the Tangent.</w:t>
       </w:r>
     </w:p>
     <w:p>
@@ -6264,7 +6595,7 @@
                     </pic:cNvPicPr>
                   </pic:nvPicPr>
                   <pic:blipFill>
-                    <a:blip r:embed="rId34">
+                    <a:blip r:embed="rId35">
                       <a:extLst>
                         <a:ext uri="{28A0092B-C50C-407E-A947-70E740481C1C}">
                           <a14:useLocalDpi xmlns:a14="http://schemas.microsoft.com/office/drawing/2010/main" val="0"/>
@@ -6330,7 +6661,7 @@
                     </pic:cNvPicPr>
                   </pic:nvPicPr>
                   <pic:blipFill>
-                    <a:blip r:embed="rId35">
+                    <a:blip r:embed="rId36">
                       <a:extLst>
                         <a:ext uri="{28A0092B-C50C-407E-A947-70E740481C1C}">
                           <a14:useLocalDpi xmlns:a14="http://schemas.microsoft.com/office/drawing/2010/main" val="0"/>
@@ -6398,6 +6729,7 @@
         <w:rPr>
           <w:noProof/>
         </w:rPr>
+        <w:lastRenderedPageBreak/>
         <w:drawing>
           <wp:anchor distT="0" distB="0" distL="114300" distR="114300" simplePos="0" relativeHeight="251689984" behindDoc="0" locked="0" layoutInCell="1" allowOverlap="1" wp14:anchorId="0021B6D3" wp14:editId="590CE4D1">
             <wp:simplePos x="0" y="0"/>
@@ -6422,7 +6754,7 @@
                     <pic:cNvPicPr/>
                   </pic:nvPicPr>
                   <pic:blipFill>
-                    <a:blip r:embed="rId36" cstate="print">
+                    <a:blip r:embed="rId37" cstate="print">
                       <a:extLst>
                         <a:ext uri="{28A0092B-C50C-407E-A947-70E740481C1C}">
                           <a14:useLocalDpi xmlns:a14="http://schemas.microsoft.com/office/drawing/2010/main" val="0"/>
@@ -6476,7 +6808,7 @@
                     <pic:cNvPicPr/>
                   </pic:nvPicPr>
                   <pic:blipFill>
-                    <a:blip r:embed="rId37" cstate="print">
+                    <a:blip r:embed="rId38" cstate="print">
                       <a:extLst>
                         <a:ext uri="{28A0092B-C50C-407E-A947-70E740481C1C}">
                           <a14:useLocalDpi xmlns:a14="http://schemas.microsoft.com/office/drawing/2010/main" val="0"/>
@@ -6565,7 +6897,7 @@
                     <pic:cNvPicPr/>
                   </pic:nvPicPr>
                   <pic:blipFill>
-                    <a:blip r:embed="rId36" cstate="print">
+                    <a:blip r:embed="rId37" cstate="print">
                       <a:extLst>
                         <a:ext uri="{28A0092B-C50C-407E-A947-70E740481C1C}">
                           <a14:useLocalDpi xmlns:a14="http://schemas.microsoft.com/office/drawing/2010/main" val="0"/>
@@ -6619,7 +6951,7 @@
                     <pic:cNvPicPr/>
                   </pic:nvPicPr>
                   <pic:blipFill>
-                    <a:blip r:embed="rId38" cstate="print">
+                    <a:blip r:embed="rId39" cstate="print">
                       <a:extLst>
                         <a:ext uri="{28A0092B-C50C-407E-A947-70E740481C1C}">
                           <a14:useLocalDpi xmlns:a14="http://schemas.microsoft.com/office/drawing/2010/main" val="0"/>
@@ -6674,7 +7006,6 @@
         <w:rPr>
           <w:noProof/>
         </w:rPr>
-        <w:lastRenderedPageBreak/>
         <w:drawing>
           <wp:anchor distT="0" distB="0" distL="114300" distR="114300" simplePos="0" relativeHeight="251696128" behindDoc="0" locked="0" layoutInCell="1" allowOverlap="1" wp14:anchorId="4FE50E8B" wp14:editId="249F9135">
             <wp:simplePos x="0" y="0"/>
@@ -6699,7 +7030,7 @@
                     <pic:cNvPicPr/>
                   </pic:nvPicPr>
                   <pic:blipFill>
-                    <a:blip r:embed="rId36" cstate="print">
+                    <a:blip r:embed="rId37" cstate="print">
                       <a:extLst>
                         <a:ext uri="{28A0092B-C50C-407E-A947-70E740481C1C}">
                           <a14:useLocalDpi xmlns:a14="http://schemas.microsoft.com/office/drawing/2010/main" val="0"/>
@@ -6753,7 +7084,7 @@
                     <pic:cNvPicPr/>
                   </pic:nvPicPr>
                   <pic:blipFill>
-                    <a:blip r:embed="rId39" cstate="print">
+                    <a:blip r:embed="rId40" cstate="print">
                       <a:extLst>
                         <a:ext uri="{28A0092B-C50C-407E-A947-70E740481C1C}">
                           <a14:useLocalDpi xmlns:a14="http://schemas.microsoft.com/office/drawing/2010/main" val="0"/>
@@ -7564,55 +7895,1171 @@
         </w:rPr>
       </w:pPr>
       <w:r>
-        <w:t xml:space="preserve">Lorem ipsum dolor sit amet, consectetur adipiscing elit. </w:t>
-      </w:r>
+        <w:t xml:space="preserve">Lorem ipsum dolor sit </w:t>
+      </w:r>
+      <w:proofErr w:type="spellStart"/>
+      <w:r>
+        <w:t>amet</w:t>
+      </w:r>
+      <w:proofErr w:type="spellEnd"/>
+      <w:r>
+        <w:t xml:space="preserve">, </w:t>
+      </w:r>
+      <w:proofErr w:type="spellStart"/>
+      <w:r>
+        <w:t>consectetur</w:t>
+      </w:r>
+      <w:proofErr w:type="spellEnd"/>
+      <w:r>
+        <w:t xml:space="preserve"> </w:t>
+      </w:r>
+      <w:proofErr w:type="spellStart"/>
+      <w:r>
+        <w:t>adipiscing</w:t>
+      </w:r>
+      <w:proofErr w:type="spellEnd"/>
+      <w:r>
+        <w:t xml:space="preserve"> </w:t>
+      </w:r>
+      <w:proofErr w:type="spellStart"/>
+      <w:r>
+        <w:t>elit</w:t>
+      </w:r>
+      <w:proofErr w:type="spellEnd"/>
+      <w:r>
+        <w:t xml:space="preserve">. </w:t>
+      </w:r>
+      <w:proofErr w:type="spellStart"/>
       <w:r>
         <w:rPr>
           <w:lang w:val="it-IT"/>
         </w:rPr>
-        <w:t xml:space="preserve">Vestibulum ac quam nec arcu semper dignissim. </w:t>
-      </w:r>
+        <w:t>Vestibulum</w:t>
+      </w:r>
+      <w:proofErr w:type="spellEnd"/>
+      <w:r>
+        <w:rPr>
+          <w:lang w:val="it-IT"/>
+        </w:rPr>
+        <w:t xml:space="preserve"> </w:t>
+      </w:r>
+      <w:proofErr w:type="spellStart"/>
+      <w:r>
+        <w:rPr>
+          <w:lang w:val="it-IT"/>
+        </w:rPr>
+        <w:t>ac</w:t>
+      </w:r>
+      <w:proofErr w:type="spellEnd"/>
+      <w:r>
+        <w:rPr>
+          <w:lang w:val="it-IT"/>
+        </w:rPr>
+        <w:t xml:space="preserve"> </w:t>
+      </w:r>
+      <w:proofErr w:type="spellStart"/>
+      <w:r>
+        <w:rPr>
+          <w:lang w:val="it-IT"/>
+        </w:rPr>
+        <w:t>quam</w:t>
+      </w:r>
+      <w:proofErr w:type="spellEnd"/>
+      <w:r>
+        <w:rPr>
+          <w:lang w:val="it-IT"/>
+        </w:rPr>
+        <w:t xml:space="preserve"> </w:t>
+      </w:r>
+      <w:proofErr w:type="spellStart"/>
+      <w:r>
+        <w:rPr>
+          <w:lang w:val="it-IT"/>
+        </w:rPr>
+        <w:t>nec</w:t>
+      </w:r>
+      <w:proofErr w:type="spellEnd"/>
+      <w:r>
+        <w:rPr>
+          <w:lang w:val="it-IT"/>
+        </w:rPr>
+        <w:t xml:space="preserve"> </w:t>
+      </w:r>
+      <w:proofErr w:type="spellStart"/>
+      <w:r>
+        <w:rPr>
+          <w:lang w:val="it-IT"/>
+        </w:rPr>
+        <w:t>arcu</w:t>
+      </w:r>
+      <w:proofErr w:type="spellEnd"/>
+      <w:r>
+        <w:rPr>
+          <w:lang w:val="it-IT"/>
+        </w:rPr>
+        <w:t xml:space="preserve"> </w:t>
+      </w:r>
+      <w:proofErr w:type="spellStart"/>
+      <w:r>
+        <w:rPr>
+          <w:lang w:val="it-IT"/>
+        </w:rPr>
+        <w:t>semper</w:t>
+      </w:r>
+      <w:proofErr w:type="spellEnd"/>
+      <w:r>
+        <w:rPr>
+          <w:lang w:val="it-IT"/>
+        </w:rPr>
+        <w:t xml:space="preserve"> </w:t>
+      </w:r>
+      <w:proofErr w:type="spellStart"/>
+      <w:r>
+        <w:rPr>
+          <w:lang w:val="it-IT"/>
+        </w:rPr>
+        <w:t>dignissim</w:t>
+      </w:r>
+      <w:proofErr w:type="spellEnd"/>
+      <w:r>
+        <w:rPr>
+          <w:lang w:val="it-IT"/>
+        </w:rPr>
+        <w:t xml:space="preserve">. </w:t>
+      </w:r>
+      <w:proofErr w:type="spellStart"/>
       <w:r>
         <w:rPr>
           <w:lang w:val="fr-BE"/>
         </w:rPr>
-        <w:t>Nulla quam magna, varius sit amet pharetra et, dictum quis elit. Pellentesque habitant morbi tristique senectus et netus et malesuada fames ac turpis egestas.</w:t>
-      </w:r>
-    </w:p>
-    <w:p>
-      <w:pPr>
+        <w:t>Nulla</w:t>
+      </w:r>
+      <w:proofErr w:type="spellEnd"/>
+      <w:r>
         <w:rPr>
           <w:lang w:val="fr-BE"/>
         </w:rPr>
-      </w:pPr>
+        <w:t xml:space="preserve"> </w:t>
+      </w:r>
+      <w:proofErr w:type="spellStart"/>
       <w:r>
         <w:rPr>
           <w:lang w:val="fr-BE"/>
         </w:rPr>
-        <w:t xml:space="preserve">Proin ullamcorper, ipsum sit amet scelerisque rhoncus, leo quam rhoncus elit, sit amet ullamcorper tellus nisi eget sapien. </w:t>
-      </w:r>
+        <w:t>quam</w:t>
+      </w:r>
+      <w:proofErr w:type="spellEnd"/>
+      <w:r>
+        <w:rPr>
+          <w:lang w:val="fr-BE"/>
+        </w:rPr>
+        <w:t xml:space="preserve"> magna, </w:t>
+      </w:r>
+      <w:proofErr w:type="spellStart"/>
+      <w:r>
+        <w:rPr>
+          <w:lang w:val="fr-BE"/>
+        </w:rPr>
+        <w:t>varius</w:t>
+      </w:r>
+      <w:proofErr w:type="spellEnd"/>
+      <w:r>
+        <w:rPr>
+          <w:lang w:val="fr-BE"/>
+        </w:rPr>
+        <w:t xml:space="preserve"> </w:t>
+      </w:r>
+      <w:proofErr w:type="spellStart"/>
+      <w:r>
+        <w:rPr>
+          <w:lang w:val="fr-BE"/>
+        </w:rPr>
+        <w:t>sit</w:t>
+      </w:r>
+      <w:proofErr w:type="spellEnd"/>
+      <w:r>
+        <w:rPr>
+          <w:lang w:val="fr-BE"/>
+        </w:rPr>
+        <w:t xml:space="preserve"> </w:t>
+      </w:r>
+      <w:proofErr w:type="spellStart"/>
+      <w:r>
+        <w:rPr>
+          <w:lang w:val="fr-BE"/>
+        </w:rPr>
+        <w:t>amet</w:t>
+      </w:r>
+      <w:proofErr w:type="spellEnd"/>
+      <w:r>
+        <w:rPr>
+          <w:lang w:val="fr-BE"/>
+        </w:rPr>
+        <w:t xml:space="preserve"> </w:t>
+      </w:r>
+      <w:proofErr w:type="spellStart"/>
+      <w:r>
+        <w:rPr>
+          <w:lang w:val="fr-BE"/>
+        </w:rPr>
+        <w:t>pharetra</w:t>
+      </w:r>
+      <w:proofErr w:type="spellEnd"/>
+      <w:r>
+        <w:rPr>
+          <w:lang w:val="fr-BE"/>
+        </w:rPr>
+        <w:t xml:space="preserve"> et, dictum </w:t>
+      </w:r>
+      <w:proofErr w:type="spellStart"/>
+      <w:r>
+        <w:rPr>
+          <w:lang w:val="fr-BE"/>
+        </w:rPr>
+        <w:t>quis</w:t>
+      </w:r>
+      <w:proofErr w:type="spellEnd"/>
+      <w:r>
+        <w:rPr>
+          <w:lang w:val="fr-BE"/>
+        </w:rPr>
+        <w:t xml:space="preserve"> </w:t>
+      </w:r>
+      <w:proofErr w:type="spellStart"/>
+      <w:r>
+        <w:rPr>
+          <w:lang w:val="fr-BE"/>
+        </w:rPr>
+        <w:t>elit</w:t>
+      </w:r>
+      <w:proofErr w:type="spellEnd"/>
+      <w:r>
+        <w:rPr>
+          <w:lang w:val="fr-BE"/>
+        </w:rPr>
+        <w:t xml:space="preserve">. </w:t>
+      </w:r>
+      <w:proofErr w:type="spellStart"/>
+      <w:r>
+        <w:rPr>
+          <w:lang w:val="fr-BE"/>
+        </w:rPr>
+        <w:t>Pellentesque</w:t>
+      </w:r>
+      <w:proofErr w:type="spellEnd"/>
+      <w:r>
+        <w:rPr>
+          <w:lang w:val="fr-BE"/>
+        </w:rPr>
+        <w:t xml:space="preserve"> habitant morbi tristique </w:t>
+      </w:r>
+      <w:proofErr w:type="spellStart"/>
+      <w:r>
+        <w:rPr>
+          <w:lang w:val="fr-BE"/>
+        </w:rPr>
+        <w:t>senectus</w:t>
+      </w:r>
+      <w:proofErr w:type="spellEnd"/>
+      <w:r>
+        <w:rPr>
+          <w:lang w:val="fr-BE"/>
+        </w:rPr>
+        <w:t xml:space="preserve"> et </w:t>
+      </w:r>
+      <w:proofErr w:type="spellStart"/>
+      <w:r>
+        <w:rPr>
+          <w:lang w:val="fr-BE"/>
+        </w:rPr>
+        <w:t>netus</w:t>
+      </w:r>
+      <w:proofErr w:type="spellEnd"/>
+      <w:r>
+        <w:rPr>
+          <w:lang w:val="fr-BE"/>
+        </w:rPr>
+        <w:t xml:space="preserve"> et </w:t>
+      </w:r>
+      <w:proofErr w:type="spellStart"/>
+      <w:r>
+        <w:rPr>
+          <w:lang w:val="fr-BE"/>
+        </w:rPr>
+        <w:t>malesuada</w:t>
+      </w:r>
+      <w:proofErr w:type="spellEnd"/>
+      <w:r>
+        <w:rPr>
+          <w:lang w:val="fr-BE"/>
+        </w:rPr>
+        <w:t xml:space="preserve"> </w:t>
+      </w:r>
+      <w:proofErr w:type="spellStart"/>
+      <w:r>
+        <w:rPr>
+          <w:lang w:val="fr-BE"/>
+        </w:rPr>
+        <w:t>fames</w:t>
+      </w:r>
+      <w:proofErr w:type="spellEnd"/>
+      <w:r>
+        <w:rPr>
+          <w:lang w:val="fr-BE"/>
+        </w:rPr>
+        <w:t xml:space="preserve"> </w:t>
+      </w:r>
+      <w:proofErr w:type="spellStart"/>
+      <w:r>
+        <w:rPr>
+          <w:lang w:val="fr-BE"/>
+        </w:rPr>
+        <w:t>ac</w:t>
+      </w:r>
+      <w:proofErr w:type="spellEnd"/>
+      <w:r>
+        <w:rPr>
+          <w:lang w:val="fr-BE"/>
+        </w:rPr>
+        <w:t xml:space="preserve"> </w:t>
+      </w:r>
+      <w:proofErr w:type="spellStart"/>
+      <w:r>
+        <w:rPr>
+          <w:lang w:val="fr-BE"/>
+        </w:rPr>
+        <w:t>turpis</w:t>
+      </w:r>
+      <w:proofErr w:type="spellEnd"/>
+      <w:r>
+        <w:rPr>
+          <w:lang w:val="fr-BE"/>
+        </w:rPr>
+        <w:t xml:space="preserve"> </w:t>
+      </w:r>
+      <w:proofErr w:type="spellStart"/>
+      <w:r>
+        <w:rPr>
+          <w:lang w:val="fr-BE"/>
+        </w:rPr>
+        <w:t>egestas</w:t>
+      </w:r>
+      <w:proofErr w:type="spellEnd"/>
+      <w:r>
+        <w:rPr>
+          <w:lang w:val="fr-BE"/>
+        </w:rPr>
+        <w:t>.</w:t>
+      </w:r>
+    </w:p>
+    <w:p>
+      <w:pPr>
+        <w:rPr>
+          <w:lang w:val="fr-BE"/>
+        </w:rPr>
+      </w:pPr>
+      <w:proofErr w:type="spellStart"/>
+      <w:r>
+        <w:rPr>
+          <w:lang w:val="fr-BE"/>
+        </w:rPr>
+        <w:t>Proin</w:t>
+      </w:r>
+      <w:proofErr w:type="spellEnd"/>
+      <w:r>
+        <w:rPr>
+          <w:lang w:val="fr-BE"/>
+        </w:rPr>
+        <w:t xml:space="preserve"> </w:t>
+      </w:r>
+      <w:proofErr w:type="spellStart"/>
+      <w:r>
+        <w:rPr>
+          <w:lang w:val="fr-BE"/>
+        </w:rPr>
+        <w:t>ullamcorper</w:t>
+      </w:r>
+      <w:proofErr w:type="spellEnd"/>
+      <w:r>
+        <w:rPr>
+          <w:lang w:val="fr-BE"/>
+        </w:rPr>
+        <w:t xml:space="preserve">, ipsum </w:t>
+      </w:r>
+      <w:proofErr w:type="spellStart"/>
+      <w:r>
+        <w:rPr>
+          <w:lang w:val="fr-BE"/>
+        </w:rPr>
+        <w:t>sit</w:t>
+      </w:r>
+      <w:proofErr w:type="spellEnd"/>
+      <w:r>
+        <w:rPr>
+          <w:lang w:val="fr-BE"/>
+        </w:rPr>
+        <w:t xml:space="preserve"> </w:t>
+      </w:r>
+      <w:proofErr w:type="spellStart"/>
+      <w:r>
+        <w:rPr>
+          <w:lang w:val="fr-BE"/>
+        </w:rPr>
+        <w:t>amet</w:t>
+      </w:r>
+      <w:proofErr w:type="spellEnd"/>
+      <w:r>
+        <w:rPr>
+          <w:lang w:val="fr-BE"/>
+        </w:rPr>
+        <w:t xml:space="preserve"> </w:t>
+      </w:r>
+      <w:proofErr w:type="spellStart"/>
+      <w:r>
+        <w:rPr>
+          <w:lang w:val="fr-BE"/>
+        </w:rPr>
+        <w:t>scelerisque</w:t>
+      </w:r>
+      <w:proofErr w:type="spellEnd"/>
+      <w:r>
+        <w:rPr>
+          <w:lang w:val="fr-BE"/>
+        </w:rPr>
+        <w:t xml:space="preserve"> rhoncus, </w:t>
+      </w:r>
+      <w:proofErr w:type="spellStart"/>
+      <w:r>
+        <w:rPr>
+          <w:lang w:val="fr-BE"/>
+        </w:rPr>
+        <w:t>leo</w:t>
+      </w:r>
+      <w:proofErr w:type="spellEnd"/>
+      <w:r>
+        <w:rPr>
+          <w:lang w:val="fr-BE"/>
+        </w:rPr>
+        <w:t xml:space="preserve"> </w:t>
+      </w:r>
+      <w:proofErr w:type="spellStart"/>
+      <w:r>
+        <w:rPr>
+          <w:lang w:val="fr-BE"/>
+        </w:rPr>
+        <w:t>quam</w:t>
+      </w:r>
+      <w:proofErr w:type="spellEnd"/>
+      <w:r>
+        <w:rPr>
+          <w:lang w:val="fr-BE"/>
+        </w:rPr>
+        <w:t xml:space="preserve"> rhoncus </w:t>
+      </w:r>
+      <w:proofErr w:type="spellStart"/>
+      <w:r>
+        <w:rPr>
+          <w:lang w:val="fr-BE"/>
+        </w:rPr>
+        <w:t>elit</w:t>
+      </w:r>
+      <w:proofErr w:type="spellEnd"/>
+      <w:r>
+        <w:rPr>
+          <w:lang w:val="fr-BE"/>
+        </w:rPr>
+        <w:t xml:space="preserve">, </w:t>
+      </w:r>
+      <w:proofErr w:type="spellStart"/>
+      <w:r>
+        <w:rPr>
+          <w:lang w:val="fr-BE"/>
+        </w:rPr>
+        <w:t>sit</w:t>
+      </w:r>
+      <w:proofErr w:type="spellEnd"/>
+      <w:r>
+        <w:rPr>
+          <w:lang w:val="fr-BE"/>
+        </w:rPr>
+        <w:t xml:space="preserve"> </w:t>
+      </w:r>
+      <w:proofErr w:type="spellStart"/>
+      <w:r>
+        <w:rPr>
+          <w:lang w:val="fr-BE"/>
+        </w:rPr>
+        <w:t>amet</w:t>
+      </w:r>
+      <w:proofErr w:type="spellEnd"/>
+      <w:r>
+        <w:rPr>
+          <w:lang w:val="fr-BE"/>
+        </w:rPr>
+        <w:t xml:space="preserve"> </w:t>
+      </w:r>
+      <w:proofErr w:type="spellStart"/>
+      <w:r>
+        <w:rPr>
+          <w:lang w:val="fr-BE"/>
+        </w:rPr>
+        <w:t>ullamcorper</w:t>
+      </w:r>
+      <w:proofErr w:type="spellEnd"/>
+      <w:r>
+        <w:rPr>
+          <w:lang w:val="fr-BE"/>
+        </w:rPr>
+        <w:t xml:space="preserve"> </w:t>
+      </w:r>
+      <w:proofErr w:type="spellStart"/>
+      <w:r>
+        <w:rPr>
+          <w:lang w:val="fr-BE"/>
+        </w:rPr>
+        <w:t>tellus</w:t>
+      </w:r>
+      <w:proofErr w:type="spellEnd"/>
+      <w:r>
+        <w:rPr>
+          <w:lang w:val="fr-BE"/>
+        </w:rPr>
+        <w:t xml:space="preserve"> </w:t>
+      </w:r>
+      <w:proofErr w:type="spellStart"/>
+      <w:r>
+        <w:rPr>
+          <w:lang w:val="fr-BE"/>
+        </w:rPr>
+        <w:t>nisi</w:t>
+      </w:r>
+      <w:proofErr w:type="spellEnd"/>
+      <w:r>
+        <w:rPr>
+          <w:lang w:val="fr-BE"/>
+        </w:rPr>
+        <w:t xml:space="preserve"> </w:t>
+      </w:r>
+      <w:proofErr w:type="spellStart"/>
+      <w:r>
+        <w:rPr>
+          <w:lang w:val="fr-BE"/>
+        </w:rPr>
+        <w:t>eget</w:t>
+      </w:r>
+      <w:proofErr w:type="spellEnd"/>
+      <w:r>
+        <w:rPr>
+          <w:lang w:val="fr-BE"/>
+        </w:rPr>
+        <w:t xml:space="preserve"> </w:t>
+      </w:r>
+      <w:proofErr w:type="spellStart"/>
+      <w:r>
+        <w:rPr>
+          <w:lang w:val="fr-BE"/>
+        </w:rPr>
+        <w:t>sapien</w:t>
+      </w:r>
+      <w:proofErr w:type="spellEnd"/>
+      <w:r>
+        <w:rPr>
+          <w:lang w:val="fr-BE"/>
+        </w:rPr>
+        <w:t xml:space="preserve">. </w:t>
+      </w:r>
+      <w:proofErr w:type="spellStart"/>
       <w:r>
         <w:rPr>
           <w:lang w:val="it-IT"/>
         </w:rPr>
-        <w:t xml:space="preserve">Suspendisse potenti. Ut non justo viverra, tempus felis vitae, elementum mi. </w:t>
+        <w:t>Suspendisse</w:t>
+      </w:r>
+      <w:proofErr w:type="spellEnd"/>
+      <w:r>
+        <w:rPr>
+          <w:lang w:val="it-IT"/>
+        </w:rPr>
+        <w:t xml:space="preserve"> potenti. Ut non </w:t>
+      </w:r>
+      <w:proofErr w:type="spellStart"/>
+      <w:r>
+        <w:rPr>
+          <w:lang w:val="it-IT"/>
+        </w:rPr>
+        <w:t>justo</w:t>
+      </w:r>
+      <w:proofErr w:type="spellEnd"/>
+      <w:r>
+        <w:rPr>
+          <w:lang w:val="it-IT"/>
+        </w:rPr>
+        <w:t xml:space="preserve"> viverra, tempus </w:t>
+      </w:r>
+      <w:proofErr w:type="spellStart"/>
+      <w:r>
+        <w:rPr>
+          <w:lang w:val="it-IT"/>
+        </w:rPr>
+        <w:t>felis</w:t>
+      </w:r>
+      <w:proofErr w:type="spellEnd"/>
+      <w:r>
+        <w:rPr>
+          <w:lang w:val="it-IT"/>
+        </w:rPr>
+        <w:t xml:space="preserve"> vitae, </w:t>
+      </w:r>
+      <w:proofErr w:type="spellStart"/>
+      <w:r>
+        <w:rPr>
+          <w:lang w:val="it-IT"/>
+        </w:rPr>
+        <w:t>elementum</w:t>
+      </w:r>
+      <w:proofErr w:type="spellEnd"/>
+      <w:r>
+        <w:rPr>
+          <w:lang w:val="it-IT"/>
+        </w:rPr>
+        <w:t xml:space="preserve"> mi. </w:t>
       </w:r>
       <w:r>
         <w:rPr>
           <w:lang w:val="fr-BE"/>
         </w:rPr>
-        <w:t>Morbi at dui sed lacus fringilla condimentum. Duis non odio ac arcu volutpat vehicula eu et turpis.</w:t>
-      </w:r>
-    </w:p>
-    <w:p>
+        <w:t xml:space="preserve">Morbi at </w:t>
+      </w:r>
+      <w:proofErr w:type="spellStart"/>
+      <w:r>
+        <w:rPr>
+          <w:lang w:val="fr-BE"/>
+        </w:rPr>
+        <w:t>dui</w:t>
+      </w:r>
+      <w:proofErr w:type="spellEnd"/>
+      <w:r>
+        <w:rPr>
+          <w:lang w:val="fr-BE"/>
+        </w:rPr>
+        <w:t xml:space="preserve"> </w:t>
+      </w:r>
+      <w:proofErr w:type="spellStart"/>
+      <w:r>
+        <w:rPr>
+          <w:lang w:val="fr-BE"/>
+        </w:rPr>
+        <w:t>sed</w:t>
+      </w:r>
+      <w:proofErr w:type="spellEnd"/>
+      <w:r>
+        <w:rPr>
+          <w:lang w:val="fr-BE"/>
+        </w:rPr>
+        <w:t xml:space="preserve"> </w:t>
+      </w:r>
+      <w:proofErr w:type="spellStart"/>
+      <w:r>
+        <w:rPr>
+          <w:lang w:val="fr-BE"/>
+        </w:rPr>
+        <w:t>lacus</w:t>
+      </w:r>
+      <w:proofErr w:type="spellEnd"/>
+      <w:r>
+        <w:rPr>
+          <w:lang w:val="fr-BE"/>
+        </w:rPr>
+        <w:t xml:space="preserve"> </w:t>
+      </w:r>
+      <w:proofErr w:type="spellStart"/>
+      <w:r>
+        <w:rPr>
+          <w:lang w:val="fr-BE"/>
+        </w:rPr>
+        <w:t>fringilla</w:t>
+      </w:r>
+      <w:proofErr w:type="spellEnd"/>
+      <w:r>
+        <w:rPr>
+          <w:lang w:val="fr-BE"/>
+        </w:rPr>
+        <w:t xml:space="preserve"> </w:t>
+      </w:r>
+      <w:proofErr w:type="spellStart"/>
+      <w:r>
+        <w:rPr>
+          <w:lang w:val="fr-BE"/>
+        </w:rPr>
+        <w:t>condimentum</w:t>
+      </w:r>
+      <w:proofErr w:type="spellEnd"/>
+      <w:r>
+        <w:rPr>
+          <w:lang w:val="fr-BE"/>
+        </w:rPr>
+        <w:t xml:space="preserve">. Duis non </w:t>
+      </w:r>
+      <w:proofErr w:type="spellStart"/>
+      <w:r>
+        <w:rPr>
+          <w:lang w:val="fr-BE"/>
+        </w:rPr>
+        <w:t>odio</w:t>
+      </w:r>
+      <w:proofErr w:type="spellEnd"/>
+      <w:r>
+        <w:rPr>
+          <w:lang w:val="fr-BE"/>
+        </w:rPr>
+        <w:t xml:space="preserve"> </w:t>
+      </w:r>
+      <w:proofErr w:type="spellStart"/>
+      <w:r>
+        <w:rPr>
+          <w:lang w:val="fr-BE"/>
+        </w:rPr>
+        <w:t>ac</w:t>
+      </w:r>
+      <w:proofErr w:type="spellEnd"/>
+      <w:r>
+        <w:rPr>
+          <w:lang w:val="fr-BE"/>
+        </w:rPr>
+        <w:t xml:space="preserve"> </w:t>
+      </w:r>
+      <w:proofErr w:type="spellStart"/>
+      <w:r>
+        <w:rPr>
+          <w:lang w:val="fr-BE"/>
+        </w:rPr>
+        <w:t>arcu</w:t>
+      </w:r>
+      <w:proofErr w:type="spellEnd"/>
+      <w:r>
+        <w:rPr>
+          <w:lang w:val="fr-BE"/>
+        </w:rPr>
+        <w:t xml:space="preserve"> </w:t>
+      </w:r>
+      <w:proofErr w:type="spellStart"/>
+      <w:r>
+        <w:rPr>
+          <w:lang w:val="fr-BE"/>
+        </w:rPr>
+        <w:t>volutpat</w:t>
+      </w:r>
+      <w:proofErr w:type="spellEnd"/>
+      <w:r>
+        <w:rPr>
+          <w:lang w:val="fr-BE"/>
+        </w:rPr>
+        <w:t xml:space="preserve"> </w:t>
+      </w:r>
+      <w:proofErr w:type="spellStart"/>
+      <w:r>
+        <w:rPr>
+          <w:lang w:val="fr-BE"/>
+        </w:rPr>
+        <w:t>vehicula</w:t>
+      </w:r>
+      <w:proofErr w:type="spellEnd"/>
+      <w:r>
+        <w:rPr>
+          <w:lang w:val="fr-BE"/>
+        </w:rPr>
+        <w:t xml:space="preserve"> eu et </w:t>
+      </w:r>
+      <w:proofErr w:type="spellStart"/>
+      <w:r>
+        <w:rPr>
+          <w:lang w:val="fr-BE"/>
+        </w:rPr>
+        <w:t>turpis</w:t>
+      </w:r>
+      <w:proofErr w:type="spellEnd"/>
+      <w:r>
+        <w:rPr>
+          <w:lang w:val="fr-BE"/>
+        </w:rPr>
+        <w:t>.</w:t>
+      </w:r>
+    </w:p>
+    <w:p>
+      <w:proofErr w:type="spellStart"/>
       <w:r>
         <w:rPr>
           <w:lang w:val="it-IT"/>
         </w:rPr>
-        <w:t xml:space="preserve">Praesent vitae magna ante. Nulla in orci lacus. Donec quis vestibulum mi. Sed ipsum sapien, pretium maximus purus sed, bibendum consequat lectus. Aliquam porttitor dolor eu gravida vulputate. </w:t>
-      </w:r>
-      <w:r>
-        <w:t>Vestibulum ut urna eget massa tincidunt ultricies. Morbi hendrerit sapien at diam tincidunt semper. Aliquam ut quam dictum quam maximus tempor sed at felis.</w:t>
+        <w:t>Praesent</w:t>
+      </w:r>
+      <w:proofErr w:type="spellEnd"/>
+      <w:r>
+        <w:rPr>
+          <w:lang w:val="it-IT"/>
+        </w:rPr>
+        <w:t xml:space="preserve"> vitae magna ante. Nulla in orci </w:t>
+      </w:r>
+      <w:proofErr w:type="spellStart"/>
+      <w:r>
+        <w:rPr>
+          <w:lang w:val="it-IT"/>
+        </w:rPr>
+        <w:t>lacus</w:t>
+      </w:r>
+      <w:proofErr w:type="spellEnd"/>
+      <w:r>
+        <w:rPr>
+          <w:lang w:val="it-IT"/>
+        </w:rPr>
+        <w:t xml:space="preserve">. </w:t>
+      </w:r>
+      <w:proofErr w:type="spellStart"/>
+      <w:r>
+        <w:rPr>
+          <w:lang w:val="it-IT"/>
+        </w:rPr>
+        <w:t>Donec</w:t>
+      </w:r>
+      <w:proofErr w:type="spellEnd"/>
+      <w:r>
+        <w:rPr>
+          <w:lang w:val="it-IT"/>
+        </w:rPr>
+        <w:t xml:space="preserve"> </w:t>
+      </w:r>
+      <w:proofErr w:type="spellStart"/>
+      <w:r>
+        <w:rPr>
+          <w:lang w:val="it-IT"/>
+        </w:rPr>
+        <w:t>quis</w:t>
+      </w:r>
+      <w:proofErr w:type="spellEnd"/>
+      <w:r>
+        <w:rPr>
+          <w:lang w:val="it-IT"/>
+        </w:rPr>
+        <w:t xml:space="preserve"> </w:t>
+      </w:r>
+      <w:proofErr w:type="spellStart"/>
+      <w:r>
+        <w:rPr>
+          <w:lang w:val="it-IT"/>
+        </w:rPr>
+        <w:t>vestibulum</w:t>
+      </w:r>
+      <w:proofErr w:type="spellEnd"/>
+      <w:r>
+        <w:rPr>
+          <w:lang w:val="it-IT"/>
+        </w:rPr>
+        <w:t xml:space="preserve"> mi. Sed </w:t>
+      </w:r>
+      <w:proofErr w:type="spellStart"/>
+      <w:r>
+        <w:rPr>
+          <w:lang w:val="it-IT"/>
+        </w:rPr>
+        <w:t>ipsum</w:t>
+      </w:r>
+      <w:proofErr w:type="spellEnd"/>
+      <w:r>
+        <w:rPr>
+          <w:lang w:val="it-IT"/>
+        </w:rPr>
+        <w:t xml:space="preserve"> </w:t>
+      </w:r>
+      <w:proofErr w:type="spellStart"/>
+      <w:r>
+        <w:rPr>
+          <w:lang w:val="it-IT"/>
+        </w:rPr>
+        <w:t>sapien</w:t>
+      </w:r>
+      <w:proofErr w:type="spellEnd"/>
+      <w:r>
+        <w:rPr>
+          <w:lang w:val="it-IT"/>
+        </w:rPr>
+        <w:t xml:space="preserve">, </w:t>
+      </w:r>
+      <w:proofErr w:type="spellStart"/>
+      <w:r>
+        <w:rPr>
+          <w:lang w:val="it-IT"/>
+        </w:rPr>
+        <w:t>pretium</w:t>
+      </w:r>
+      <w:proofErr w:type="spellEnd"/>
+      <w:r>
+        <w:rPr>
+          <w:lang w:val="it-IT"/>
+        </w:rPr>
+        <w:t xml:space="preserve"> </w:t>
+      </w:r>
+      <w:proofErr w:type="spellStart"/>
+      <w:r>
+        <w:rPr>
+          <w:lang w:val="it-IT"/>
+        </w:rPr>
+        <w:t>maximus</w:t>
+      </w:r>
+      <w:proofErr w:type="spellEnd"/>
+      <w:r>
+        <w:rPr>
+          <w:lang w:val="it-IT"/>
+        </w:rPr>
+        <w:t xml:space="preserve"> </w:t>
+      </w:r>
+      <w:proofErr w:type="spellStart"/>
+      <w:r>
+        <w:rPr>
+          <w:lang w:val="it-IT"/>
+        </w:rPr>
+        <w:t>purus</w:t>
+      </w:r>
+      <w:proofErr w:type="spellEnd"/>
+      <w:r>
+        <w:rPr>
+          <w:lang w:val="it-IT"/>
+        </w:rPr>
+        <w:t xml:space="preserve"> sed, </w:t>
+      </w:r>
+      <w:proofErr w:type="spellStart"/>
+      <w:r>
+        <w:rPr>
+          <w:lang w:val="it-IT"/>
+        </w:rPr>
+        <w:t>bibendum</w:t>
+      </w:r>
+      <w:proofErr w:type="spellEnd"/>
+      <w:r>
+        <w:rPr>
+          <w:lang w:val="it-IT"/>
+        </w:rPr>
+        <w:t xml:space="preserve"> </w:t>
+      </w:r>
+      <w:proofErr w:type="spellStart"/>
+      <w:r>
+        <w:rPr>
+          <w:lang w:val="it-IT"/>
+        </w:rPr>
+        <w:t>consequat</w:t>
+      </w:r>
+      <w:proofErr w:type="spellEnd"/>
+      <w:r>
+        <w:rPr>
+          <w:lang w:val="it-IT"/>
+        </w:rPr>
+        <w:t xml:space="preserve"> </w:t>
+      </w:r>
+      <w:proofErr w:type="spellStart"/>
+      <w:r>
+        <w:rPr>
+          <w:lang w:val="it-IT"/>
+        </w:rPr>
+        <w:t>lectus</w:t>
+      </w:r>
+      <w:proofErr w:type="spellEnd"/>
+      <w:r>
+        <w:rPr>
+          <w:lang w:val="it-IT"/>
+        </w:rPr>
+        <w:t xml:space="preserve">. </w:t>
+      </w:r>
+      <w:proofErr w:type="spellStart"/>
+      <w:r>
+        <w:rPr>
+          <w:lang w:val="it-IT"/>
+        </w:rPr>
+        <w:t>Aliquam</w:t>
+      </w:r>
+      <w:proofErr w:type="spellEnd"/>
+      <w:r>
+        <w:rPr>
+          <w:lang w:val="it-IT"/>
+        </w:rPr>
+        <w:t xml:space="preserve"> </w:t>
+      </w:r>
+      <w:proofErr w:type="spellStart"/>
+      <w:r>
+        <w:rPr>
+          <w:lang w:val="it-IT"/>
+        </w:rPr>
+        <w:t>porttitor</w:t>
+      </w:r>
+      <w:proofErr w:type="spellEnd"/>
+      <w:r>
+        <w:rPr>
+          <w:lang w:val="it-IT"/>
+        </w:rPr>
+        <w:t xml:space="preserve"> </w:t>
+      </w:r>
+      <w:proofErr w:type="spellStart"/>
+      <w:r>
+        <w:rPr>
+          <w:lang w:val="it-IT"/>
+        </w:rPr>
+        <w:t>dolor</w:t>
+      </w:r>
+      <w:proofErr w:type="spellEnd"/>
+      <w:r>
+        <w:rPr>
+          <w:lang w:val="it-IT"/>
+        </w:rPr>
+        <w:t xml:space="preserve"> </w:t>
+      </w:r>
+      <w:proofErr w:type="spellStart"/>
+      <w:r>
+        <w:rPr>
+          <w:lang w:val="it-IT"/>
+        </w:rPr>
+        <w:t>eu</w:t>
+      </w:r>
+      <w:proofErr w:type="spellEnd"/>
+      <w:r>
+        <w:rPr>
+          <w:lang w:val="it-IT"/>
+        </w:rPr>
+        <w:t xml:space="preserve"> gravida </w:t>
+      </w:r>
+      <w:proofErr w:type="spellStart"/>
+      <w:r>
+        <w:rPr>
+          <w:lang w:val="it-IT"/>
+        </w:rPr>
+        <w:t>vulputate</w:t>
+      </w:r>
+      <w:proofErr w:type="spellEnd"/>
+      <w:r>
+        <w:rPr>
+          <w:lang w:val="it-IT"/>
+        </w:rPr>
+        <w:t xml:space="preserve">. </w:t>
+      </w:r>
+      <w:r>
+        <w:t xml:space="preserve">Vestibulum </w:t>
+      </w:r>
+      <w:proofErr w:type="spellStart"/>
+      <w:r>
+        <w:t>ut</w:t>
+      </w:r>
+      <w:proofErr w:type="spellEnd"/>
+      <w:r>
+        <w:t xml:space="preserve"> </w:t>
+      </w:r>
+      <w:proofErr w:type="spellStart"/>
+      <w:r>
+        <w:t>urna</w:t>
+      </w:r>
+      <w:proofErr w:type="spellEnd"/>
+      <w:r>
+        <w:t xml:space="preserve"> </w:t>
+      </w:r>
+      <w:proofErr w:type="spellStart"/>
+      <w:r>
+        <w:t>eget</w:t>
+      </w:r>
+      <w:proofErr w:type="spellEnd"/>
+      <w:r>
+        <w:t xml:space="preserve"> </w:t>
+      </w:r>
+      <w:proofErr w:type="spellStart"/>
+      <w:r>
+        <w:t>massa</w:t>
+      </w:r>
+      <w:proofErr w:type="spellEnd"/>
+      <w:r>
+        <w:t xml:space="preserve"> </w:t>
+      </w:r>
+      <w:proofErr w:type="spellStart"/>
+      <w:r>
+        <w:t>tincidunt</w:t>
+      </w:r>
+      <w:proofErr w:type="spellEnd"/>
+      <w:r>
+        <w:t xml:space="preserve"> </w:t>
+      </w:r>
+      <w:proofErr w:type="spellStart"/>
+      <w:r>
+        <w:t>ultricies</w:t>
+      </w:r>
+      <w:proofErr w:type="spellEnd"/>
+      <w:r>
+        <w:t xml:space="preserve">. Morbi </w:t>
+      </w:r>
+      <w:proofErr w:type="spellStart"/>
+      <w:r>
+        <w:t>hendrerit</w:t>
+      </w:r>
+      <w:proofErr w:type="spellEnd"/>
+      <w:r>
+        <w:t xml:space="preserve"> </w:t>
+      </w:r>
+      <w:proofErr w:type="spellStart"/>
+      <w:r>
+        <w:t>sapien</w:t>
+      </w:r>
+      <w:proofErr w:type="spellEnd"/>
+      <w:r>
+        <w:t xml:space="preserve"> at diam </w:t>
+      </w:r>
+      <w:proofErr w:type="spellStart"/>
+      <w:r>
+        <w:t>tincidunt</w:t>
+      </w:r>
+      <w:proofErr w:type="spellEnd"/>
+      <w:r>
+        <w:t xml:space="preserve"> semper. </w:t>
+      </w:r>
+      <w:proofErr w:type="spellStart"/>
+      <w:r>
+        <w:t>Aliquam</w:t>
+      </w:r>
+      <w:proofErr w:type="spellEnd"/>
+      <w:r>
+        <w:t xml:space="preserve"> </w:t>
+      </w:r>
+      <w:proofErr w:type="spellStart"/>
+      <w:r>
+        <w:t>ut</w:t>
+      </w:r>
+      <w:proofErr w:type="spellEnd"/>
+      <w:r>
+        <w:t xml:space="preserve"> </w:t>
+      </w:r>
+      <w:proofErr w:type="spellStart"/>
+      <w:r>
+        <w:t>quam</w:t>
+      </w:r>
+      <w:proofErr w:type="spellEnd"/>
+      <w:r>
+        <w:t xml:space="preserve"> dictum </w:t>
+      </w:r>
+      <w:proofErr w:type="spellStart"/>
+      <w:r>
+        <w:t>quam</w:t>
+      </w:r>
+      <w:proofErr w:type="spellEnd"/>
+      <w:r>
+        <w:t xml:space="preserve"> maximus </w:t>
+      </w:r>
+      <w:proofErr w:type="spellStart"/>
+      <w:r>
+        <w:t>tempor</w:t>
+      </w:r>
+      <w:proofErr w:type="spellEnd"/>
+      <w:r>
+        <w:t xml:space="preserve"> sed at </w:t>
+      </w:r>
+      <w:proofErr w:type="spellStart"/>
+      <w:r>
+        <w:t>felis</w:t>
+      </w:r>
+      <w:proofErr w:type="spellEnd"/>
+      <w:r>
+        <w:t>.</w:t>
       </w:r>
     </w:p>
     <w:p/>
@@ -7709,9 +9156,23 @@
         <w:rPr>
           <w:lang w:val="fr-BE"/>
         </w:rPr>
-        <w:t xml:space="preserve">[Online]. Available: </w:t>
-      </w:r>
-      <w:hyperlink r:id="rId40" w:history="1">
+        <w:t xml:space="preserve">[Online]. </w:t>
+      </w:r>
+      <w:proofErr w:type="spellStart"/>
+      <w:r>
+        <w:rPr>
+          <w:lang w:val="fr-BE"/>
+        </w:rPr>
+        <w:t>Available</w:t>
+      </w:r>
+      <w:proofErr w:type="spellEnd"/>
+      <w:r>
+        <w:rPr>
+          <w:lang w:val="fr-BE"/>
+        </w:rPr>
+        <w:t xml:space="preserve">: </w:t>
+      </w:r>
+      <w:hyperlink r:id="rId41" w:history="1">
         <w:r>
           <w:rPr>
             <w:rStyle w:val="Hyperlink"/>
@@ -7746,9 +9207,23 @@
         <w:rPr>
           <w:lang w:val="fr-BE"/>
         </w:rPr>
-        <w:t xml:space="preserve">[Online]. Available: </w:t>
-      </w:r>
-      <w:hyperlink r:id="rId41" w:history="1">
+        <w:t xml:space="preserve">[Online]. </w:t>
+      </w:r>
+      <w:proofErr w:type="spellStart"/>
+      <w:r>
+        <w:rPr>
+          <w:lang w:val="fr-BE"/>
+        </w:rPr>
+        <w:t>Available</w:t>
+      </w:r>
+      <w:proofErr w:type="spellEnd"/>
+      <w:r>
+        <w:rPr>
+          <w:lang w:val="fr-BE"/>
+        </w:rPr>
+        <w:t xml:space="preserve">: </w:t>
+      </w:r>
+      <w:hyperlink r:id="rId42" w:history="1">
         <w:r>
           <w:rPr>
             <w:rStyle w:val="Hyperlink"/>
@@ -7838,9 +9313,23 @@
         <w:rPr>
           <w:lang w:val="fr-BE"/>
         </w:rPr>
-        <w:t xml:space="preserve">[Online]. Available: </w:t>
-      </w:r>
-      <w:hyperlink r:id="rId42" w:history="1">
+        <w:t xml:space="preserve">[Online]. </w:t>
+      </w:r>
+      <w:proofErr w:type="spellStart"/>
+      <w:r>
+        <w:rPr>
+          <w:lang w:val="fr-BE"/>
+        </w:rPr>
+        <w:t>Available</w:t>
+      </w:r>
+      <w:proofErr w:type="spellEnd"/>
+      <w:r>
+        <w:rPr>
+          <w:lang w:val="fr-BE"/>
+        </w:rPr>
+        <w:t xml:space="preserve">: </w:t>
+      </w:r>
+      <w:hyperlink r:id="rId43" w:history="1">
         <w:r>
           <w:rPr>
             <w:rStyle w:val="Hyperlink"/>
@@ -7868,9 +9357,17 @@
         </w:rPr>
       </w:pPr>
       <w:r>
-        <w:t xml:space="preserve">‘What’s the Difference Between Ray Casting, Ray Tracing, Path Tracing and Rasterization? Physical light tracing… – pIXELsHAM’. Accessed: Aug. 17, 2025. [Online]. Available: </w:t>
-      </w:r>
-      <w:hyperlink r:id="rId43" w:history="1">
+        <w:t xml:space="preserve">‘What’s the Difference Between Ray Casting, Ray Tracing, Path Tracing and Rasterization? Physical light tracing… – </w:t>
+      </w:r>
+      <w:proofErr w:type="spellStart"/>
+      <w:r>
+        <w:t>pIXELsHAM</w:t>
+      </w:r>
+      <w:proofErr w:type="spellEnd"/>
+      <w:r>
+        <w:t xml:space="preserve">’. Accessed: Aug. 17, 2025. [Online]. Available: </w:t>
+      </w:r>
+      <w:hyperlink r:id="rId44" w:history="1">
         <w:r>
           <w:rPr>
             <w:rStyle w:val="Hyperlink"/>
@@ -7901,15 +9398,37 @@
         </w:rPr>
       </w:pPr>
       <w:r>
-        <w:t xml:space="preserve">‘LearnOpenGL - Deferred Shading’. Accessed: Aug. 15, 2025. </w:t>
+        <w:t>‘</w:t>
+      </w:r>
+      <w:proofErr w:type="spellStart"/>
+      <w:r>
+        <w:t>LearnOpenGL</w:t>
+      </w:r>
+      <w:proofErr w:type="spellEnd"/>
+      <w:r>
+        <w:t xml:space="preserve"> - Deferred Shading’. Accessed: Aug. 15, 2025. </w:t>
       </w:r>
       <w:r>
         <w:rPr>
           <w:lang w:val="fr-BE"/>
         </w:rPr>
-        <w:t xml:space="preserve">[Online]. Available: </w:t>
-      </w:r>
-      <w:hyperlink r:id="rId44" w:history="1">
+        <w:t xml:space="preserve">[Online]. </w:t>
+      </w:r>
+      <w:proofErr w:type="spellStart"/>
+      <w:r>
+        <w:rPr>
+          <w:lang w:val="fr-BE"/>
+        </w:rPr>
+        <w:t>Available</w:t>
+      </w:r>
+      <w:proofErr w:type="spellEnd"/>
+      <w:r>
+        <w:rPr>
+          <w:lang w:val="fr-BE"/>
+        </w:rPr>
+        <w:t xml:space="preserve">: </w:t>
+      </w:r>
+      <w:hyperlink r:id="rId45" w:history="1">
         <w:r>
           <w:rPr>
             <w:rStyle w:val="Hyperlink"/>
@@ -7929,9 +9448,17 @@
     </w:p>
     <w:p>
       <w:r>
-        <w:t xml:space="preserve">D. Lettier, ‘Deferred Rendering | 3D Game Shaders For Beginners’. Accessed: Aug. 17, 2025. [Online]. Available: </w:t>
-      </w:r>
-      <w:hyperlink r:id="rId45" w:history="1">
+        <w:t xml:space="preserve">D. </w:t>
+      </w:r>
+      <w:proofErr w:type="spellStart"/>
+      <w:r>
+        <w:t>Lettier</w:t>
+      </w:r>
+      <w:proofErr w:type="spellEnd"/>
+      <w:r>
+        <w:t xml:space="preserve">, ‘Deferred Rendering | 3D Game Shaders For Beginners’. Accessed: Aug. 17, 2025. [Online]. Available: </w:t>
+      </w:r>
+      <w:hyperlink r:id="rId46" w:history="1">
         <w:r>
           <w:rPr>
             <w:rStyle w:val="Hyperlink"/>
@@ -7946,13 +9473,7 @@
       </w:pPr>
       <w:r>
         <w:lastRenderedPageBreak/>
-        <w:t>[</w:t>
-      </w:r>
-      <w:r>
-        <w:t>8</w:t>
-      </w:r>
-      <w:r>
-        <w:t>]</w:t>
+        <w:t>[8]</w:t>
       </w:r>
     </w:p>
     <w:p>
@@ -7964,8 +9485,13 @@
           <w:color w:val="auto"/>
         </w:rPr>
       </w:pPr>
-      <w:r>
-        <w:t xml:space="preserve">GetIntoGameDev, </w:t>
+      <w:proofErr w:type="spellStart"/>
+      <w:r>
+        <w:t>GetIntoGameDev</w:t>
+      </w:r>
+      <w:proofErr w:type="spellEnd"/>
+      <w:r>
+        <w:t xml:space="preserve">, </w:t>
       </w:r>
       <w:r>
         <w:rPr>
@@ -7977,7 +9503,7 @@
       <w:r>
         <w:t xml:space="preserve">, (June 14, 2023). Accessed: Aug. 17, 2025. [Online Video]. Available: </w:t>
       </w:r>
-      <w:hyperlink r:id="rId46" w:history="1">
+      <w:hyperlink r:id="rId47" w:history="1">
         <w:r>
           <w:rPr>
             <w:rStyle w:val="Hyperlink"/>
@@ -8027,9 +9553,23 @@
         <w:rPr>
           <w:lang w:val="fr-BE"/>
         </w:rPr>
-        <w:t xml:space="preserve">[Online]. Available: </w:t>
-      </w:r>
-      <w:hyperlink r:id="rId47" w:history="1">
+        <w:t xml:space="preserve">[Online]. </w:t>
+      </w:r>
+      <w:proofErr w:type="spellStart"/>
+      <w:r>
+        <w:rPr>
+          <w:lang w:val="fr-BE"/>
+        </w:rPr>
+        <w:t>Available</w:t>
+      </w:r>
+      <w:proofErr w:type="spellEnd"/>
+      <w:r>
+        <w:rPr>
+          <w:lang w:val="fr-BE"/>
+        </w:rPr>
+        <w:t xml:space="preserve">: </w:t>
+      </w:r>
+      <w:hyperlink r:id="rId48" w:history="1">
         <w:r>
           <w:rPr>
             <w:rStyle w:val="Hyperlink"/>
@@ -8075,7 +9615,21 @@
         <w:rPr>
           <w:lang w:val="fr-BE"/>
         </w:rPr>
-        <w:t xml:space="preserve">[Online]. Available: </w:t>
+        <w:t xml:space="preserve">[Online]. </w:t>
+      </w:r>
+      <w:proofErr w:type="spellStart"/>
+      <w:r>
+        <w:rPr>
+          <w:lang w:val="fr-BE"/>
+        </w:rPr>
+        <w:t>Available</w:t>
+      </w:r>
+      <w:proofErr w:type="spellEnd"/>
+      <w:r>
+        <w:rPr>
+          <w:lang w:val="fr-BE"/>
+        </w:rPr>
+        <w:t xml:space="preserve">: </w:t>
       </w:r>
       <w:r>
         <w:rPr>
@@ -8135,13 +9689,21 @@
       <w:r>
         <w:t xml:space="preserve">. May 23, 2025. Accessed: Aug. 05, 2025. [Online]. </w:t>
       </w:r>
+      <w:proofErr w:type="spellStart"/>
       <w:r>
         <w:rPr>
           <w:lang w:val="fr-BE"/>
         </w:rPr>
-        <w:t xml:space="preserve">Available: </w:t>
-      </w:r>
-      <w:hyperlink r:id="rId48" w:anchor="cite_note-6" w:history="1">
+        <w:t>Available</w:t>
+      </w:r>
+      <w:proofErr w:type="spellEnd"/>
+      <w:r>
+        <w:rPr>
+          <w:lang w:val="fr-BE"/>
+        </w:rPr>
+        <w:t xml:space="preserve">: </w:t>
+      </w:r>
+      <w:hyperlink r:id="rId49" w:anchor="cite_note-6" w:history="1">
         <w:r>
           <w:rPr>
             <w:rStyle w:val="Hyperlink"/>
@@ -8172,7 +9734,7 @@
       <w:r>
         <w:t xml:space="preserve">‘Figure 4: Comparison of the soft shadow mapping problem to the...’, ResearchGate. Accessed: Aug. 15, 2025. [Online]. Available: </w:t>
       </w:r>
-      <w:hyperlink r:id="rId49" w:history="1">
+      <w:hyperlink r:id="rId50" w:history="1">
         <w:r>
           <w:rPr>
             <w:rStyle w:val="Hyperlink"/>
@@ -8218,7 +9780,35 @@
         <w:rPr>
           <w:lang w:val="it-IT"/>
         </w:rPr>
-        <w:t xml:space="preserve">‘Screen space ambient occlusion’, </w:t>
+        <w:t xml:space="preserve">‘Screen </w:t>
+      </w:r>
+      <w:proofErr w:type="spellStart"/>
+      <w:r>
+        <w:rPr>
+          <w:lang w:val="it-IT"/>
+        </w:rPr>
+        <w:t>space</w:t>
+      </w:r>
+      <w:proofErr w:type="spellEnd"/>
+      <w:r>
+        <w:rPr>
+          <w:lang w:val="it-IT"/>
+        </w:rPr>
+        <w:t xml:space="preserve"> ambient </w:t>
+      </w:r>
+      <w:proofErr w:type="spellStart"/>
+      <w:r>
+        <w:rPr>
+          <w:lang w:val="it-IT"/>
+        </w:rPr>
+        <w:t>occlusion</w:t>
+      </w:r>
+      <w:proofErr w:type="spellEnd"/>
+      <w:r>
+        <w:rPr>
+          <w:lang w:val="it-IT"/>
+        </w:rPr>
+        <w:t xml:space="preserve">’, </w:t>
       </w:r>
       <w:r>
         <w:rPr>
@@ -8237,7 +9827,7 @@
       <w:r>
         <w:t xml:space="preserve">Apr. 14, 2025. Accessed: Aug. 15, 2025. [Online]. Available: </w:t>
       </w:r>
-      <w:hyperlink r:id="rId50" w:history="1">
+      <w:hyperlink r:id="rId51" w:history="1">
         <w:r>
           <w:rPr>
             <w:rStyle w:val="Hyperlink"/>
@@ -8385,7 +9975,7 @@
         </w:rPr>
         <w:br/>
       </w:r>
-      <w:hyperlink r:id="rId51" w:history="1">
+      <w:hyperlink r:id="rId52" w:history="1">
         <w:r>
           <w:rPr>
             <w:rStyle w:val="Hyperlink"/>
@@ -8399,8 +9989,8 @@
     <w:p/>
     <w:p/>
     <w:sectPr>
-      <w:headerReference w:type="default" r:id="rId52"/>
-      <w:footerReference w:type="default" r:id="rId53"/>
+      <w:headerReference w:type="default" r:id="rId53"/>
+      <w:footerReference w:type="default" r:id="rId54"/>
       <w:pgSz w:w="12240" w:h="15840"/>
       <w:pgMar w:top="1440" w:right="1440" w:bottom="1440" w:left="1440" w:header="720" w:footer="720" w:gutter="0"/>
       <w:pgNumType w:start="0"/>
@@ -12818,6 +14408,7 @@
     <w:rsid w:val="00E86D88"/>
     <w:rsid w:val="00E978A2"/>
     <w:rsid w:val="00F52E0F"/>
+    <w:rsid w:val="00F974D9"/>
   </w:rsids>
   <m:mathPr>
     <m:mathFont m:val="Cambria Math"/>
@@ -13548,34 +15139,10 @@
 </file>
 
 <file path=customXml/item1.xml><?xml version="1.0" encoding="utf-8"?>
-<?mso-contentType ?>
-<FormTemplates xmlns="http://schemas.microsoft.com/sharepoint/v3/contenttype/forms">
-  <Display>DocumentLibraryForm</Display>
-  <Edit>DocumentLibraryForm</Edit>
-  <New>DocumentLibraryForm</New>
-</FormTemplates>
+<b:Sources xmlns:b="http://schemas.openxmlformats.org/officeDocument/2006/bibliography" xmlns="http://schemas.openxmlformats.org/officeDocument/2006/bibliography" SelectedStyle="\APASixthEditionOfficeOnline.xsl" StyleName="APA" Version="6"/>
 </file>
 
 <file path=customXml/item2.xml><?xml version="1.0" encoding="utf-8"?>
-<b:Sources xmlns:b="http://schemas.openxmlformats.org/officeDocument/2006/bibliography" xmlns="http://schemas.openxmlformats.org/officeDocument/2006/bibliography" SelectedStyle="\APASixthEditionOfficeOnline.xsl" StyleName="APA" Version="6"/>
-</file>
-
-<file path=customXml/item3.xml><?xml version="1.0" encoding="utf-8"?>
-<p:properties xmlns:p="http://schemas.microsoft.com/office/2006/metadata/properties" xmlns:xsi="http://www.w3.org/2001/XMLSchema-instance" xmlns:pc="http://schemas.microsoft.com/office/infopath/2007/PartnerControls">
-  <documentManagement>
-    <IconOverlay xmlns="http://schemas.microsoft.com/sharepoint/v4" xsi:nil="true"/>
-    <TaxCatchAll xmlns="128482ec-0431-40d5-ab26-89ea2a4f3ccd" xsi:nil="true"/>
-    <m99485b88215436a82099f8287cba0b0 xmlns="128482ec-0431-40d5-ab26-89ea2a4f3ccd">
-      <Terms xmlns="http://schemas.microsoft.com/office/infopath/2007/PartnerControls"/>
-    </m99485b88215436a82099f8287cba0b0>
-    <lcf76f155ced4ddcb4097134ff3c332f xmlns="60eb0cf4-ae2a-4762-800a-cb593b869ecb">
-      <Terms xmlns="http://schemas.microsoft.com/office/infopath/2007/PartnerControls"/>
-    </lcf76f155ced4ddcb4097134ff3c332f>
-  </documentManagement>
-</p:properties>
-</file>
-
-<file path=customXml/item4.xml><?xml version="1.0" encoding="utf-8"?>
 <ct:contentTypeSchema xmlns:ct="http://schemas.microsoft.com/office/2006/metadata/contentType" xmlns:ma="http://schemas.microsoft.com/office/2006/metadata/properties/metaAttributes" ct:_="" ma:_="" ma:contentTypeName="Document" ma:contentTypeID="0x010100723942CCEB3A674D8F1F6472CCEFB38E" ma:contentTypeVersion="11" ma:contentTypeDescription="Create a new document." ma:contentTypeScope="" ma:versionID="e4de40d148e029d40e3aaddc8bf68a5e">
   <xsd:schema xmlns:xsd="http://www.w3.org/2001/XMLSchema" xmlns:xs="http://www.w3.org/2001/XMLSchema" xmlns:p="http://schemas.microsoft.com/office/2006/metadata/properties" xmlns:ns2="128482ec-0431-40d5-ab26-89ea2a4f3ccd" xmlns:ns3="60eb0cf4-ae2a-4762-800a-cb593b869ecb" xmlns:ns4="http://schemas.microsoft.com/sharepoint/v4" xmlns:ns5="a2e691a9-fcfc-4d85-a390-1894fe98bd9e" targetNamespace="http://schemas.microsoft.com/office/2006/metadata/properties" ma:root="true" ma:fieldsID="fce8e8bd091658f3fe51b22d57dec109" ns2:_="" ns3:_="" ns4:_="" ns5:_="">
     <xsd:import namespace="128482ec-0431-40d5-ab26-89ea2a4f3ccd"/>
@@ -13848,15 +15415,31 @@
 </ct:contentTypeSchema>
 </file>
 
-<file path=customXml/itemProps1.xml><?xml version="1.0" encoding="utf-8"?>
-<ds:datastoreItem xmlns:ds="http://schemas.openxmlformats.org/officeDocument/2006/customXml" ds:itemID="{5EBBBFF2-2B1E-4E2A-81ED-02FB13488392}">
-  <ds:schemaRefs>
-    <ds:schemaRef ds:uri="http://schemas.microsoft.com/sharepoint/v3/contenttype/forms"/>
-  </ds:schemaRefs>
-</ds:datastoreItem>
+<file path=customXml/item3.xml><?xml version="1.0" encoding="utf-8"?>
+<p:properties xmlns:p="http://schemas.microsoft.com/office/2006/metadata/properties" xmlns:xsi="http://www.w3.org/2001/XMLSchema-instance" xmlns:pc="http://schemas.microsoft.com/office/infopath/2007/PartnerControls">
+  <documentManagement>
+    <IconOverlay xmlns="http://schemas.microsoft.com/sharepoint/v4" xsi:nil="true"/>
+    <TaxCatchAll xmlns="128482ec-0431-40d5-ab26-89ea2a4f3ccd" xsi:nil="true"/>
+    <m99485b88215436a82099f8287cba0b0 xmlns="128482ec-0431-40d5-ab26-89ea2a4f3ccd">
+      <Terms xmlns="http://schemas.microsoft.com/office/infopath/2007/PartnerControls"/>
+    </m99485b88215436a82099f8287cba0b0>
+    <lcf76f155ced4ddcb4097134ff3c332f xmlns="60eb0cf4-ae2a-4762-800a-cb593b869ecb">
+      <Terms xmlns="http://schemas.microsoft.com/office/infopath/2007/PartnerControls"/>
+    </lcf76f155ced4ddcb4097134ff3c332f>
+  </documentManagement>
+</p:properties>
 </file>
 
-<file path=customXml/itemProps2.xml><?xml version="1.0" encoding="utf-8"?>
+<file path=customXml/item4.xml><?xml version="1.0" encoding="utf-8"?>
+<?mso-contentType ?>
+<FormTemplates xmlns="http://schemas.microsoft.com/sharepoint/v3/contenttype/forms">
+  <Display>DocumentLibraryForm</Display>
+  <Edit>DocumentLibraryForm</Edit>
+  <New>DocumentLibraryForm</New>
+</FormTemplates>
+</file>
+
+<file path=customXml/itemProps1.xml><?xml version="1.0" encoding="utf-8"?>
 <ds:datastoreItem xmlns:ds="http://schemas.openxmlformats.org/officeDocument/2006/customXml" ds:itemID="{9FB24B6F-1995-495D-B4E9-64B4DC9866CE}">
   <ds:schemaRefs>
     <ds:schemaRef ds:uri="http://schemas.openxmlformats.org/officeDocument/2006/bibliography"/>
@@ -13864,19 +15447,7 @@
 </ds:datastoreItem>
 </file>
 
-<file path=customXml/itemProps3.xml><?xml version="1.0" encoding="utf-8"?>
-<ds:datastoreItem xmlns:ds="http://schemas.openxmlformats.org/officeDocument/2006/customXml" ds:itemID="{0744C301-BA8E-4358-811D-299431B59409}">
-  <ds:schemaRefs>
-    <ds:schemaRef ds:uri="http://schemas.microsoft.com/office/2006/metadata/properties"/>
-    <ds:schemaRef ds:uri="http://schemas.microsoft.com/office/infopath/2007/PartnerControls"/>
-    <ds:schemaRef ds:uri="http://schemas.microsoft.com/sharepoint/v4"/>
-    <ds:schemaRef ds:uri="128482ec-0431-40d5-ab26-89ea2a4f3ccd"/>
-    <ds:schemaRef ds:uri="60eb0cf4-ae2a-4762-800a-cb593b869ecb"/>
-  </ds:schemaRefs>
-</ds:datastoreItem>
-</file>
-
-<file path=customXml/itemProps4.xml><?xml version="1.0" encoding="utf-8"?>
+<file path=customXml/itemProps2.xml><?xml version="1.0" encoding="utf-8"?>
 <ds:datastoreItem xmlns:ds="http://schemas.openxmlformats.org/officeDocument/2006/customXml" ds:itemID="{6AD6E667-9FE3-44F6-AA83-894C6D5E44A5}">
   <ds:schemaRefs>
     <ds:schemaRef ds:uri="http://schemas.microsoft.com/office/2006/metadata/contentType"/>
@@ -13895,4 +15466,24 @@
     <ds:schemaRef ds:uri="http://schemas.microsoft.com/internal/obd"/>
   </ds:schemaRefs>
 </ds:datastoreItem>
+</file>
+
+<file path=customXml/itemProps3.xml><?xml version="1.0" encoding="utf-8"?>
+<ds:datastoreItem xmlns:ds="http://schemas.openxmlformats.org/officeDocument/2006/customXml" ds:itemID="{0744C301-BA8E-4358-811D-299431B59409}">
+  <ds:schemaRefs>
+    <ds:schemaRef ds:uri="http://schemas.microsoft.com/office/2006/metadata/properties"/>
+    <ds:schemaRef ds:uri="http://schemas.microsoft.com/office/infopath/2007/PartnerControls"/>
+    <ds:schemaRef ds:uri="http://schemas.microsoft.com/sharepoint/v4"/>
+    <ds:schemaRef ds:uri="128482ec-0431-40d5-ab26-89ea2a4f3ccd"/>
+    <ds:schemaRef ds:uri="60eb0cf4-ae2a-4762-800a-cb593b869ecb"/>
+  </ds:schemaRefs>
+</ds:datastoreItem>
+</file>
+
+<file path=customXml/itemProps4.xml><?xml version="1.0" encoding="utf-8"?>
+<ds:datastoreItem xmlns:ds="http://schemas.openxmlformats.org/officeDocument/2006/customXml" ds:itemID="{5EBBBFF2-2B1E-4E2A-81ED-02FB13488392}">
+  <ds:schemaRefs>
+    <ds:schemaRef ds:uri="http://schemas.microsoft.com/sharepoint/v3/contenttype/forms"/>
+  </ds:schemaRefs>
+</ds:datastoreItem>
 </file>
</xml_diff>

<commit_message>
Added "transparancy pass" section
</commit_message>
<xml_diff>
--- a/Paper/GW2425_Demaecker_Daan_NL_Paper.docx
+++ b/Paper/GW2425_Demaecker_Daan_NL_Paper.docx
@@ -166,13 +166,8 @@
       <w:r>
         <w:t xml:space="preserve">Supervisor: </w:t>
       </w:r>
-      <w:proofErr w:type="spellStart"/>
-      <w:r>
-        <w:t>Deweppe</w:t>
-      </w:r>
-      <w:proofErr w:type="spellEnd"/>
-      <w:r>
-        <w:t xml:space="preserve"> Alexander</w:t>
+      <w:r>
+        <w:t>Deweppe Alexander</w:t>
       </w:r>
     </w:p>
     <w:p>
@@ -182,13 +177,8 @@
       <w:r>
         <w:t xml:space="preserve">Coach: </w:t>
       </w:r>
-      <w:proofErr w:type="spellStart"/>
-      <w:r>
-        <w:t>Verspecht</w:t>
-      </w:r>
-      <w:proofErr w:type="spellEnd"/>
-      <w:r>
-        <w:t xml:space="preserve"> Marijn</w:t>
+      <w:r>
+        <w:t>Verspecht Marijn</w:t>
       </w:r>
     </w:p>
     <w:p>
@@ -3251,127 +3241,35 @@
           <w:lang w:val="nl-BE"/>
         </w:rPr>
       </w:pPr>
-      <w:proofErr w:type="spellStart"/>
       <w:r>
         <w:rPr>
           <w:lang w:val="nl-BE"/>
         </w:rPr>
-        <w:t>Ambient</w:t>
-      </w:r>
-      <w:proofErr w:type="spellEnd"/>
+        <w:t>Ambient occlusion is een globale verlichti</w:t>
+      </w:r>
       <w:r>
         <w:rPr>
           <w:lang w:val="nl-BE"/>
         </w:rPr>
-        <w:t xml:space="preserve"> </w:t>
-      </w:r>
-      <w:proofErr w:type="spellStart"/>
+        <w:t xml:space="preserve">ngsmethode en een belangrijke stap in renderen om de wereld meer realistisch te laten lijken door de harde CGI look wat  zachter te maken. In pre-renderen is kan dit redelijk </w:t>
+      </w:r>
       <w:r>
         <w:rPr>
           <w:lang w:val="nl-BE"/>
         </w:rPr>
-        <w:t>occlusion</w:t>
-      </w:r>
-      <w:proofErr w:type="spellEnd"/>
+        <w:t>accuraat</w:t>
+      </w:r>
       <w:r>
         <w:rPr>
           <w:lang w:val="nl-BE"/>
         </w:rPr>
-        <w:t xml:space="preserve"> is een globale verlichti</w:t>
+        <w:t xml:space="preserve"> ged</w:t>
       </w:r>
       <w:r>
         <w:rPr>
           <w:lang w:val="nl-BE"/>
         </w:rPr>
-        <w:t xml:space="preserve">ngsmethode en een belangrijke stap in renderen om de wereld meer realistisch te laten lijken door de harde CGI look wat  zachter te maken. In pre-renderen is kan dit redelijk </w:t>
-      </w:r>
-      <w:r>
-        <w:rPr>
-          <w:lang w:val="nl-BE"/>
-        </w:rPr>
-        <w:t>accuraat</w:t>
-      </w:r>
-      <w:r>
-        <w:rPr>
-          <w:lang w:val="nl-BE"/>
-        </w:rPr>
-        <w:t xml:space="preserve"> ged</w:t>
-      </w:r>
-      <w:r>
-        <w:rPr>
-          <w:lang w:val="nl-BE"/>
-        </w:rPr>
-        <w:t xml:space="preserve">aan worden omdat tijd een minder groot probleem is, maar in real-time renderen is dit een ander verhaal. In real-time renderen moet de </w:t>
-      </w:r>
-      <w:proofErr w:type="spellStart"/>
-      <w:r>
-        <w:rPr>
-          <w:lang w:val="nl-BE"/>
-        </w:rPr>
-        <w:t>ambient</w:t>
-      </w:r>
-      <w:proofErr w:type="spellEnd"/>
-      <w:r>
-        <w:rPr>
-          <w:lang w:val="nl-BE"/>
-        </w:rPr>
-        <w:t xml:space="preserve"> </w:t>
-      </w:r>
-      <w:proofErr w:type="spellStart"/>
-      <w:r>
-        <w:rPr>
-          <w:lang w:val="nl-BE"/>
-        </w:rPr>
-        <w:t>occlusion</w:t>
-      </w:r>
-      <w:proofErr w:type="spellEnd"/>
-      <w:r>
-        <w:rPr>
-          <w:lang w:val="nl-BE"/>
-        </w:rPr>
-        <w:t xml:space="preserve"> elk frame opnieuw berekend worden, dus zullen we een paar hoeken moeten afsnijden. In deze paper zal ik het hebben over 3 verschillende types real-time </w:t>
-      </w:r>
-      <w:proofErr w:type="spellStart"/>
-      <w:r>
-        <w:rPr>
-          <w:lang w:val="nl-BE"/>
-        </w:rPr>
-        <w:t>ambient</w:t>
-      </w:r>
-      <w:proofErr w:type="spellEnd"/>
-      <w:r>
-        <w:rPr>
-          <w:lang w:val="nl-BE"/>
-        </w:rPr>
-        <w:t xml:space="preserve"> </w:t>
-      </w:r>
-      <w:proofErr w:type="spellStart"/>
-      <w:r>
-        <w:rPr>
-          <w:lang w:val="nl-BE"/>
-        </w:rPr>
-        <w:t>occlusion</w:t>
-      </w:r>
-      <w:proofErr w:type="spellEnd"/>
-      <w:r>
-        <w:rPr>
-          <w:lang w:val="nl-BE"/>
-        </w:rPr>
-        <w:t xml:space="preserve">. Ik zal bespreken hoe je ze kan implementeren in C++, </w:t>
-      </w:r>
-      <w:proofErr w:type="spellStart"/>
-      <w:r>
-        <w:rPr>
-          <w:lang w:val="nl-BE"/>
-        </w:rPr>
-        <w:t>Vulkan</w:t>
-      </w:r>
-      <w:proofErr w:type="spellEnd"/>
-      <w:r>
-        <w:rPr>
-          <w:lang w:val="nl-BE"/>
-        </w:rPr>
-        <w:t xml:space="preserve"> en welke je best kiest, gegeven de keuze.</w:t>
+        <w:t>aan worden omdat tijd een minder groot probleem is, maar in real-time renderen is dit een ander verhaal. In real-time renderen moet de ambient occlusion elk frame opnieuw berekend worden, dus zullen we een paar hoeken moeten afsnijden. In deze paper zal ik het hebben over 3 verschillende types real-time ambient occlusion. Ik zal bespreken hoe je ze kan implementeren in C++, Vulkan en welke je best kiest, gegeven de keuze.</w:t>
       </w:r>
       <w:r>
         <w:rPr>
@@ -3393,15 +3291,7 @@
     </w:p>
     <w:p>
       <w:r>
-        <w:t xml:space="preserve">During my studies at </w:t>
-      </w:r>
-      <w:proofErr w:type="spellStart"/>
-      <w:r>
-        <w:t>Howest</w:t>
-      </w:r>
-      <w:proofErr w:type="spellEnd"/>
-      <w:r>
-        <w:t xml:space="preserve"> – Digital Arts and Entertainment (DAE), I was introduced to graphics programming through our course that is aptly named Graphics Programming 1. In this course</w:t>
+        <w:t>During my studies at Howest – Digital Arts and Entertainment (DAE), I was introduced to graphics programming through our course that is aptly named Graphics Programming 1. In this course</w:t>
       </w:r>
       <w:r>
         <w:t>,</w:t>
@@ -3894,15 +3784,7 @@
         <w:t>Vulkan has 2 types of devices, logical and physical. Physical devices are often part of the system in the form of a graphics card, accelerator, DSP, or other component.</w:t>
       </w:r>
       <w:r>
-        <w:t xml:space="preserve"> There is a fixed number of physical devices, and it is up to the user to choose which one is the most optimal. After choosing the desired physical device, a handle to it is stored in a variable of type </w:t>
-      </w:r>
-      <w:proofErr w:type="spellStart"/>
-      <w:r>
-        <w:t>VkPhysicalDevice</w:t>
-      </w:r>
-      <w:proofErr w:type="spellEnd"/>
-      <w:r>
-        <w:t>. Using the physical device, a logical device can be created. The logical device will be the object that is mainly used in the application to “talk” to the GPU.</w:t>
+        <w:t xml:space="preserve"> There is a fixed number of physical devices, and it is up to the user to choose which one is the most optimal. After choosing the desired physical device, a handle to it is stored in a variable of type VkPhysicalDevice. Using the physical device, a logical device can be created. The logical device will be the object that is mainly used in the application to “talk” to the GPU.</w:t>
       </w:r>
     </w:p>
     <w:p>
@@ -4230,27 +4112,14 @@
                             <w:r>
                               <w:t xml:space="preserve">Figure </w:t>
                             </w:r>
-                            <w:r>
-                              <w:fldChar w:fldCharType="begin"/>
-                            </w:r>
-                            <w:r>
-                              <w:instrText xml:space="preserve"> SEQ Figure \* ARABIC </w:instrText>
-                            </w:r>
-                            <w:r>
-                              <w:fldChar w:fldCharType="separate"/>
-                            </w:r>
-                            <w:r>
-                              <w:rPr>
-                                <w:noProof/>
-                              </w:rPr>
-                              <w:t>1</w:t>
-                            </w:r>
-                            <w:r>
-                              <w:rPr>
-                                <w:noProof/>
-                              </w:rPr>
-                              <w:fldChar w:fldCharType="end"/>
-                            </w:r>
+                            <w:fldSimple w:instr=" SEQ Figure \* ARABIC ">
+                              <w:r>
+                                <w:rPr>
+                                  <w:noProof/>
+                                </w:rPr>
+                                <w:t>1</w:t>
+                              </w:r>
+                            </w:fldSimple>
                           </w:p>
                         </w:txbxContent>
                       </wps:txbx>
@@ -4998,16 +4867,15 @@
         <w:pStyle w:val="Heading3"/>
       </w:pPr>
       <w:r>
-        <w:t xml:space="preserve">2.4 </w:t>
-      </w:r>
-      <w:r>
-        <w:t>Transparency</w:t>
-      </w:r>
-      <w:r>
-        <w:t xml:space="preserve"> pass</w:t>
-      </w:r>
-    </w:p>
-    <w:p/>
+        <w:t>2.4 Transparency pass</w:t>
+      </w:r>
+    </w:p>
+    <w:p>
+      <w:r>
+        <w:lastRenderedPageBreak/>
+        <w:t>The final stage I will talk about is the transparency pass. When rendering transparent objects, we run into a small problem. We can’t store our scene in layers like in Photoshop or other software like it. Only the top “layer” is saved. When we render a transparent object, the depth buffer will see this as the top layer, and objects rendered behind it will be discarded. To fix this issue, we render all transparent objects at the very end of our pipeline, even after the lighting stage. We will call this the transparency pass</w:t>
+      </w:r>
+    </w:p>
     <w:p>
       <w:pPr>
         <w:pStyle w:val="Heading3"/>
@@ -5018,16 +4886,7 @@
     </w:p>
     <w:p>
       <w:r>
-        <w:t>Now that we have covered all this, we only need 2 more pieces of the puzzle</w:t>
-      </w:r>
-      <w:r>
-        <w:t>, the ambient occlusion map generation and the ambient occlusion map blur</w:t>
-      </w:r>
-      <w:r>
-        <w:t>, but I will delve deeper into those later. Right no</w:t>
-      </w:r>
-      <w:r>
-        <w:t>w, this is our overview of the pipeline.</w:t>
+        <w:t>Now that we have covered all this, we only need 2 more pieces of the puzzle, the ambient occlusion map generation and the ambient occlusion map blur, but I will delve deeper into those later. Right now, this is our overview of the pipeline.</w:t>
       </w:r>
     </w:p>
     <w:p>
@@ -5150,6 +5009,7 @@
         </w:numPr>
       </w:pPr>
       <w:r>
+        <w:lastRenderedPageBreak/>
         <w:t>Ambient Occlusion: This is the technique that I will be breaking down into detail throughout this paper.</w:t>
       </w:r>
     </w:p>
@@ -5165,7 +5025,6 @@
         <w:rPr>
           <w:noProof/>
         </w:rPr>
-        <w:lastRenderedPageBreak/>
         <w:drawing>
           <wp:anchor distT="0" distB="0" distL="114300" distR="114300" simplePos="0" relativeHeight="251665408" behindDoc="1" locked="0" layoutInCell="1" allowOverlap="1" wp14:anchorId="4DFB6262" wp14:editId="092E14CF">
             <wp:simplePos x="0" y="0"/>
@@ -5347,14 +5206,11 @@
     </w:p>
     <w:p>
       <w:r>
+        <w:lastRenderedPageBreak/>
         <w:t>In ambient occlusion, the area around a point in the world is checked for occluding geometry nearby, the filter region is often quite small</w:t>
       </w:r>
       <w:r>
-        <w:t xml:space="preserve"> and in the shape of a dome around the point, in the </w:t>
-      </w:r>
-      <w:r>
-        <w:lastRenderedPageBreak/>
-        <w:t>direction of the normal</w:t>
+        <w:t xml:space="preserve"> and in the shape of a dome around the point, in the direction of the normal</w:t>
       </w:r>
       <w:r>
         <w:t>.</w:t>
@@ -5526,27 +5382,11 @@
     </w:p>
     <w:p>
       <w:r>
-        <w:t xml:space="preserve">SSAO needs 2 main things to make the correct calculations: the view space position and the view space </w:t>
-      </w:r>
-      <w:proofErr w:type="spellStart"/>
-      <w:r>
-        <w:t>normals</w:t>
-      </w:r>
-      <w:proofErr w:type="spellEnd"/>
-      <w:r>
-        <w:t xml:space="preserve">. View space means that it is relevant to the camera; the view space position of the camera would be (0,0,0), the view space position of an object 1 unit in front of the camera would be (0,0,1), etc. The same is true of view space </w:t>
-      </w:r>
-      <w:proofErr w:type="spellStart"/>
-      <w:r>
-        <w:t>normals</w:t>
-      </w:r>
-      <w:proofErr w:type="spellEnd"/>
-      <w:r>
-        <w:t xml:space="preserve">. A normal facing towards </w:t>
+        <w:t xml:space="preserve">SSAO needs 2 main things to make the correct calculations: the view space position and the view space normals. View space means that it is relevant to the camera; the view space position </w:t>
       </w:r>
       <w:r>
         <w:lastRenderedPageBreak/>
-        <w:t>the camera would hold a value of (0,0,-1), while a normal facing away from the camera would hold a value of (0,0,1).</w:t>
+        <w:t>of the camera would be (0,0,0), the view space position of an object 1 unit in front of the camera would be (0,0,1), etc. The same is true of view space normals. A normal facing towards the camera would hold a value of (0,0,-1), while a normal facing away from the camera would hold a value of (0,0,1).</w:t>
       </w:r>
     </w:p>
     <w:p>
@@ -5807,19 +5647,15 @@
         <w:t>The original SSAO is simply called SSAO</w:t>
       </w:r>
       <w:r>
-        <w:t xml:space="preserve">[5]. It was developed by Vladimir </w:t>
-      </w:r>
-      <w:proofErr w:type="spellStart"/>
-      <w:r>
-        <w:t>Kajalin</w:t>
-      </w:r>
-      <w:proofErr w:type="spellEnd"/>
-      <w:r>
-        <w:t xml:space="preserve"> and was used for the first time in 2007 by the game Crysis, developed by Crytek.</w:t>
+        <w:t>[5]. It was developed by Vladimir Kajalin and was used for the first time in 2007 by the game Crysis, developed by Crytek.</w:t>
       </w:r>
       <w:r>
         <w:br/>
-        <w:t>The general idea is that we project a small dome around a single point in the direction of the view space normal of that point. We then project several points within that dome and check which ones are visible to the camera. We do this by calculating the view space position of said points and checking if they are visible to the camera with the help of the previously mentioned view space position map.</w:t>
+        <w:t xml:space="preserve">The general idea is that we project a small dome around a single point in the direction of the view space normal of that point. We then project several points within that dome and check which ones are visible to the camera. We do this by calculating the view space position of said </w:t>
+      </w:r>
+      <w:r>
+        <w:lastRenderedPageBreak/>
+        <w:t>points and checking if they are visible to the camera with the help of the previously mentioned view space position map.</w:t>
       </w:r>
     </w:p>
     <w:p>
@@ -5827,7 +5663,6 @@
         <w:rPr>
           <w:noProof/>
         </w:rPr>
-        <w:lastRenderedPageBreak/>
         <w:drawing>
           <wp:inline distT="0" distB="0" distL="0" distR="0" wp14:anchorId="563F1A1F" wp14:editId="7C24F6DF">
             <wp:extent cx="4789552" cy="2403475"/>
@@ -6088,6 +5923,7 @@
     </w:p>
     <w:p>
       <w:r>
+        <w:lastRenderedPageBreak/>
         <w:t>Now that we have the complete calculation, I will break down how to calculate the AO for a single sample direction.</w:t>
       </w:r>
     </w:p>
@@ -6099,7 +5935,6 @@
         <w:rPr>
           <w:noProof/>
         </w:rPr>
-        <w:lastRenderedPageBreak/>
         <w:drawing>
           <wp:anchor distT="0" distB="0" distL="114300" distR="114300" simplePos="0" relativeHeight="251678720" behindDoc="0" locked="0" layoutInCell="1" allowOverlap="1" wp14:anchorId="517BD431" wp14:editId="38FC97AA">
             <wp:simplePos x="0" y="0"/>
@@ -6541,15 +6376,7 @@
         </w:drawing>
       </w:r>
       <w:r>
-        <w:t>Calculate and normalize the cross product of the so-called “</w:t>
-      </w:r>
-      <w:proofErr w:type="spellStart"/>
-      <w:r>
-        <w:t>leftDirection</w:t>
-      </w:r>
-      <w:proofErr w:type="spellEnd"/>
-      <w:r>
-        <w:t>” and the normal, which will give us a vector perpendicular to the curve at point P, also called the Tangent.</w:t>
+        <w:t>Calculate and normalize the cross product of the so-called “leftDirection” and the normal, which will give us a vector perpendicular to the curve at point P, also called the Tangent.</w:t>
       </w:r>
     </w:p>
     <w:p>
@@ -7895,1171 +7722,55 @@
         </w:rPr>
       </w:pPr>
       <w:r>
-        <w:t xml:space="preserve">Lorem ipsum dolor sit </w:t>
-      </w:r>
-      <w:proofErr w:type="spellStart"/>
-      <w:r>
-        <w:t>amet</w:t>
-      </w:r>
-      <w:proofErr w:type="spellEnd"/>
-      <w:r>
-        <w:t xml:space="preserve">, </w:t>
-      </w:r>
-      <w:proofErr w:type="spellStart"/>
-      <w:r>
-        <w:t>consectetur</w:t>
-      </w:r>
-      <w:proofErr w:type="spellEnd"/>
-      <w:r>
-        <w:t xml:space="preserve"> </w:t>
-      </w:r>
-      <w:proofErr w:type="spellStart"/>
-      <w:r>
-        <w:t>adipiscing</w:t>
-      </w:r>
-      <w:proofErr w:type="spellEnd"/>
-      <w:r>
-        <w:t xml:space="preserve"> </w:t>
-      </w:r>
-      <w:proofErr w:type="spellStart"/>
-      <w:r>
-        <w:t>elit</w:t>
-      </w:r>
-      <w:proofErr w:type="spellEnd"/>
-      <w:r>
-        <w:t xml:space="preserve">. </w:t>
-      </w:r>
-      <w:proofErr w:type="spellStart"/>
+        <w:t xml:space="preserve">Lorem ipsum dolor sit amet, consectetur adipiscing elit. </w:t>
+      </w:r>
       <w:r>
         <w:rPr>
           <w:lang w:val="it-IT"/>
         </w:rPr>
-        <w:t>Vestibulum</w:t>
-      </w:r>
-      <w:proofErr w:type="spellEnd"/>
+        <w:t xml:space="preserve">Vestibulum ac quam nec arcu semper dignissim. </w:t>
+      </w:r>
+      <w:r>
+        <w:rPr>
+          <w:lang w:val="fr-BE"/>
+        </w:rPr>
+        <w:t>Nulla quam magna, varius sit amet pharetra et, dictum quis elit. Pellentesque habitant morbi tristique senectus et netus et malesuada fames ac turpis egestas.</w:t>
+      </w:r>
+    </w:p>
+    <w:p>
+      <w:pPr>
+        <w:rPr>
+          <w:lang w:val="fr-BE"/>
+        </w:rPr>
+      </w:pPr>
+      <w:r>
+        <w:rPr>
+          <w:lang w:val="fr-BE"/>
+        </w:rPr>
+        <w:t xml:space="preserve">Proin ullamcorper, ipsum sit amet scelerisque rhoncus, leo quam rhoncus elit, sit amet ullamcorper tellus nisi eget sapien. </w:t>
+      </w:r>
       <w:r>
         <w:rPr>
           <w:lang w:val="it-IT"/>
         </w:rPr>
-        <w:t xml:space="preserve"> </w:t>
-      </w:r>
-      <w:proofErr w:type="spellStart"/>
+        <w:t xml:space="preserve">Suspendisse potenti. Ut non justo viverra, tempus felis vitae, elementum mi. </w:t>
+      </w:r>
+      <w:r>
+        <w:rPr>
+          <w:lang w:val="fr-BE"/>
+        </w:rPr>
+        <w:t>Morbi at dui sed lacus fringilla condimentum. Duis non odio ac arcu volutpat vehicula eu et turpis.</w:t>
+      </w:r>
+    </w:p>
+    <w:p>
       <w:r>
         <w:rPr>
           <w:lang w:val="it-IT"/>
         </w:rPr>
-        <w:t>ac</w:t>
-      </w:r>
-      <w:proofErr w:type="spellEnd"/>
-      <w:r>
-        <w:rPr>
-          <w:lang w:val="it-IT"/>
-        </w:rPr>
-        <w:t xml:space="preserve"> </w:t>
-      </w:r>
-      <w:proofErr w:type="spellStart"/>
-      <w:r>
-        <w:rPr>
-          <w:lang w:val="it-IT"/>
-        </w:rPr>
-        <w:t>quam</w:t>
-      </w:r>
-      <w:proofErr w:type="spellEnd"/>
-      <w:r>
-        <w:rPr>
-          <w:lang w:val="it-IT"/>
-        </w:rPr>
-        <w:t xml:space="preserve"> </w:t>
-      </w:r>
-      <w:proofErr w:type="spellStart"/>
-      <w:r>
-        <w:rPr>
-          <w:lang w:val="it-IT"/>
-        </w:rPr>
-        <w:t>nec</w:t>
-      </w:r>
-      <w:proofErr w:type="spellEnd"/>
-      <w:r>
-        <w:rPr>
-          <w:lang w:val="it-IT"/>
-        </w:rPr>
-        <w:t xml:space="preserve"> </w:t>
-      </w:r>
-      <w:proofErr w:type="spellStart"/>
-      <w:r>
-        <w:rPr>
-          <w:lang w:val="it-IT"/>
-        </w:rPr>
-        <w:t>arcu</w:t>
-      </w:r>
-      <w:proofErr w:type="spellEnd"/>
-      <w:r>
-        <w:rPr>
-          <w:lang w:val="it-IT"/>
-        </w:rPr>
-        <w:t xml:space="preserve"> </w:t>
-      </w:r>
-      <w:proofErr w:type="spellStart"/>
-      <w:r>
-        <w:rPr>
-          <w:lang w:val="it-IT"/>
-        </w:rPr>
-        <w:t>semper</w:t>
-      </w:r>
-      <w:proofErr w:type="spellEnd"/>
-      <w:r>
-        <w:rPr>
-          <w:lang w:val="it-IT"/>
-        </w:rPr>
-        <w:t xml:space="preserve"> </w:t>
-      </w:r>
-      <w:proofErr w:type="spellStart"/>
-      <w:r>
-        <w:rPr>
-          <w:lang w:val="it-IT"/>
-        </w:rPr>
-        <w:t>dignissim</w:t>
-      </w:r>
-      <w:proofErr w:type="spellEnd"/>
-      <w:r>
-        <w:rPr>
-          <w:lang w:val="it-IT"/>
-        </w:rPr>
-        <w:t xml:space="preserve">. </w:t>
-      </w:r>
-      <w:proofErr w:type="spellStart"/>
-      <w:r>
-        <w:rPr>
-          <w:lang w:val="fr-BE"/>
-        </w:rPr>
-        <w:t>Nulla</w:t>
-      </w:r>
-      <w:proofErr w:type="spellEnd"/>
-      <w:r>
-        <w:rPr>
-          <w:lang w:val="fr-BE"/>
-        </w:rPr>
-        <w:t xml:space="preserve"> </w:t>
-      </w:r>
-      <w:proofErr w:type="spellStart"/>
-      <w:r>
-        <w:rPr>
-          <w:lang w:val="fr-BE"/>
-        </w:rPr>
-        <w:t>quam</w:t>
-      </w:r>
-      <w:proofErr w:type="spellEnd"/>
-      <w:r>
-        <w:rPr>
-          <w:lang w:val="fr-BE"/>
-        </w:rPr>
-        <w:t xml:space="preserve"> magna, </w:t>
-      </w:r>
-      <w:proofErr w:type="spellStart"/>
-      <w:r>
-        <w:rPr>
-          <w:lang w:val="fr-BE"/>
-        </w:rPr>
-        <w:t>varius</w:t>
-      </w:r>
-      <w:proofErr w:type="spellEnd"/>
-      <w:r>
-        <w:rPr>
-          <w:lang w:val="fr-BE"/>
-        </w:rPr>
-        <w:t xml:space="preserve"> </w:t>
-      </w:r>
-      <w:proofErr w:type="spellStart"/>
-      <w:r>
-        <w:rPr>
-          <w:lang w:val="fr-BE"/>
-        </w:rPr>
-        <w:t>sit</w:t>
-      </w:r>
-      <w:proofErr w:type="spellEnd"/>
-      <w:r>
-        <w:rPr>
-          <w:lang w:val="fr-BE"/>
-        </w:rPr>
-        <w:t xml:space="preserve"> </w:t>
-      </w:r>
-      <w:proofErr w:type="spellStart"/>
-      <w:r>
-        <w:rPr>
-          <w:lang w:val="fr-BE"/>
-        </w:rPr>
-        <w:t>amet</w:t>
-      </w:r>
-      <w:proofErr w:type="spellEnd"/>
-      <w:r>
-        <w:rPr>
-          <w:lang w:val="fr-BE"/>
-        </w:rPr>
-        <w:t xml:space="preserve"> </w:t>
-      </w:r>
-      <w:proofErr w:type="spellStart"/>
-      <w:r>
-        <w:rPr>
-          <w:lang w:val="fr-BE"/>
-        </w:rPr>
-        <w:t>pharetra</w:t>
-      </w:r>
-      <w:proofErr w:type="spellEnd"/>
-      <w:r>
-        <w:rPr>
-          <w:lang w:val="fr-BE"/>
-        </w:rPr>
-        <w:t xml:space="preserve"> et, dictum </w:t>
-      </w:r>
-      <w:proofErr w:type="spellStart"/>
-      <w:r>
-        <w:rPr>
-          <w:lang w:val="fr-BE"/>
-        </w:rPr>
-        <w:t>quis</w:t>
-      </w:r>
-      <w:proofErr w:type="spellEnd"/>
-      <w:r>
-        <w:rPr>
-          <w:lang w:val="fr-BE"/>
-        </w:rPr>
-        <w:t xml:space="preserve"> </w:t>
-      </w:r>
-      <w:proofErr w:type="spellStart"/>
-      <w:r>
-        <w:rPr>
-          <w:lang w:val="fr-BE"/>
-        </w:rPr>
-        <w:t>elit</w:t>
-      </w:r>
-      <w:proofErr w:type="spellEnd"/>
-      <w:r>
-        <w:rPr>
-          <w:lang w:val="fr-BE"/>
-        </w:rPr>
-        <w:t xml:space="preserve">. </w:t>
-      </w:r>
-      <w:proofErr w:type="spellStart"/>
-      <w:r>
-        <w:rPr>
-          <w:lang w:val="fr-BE"/>
-        </w:rPr>
-        <w:t>Pellentesque</w:t>
-      </w:r>
-      <w:proofErr w:type="spellEnd"/>
-      <w:r>
-        <w:rPr>
-          <w:lang w:val="fr-BE"/>
-        </w:rPr>
-        <w:t xml:space="preserve"> habitant morbi tristique </w:t>
-      </w:r>
-      <w:proofErr w:type="spellStart"/>
-      <w:r>
-        <w:rPr>
-          <w:lang w:val="fr-BE"/>
-        </w:rPr>
-        <w:t>senectus</w:t>
-      </w:r>
-      <w:proofErr w:type="spellEnd"/>
-      <w:r>
-        <w:rPr>
-          <w:lang w:val="fr-BE"/>
-        </w:rPr>
-        <w:t xml:space="preserve"> et </w:t>
-      </w:r>
-      <w:proofErr w:type="spellStart"/>
-      <w:r>
-        <w:rPr>
-          <w:lang w:val="fr-BE"/>
-        </w:rPr>
-        <w:t>netus</w:t>
-      </w:r>
-      <w:proofErr w:type="spellEnd"/>
-      <w:r>
-        <w:rPr>
-          <w:lang w:val="fr-BE"/>
-        </w:rPr>
-        <w:t xml:space="preserve"> et </w:t>
-      </w:r>
-      <w:proofErr w:type="spellStart"/>
-      <w:r>
-        <w:rPr>
-          <w:lang w:val="fr-BE"/>
-        </w:rPr>
-        <w:t>malesuada</w:t>
-      </w:r>
-      <w:proofErr w:type="spellEnd"/>
-      <w:r>
-        <w:rPr>
-          <w:lang w:val="fr-BE"/>
-        </w:rPr>
-        <w:t xml:space="preserve"> </w:t>
-      </w:r>
-      <w:proofErr w:type="spellStart"/>
-      <w:r>
-        <w:rPr>
-          <w:lang w:val="fr-BE"/>
-        </w:rPr>
-        <w:t>fames</w:t>
-      </w:r>
-      <w:proofErr w:type="spellEnd"/>
-      <w:r>
-        <w:rPr>
-          <w:lang w:val="fr-BE"/>
-        </w:rPr>
-        <w:t xml:space="preserve"> </w:t>
-      </w:r>
-      <w:proofErr w:type="spellStart"/>
-      <w:r>
-        <w:rPr>
-          <w:lang w:val="fr-BE"/>
-        </w:rPr>
-        <w:t>ac</w:t>
-      </w:r>
-      <w:proofErr w:type="spellEnd"/>
-      <w:r>
-        <w:rPr>
-          <w:lang w:val="fr-BE"/>
-        </w:rPr>
-        <w:t xml:space="preserve"> </w:t>
-      </w:r>
-      <w:proofErr w:type="spellStart"/>
-      <w:r>
-        <w:rPr>
-          <w:lang w:val="fr-BE"/>
-        </w:rPr>
-        <w:t>turpis</w:t>
-      </w:r>
-      <w:proofErr w:type="spellEnd"/>
-      <w:r>
-        <w:rPr>
-          <w:lang w:val="fr-BE"/>
-        </w:rPr>
-        <w:t xml:space="preserve"> </w:t>
-      </w:r>
-      <w:proofErr w:type="spellStart"/>
-      <w:r>
-        <w:rPr>
-          <w:lang w:val="fr-BE"/>
-        </w:rPr>
-        <w:t>egestas</w:t>
-      </w:r>
-      <w:proofErr w:type="spellEnd"/>
-      <w:r>
-        <w:rPr>
-          <w:lang w:val="fr-BE"/>
-        </w:rPr>
-        <w:t>.</w:t>
-      </w:r>
-    </w:p>
-    <w:p>
-      <w:pPr>
-        <w:rPr>
-          <w:lang w:val="fr-BE"/>
-        </w:rPr>
-      </w:pPr>
-      <w:proofErr w:type="spellStart"/>
-      <w:r>
-        <w:rPr>
-          <w:lang w:val="fr-BE"/>
-        </w:rPr>
-        <w:t>Proin</w:t>
-      </w:r>
-      <w:proofErr w:type="spellEnd"/>
-      <w:r>
-        <w:rPr>
-          <w:lang w:val="fr-BE"/>
-        </w:rPr>
-        <w:t xml:space="preserve"> </w:t>
-      </w:r>
-      <w:proofErr w:type="spellStart"/>
-      <w:r>
-        <w:rPr>
-          <w:lang w:val="fr-BE"/>
-        </w:rPr>
-        <w:t>ullamcorper</w:t>
-      </w:r>
-      <w:proofErr w:type="spellEnd"/>
-      <w:r>
-        <w:rPr>
-          <w:lang w:val="fr-BE"/>
-        </w:rPr>
-        <w:t xml:space="preserve">, ipsum </w:t>
-      </w:r>
-      <w:proofErr w:type="spellStart"/>
-      <w:r>
-        <w:rPr>
-          <w:lang w:val="fr-BE"/>
-        </w:rPr>
-        <w:t>sit</w:t>
-      </w:r>
-      <w:proofErr w:type="spellEnd"/>
-      <w:r>
-        <w:rPr>
-          <w:lang w:val="fr-BE"/>
-        </w:rPr>
-        <w:t xml:space="preserve"> </w:t>
-      </w:r>
-      <w:proofErr w:type="spellStart"/>
-      <w:r>
-        <w:rPr>
-          <w:lang w:val="fr-BE"/>
-        </w:rPr>
-        <w:t>amet</w:t>
-      </w:r>
-      <w:proofErr w:type="spellEnd"/>
-      <w:r>
-        <w:rPr>
-          <w:lang w:val="fr-BE"/>
-        </w:rPr>
-        <w:t xml:space="preserve"> </w:t>
-      </w:r>
-      <w:proofErr w:type="spellStart"/>
-      <w:r>
-        <w:rPr>
-          <w:lang w:val="fr-BE"/>
-        </w:rPr>
-        <w:t>scelerisque</w:t>
-      </w:r>
-      <w:proofErr w:type="spellEnd"/>
-      <w:r>
-        <w:rPr>
-          <w:lang w:val="fr-BE"/>
-        </w:rPr>
-        <w:t xml:space="preserve"> rhoncus, </w:t>
-      </w:r>
-      <w:proofErr w:type="spellStart"/>
-      <w:r>
-        <w:rPr>
-          <w:lang w:val="fr-BE"/>
-        </w:rPr>
-        <w:t>leo</w:t>
-      </w:r>
-      <w:proofErr w:type="spellEnd"/>
-      <w:r>
-        <w:rPr>
-          <w:lang w:val="fr-BE"/>
-        </w:rPr>
-        <w:t xml:space="preserve"> </w:t>
-      </w:r>
-      <w:proofErr w:type="spellStart"/>
-      <w:r>
-        <w:rPr>
-          <w:lang w:val="fr-BE"/>
-        </w:rPr>
-        <w:t>quam</w:t>
-      </w:r>
-      <w:proofErr w:type="spellEnd"/>
-      <w:r>
-        <w:rPr>
-          <w:lang w:val="fr-BE"/>
-        </w:rPr>
-        <w:t xml:space="preserve"> rhoncus </w:t>
-      </w:r>
-      <w:proofErr w:type="spellStart"/>
-      <w:r>
-        <w:rPr>
-          <w:lang w:val="fr-BE"/>
-        </w:rPr>
-        <w:t>elit</w:t>
-      </w:r>
-      <w:proofErr w:type="spellEnd"/>
-      <w:r>
-        <w:rPr>
-          <w:lang w:val="fr-BE"/>
-        </w:rPr>
-        <w:t xml:space="preserve">, </w:t>
-      </w:r>
-      <w:proofErr w:type="spellStart"/>
-      <w:r>
-        <w:rPr>
-          <w:lang w:val="fr-BE"/>
-        </w:rPr>
-        <w:t>sit</w:t>
-      </w:r>
-      <w:proofErr w:type="spellEnd"/>
-      <w:r>
-        <w:rPr>
-          <w:lang w:val="fr-BE"/>
-        </w:rPr>
-        <w:t xml:space="preserve"> </w:t>
-      </w:r>
-      <w:proofErr w:type="spellStart"/>
-      <w:r>
-        <w:rPr>
-          <w:lang w:val="fr-BE"/>
-        </w:rPr>
-        <w:t>amet</w:t>
-      </w:r>
-      <w:proofErr w:type="spellEnd"/>
-      <w:r>
-        <w:rPr>
-          <w:lang w:val="fr-BE"/>
-        </w:rPr>
-        <w:t xml:space="preserve"> </w:t>
-      </w:r>
-      <w:proofErr w:type="spellStart"/>
-      <w:r>
-        <w:rPr>
-          <w:lang w:val="fr-BE"/>
-        </w:rPr>
-        <w:t>ullamcorper</w:t>
-      </w:r>
-      <w:proofErr w:type="spellEnd"/>
-      <w:r>
-        <w:rPr>
-          <w:lang w:val="fr-BE"/>
-        </w:rPr>
-        <w:t xml:space="preserve"> </w:t>
-      </w:r>
-      <w:proofErr w:type="spellStart"/>
-      <w:r>
-        <w:rPr>
-          <w:lang w:val="fr-BE"/>
-        </w:rPr>
-        <w:t>tellus</w:t>
-      </w:r>
-      <w:proofErr w:type="spellEnd"/>
-      <w:r>
-        <w:rPr>
-          <w:lang w:val="fr-BE"/>
-        </w:rPr>
-        <w:t xml:space="preserve"> </w:t>
-      </w:r>
-      <w:proofErr w:type="spellStart"/>
-      <w:r>
-        <w:rPr>
-          <w:lang w:val="fr-BE"/>
-        </w:rPr>
-        <w:t>nisi</w:t>
-      </w:r>
-      <w:proofErr w:type="spellEnd"/>
-      <w:r>
-        <w:rPr>
-          <w:lang w:val="fr-BE"/>
-        </w:rPr>
-        <w:t xml:space="preserve"> </w:t>
-      </w:r>
-      <w:proofErr w:type="spellStart"/>
-      <w:r>
-        <w:rPr>
-          <w:lang w:val="fr-BE"/>
-        </w:rPr>
-        <w:t>eget</w:t>
-      </w:r>
-      <w:proofErr w:type="spellEnd"/>
-      <w:r>
-        <w:rPr>
-          <w:lang w:val="fr-BE"/>
-        </w:rPr>
-        <w:t xml:space="preserve"> </w:t>
-      </w:r>
-      <w:proofErr w:type="spellStart"/>
-      <w:r>
-        <w:rPr>
-          <w:lang w:val="fr-BE"/>
-        </w:rPr>
-        <w:t>sapien</w:t>
-      </w:r>
-      <w:proofErr w:type="spellEnd"/>
-      <w:r>
-        <w:rPr>
-          <w:lang w:val="fr-BE"/>
-        </w:rPr>
-        <w:t xml:space="preserve">. </w:t>
-      </w:r>
-      <w:proofErr w:type="spellStart"/>
-      <w:r>
-        <w:rPr>
-          <w:lang w:val="it-IT"/>
-        </w:rPr>
-        <w:t>Suspendisse</w:t>
-      </w:r>
-      <w:proofErr w:type="spellEnd"/>
-      <w:r>
-        <w:rPr>
-          <w:lang w:val="it-IT"/>
-        </w:rPr>
-        <w:t xml:space="preserve"> potenti. Ut non </w:t>
-      </w:r>
-      <w:proofErr w:type="spellStart"/>
-      <w:r>
-        <w:rPr>
-          <w:lang w:val="it-IT"/>
-        </w:rPr>
-        <w:t>justo</w:t>
-      </w:r>
-      <w:proofErr w:type="spellEnd"/>
-      <w:r>
-        <w:rPr>
-          <w:lang w:val="it-IT"/>
-        </w:rPr>
-        <w:t xml:space="preserve"> viverra, tempus </w:t>
-      </w:r>
-      <w:proofErr w:type="spellStart"/>
-      <w:r>
-        <w:rPr>
-          <w:lang w:val="it-IT"/>
-        </w:rPr>
-        <w:t>felis</w:t>
-      </w:r>
-      <w:proofErr w:type="spellEnd"/>
-      <w:r>
-        <w:rPr>
-          <w:lang w:val="it-IT"/>
-        </w:rPr>
-        <w:t xml:space="preserve"> vitae, </w:t>
-      </w:r>
-      <w:proofErr w:type="spellStart"/>
-      <w:r>
-        <w:rPr>
-          <w:lang w:val="it-IT"/>
-        </w:rPr>
-        <w:t>elementum</w:t>
-      </w:r>
-      <w:proofErr w:type="spellEnd"/>
-      <w:r>
-        <w:rPr>
-          <w:lang w:val="it-IT"/>
-        </w:rPr>
-        <w:t xml:space="preserve"> mi. </w:t>
-      </w:r>
-      <w:r>
-        <w:rPr>
-          <w:lang w:val="fr-BE"/>
-        </w:rPr>
-        <w:t xml:space="preserve">Morbi at </w:t>
-      </w:r>
-      <w:proofErr w:type="spellStart"/>
-      <w:r>
-        <w:rPr>
-          <w:lang w:val="fr-BE"/>
-        </w:rPr>
-        <w:t>dui</w:t>
-      </w:r>
-      <w:proofErr w:type="spellEnd"/>
-      <w:r>
-        <w:rPr>
-          <w:lang w:val="fr-BE"/>
-        </w:rPr>
-        <w:t xml:space="preserve"> </w:t>
-      </w:r>
-      <w:proofErr w:type="spellStart"/>
-      <w:r>
-        <w:rPr>
-          <w:lang w:val="fr-BE"/>
-        </w:rPr>
-        <w:t>sed</w:t>
-      </w:r>
-      <w:proofErr w:type="spellEnd"/>
-      <w:r>
-        <w:rPr>
-          <w:lang w:val="fr-BE"/>
-        </w:rPr>
-        <w:t xml:space="preserve"> </w:t>
-      </w:r>
-      <w:proofErr w:type="spellStart"/>
-      <w:r>
-        <w:rPr>
-          <w:lang w:val="fr-BE"/>
-        </w:rPr>
-        <w:t>lacus</w:t>
-      </w:r>
-      <w:proofErr w:type="spellEnd"/>
-      <w:r>
-        <w:rPr>
-          <w:lang w:val="fr-BE"/>
-        </w:rPr>
-        <w:t xml:space="preserve"> </w:t>
-      </w:r>
-      <w:proofErr w:type="spellStart"/>
-      <w:r>
-        <w:rPr>
-          <w:lang w:val="fr-BE"/>
-        </w:rPr>
-        <w:t>fringilla</w:t>
-      </w:r>
-      <w:proofErr w:type="spellEnd"/>
-      <w:r>
-        <w:rPr>
-          <w:lang w:val="fr-BE"/>
-        </w:rPr>
-        <w:t xml:space="preserve"> </w:t>
-      </w:r>
-      <w:proofErr w:type="spellStart"/>
-      <w:r>
-        <w:rPr>
-          <w:lang w:val="fr-BE"/>
-        </w:rPr>
-        <w:t>condimentum</w:t>
-      </w:r>
-      <w:proofErr w:type="spellEnd"/>
-      <w:r>
-        <w:rPr>
-          <w:lang w:val="fr-BE"/>
-        </w:rPr>
-        <w:t xml:space="preserve">. Duis non </w:t>
-      </w:r>
-      <w:proofErr w:type="spellStart"/>
-      <w:r>
-        <w:rPr>
-          <w:lang w:val="fr-BE"/>
-        </w:rPr>
-        <w:t>odio</w:t>
-      </w:r>
-      <w:proofErr w:type="spellEnd"/>
-      <w:r>
-        <w:rPr>
-          <w:lang w:val="fr-BE"/>
-        </w:rPr>
-        <w:t xml:space="preserve"> </w:t>
-      </w:r>
-      <w:proofErr w:type="spellStart"/>
-      <w:r>
-        <w:rPr>
-          <w:lang w:val="fr-BE"/>
-        </w:rPr>
-        <w:t>ac</w:t>
-      </w:r>
-      <w:proofErr w:type="spellEnd"/>
-      <w:r>
-        <w:rPr>
-          <w:lang w:val="fr-BE"/>
-        </w:rPr>
-        <w:t xml:space="preserve"> </w:t>
-      </w:r>
-      <w:proofErr w:type="spellStart"/>
-      <w:r>
-        <w:rPr>
-          <w:lang w:val="fr-BE"/>
-        </w:rPr>
-        <w:t>arcu</w:t>
-      </w:r>
-      <w:proofErr w:type="spellEnd"/>
-      <w:r>
-        <w:rPr>
-          <w:lang w:val="fr-BE"/>
-        </w:rPr>
-        <w:t xml:space="preserve"> </w:t>
-      </w:r>
-      <w:proofErr w:type="spellStart"/>
-      <w:r>
-        <w:rPr>
-          <w:lang w:val="fr-BE"/>
-        </w:rPr>
-        <w:t>volutpat</w:t>
-      </w:r>
-      <w:proofErr w:type="spellEnd"/>
-      <w:r>
-        <w:rPr>
-          <w:lang w:val="fr-BE"/>
-        </w:rPr>
-        <w:t xml:space="preserve"> </w:t>
-      </w:r>
-      <w:proofErr w:type="spellStart"/>
-      <w:r>
-        <w:rPr>
-          <w:lang w:val="fr-BE"/>
-        </w:rPr>
-        <w:t>vehicula</w:t>
-      </w:r>
-      <w:proofErr w:type="spellEnd"/>
-      <w:r>
-        <w:rPr>
-          <w:lang w:val="fr-BE"/>
-        </w:rPr>
-        <w:t xml:space="preserve"> eu et </w:t>
-      </w:r>
-      <w:proofErr w:type="spellStart"/>
-      <w:r>
-        <w:rPr>
-          <w:lang w:val="fr-BE"/>
-        </w:rPr>
-        <w:t>turpis</w:t>
-      </w:r>
-      <w:proofErr w:type="spellEnd"/>
-      <w:r>
-        <w:rPr>
-          <w:lang w:val="fr-BE"/>
-        </w:rPr>
-        <w:t>.</w:t>
-      </w:r>
-    </w:p>
-    <w:p>
-      <w:proofErr w:type="spellStart"/>
-      <w:r>
-        <w:rPr>
-          <w:lang w:val="it-IT"/>
-        </w:rPr>
-        <w:t>Praesent</w:t>
-      </w:r>
-      <w:proofErr w:type="spellEnd"/>
-      <w:r>
-        <w:rPr>
-          <w:lang w:val="it-IT"/>
-        </w:rPr>
-        <w:t xml:space="preserve"> vitae magna ante. Nulla in orci </w:t>
-      </w:r>
-      <w:proofErr w:type="spellStart"/>
-      <w:r>
-        <w:rPr>
-          <w:lang w:val="it-IT"/>
-        </w:rPr>
-        <w:t>lacus</w:t>
-      </w:r>
-      <w:proofErr w:type="spellEnd"/>
-      <w:r>
-        <w:rPr>
-          <w:lang w:val="it-IT"/>
-        </w:rPr>
-        <w:t xml:space="preserve">. </w:t>
-      </w:r>
-      <w:proofErr w:type="spellStart"/>
-      <w:r>
-        <w:rPr>
-          <w:lang w:val="it-IT"/>
-        </w:rPr>
-        <w:t>Donec</w:t>
-      </w:r>
-      <w:proofErr w:type="spellEnd"/>
-      <w:r>
-        <w:rPr>
-          <w:lang w:val="it-IT"/>
-        </w:rPr>
-        <w:t xml:space="preserve"> </w:t>
-      </w:r>
-      <w:proofErr w:type="spellStart"/>
-      <w:r>
-        <w:rPr>
-          <w:lang w:val="it-IT"/>
-        </w:rPr>
-        <w:t>quis</w:t>
-      </w:r>
-      <w:proofErr w:type="spellEnd"/>
-      <w:r>
-        <w:rPr>
-          <w:lang w:val="it-IT"/>
-        </w:rPr>
-        <w:t xml:space="preserve"> </w:t>
-      </w:r>
-      <w:proofErr w:type="spellStart"/>
-      <w:r>
-        <w:rPr>
-          <w:lang w:val="it-IT"/>
-        </w:rPr>
-        <w:t>vestibulum</w:t>
-      </w:r>
-      <w:proofErr w:type="spellEnd"/>
-      <w:r>
-        <w:rPr>
-          <w:lang w:val="it-IT"/>
-        </w:rPr>
-        <w:t xml:space="preserve"> mi. Sed </w:t>
-      </w:r>
-      <w:proofErr w:type="spellStart"/>
-      <w:r>
-        <w:rPr>
-          <w:lang w:val="it-IT"/>
-        </w:rPr>
-        <w:t>ipsum</w:t>
-      </w:r>
-      <w:proofErr w:type="spellEnd"/>
-      <w:r>
-        <w:rPr>
-          <w:lang w:val="it-IT"/>
-        </w:rPr>
-        <w:t xml:space="preserve"> </w:t>
-      </w:r>
-      <w:proofErr w:type="spellStart"/>
-      <w:r>
-        <w:rPr>
-          <w:lang w:val="it-IT"/>
-        </w:rPr>
-        <w:t>sapien</w:t>
-      </w:r>
-      <w:proofErr w:type="spellEnd"/>
-      <w:r>
-        <w:rPr>
-          <w:lang w:val="it-IT"/>
-        </w:rPr>
-        <w:t xml:space="preserve">, </w:t>
-      </w:r>
-      <w:proofErr w:type="spellStart"/>
-      <w:r>
-        <w:rPr>
-          <w:lang w:val="it-IT"/>
-        </w:rPr>
-        <w:t>pretium</w:t>
-      </w:r>
-      <w:proofErr w:type="spellEnd"/>
-      <w:r>
-        <w:rPr>
-          <w:lang w:val="it-IT"/>
-        </w:rPr>
-        <w:t xml:space="preserve"> </w:t>
-      </w:r>
-      <w:proofErr w:type="spellStart"/>
-      <w:r>
-        <w:rPr>
-          <w:lang w:val="it-IT"/>
-        </w:rPr>
-        <w:t>maximus</w:t>
-      </w:r>
-      <w:proofErr w:type="spellEnd"/>
-      <w:r>
-        <w:rPr>
-          <w:lang w:val="it-IT"/>
-        </w:rPr>
-        <w:t xml:space="preserve"> </w:t>
-      </w:r>
-      <w:proofErr w:type="spellStart"/>
-      <w:r>
-        <w:rPr>
-          <w:lang w:val="it-IT"/>
-        </w:rPr>
-        <w:t>purus</w:t>
-      </w:r>
-      <w:proofErr w:type="spellEnd"/>
-      <w:r>
-        <w:rPr>
-          <w:lang w:val="it-IT"/>
-        </w:rPr>
-        <w:t xml:space="preserve"> sed, </w:t>
-      </w:r>
-      <w:proofErr w:type="spellStart"/>
-      <w:r>
-        <w:rPr>
-          <w:lang w:val="it-IT"/>
-        </w:rPr>
-        <w:t>bibendum</w:t>
-      </w:r>
-      <w:proofErr w:type="spellEnd"/>
-      <w:r>
-        <w:rPr>
-          <w:lang w:val="it-IT"/>
-        </w:rPr>
-        <w:t xml:space="preserve"> </w:t>
-      </w:r>
-      <w:proofErr w:type="spellStart"/>
-      <w:r>
-        <w:rPr>
-          <w:lang w:val="it-IT"/>
-        </w:rPr>
-        <w:t>consequat</w:t>
-      </w:r>
-      <w:proofErr w:type="spellEnd"/>
-      <w:r>
-        <w:rPr>
-          <w:lang w:val="it-IT"/>
-        </w:rPr>
-        <w:t xml:space="preserve"> </w:t>
-      </w:r>
-      <w:proofErr w:type="spellStart"/>
-      <w:r>
-        <w:rPr>
-          <w:lang w:val="it-IT"/>
-        </w:rPr>
-        <w:t>lectus</w:t>
-      </w:r>
-      <w:proofErr w:type="spellEnd"/>
-      <w:r>
-        <w:rPr>
-          <w:lang w:val="it-IT"/>
-        </w:rPr>
-        <w:t xml:space="preserve">. </w:t>
-      </w:r>
-      <w:proofErr w:type="spellStart"/>
-      <w:r>
-        <w:rPr>
-          <w:lang w:val="it-IT"/>
-        </w:rPr>
-        <w:t>Aliquam</w:t>
-      </w:r>
-      <w:proofErr w:type="spellEnd"/>
-      <w:r>
-        <w:rPr>
-          <w:lang w:val="it-IT"/>
-        </w:rPr>
-        <w:t xml:space="preserve"> </w:t>
-      </w:r>
-      <w:proofErr w:type="spellStart"/>
-      <w:r>
-        <w:rPr>
-          <w:lang w:val="it-IT"/>
-        </w:rPr>
-        <w:t>porttitor</w:t>
-      </w:r>
-      <w:proofErr w:type="spellEnd"/>
-      <w:r>
-        <w:rPr>
-          <w:lang w:val="it-IT"/>
-        </w:rPr>
-        <w:t xml:space="preserve"> </w:t>
-      </w:r>
-      <w:proofErr w:type="spellStart"/>
-      <w:r>
-        <w:rPr>
-          <w:lang w:val="it-IT"/>
-        </w:rPr>
-        <w:t>dolor</w:t>
-      </w:r>
-      <w:proofErr w:type="spellEnd"/>
-      <w:r>
-        <w:rPr>
-          <w:lang w:val="it-IT"/>
-        </w:rPr>
-        <w:t xml:space="preserve"> </w:t>
-      </w:r>
-      <w:proofErr w:type="spellStart"/>
-      <w:r>
-        <w:rPr>
-          <w:lang w:val="it-IT"/>
-        </w:rPr>
-        <w:t>eu</w:t>
-      </w:r>
-      <w:proofErr w:type="spellEnd"/>
-      <w:r>
-        <w:rPr>
-          <w:lang w:val="it-IT"/>
-        </w:rPr>
-        <w:t xml:space="preserve"> gravida </w:t>
-      </w:r>
-      <w:proofErr w:type="spellStart"/>
-      <w:r>
-        <w:rPr>
-          <w:lang w:val="it-IT"/>
-        </w:rPr>
-        <w:t>vulputate</w:t>
-      </w:r>
-      <w:proofErr w:type="spellEnd"/>
-      <w:r>
-        <w:rPr>
-          <w:lang w:val="it-IT"/>
-        </w:rPr>
-        <w:t xml:space="preserve">. </w:t>
-      </w:r>
-      <w:r>
-        <w:t xml:space="preserve">Vestibulum </w:t>
-      </w:r>
-      <w:proofErr w:type="spellStart"/>
-      <w:r>
-        <w:t>ut</w:t>
-      </w:r>
-      <w:proofErr w:type="spellEnd"/>
-      <w:r>
-        <w:t xml:space="preserve"> </w:t>
-      </w:r>
-      <w:proofErr w:type="spellStart"/>
-      <w:r>
-        <w:t>urna</w:t>
-      </w:r>
-      <w:proofErr w:type="spellEnd"/>
-      <w:r>
-        <w:t xml:space="preserve"> </w:t>
-      </w:r>
-      <w:proofErr w:type="spellStart"/>
-      <w:r>
-        <w:t>eget</w:t>
-      </w:r>
-      <w:proofErr w:type="spellEnd"/>
-      <w:r>
-        <w:t xml:space="preserve"> </w:t>
-      </w:r>
-      <w:proofErr w:type="spellStart"/>
-      <w:r>
-        <w:t>massa</w:t>
-      </w:r>
-      <w:proofErr w:type="spellEnd"/>
-      <w:r>
-        <w:t xml:space="preserve"> </w:t>
-      </w:r>
-      <w:proofErr w:type="spellStart"/>
-      <w:r>
-        <w:t>tincidunt</w:t>
-      </w:r>
-      <w:proofErr w:type="spellEnd"/>
-      <w:r>
-        <w:t xml:space="preserve"> </w:t>
-      </w:r>
-      <w:proofErr w:type="spellStart"/>
-      <w:r>
-        <w:t>ultricies</w:t>
-      </w:r>
-      <w:proofErr w:type="spellEnd"/>
-      <w:r>
-        <w:t xml:space="preserve">. Morbi </w:t>
-      </w:r>
-      <w:proofErr w:type="spellStart"/>
-      <w:r>
-        <w:t>hendrerit</w:t>
-      </w:r>
-      <w:proofErr w:type="spellEnd"/>
-      <w:r>
-        <w:t xml:space="preserve"> </w:t>
-      </w:r>
-      <w:proofErr w:type="spellStart"/>
-      <w:r>
-        <w:t>sapien</w:t>
-      </w:r>
-      <w:proofErr w:type="spellEnd"/>
-      <w:r>
-        <w:t xml:space="preserve"> at diam </w:t>
-      </w:r>
-      <w:proofErr w:type="spellStart"/>
-      <w:r>
-        <w:t>tincidunt</w:t>
-      </w:r>
-      <w:proofErr w:type="spellEnd"/>
-      <w:r>
-        <w:t xml:space="preserve"> semper. </w:t>
-      </w:r>
-      <w:proofErr w:type="spellStart"/>
-      <w:r>
-        <w:t>Aliquam</w:t>
-      </w:r>
-      <w:proofErr w:type="spellEnd"/>
-      <w:r>
-        <w:t xml:space="preserve"> </w:t>
-      </w:r>
-      <w:proofErr w:type="spellStart"/>
-      <w:r>
-        <w:t>ut</w:t>
-      </w:r>
-      <w:proofErr w:type="spellEnd"/>
-      <w:r>
-        <w:t xml:space="preserve"> </w:t>
-      </w:r>
-      <w:proofErr w:type="spellStart"/>
-      <w:r>
-        <w:t>quam</w:t>
-      </w:r>
-      <w:proofErr w:type="spellEnd"/>
-      <w:r>
-        <w:t xml:space="preserve"> dictum </w:t>
-      </w:r>
-      <w:proofErr w:type="spellStart"/>
-      <w:r>
-        <w:t>quam</w:t>
-      </w:r>
-      <w:proofErr w:type="spellEnd"/>
-      <w:r>
-        <w:t xml:space="preserve"> maximus </w:t>
-      </w:r>
-      <w:proofErr w:type="spellStart"/>
-      <w:r>
-        <w:t>tempor</w:t>
-      </w:r>
-      <w:proofErr w:type="spellEnd"/>
-      <w:r>
-        <w:t xml:space="preserve"> sed at </w:t>
-      </w:r>
-      <w:proofErr w:type="spellStart"/>
-      <w:r>
-        <w:t>felis</w:t>
-      </w:r>
-      <w:proofErr w:type="spellEnd"/>
-      <w:r>
-        <w:t>.</w:t>
+        <w:t xml:space="preserve">Praesent vitae magna ante. Nulla in orci lacus. Donec quis vestibulum mi. Sed ipsum sapien, pretium maximus purus sed, bibendum consequat lectus. Aliquam porttitor dolor eu gravida vulputate. </w:t>
+      </w:r>
+      <w:r>
+        <w:t>Vestibulum ut urna eget massa tincidunt ultricies. Morbi hendrerit sapien at diam tincidunt semper. Aliquam ut quam dictum quam maximus tempor sed at felis.</w:t>
       </w:r>
     </w:p>
     <w:p/>
@@ -9156,21 +7867,7 @@
         <w:rPr>
           <w:lang w:val="fr-BE"/>
         </w:rPr>
-        <w:t xml:space="preserve">[Online]. </w:t>
-      </w:r>
-      <w:proofErr w:type="spellStart"/>
-      <w:r>
-        <w:rPr>
-          <w:lang w:val="fr-BE"/>
-        </w:rPr>
-        <w:t>Available</w:t>
-      </w:r>
-      <w:proofErr w:type="spellEnd"/>
-      <w:r>
-        <w:rPr>
-          <w:lang w:val="fr-BE"/>
-        </w:rPr>
-        <w:t xml:space="preserve">: </w:t>
+        <w:t xml:space="preserve">[Online]. Available: </w:t>
       </w:r>
       <w:hyperlink r:id="rId41" w:history="1">
         <w:r>
@@ -9207,21 +7904,7 @@
         <w:rPr>
           <w:lang w:val="fr-BE"/>
         </w:rPr>
-        <w:t xml:space="preserve">[Online]. </w:t>
-      </w:r>
-      <w:proofErr w:type="spellStart"/>
-      <w:r>
-        <w:rPr>
-          <w:lang w:val="fr-BE"/>
-        </w:rPr>
-        <w:t>Available</w:t>
-      </w:r>
-      <w:proofErr w:type="spellEnd"/>
-      <w:r>
-        <w:rPr>
-          <w:lang w:val="fr-BE"/>
-        </w:rPr>
-        <w:t xml:space="preserve">: </w:t>
+        <w:t xml:space="preserve">[Online]. Available: </w:t>
       </w:r>
       <w:hyperlink r:id="rId42" w:history="1">
         <w:r>
@@ -9313,21 +7996,7 @@
         <w:rPr>
           <w:lang w:val="fr-BE"/>
         </w:rPr>
-        <w:t xml:space="preserve">[Online]. </w:t>
-      </w:r>
-      <w:proofErr w:type="spellStart"/>
-      <w:r>
-        <w:rPr>
-          <w:lang w:val="fr-BE"/>
-        </w:rPr>
-        <w:t>Available</w:t>
-      </w:r>
-      <w:proofErr w:type="spellEnd"/>
-      <w:r>
-        <w:rPr>
-          <w:lang w:val="fr-BE"/>
-        </w:rPr>
-        <w:t xml:space="preserve">: </w:t>
+        <w:t xml:space="preserve">[Online]. Available: </w:t>
       </w:r>
       <w:hyperlink r:id="rId43" w:history="1">
         <w:r>
@@ -9357,15 +8026,7 @@
         </w:rPr>
       </w:pPr>
       <w:r>
-        <w:t xml:space="preserve">‘What’s the Difference Between Ray Casting, Ray Tracing, Path Tracing and Rasterization? Physical light tracing… – </w:t>
-      </w:r>
-      <w:proofErr w:type="spellStart"/>
-      <w:r>
-        <w:t>pIXELsHAM</w:t>
-      </w:r>
-      <w:proofErr w:type="spellEnd"/>
-      <w:r>
-        <w:t xml:space="preserve">’. Accessed: Aug. 17, 2025. [Online]. Available: </w:t>
+        <w:t xml:space="preserve">‘What’s the Difference Between Ray Casting, Ray Tracing, Path Tracing and Rasterization? Physical light tracing… – pIXELsHAM’. Accessed: Aug. 17, 2025. [Online]. Available: </w:t>
       </w:r>
       <w:hyperlink r:id="rId44" w:history="1">
         <w:r>
@@ -9398,35 +8059,13 @@
         </w:rPr>
       </w:pPr>
       <w:r>
-        <w:t>‘</w:t>
-      </w:r>
-      <w:proofErr w:type="spellStart"/>
-      <w:r>
-        <w:t>LearnOpenGL</w:t>
-      </w:r>
-      <w:proofErr w:type="spellEnd"/>
-      <w:r>
-        <w:t xml:space="preserve"> - Deferred Shading’. Accessed: Aug. 15, 2025. </w:t>
+        <w:t xml:space="preserve">‘LearnOpenGL - Deferred Shading’. Accessed: Aug. 15, 2025. </w:t>
       </w:r>
       <w:r>
         <w:rPr>
           <w:lang w:val="fr-BE"/>
         </w:rPr>
-        <w:t xml:space="preserve">[Online]. </w:t>
-      </w:r>
-      <w:proofErr w:type="spellStart"/>
-      <w:r>
-        <w:rPr>
-          <w:lang w:val="fr-BE"/>
-        </w:rPr>
-        <w:t>Available</w:t>
-      </w:r>
-      <w:proofErr w:type="spellEnd"/>
-      <w:r>
-        <w:rPr>
-          <w:lang w:val="fr-BE"/>
-        </w:rPr>
-        <w:t xml:space="preserve">: </w:t>
+        <w:t xml:space="preserve">[Online]. Available: </w:t>
       </w:r>
       <w:hyperlink r:id="rId45" w:history="1">
         <w:r>
@@ -9448,15 +8087,7 @@
     </w:p>
     <w:p>
       <w:r>
-        <w:t xml:space="preserve">D. </w:t>
-      </w:r>
-      <w:proofErr w:type="spellStart"/>
-      <w:r>
-        <w:t>Lettier</w:t>
-      </w:r>
-      <w:proofErr w:type="spellEnd"/>
-      <w:r>
-        <w:t xml:space="preserve">, ‘Deferred Rendering | 3D Game Shaders For Beginners’. Accessed: Aug. 17, 2025. [Online]. Available: </w:t>
+        <w:t xml:space="preserve">D. Lettier, ‘Deferred Rendering | 3D Game Shaders For Beginners’. Accessed: Aug. 17, 2025. [Online]. Available: </w:t>
       </w:r>
       <w:hyperlink r:id="rId46" w:history="1">
         <w:r>
@@ -9485,13 +8116,8 @@
           <w:color w:val="auto"/>
         </w:rPr>
       </w:pPr>
-      <w:proofErr w:type="spellStart"/>
-      <w:r>
-        <w:t>GetIntoGameDev</w:t>
-      </w:r>
-      <w:proofErr w:type="spellEnd"/>
-      <w:r>
-        <w:t xml:space="preserve">, </w:t>
+      <w:r>
+        <w:t xml:space="preserve">GetIntoGameDev, </w:t>
       </w:r>
       <w:r>
         <w:rPr>
@@ -9553,21 +8179,7 @@
         <w:rPr>
           <w:lang w:val="fr-BE"/>
         </w:rPr>
-        <w:t xml:space="preserve">[Online]. </w:t>
-      </w:r>
-      <w:proofErr w:type="spellStart"/>
-      <w:r>
-        <w:rPr>
-          <w:lang w:val="fr-BE"/>
-        </w:rPr>
-        <w:t>Available</w:t>
-      </w:r>
-      <w:proofErr w:type="spellEnd"/>
-      <w:r>
-        <w:rPr>
-          <w:lang w:val="fr-BE"/>
-        </w:rPr>
-        <w:t xml:space="preserve">: </w:t>
+        <w:t xml:space="preserve">[Online]. Available: </w:t>
       </w:r>
       <w:hyperlink r:id="rId48" w:history="1">
         <w:r>
@@ -9615,21 +8227,7 @@
         <w:rPr>
           <w:lang w:val="fr-BE"/>
         </w:rPr>
-        <w:t xml:space="preserve">[Online]. </w:t>
-      </w:r>
-      <w:proofErr w:type="spellStart"/>
-      <w:r>
-        <w:rPr>
-          <w:lang w:val="fr-BE"/>
-        </w:rPr>
-        <w:t>Available</w:t>
-      </w:r>
-      <w:proofErr w:type="spellEnd"/>
-      <w:r>
-        <w:rPr>
-          <w:lang w:val="fr-BE"/>
-        </w:rPr>
-        <w:t xml:space="preserve">: </w:t>
+        <w:t xml:space="preserve">[Online]. Available: </w:t>
       </w:r>
       <w:r>
         <w:rPr>
@@ -9689,19 +8287,11 @@
       <w:r>
         <w:t xml:space="preserve">. May 23, 2025. Accessed: Aug. 05, 2025. [Online]. </w:t>
       </w:r>
-      <w:proofErr w:type="spellStart"/>
       <w:r>
         <w:rPr>
           <w:lang w:val="fr-BE"/>
         </w:rPr>
-        <w:t>Available</w:t>
-      </w:r>
-      <w:proofErr w:type="spellEnd"/>
-      <w:r>
-        <w:rPr>
-          <w:lang w:val="fr-BE"/>
-        </w:rPr>
-        <w:t xml:space="preserve">: </w:t>
+        <w:t xml:space="preserve">Available: </w:t>
       </w:r>
       <w:hyperlink r:id="rId49" w:anchor="cite_note-6" w:history="1">
         <w:r>
@@ -9780,35 +8370,7 @@
         <w:rPr>
           <w:lang w:val="it-IT"/>
         </w:rPr>
-        <w:t xml:space="preserve">‘Screen </w:t>
-      </w:r>
-      <w:proofErr w:type="spellStart"/>
-      <w:r>
-        <w:rPr>
-          <w:lang w:val="it-IT"/>
-        </w:rPr>
-        <w:t>space</w:t>
-      </w:r>
-      <w:proofErr w:type="spellEnd"/>
-      <w:r>
-        <w:rPr>
-          <w:lang w:val="it-IT"/>
-        </w:rPr>
-        <w:t xml:space="preserve"> ambient </w:t>
-      </w:r>
-      <w:proofErr w:type="spellStart"/>
-      <w:r>
-        <w:rPr>
-          <w:lang w:val="it-IT"/>
-        </w:rPr>
-        <w:t>occlusion</w:t>
-      </w:r>
-      <w:proofErr w:type="spellEnd"/>
-      <w:r>
-        <w:rPr>
-          <w:lang w:val="it-IT"/>
-        </w:rPr>
-        <w:t xml:space="preserve">’, </w:t>
+        <w:t xml:space="preserve">‘Screen space ambient occlusion’, </w:t>
       </w:r>
       <w:r>
         <w:rPr>
@@ -14407,6 +12969,7 @@
     <w:rsid w:val="00E842E1"/>
     <w:rsid w:val="00E86D88"/>
     <w:rsid w:val="00E978A2"/>
+    <w:rsid w:val="00EC035C"/>
     <w:rsid w:val="00F52E0F"/>
     <w:rsid w:val="00F974D9"/>
   </w:rsids>
@@ -15139,10 +13702,6 @@
 </file>
 
 <file path=customXml/item1.xml><?xml version="1.0" encoding="utf-8"?>
-<b:Sources xmlns:b="http://schemas.openxmlformats.org/officeDocument/2006/bibliography" xmlns="http://schemas.openxmlformats.org/officeDocument/2006/bibliography" SelectedStyle="\APASixthEditionOfficeOnline.xsl" StyleName="APA" Version="6"/>
-</file>
-
-<file path=customXml/item2.xml><?xml version="1.0" encoding="utf-8"?>
 <ct:contentTypeSchema xmlns:ct="http://schemas.microsoft.com/office/2006/metadata/contentType" xmlns:ma="http://schemas.microsoft.com/office/2006/metadata/properties/metaAttributes" ct:_="" ma:_="" ma:contentTypeName="Document" ma:contentTypeID="0x010100723942CCEB3A674D8F1F6472CCEFB38E" ma:contentTypeVersion="11" ma:contentTypeDescription="Create a new document." ma:contentTypeScope="" ma:versionID="e4de40d148e029d40e3aaddc8bf68a5e">
   <xsd:schema xmlns:xsd="http://www.w3.org/2001/XMLSchema" xmlns:xs="http://www.w3.org/2001/XMLSchema" xmlns:p="http://schemas.microsoft.com/office/2006/metadata/properties" xmlns:ns2="128482ec-0431-40d5-ab26-89ea2a4f3ccd" xmlns:ns3="60eb0cf4-ae2a-4762-800a-cb593b869ecb" xmlns:ns4="http://schemas.microsoft.com/sharepoint/v4" xmlns:ns5="a2e691a9-fcfc-4d85-a390-1894fe98bd9e" targetNamespace="http://schemas.microsoft.com/office/2006/metadata/properties" ma:root="true" ma:fieldsID="fce8e8bd091658f3fe51b22d57dec109" ns2:_="" ns3:_="" ns4:_="" ns5:_="">
     <xsd:import namespace="128482ec-0431-40d5-ab26-89ea2a4f3ccd"/>
@@ -15415,6 +13974,15 @@
 </ct:contentTypeSchema>
 </file>
 
+<file path=customXml/item2.xml><?xml version="1.0" encoding="utf-8"?>
+<?mso-contentType ?>
+<FormTemplates xmlns="http://schemas.microsoft.com/sharepoint/v3/contenttype/forms">
+  <Display>DocumentLibraryForm</Display>
+  <Edit>DocumentLibraryForm</Edit>
+  <New>DocumentLibraryForm</New>
+</FormTemplates>
+</file>
+
 <file path=customXml/item3.xml><?xml version="1.0" encoding="utf-8"?>
 <p:properties xmlns:p="http://schemas.microsoft.com/office/2006/metadata/properties" xmlns:xsi="http://www.w3.org/2001/XMLSchema-instance" xmlns:pc="http://schemas.microsoft.com/office/infopath/2007/PartnerControls">
   <documentManagement>
@@ -15431,23 +13999,10 @@
 </file>
 
 <file path=customXml/item4.xml><?xml version="1.0" encoding="utf-8"?>
-<?mso-contentType ?>
-<FormTemplates xmlns="http://schemas.microsoft.com/sharepoint/v3/contenttype/forms">
-  <Display>DocumentLibraryForm</Display>
-  <Edit>DocumentLibraryForm</Edit>
-  <New>DocumentLibraryForm</New>
-</FormTemplates>
+<b:Sources xmlns:b="http://schemas.openxmlformats.org/officeDocument/2006/bibliography" xmlns="http://schemas.openxmlformats.org/officeDocument/2006/bibliography" SelectedStyle="\APASixthEditionOfficeOnline.xsl" StyleName="APA" Version="6"/>
 </file>
 
 <file path=customXml/itemProps1.xml><?xml version="1.0" encoding="utf-8"?>
-<ds:datastoreItem xmlns:ds="http://schemas.openxmlformats.org/officeDocument/2006/customXml" ds:itemID="{9FB24B6F-1995-495D-B4E9-64B4DC9866CE}">
-  <ds:schemaRefs>
-    <ds:schemaRef ds:uri="http://schemas.openxmlformats.org/officeDocument/2006/bibliography"/>
-  </ds:schemaRefs>
-</ds:datastoreItem>
-</file>
-
-<file path=customXml/itemProps2.xml><?xml version="1.0" encoding="utf-8"?>
 <ds:datastoreItem xmlns:ds="http://schemas.openxmlformats.org/officeDocument/2006/customXml" ds:itemID="{6AD6E667-9FE3-44F6-AA83-894C6D5E44A5}">
   <ds:schemaRefs>
     <ds:schemaRef ds:uri="http://schemas.microsoft.com/office/2006/metadata/contentType"/>
@@ -15468,6 +14023,14 @@
 </ds:datastoreItem>
 </file>
 
+<file path=customXml/itemProps2.xml><?xml version="1.0" encoding="utf-8"?>
+<ds:datastoreItem xmlns:ds="http://schemas.openxmlformats.org/officeDocument/2006/customXml" ds:itemID="{5EBBBFF2-2B1E-4E2A-81ED-02FB13488392}">
+  <ds:schemaRefs>
+    <ds:schemaRef ds:uri="http://schemas.microsoft.com/sharepoint/v3/contenttype/forms"/>
+  </ds:schemaRefs>
+</ds:datastoreItem>
+</file>
+
 <file path=customXml/itemProps3.xml><?xml version="1.0" encoding="utf-8"?>
 <ds:datastoreItem xmlns:ds="http://schemas.openxmlformats.org/officeDocument/2006/customXml" ds:itemID="{0744C301-BA8E-4358-811D-299431B59409}">
   <ds:schemaRefs>
@@ -15481,9 +14044,9 @@
 </file>
 
 <file path=customXml/itemProps4.xml><?xml version="1.0" encoding="utf-8"?>
-<ds:datastoreItem xmlns:ds="http://schemas.openxmlformats.org/officeDocument/2006/customXml" ds:itemID="{5EBBBFF2-2B1E-4E2A-81ED-02FB13488392}">
+<ds:datastoreItem xmlns:ds="http://schemas.openxmlformats.org/officeDocument/2006/customXml" ds:itemID="{9FB24B6F-1995-495D-B4E9-64B4DC9866CE}">
   <ds:schemaRefs>
-    <ds:schemaRef ds:uri="http://schemas.microsoft.com/sharepoint/v3/contenttype/forms"/>
+    <ds:schemaRef ds:uri="http://schemas.openxmlformats.org/officeDocument/2006/bibliography"/>
   </ds:schemaRefs>
 </ds:datastoreItem>
 </file>
</xml_diff>

<commit_message>
Adjusted layout of paper
</commit_message>
<xml_diff>
--- a/Paper/GW2425_Demaecker_Daan_NL_Paper.docx
+++ b/Paper/GW2425_Demaecker_Daan_NL_Paper.docx
@@ -244,6 +244,7 @@
           <w:rFonts w:ascii="Biome" w:hAnsi="Biome" w:cs="Biome"/>
           <w:noProof/>
         </w:rPr>
+        <w:lastRenderedPageBreak/>
         <w:drawing>
           <wp:anchor distT="0" distB="0" distL="114300" distR="114300" simplePos="0" relativeHeight="251661312" behindDoc="1" locked="0" layoutInCell="1" allowOverlap="1" wp14:anchorId="326D3556" wp14:editId="773E9556">
             <wp:simplePos x="0" y="0"/>
@@ -3654,6 +3655,15 @@
       </w:r>
     </w:p>
     <w:p>
+      <w:pPr>
+        <w:spacing w:before="100" w:after="200"/>
+      </w:pPr>
+      <w:r>
+        <w:br w:type="page"/>
+      </w:r>
+    </w:p>
+    <w:p/>
+    <w:p>
       <w:r>
         <w:t>My research question for this paper is:</w:t>
       </w:r>
@@ -3711,7 +3721,13 @@
         <w:spacing w:before="0" w:after="160" w:line="259" w:lineRule="auto"/>
       </w:pPr>
       <w:r>
-        <w:t>“GTAO will look better than HBAO and SSAO”</w:t>
+        <w:t xml:space="preserve">“GTAO will </w:t>
+      </w:r>
+      <w:r>
+        <w:t>appear</w:t>
+      </w:r>
+      <w:r>
+        <w:t xml:space="preserve"> better than HBAO and SSAO”</w:t>
       </w:r>
     </w:p>
     <w:p>
@@ -3724,7 +3740,13 @@
         <w:spacing w:before="0" w:after="160" w:line="259" w:lineRule="auto"/>
       </w:pPr>
       <w:r>
-        <w:t>“HBAO will look better than SSAO but worse than HBAO”</w:t>
+        <w:t xml:space="preserve">“HBAO will </w:t>
+      </w:r>
+      <w:r>
+        <w:t xml:space="preserve">appear </w:t>
+      </w:r>
+      <w:r>
+        <w:t>better than SSAO but worse than HBAO”</w:t>
       </w:r>
     </w:p>
     <w:p>
@@ -3737,7 +3759,13 @@
         <w:spacing w:before="0" w:after="160" w:line="259" w:lineRule="auto"/>
       </w:pPr>
       <w:r>
-        <w:t>“SSAO will look worse than both GTAO and HBAO”</w:t>
+        <w:t xml:space="preserve">“SSAO will </w:t>
+      </w:r>
+      <w:r>
+        <w:t xml:space="preserve">appear </w:t>
+      </w:r>
+      <w:r>
+        <w:t>worse than both GTAO and HBAO”</w:t>
       </w:r>
     </w:p>
     <w:p>
@@ -3943,17 +3971,157 @@
       </w:pPr>
       <w:r>
         <w:rPr>
+          <w:lang w:val="en-GB"/>
+        </w:rPr>
+        <w:t>The Vulkan pipeline consist</w:t>
+      </w:r>
+      <w:r>
+        <w:rPr>
+          <w:lang w:val="en-GB"/>
+        </w:rPr>
+        <w:t>s of a number of shader stages</w:t>
+      </w:r>
+      <w:r>
+        <w:rPr>
+          <w:lang w:val="en-GB"/>
+        </w:rPr>
+        <w:t>. Some of these stages are fixed functions that the user can’t change, while others are programmable functions that give the user the freedom to customize. Here is a list of the shader stages in order of execution:</w:t>
+      </w:r>
+    </w:p>
+    <w:p>
+      <w:pPr>
+        <w:rPr>
+          <w:lang w:val="en-GB"/>
+        </w:rPr>
+      </w:pPr>
+    </w:p>
+    <w:p>
+      <w:pPr>
+        <w:pStyle w:val="ListParagraph"/>
+        <w:numPr>
+          <w:ilvl w:val="0"/>
+          <w:numId w:val="33"/>
+        </w:numPr>
+        <w:rPr>
+          <w:lang w:val="en-GB"/>
+        </w:rPr>
+      </w:pPr>
+      <w:r>
+        <w:rPr>
+          <w:lang w:val="en-GB"/>
+        </w:rPr>
+        <w:t xml:space="preserve">Input assembler: </w:t>
+      </w:r>
+      <w:r>
+        <w:rPr>
+          <w:lang w:val="en-GB"/>
+        </w:rPr>
+        <w:t>A fixed</w:t>
+      </w:r>
+      <w:r>
+        <w:rPr>
+          <w:lang w:val="en-GB"/>
+        </w:rPr>
+        <w:t>-</w:t>
+      </w:r>
+      <w:r>
+        <w:rPr>
+          <w:lang w:val="en-GB"/>
+        </w:rPr>
+        <w:t>function</w:t>
+      </w:r>
+      <w:r>
+        <w:rPr>
+          <w:lang w:val="en-GB"/>
+        </w:rPr>
+        <w:t xml:space="preserve"> stage</w:t>
+      </w:r>
+      <w:r>
+        <w:rPr>
+          <w:lang w:val="en-GB"/>
+        </w:rPr>
+        <w:t xml:space="preserve"> that </w:t>
+      </w:r>
+      <w:r>
+        <w:rPr>
+          <w:lang w:val="en-GB"/>
+        </w:rPr>
+        <w:t xml:space="preserve">collects raw data from the vertex and index buffers. </w:t>
+      </w:r>
+    </w:p>
+    <w:p>
+      <w:pPr>
+        <w:pStyle w:val="ListParagraph"/>
+        <w:numPr>
+          <w:ilvl w:val="0"/>
+          <w:numId w:val="33"/>
+        </w:numPr>
+        <w:rPr>
+          <w:lang w:val="en-GB"/>
+        </w:rPr>
+      </w:pPr>
+      <w:r>
+        <w:rPr>
+          <w:lang w:val="en-GB"/>
+        </w:rPr>
+        <w:t>Vertex shader: This</w:t>
+      </w:r>
+      <w:r>
+        <w:rPr>
+          <w:lang w:val="en-GB"/>
+        </w:rPr>
+        <w:t xml:space="preserve"> programmable</w:t>
+      </w:r>
+      <w:r>
+        <w:rPr>
+          <w:lang w:val="en-GB"/>
+        </w:rPr>
+        <w:t xml:space="preserve"> shader</w:t>
+      </w:r>
+      <w:r>
+        <w:rPr>
+          <w:lang w:val="en-GB"/>
+        </w:rPr>
+        <w:t xml:space="preserve"> stage</w:t>
+      </w:r>
+      <w:r>
+        <w:rPr>
+          <w:lang w:val="en-GB"/>
+        </w:rPr>
+        <w:t xml:space="preserve"> is executed for every vertex; usually, this is used to transform each vertex from model space to screen space.</w:t>
+      </w:r>
+      <w:r>
+        <w:rPr>
+          <w:lang w:val="en-GB"/>
+        </w:rPr>
+        <w:t xml:space="preserve"> This is the only mandatory programmable stage.</w:t>
+      </w:r>
+    </w:p>
+    <w:p>
+      <w:pPr>
+        <w:pStyle w:val="ListParagraph"/>
+        <w:numPr>
+          <w:ilvl w:val="0"/>
+          <w:numId w:val="33"/>
+        </w:numPr>
+        <w:rPr>
+          <w:lang w:val="en-GB"/>
+        </w:rPr>
+      </w:pPr>
+      <w:r>
+        <w:rPr>
           <w:noProof/>
           <w:lang w:val="en-GB"/>
         </w:rPr>
+        <w:lastRenderedPageBreak/>
         <w:drawing>
-          <wp:anchor distT="0" distB="0" distL="114300" distR="114300" simplePos="0" relativeHeight="251698176" behindDoc="1" locked="0" layoutInCell="1" allowOverlap="1" wp14:anchorId="1A282744" wp14:editId="33AA3EFF">
+          <wp:anchor distT="0" distB="0" distL="114300" distR="114300" simplePos="0" relativeHeight="251708416" behindDoc="1" locked="0" layoutInCell="1" allowOverlap="1" wp14:anchorId="71B9DDF6" wp14:editId="04B290F4">
             <wp:simplePos x="0" y="0"/>
             <wp:positionH relativeFrom="column">
-              <wp:posOffset>4754880</wp:posOffset>
+              <wp:posOffset>5015865</wp:posOffset>
             </wp:positionH>
             <wp:positionV relativeFrom="paragraph">
-              <wp:posOffset>67945</wp:posOffset>
+              <wp:posOffset>0</wp:posOffset>
             </wp:positionV>
             <wp:extent cx="1493520" cy="3669030"/>
             <wp:effectExtent l="0" t="0" r="0" b="7620"/>
@@ -4001,12 +4169,6 @@
                 </pic:pic>
               </a:graphicData>
             </a:graphic>
-            <wp14:sizeRelH relativeFrom="margin">
-              <wp14:pctWidth>0</wp14:pctWidth>
-            </wp14:sizeRelH>
-            <wp14:sizeRelV relativeFrom="margin">
-              <wp14:pctHeight>0</wp14:pctHeight>
-            </wp14:sizeRelV>
           </wp:anchor>
         </w:drawing>
       </w:r>
@@ -4014,19 +4176,7 @@
         <w:rPr>
           <w:lang w:val="en-GB"/>
         </w:rPr>
-        <w:t>The Vulkan pipeline consist</w:t>
-      </w:r>
-      <w:r>
-        <w:rPr>
-          <w:lang w:val="en-GB"/>
-        </w:rPr>
-        <w:t>s of a number of shader stages</w:t>
-      </w:r>
-      <w:r>
-        <w:rPr>
-          <w:lang w:val="en-GB"/>
-        </w:rPr>
-        <w:t>. Some of these stages are fixed functions that the user can’t change, while others are programmable functions that give the user the freedom to customize. Here is a list of the shader stages in order of execution:</w:t>
+        <w:t>Tessellation stage: This programmable shader stage allows the user to subdivide the geometry to increase mesh quality.</w:t>
       </w:r>
     </w:p>
     <w:p>
@@ -4044,43 +4194,7 @@
         <w:rPr>
           <w:lang w:val="en-GB"/>
         </w:rPr>
-        <w:t xml:space="preserve">Input assembler: </w:t>
-      </w:r>
-      <w:r>
-        <w:rPr>
-          <w:lang w:val="en-GB"/>
-        </w:rPr>
-        <w:t>A fixed</w:t>
-      </w:r>
-      <w:r>
-        <w:rPr>
-          <w:lang w:val="en-GB"/>
-        </w:rPr>
-        <w:t>-</w:t>
-      </w:r>
-      <w:r>
-        <w:rPr>
-          <w:lang w:val="en-GB"/>
-        </w:rPr>
-        <w:t>function</w:t>
-      </w:r>
-      <w:r>
-        <w:rPr>
-          <w:lang w:val="en-GB"/>
-        </w:rPr>
-        <w:t xml:space="preserve"> stage</w:t>
-      </w:r>
-      <w:r>
-        <w:rPr>
-          <w:lang w:val="en-GB"/>
-        </w:rPr>
-        <w:t xml:space="preserve"> that </w:t>
-      </w:r>
-      <w:r>
-        <w:rPr>
-          <w:lang w:val="en-GB"/>
-        </w:rPr>
-        <w:t xml:space="preserve">collects raw data from the vertex and index buffers. </w:t>
+        <w:t>Geometry shader: This programmable shader stage is executed for every primitive (triangle, line, or point). It can be used to discard primitives or output extra primitives.</w:t>
       </w:r>
     </w:p>
     <w:p>
@@ -4098,37 +4212,13 @@
         <w:rPr>
           <w:lang w:val="en-GB"/>
         </w:rPr>
-        <w:t>Vertex shader: This</w:t>
+        <w:t>Rasterization stage: This</w:t>
       </w:r>
       <w:r>
         <w:rPr>
           <w:lang w:val="en-GB"/>
         </w:rPr>
-        <w:t xml:space="preserve"> programmable</w:t>
-      </w:r>
-      <w:r>
-        <w:rPr>
-          <w:lang w:val="en-GB"/>
-        </w:rPr>
-        <w:t xml:space="preserve"> shader</w:t>
-      </w:r>
-      <w:r>
-        <w:rPr>
-          <w:lang w:val="en-GB"/>
-        </w:rPr>
-        <w:t xml:space="preserve"> stage</w:t>
-      </w:r>
-      <w:r>
-        <w:rPr>
-          <w:lang w:val="en-GB"/>
-        </w:rPr>
-        <w:t xml:space="preserve"> is executed for every vertex; usually, this is used to transform each vertex from model space to screen space.</w:t>
-      </w:r>
-      <w:r>
-        <w:rPr>
-          <w:lang w:val="en-GB"/>
-        </w:rPr>
-        <w:t xml:space="preserve"> This is the only mandatory programmable stage.</w:t>
+        <w:t xml:space="preserve"> fixed-function stage discretises the primitives into fragments. Fragments are equivalent to pixels on your screen; one fragment is one pixel. Any pixel outside of the screen is discarded. When depth testing is enabled, pixels behind previously rendered pixels are also discarded.</w:t>
       </w:r>
     </w:p>
     <w:p>
@@ -4146,7 +4236,31 @@
         <w:rPr>
           <w:lang w:val="en-GB"/>
         </w:rPr>
-        <w:t>Tessellation stage: This programmable shader stage allows the user to subdivide the geometry to increase mesh quality.</w:t>
+        <w:t>Fragment shader</w:t>
+      </w:r>
+      <w:r>
+        <w:rPr>
+          <w:lang w:val="en-GB"/>
+        </w:rPr>
+        <w:t xml:space="preserve"> stage</w:t>
+      </w:r>
+      <w:r>
+        <w:rPr>
+          <w:lang w:val="en-GB"/>
+        </w:rPr>
+        <w:t>: This stage</w:t>
+      </w:r>
+      <w:r>
+        <w:rPr>
+          <w:lang w:val="en-GB"/>
+        </w:rPr>
+        <w:t xml:space="preserve"> is the final programmable shader stage, and</w:t>
+      </w:r>
+      <w:r>
+        <w:rPr>
+          <w:lang w:val="en-GB"/>
+        </w:rPr>
+        <w:t xml:space="preserve"> also known as the pixel shader in other graphics API’s like OpenGL and DirectX. It is executed for every rendered fragment or pixel. It is often used to calculate textures and lighting using the interpolated data from the vertex shader.</w:t>
       </w:r>
     </w:p>
     <w:p>
@@ -4164,97 +4278,6 @@
         <w:rPr>
           <w:lang w:val="en-GB"/>
         </w:rPr>
-        <w:t>Geometry shader: This programmable shader stage is executed for every primitive (triangle, line, or point). It can be used to discard primitives or output extra primitives.</w:t>
-      </w:r>
-    </w:p>
-    <w:p>
-      <w:pPr>
-        <w:pStyle w:val="ListParagraph"/>
-        <w:numPr>
-          <w:ilvl w:val="0"/>
-          <w:numId w:val="33"/>
-        </w:numPr>
-        <w:rPr>
-          <w:lang w:val="en-GB"/>
-        </w:rPr>
-      </w:pPr>
-      <w:r>
-        <w:rPr>
-          <w:lang w:val="en-GB"/>
-        </w:rPr>
-        <w:t>Rasterization stage: This</w:t>
-      </w:r>
-      <w:r>
-        <w:rPr>
-          <w:lang w:val="en-GB"/>
-        </w:rPr>
-        <w:t xml:space="preserve"> fixed-function stage discretises the primitives into fragments. Fragments are equivalent to pixels </w:t>
-      </w:r>
-      <w:r>
-        <w:rPr>
-          <w:lang w:val="en-GB"/>
-        </w:rPr>
-        <w:lastRenderedPageBreak/>
-        <w:t>on your screen; one fragment is one pixel. Any pixel outside of the screen is discarded. When depth testing is enabled, pixels behind previously rendered pixels are also discarded.</w:t>
-      </w:r>
-    </w:p>
-    <w:p>
-      <w:pPr>
-        <w:pStyle w:val="ListParagraph"/>
-        <w:numPr>
-          <w:ilvl w:val="0"/>
-          <w:numId w:val="33"/>
-        </w:numPr>
-        <w:rPr>
-          <w:lang w:val="en-GB"/>
-        </w:rPr>
-      </w:pPr>
-      <w:r>
-        <w:rPr>
-          <w:lang w:val="en-GB"/>
-        </w:rPr>
-        <w:t>Fragment shader</w:t>
-      </w:r>
-      <w:r>
-        <w:rPr>
-          <w:lang w:val="en-GB"/>
-        </w:rPr>
-        <w:t xml:space="preserve"> stage</w:t>
-      </w:r>
-      <w:r>
-        <w:rPr>
-          <w:lang w:val="en-GB"/>
-        </w:rPr>
-        <w:t>: This stage</w:t>
-      </w:r>
-      <w:r>
-        <w:rPr>
-          <w:lang w:val="en-GB"/>
-        </w:rPr>
-        <w:t xml:space="preserve"> is the final programmable shader stage, and</w:t>
-      </w:r>
-      <w:r>
-        <w:rPr>
-          <w:lang w:val="en-GB"/>
-        </w:rPr>
-        <w:t xml:space="preserve"> also known as the pixel shader in other graphics API’s like OpenGL and DirectX. It is executed for every rendered fragment or pixel. It is often used to calculate textures and lighting using the interpolated data from the vertex shader.</w:t>
-      </w:r>
-    </w:p>
-    <w:p>
-      <w:pPr>
-        <w:pStyle w:val="ListParagraph"/>
-        <w:numPr>
-          <w:ilvl w:val="0"/>
-          <w:numId w:val="33"/>
-        </w:numPr>
-        <w:rPr>
-          <w:lang w:val="en-GB"/>
-        </w:rPr>
-      </w:pPr>
-      <w:r>
-        <w:rPr>
-          <w:lang w:val="en-GB"/>
-        </w:rPr>
         <w:t>Colour blending stage: This is the final stage and a fixed function. It applies an operation to mix different fragments that happened to be rendered to the same pixel.</w:t>
       </w:r>
     </w:p>
@@ -4401,7 +4424,14 @@
         <w:rPr>
           <w:lang w:val="en-GB"/>
         </w:rPr>
-        <w:t xml:space="preserve">An attachment is an image associated with a renderpass that can be used as an input or output of one or more of its subpasses. This means that you can render to an image in one subpass and then sample from that image in </w:t>
+        <w:t xml:space="preserve">An attachment is an image associated with a renderpass that can be used as an input or output of one or more of its subpasses. This means that you can render to an image in one subpass and </w:t>
+      </w:r>
+      <w:r>
+        <w:rPr>
+          <w:lang w:val="en-GB"/>
+        </w:rPr>
+        <w:lastRenderedPageBreak/>
+        <w:t xml:space="preserve">then sample from that image in </w:t>
       </w:r>
       <w:r>
         <w:rPr>
@@ -4497,168 +4527,168 @@
         <w:rPr>
           <w:lang w:val="en-GB"/>
         </w:rPr>
+        <w:t>2.1 Rasterization vs raytracing</w:t>
+      </w:r>
+      <w:r>
+        <w:rPr>
+          <w:lang w:val="en-GB"/>
+        </w:rPr>
+        <w:t xml:space="preserve"> [5]</w:t>
+      </w:r>
+    </w:p>
+    <w:p>
+      <w:pPr>
+        <w:rPr>
+          <w:lang w:val="en-GB"/>
+        </w:rPr>
+      </w:pPr>
+      <w:r>
+        <w:rPr>
+          <w:lang w:val="en-GB"/>
+        </w:rPr>
+        <w:t>In real-time rendering, there are 2 main types of rendering</w:t>
+      </w:r>
+      <w:r>
+        <w:rPr>
+          <w:lang w:val="en-GB"/>
+        </w:rPr>
+        <w:t>:</w:t>
+      </w:r>
+      <w:r>
+        <w:rPr>
+          <w:lang w:val="en-GB"/>
+        </w:rPr>
+        <w:t xml:space="preserve"> rasterization and </w:t>
+      </w:r>
+      <w:r>
+        <w:rPr>
+          <w:lang w:val="en-GB"/>
+        </w:rPr>
+        <w:t>ray tracing</w:t>
+      </w:r>
+      <w:r>
+        <w:rPr>
+          <w:lang w:val="en-GB"/>
+        </w:rPr>
+        <w:t>.</w:t>
+      </w:r>
+    </w:p>
+    <w:p>
+      <w:pPr>
+        <w:rPr>
+          <w:lang w:val="en-GB"/>
+        </w:rPr>
+      </w:pPr>
+      <w:r>
+        <w:rPr>
+          <w:lang w:val="en-GB"/>
+        </w:rPr>
+        <w:t xml:space="preserve">In </w:t>
+      </w:r>
+      <w:r>
+        <w:rPr>
+          <w:lang w:val="en-GB"/>
+        </w:rPr>
+        <w:t>ray tracing</w:t>
+      </w:r>
+      <w:r>
+        <w:rPr>
+          <w:lang w:val="en-GB"/>
+        </w:rPr>
+        <w:t>, we shoot a ray into the scene for every pixel of the screen. When hitting an object in the scene, we get information about the material it is made of</w:t>
+      </w:r>
+      <w:r>
+        <w:rPr>
+          <w:lang w:val="en-GB"/>
+        </w:rPr>
+        <w:t>. T</w:t>
+      </w:r>
+      <w:r>
+        <w:rPr>
+          <w:lang w:val="en-GB"/>
+        </w:rPr>
+        <w:t>his material can then give us the information on how to proceed with shading. You can shoot more rays from that point to account for reflections, lights, shadows</w:t>
+      </w:r>
+      <w:r>
+        <w:rPr>
+          <w:lang w:val="en-GB"/>
+        </w:rPr>
+        <w:t>,</w:t>
+      </w:r>
+      <w:r>
+        <w:rPr>
+          <w:lang w:val="en-GB"/>
+        </w:rPr>
+        <w:t xml:space="preserve"> etc.</w:t>
+      </w:r>
+    </w:p>
+    <w:p>
+      <w:pPr>
+        <w:rPr>
+          <w:lang w:val="en-GB"/>
+        </w:rPr>
+      </w:pPr>
+      <w:r>
+        <w:rPr>
+          <w:lang w:val="en-GB"/>
+        </w:rPr>
+        <w:t>In rasterization</w:t>
+      </w:r>
+      <w:r>
+        <w:rPr>
+          <w:lang w:val="en-GB"/>
+        </w:rPr>
+        <w:t>,</w:t>
+      </w:r>
+      <w:r>
+        <w:rPr>
+          <w:lang w:val="en-GB"/>
+        </w:rPr>
+        <w:t xml:space="preserve"> however, we render objects by projecting</w:t>
+      </w:r>
+      <w:r>
+        <w:rPr>
+          <w:lang w:val="en-GB"/>
+        </w:rPr>
+        <w:t xml:space="preserve"> the triangles of a 3D mesh </w:t>
+      </w:r>
+      <w:r>
+        <w:rPr>
+          <w:lang w:val="en-GB"/>
+        </w:rPr>
+        <w:t xml:space="preserve">on a 2D </w:t>
+      </w:r>
+      <w:r>
+        <w:rPr>
+          <w:lang w:val="en-GB"/>
+        </w:rPr>
+        <w:t>raster. A raster or bitmap image is a dot matrix data structure that represents a generally rectangular grid of pixels, viewable via a monitor or other display medium.</w:t>
+      </w:r>
+    </w:p>
+    <w:p>
+      <w:pPr>
+        <w:rPr>
+          <w:lang w:val="en-GB"/>
+        </w:rPr>
+      </w:pPr>
+      <w:r>
+        <w:rPr>
+          <w:lang w:val="en-GB"/>
+        </w:rPr>
+        <w:t>We will be using rasterization.</w:t>
+      </w:r>
+    </w:p>
+    <w:p>
+      <w:pPr>
+        <w:rPr>
+          <w:lang w:val="en-GB"/>
+        </w:rPr>
+      </w:pPr>
+      <w:r>
+        <w:rPr>
+          <w:noProof/>
+        </w:rPr>
         <w:lastRenderedPageBreak/>
-        <w:t>2.1 Rasterization vs raytracing</w:t>
-      </w:r>
-      <w:r>
-        <w:rPr>
-          <w:lang w:val="en-GB"/>
-        </w:rPr>
-        <w:t xml:space="preserve"> [5]</w:t>
-      </w:r>
-    </w:p>
-    <w:p>
-      <w:pPr>
-        <w:rPr>
-          <w:lang w:val="en-GB"/>
-        </w:rPr>
-      </w:pPr>
-      <w:r>
-        <w:rPr>
-          <w:lang w:val="en-GB"/>
-        </w:rPr>
-        <w:t>In real-time rendering, there are 2 main types of rendering</w:t>
-      </w:r>
-      <w:r>
-        <w:rPr>
-          <w:lang w:val="en-GB"/>
-        </w:rPr>
-        <w:t>:</w:t>
-      </w:r>
-      <w:r>
-        <w:rPr>
-          <w:lang w:val="en-GB"/>
-        </w:rPr>
-        <w:t xml:space="preserve"> rasterization and </w:t>
-      </w:r>
-      <w:r>
-        <w:rPr>
-          <w:lang w:val="en-GB"/>
-        </w:rPr>
-        <w:t>ray tracing</w:t>
-      </w:r>
-      <w:r>
-        <w:rPr>
-          <w:lang w:val="en-GB"/>
-        </w:rPr>
-        <w:t>.</w:t>
-      </w:r>
-    </w:p>
-    <w:p>
-      <w:pPr>
-        <w:rPr>
-          <w:lang w:val="en-GB"/>
-        </w:rPr>
-      </w:pPr>
-      <w:r>
-        <w:rPr>
-          <w:lang w:val="en-GB"/>
-        </w:rPr>
-        <w:t xml:space="preserve">In </w:t>
-      </w:r>
-      <w:r>
-        <w:rPr>
-          <w:lang w:val="en-GB"/>
-        </w:rPr>
-        <w:t>ray tracing</w:t>
-      </w:r>
-      <w:r>
-        <w:rPr>
-          <w:lang w:val="en-GB"/>
-        </w:rPr>
-        <w:t>, we shoot a ray into the scene for every pixel of the screen. When hitting an object in the scene, we get information about the material it is made of</w:t>
-      </w:r>
-      <w:r>
-        <w:rPr>
-          <w:lang w:val="en-GB"/>
-        </w:rPr>
-        <w:t>. T</w:t>
-      </w:r>
-      <w:r>
-        <w:rPr>
-          <w:lang w:val="en-GB"/>
-        </w:rPr>
-        <w:t>his material can then give us the information on how to proceed with shading. You can shoot more rays from that point to account for reflections, lights, shadows</w:t>
-      </w:r>
-      <w:r>
-        <w:rPr>
-          <w:lang w:val="en-GB"/>
-        </w:rPr>
-        <w:t>,</w:t>
-      </w:r>
-      <w:r>
-        <w:rPr>
-          <w:lang w:val="en-GB"/>
-        </w:rPr>
-        <w:t xml:space="preserve"> etc.</w:t>
-      </w:r>
-    </w:p>
-    <w:p>
-      <w:pPr>
-        <w:rPr>
-          <w:lang w:val="en-GB"/>
-        </w:rPr>
-      </w:pPr>
-      <w:r>
-        <w:rPr>
-          <w:lang w:val="en-GB"/>
-        </w:rPr>
-        <w:t>In rasterization</w:t>
-      </w:r>
-      <w:r>
-        <w:rPr>
-          <w:lang w:val="en-GB"/>
-        </w:rPr>
-        <w:t>,</w:t>
-      </w:r>
-      <w:r>
-        <w:rPr>
-          <w:lang w:val="en-GB"/>
-        </w:rPr>
-        <w:t xml:space="preserve"> however, we render objects by projecting</w:t>
-      </w:r>
-      <w:r>
-        <w:rPr>
-          <w:lang w:val="en-GB"/>
-        </w:rPr>
-        <w:t xml:space="preserve"> the triangles of a 3D mesh </w:t>
-      </w:r>
-      <w:r>
-        <w:rPr>
-          <w:lang w:val="en-GB"/>
-        </w:rPr>
-        <w:t xml:space="preserve">on a 2D </w:t>
-      </w:r>
-      <w:r>
-        <w:rPr>
-          <w:lang w:val="en-GB"/>
-        </w:rPr>
-        <w:t>raster. A raster or bitmap image is a dot matrix data structure that represents a generally rectangular grid of pixels, viewable via a monitor or other display medium.</w:t>
-      </w:r>
-    </w:p>
-    <w:p>
-      <w:pPr>
-        <w:rPr>
-          <w:lang w:val="en-GB"/>
-        </w:rPr>
-      </w:pPr>
-      <w:r>
-        <w:rPr>
-          <w:lang w:val="en-GB"/>
-        </w:rPr>
-        <w:t>We will be using rasterization.</w:t>
-      </w:r>
-    </w:p>
-    <w:p>
-      <w:pPr>
-        <w:rPr>
-          <w:lang w:val="en-GB"/>
-        </w:rPr>
-      </w:pPr>
-      <w:r>
-        <w:rPr>
-          <w:noProof/>
-        </w:rPr>
         <w:drawing>
           <wp:anchor distT="0" distB="0" distL="114300" distR="114300" simplePos="0" relativeHeight="251699200" behindDoc="0" locked="0" layoutInCell="1" allowOverlap="1" wp14:anchorId="3C86F89B" wp14:editId="2A338F6F">
             <wp:simplePos x="0" y="0"/>
@@ -4754,40 +4784,67 @@
         <w:t xml:space="preserve"> </w:t>
       </w:r>
       <w:r>
-        <w:t xml:space="preserve">This is very straightforward, but it brings up one big issue. Calculating lighting is not a cheap operation, and sometimes, a pixel is rendered, the lighting for it is calculated, only for </w:t>
-      </w:r>
-      <w:r>
+        <w:t>This is very straightforward, but it brings up one big issue. Calculating lighting is not a cheap operation, and sometimes, a pixel is rendered, the lighting for it is calculated, only for another pixel to be rendered on top of it, and the lighting calculations have to be done all over again. This is a big waste of resources</w:t>
+      </w:r>
+      <w:r>
+        <w:t xml:space="preserve"> called </w:t>
+      </w:r>
+      <w:r>
+        <w:t>overdraw</w:t>
+      </w:r>
+      <w:r>
+        <w:t>.</w:t>
+      </w:r>
+    </w:p>
+    <w:p>
+      <w:pPr>
+        <w:rPr>
+          <w:noProof/>
+        </w:rPr>
+      </w:pPr>
+      <w:r>
+        <w:t>The solution to this problem is deferred rendering or deferred shading. In deferred rendering</w:t>
+      </w:r>
+      <w:r>
+        <w:t>,</w:t>
+      </w:r>
+      <w:r>
+        <w:t xml:space="preserve"> we first render to a G-buffer</w:t>
+      </w:r>
+      <w:r>
+        <w:t xml:space="preserve">. This buffer will </w:t>
+      </w:r>
+      <w:r>
+        <w:t>store information such as normal, albedo color, position, specular value, metalness value, roughness value, and any other desired data</w:t>
+      </w:r>
+      <w:r>
+        <w:t>.</w:t>
+      </w:r>
+      <w:r>
+        <w:br/>
+        <w:t>After rendering everything, we process the G-buffer and calculate the lighting for every pixel. This prevents multiple lighting calculations per pixel and helps increase the performance of the render, making it perfect for real-time rendering.</w:t>
+      </w:r>
+      <w:r>
+        <w:rPr>
+          <w:noProof/>
+        </w:rPr>
+        <w:t xml:space="preserve"> </w:t>
+      </w:r>
+    </w:p>
+    <w:p>
+      <w:r>
+        <w:rPr>
+          <w:noProof/>
+        </w:rPr>
         <w:lastRenderedPageBreak/>
-        <w:t>another pixel to be rendered on top of it, and the lighting calculations have to be done all over again. This is a big waste of resources</w:t>
-      </w:r>
-      <w:r>
-        <w:t xml:space="preserve"> called </w:t>
-      </w:r>
-      <w:r>
-        <w:t>overdraw</w:t>
-      </w:r>
-      <w:r>
-        <w:t>.</w:t>
-      </w:r>
-    </w:p>
-    <w:p>
-      <w:pPr>
-        <w:rPr>
-          <w:noProof/>
-        </w:rPr>
-      </w:pPr>
-      <w:r>
-        <w:rPr>
-          <w:noProof/>
-        </w:rPr>
         <w:drawing>
-          <wp:anchor distT="0" distB="0" distL="114300" distR="114300" simplePos="0" relativeHeight="251697152" behindDoc="0" locked="0" layoutInCell="1" allowOverlap="1" wp14:anchorId="51901B0D" wp14:editId="37F2B12F">
+          <wp:anchor distT="0" distB="0" distL="114300" distR="114300" simplePos="0" relativeHeight="251697152" behindDoc="0" locked="0" layoutInCell="1" allowOverlap="1" wp14:anchorId="51901B0D" wp14:editId="0785B829">
             <wp:simplePos x="0" y="0"/>
             <wp:positionH relativeFrom="margin">
-              <wp:posOffset>2857500</wp:posOffset>
+              <wp:posOffset>2796540</wp:posOffset>
             </wp:positionH>
             <wp:positionV relativeFrom="paragraph">
-              <wp:posOffset>1617345</wp:posOffset>
+              <wp:posOffset>171450</wp:posOffset>
             </wp:positionV>
             <wp:extent cx="2781300" cy="2091690"/>
             <wp:effectExtent l="0" t="0" r="0" b="3810"/>
@@ -4837,41 +4894,11 @@
         </w:drawing>
       </w:r>
       <w:r>
-        <w:t>The solution to this problem is deferred rendering or deferred shading. In deferred rendering</w:t>
-      </w:r>
-      <w:r>
-        <w:t>,</w:t>
-      </w:r>
-      <w:r>
-        <w:t xml:space="preserve"> we first render to a G-buffer</w:t>
-      </w:r>
-      <w:r>
-        <w:t xml:space="preserve">. This buffer will </w:t>
-      </w:r>
-      <w:r>
-        <w:t>store information such as normal, albedo color, position, specular value, metalness value, roughness value, and any other desired data</w:t>
-      </w:r>
-      <w:r>
-        <w:t>.</w:t>
-      </w:r>
-      <w:r>
-        <w:br/>
-        <w:t>After rendering everything, we process the G-buffer and calculate the lighting for every pixel. This prevents multiple lighting calculations per pixel and helps increase the performance of the render, making it perfect for real-time rendering.</w:t>
-      </w:r>
-      <w:r>
         <w:rPr>
           <w:noProof/>
         </w:rPr>
-        <w:t xml:space="preserve"> </w:t>
-      </w:r>
-    </w:p>
-    <w:p>
-      <w:r>
-        <w:rPr>
-          <w:noProof/>
-        </w:rPr>
         <w:drawing>
-          <wp:anchor distT="0" distB="0" distL="114300" distR="114300" simplePos="0" relativeHeight="251671552" behindDoc="0" locked="0" layoutInCell="1" allowOverlap="1" wp14:anchorId="77586F00" wp14:editId="0DBA4535">
+          <wp:anchor distT="0" distB="0" distL="114300" distR="114300" simplePos="0" relativeHeight="251671552" behindDoc="0" locked="0" layoutInCell="1" allowOverlap="1" wp14:anchorId="77586F00" wp14:editId="784F7658">
             <wp:simplePos x="0" y="0"/>
             <wp:positionH relativeFrom="margin">
               <wp:posOffset>-38100</wp:posOffset>
@@ -4978,18 +5005,15 @@
     </w:p>
     <w:p>
       <w:r>
-        <w:t xml:space="preserve">The final stage I will talk about is the transparency pass. When rendering transparent objects, we run into a small problem. We can’t store our scene in layers like in Photoshop or other </w:t>
-      </w:r>
+        <w:t>The final stage I will talk about is the transparency pass. When rendering transparent objects, we run into a small problem. We can’t store our scene in layers like in Photoshop or other software like it. Only the top “layer” is saved. When we render a transparent object, the depth buffer will see this as the top layer, and objects rendered behind it will be discarded. To fix this issue, we render all transparent objects at the very end of our pipeline, even after the lighting stage. We will call this the transparency pass</w:t>
+      </w:r>
+    </w:p>
+    <w:p>
+      <w:pPr>
+        <w:pStyle w:val="Heading3"/>
+      </w:pPr>
       <w:r>
         <w:lastRenderedPageBreak/>
-        <w:t>software like it. Only the top “layer” is saved. When we render a transparent object, the depth buffer will see this as the top layer, and objects rendered behind it will be discarded. To fix this issue, we render all transparent objects at the very end of our pipeline, even after the lighting stage. We will call this the transparency pass</w:t>
-      </w:r>
-    </w:p>
-    <w:p>
-      <w:pPr>
-        <w:pStyle w:val="Heading3"/>
-      </w:pPr>
-      <w:r>
         <w:t>2.5 Full pipeline</w:t>
       </w:r>
     </w:p>
@@ -5130,7 +5154,6 @@
         </w:numPr>
       </w:pPr>
       <w:r>
-        <w:lastRenderedPageBreak/>
         <w:t>Ambient Occlusion: This is the technique that I will be breaking down into detail throughout this paper.</w:t>
       </w:r>
     </w:p>
@@ -5146,6 +5169,7 @@
         <w:rPr>
           <w:noProof/>
         </w:rPr>
+        <w:lastRenderedPageBreak/>
         <w:drawing>
           <wp:anchor distT="0" distB="0" distL="114300" distR="114300" simplePos="0" relativeHeight="251665408" behindDoc="1" locked="0" layoutInCell="1" allowOverlap="1" wp14:anchorId="4DFB6262" wp14:editId="092E14CF">
             <wp:simplePos x="0" y="0"/>
@@ -5289,7 +5313,7 @@
     </w:p>
     <w:p>
       <w:pPr>
-        <w:pStyle w:val="Heading2"/>
+        <w:pStyle w:val="Heading3"/>
       </w:pPr>
       <w:bookmarkStart w:id="10" w:name="_Toc206280104"/>
       <w:r>
@@ -5503,6 +5527,7 @@
     </w:p>
     <w:p>
       <w:r>
+        <w:lastRenderedPageBreak/>
         <w:t xml:space="preserve">SSAO needs 2 main things to make the correct calculations: the view space position and the view space </w:t>
       </w:r>
       <w:proofErr w:type="spellStart"/>
@@ -5511,11 +5536,7 @@
       </w:r>
       <w:proofErr w:type="spellEnd"/>
       <w:r>
-        <w:t xml:space="preserve">. View space means that it is relevant to the camera; the view space position </w:t>
-      </w:r>
-      <w:r>
-        <w:lastRenderedPageBreak/>
-        <w:t xml:space="preserve">of the camera would be (0,0,0), the view space position of an object 1 unit in front of the camera would be (0,0,1), etc. The same is true of view space </w:t>
+        <w:t xml:space="preserve">. View space means that it is relevant to the camera; the view space position of the camera would be (0,0,0), the view space position of an object 1 unit in front of the camera would be (0,0,1), etc. The same is true of view space </w:t>
       </w:r>
       <w:proofErr w:type="spellStart"/>
       <w:r>
@@ -5786,6 +5807,7 @@
     </w:p>
     <w:p>
       <w:r>
+        <w:lastRenderedPageBreak/>
         <w:t>The original SSAO is simply called SSAO</w:t>
       </w:r>
       <w:r>
@@ -5801,11 +5823,7 @@
       </w:r>
       <w:r>
         <w:br/>
-        <w:t xml:space="preserve">The general idea is that we project a small dome around a single point in the direction of the </w:t>
-      </w:r>
-      <w:r>
-        <w:lastRenderedPageBreak/>
-        <w:t>view space normal of that point. We then project several points within that dome and check which ones are visible to the camera. We do this by calculating the view space position of said points and checking if they are visible to the camera with the help of the previously mentioned view space position map.</w:t>
+        <w:t>The general idea is that we project a small dome around a single point in the direction of the view space normal of that point. We then project several points within that dome and check which ones are visible to the camera. We do this by calculating the view space position of said points and checking if they are visible to the camera with the help of the previously mentioned view space position map.</w:t>
       </w:r>
     </w:p>
     <w:p>
@@ -5935,7 +5953,6 @@
     </w:p>
     <w:p>
       <w:r>
-        <w:lastRenderedPageBreak/>
         <w:t>Horizon-based ambient occlusion (HBAO) is a similar but newer version of SSAO. The algorithm starts with the information available in the view space position and normal buffers.</w:t>
       </w:r>
     </w:p>
@@ -6015,16 +6032,16 @@
           <w:noProof/>
         </w:rPr>
         <w:drawing>
-          <wp:anchor distT="0" distB="0" distL="114300" distR="114300" simplePos="0" relativeHeight="251686912" behindDoc="0" locked="0" layoutInCell="1" allowOverlap="1" wp14:anchorId="48FF1C5B" wp14:editId="006981CB">
+          <wp:anchor distT="0" distB="0" distL="114300" distR="114300" simplePos="0" relativeHeight="251686912" behindDoc="0" locked="0" layoutInCell="1" allowOverlap="1" wp14:anchorId="48FF1C5B" wp14:editId="454D95B3">
             <wp:simplePos x="0" y="0"/>
             <wp:positionH relativeFrom="column">
-              <wp:posOffset>1379220</wp:posOffset>
+              <wp:posOffset>788035</wp:posOffset>
             </wp:positionH>
             <wp:positionV relativeFrom="paragraph">
-              <wp:posOffset>319405</wp:posOffset>
+              <wp:posOffset>264795</wp:posOffset>
             </wp:positionV>
-            <wp:extent cx="2695951" cy="228632"/>
-            <wp:effectExtent l="0" t="0" r="0" b="0"/>
+            <wp:extent cx="3952875" cy="335280"/>
+            <wp:effectExtent l="0" t="0" r="9525" b="7620"/>
             <wp:wrapTopAndBottom/>
             <wp:docPr id="27" name="Picture 27"/>
             <wp:cNvGraphicFramePr>
@@ -6052,7 +6069,7 @@
                   <pic:spPr>
                     <a:xfrm>
                       <a:off x="0" y="0"/>
-                      <a:ext cx="2695951" cy="228632"/>
+                      <a:ext cx="3952875" cy="335280"/>
                     </a:xfrm>
                     <a:prstGeom prst="rect">
                       <a:avLst/>
@@ -6061,6 +6078,12 @@
                 </pic:pic>
               </a:graphicData>
             </a:graphic>
+            <wp14:sizeRelH relativeFrom="margin">
+              <wp14:pctWidth>0</wp14:pctWidth>
+            </wp14:sizeRelH>
+            <wp14:sizeRelV relativeFrom="margin">
+              <wp14:pctHeight>0</wp14:pctHeight>
+            </wp14:sizeRelV>
           </wp:anchor>
         </w:drawing>
       </w:r>
@@ -6074,16 +6097,16 @@
           <w:noProof/>
         </w:rPr>
         <w:drawing>
-          <wp:anchor distT="0" distB="0" distL="114300" distR="114300" simplePos="0" relativeHeight="251687936" behindDoc="0" locked="0" layoutInCell="1" allowOverlap="1" wp14:anchorId="5ACCDD11" wp14:editId="5E46B841">
+          <wp:anchor distT="0" distB="0" distL="114300" distR="114300" simplePos="0" relativeHeight="251687936" behindDoc="0" locked="0" layoutInCell="1" allowOverlap="1" wp14:anchorId="5ACCDD11" wp14:editId="4858DBEF">
             <wp:simplePos x="0" y="0"/>
             <wp:positionH relativeFrom="column">
-              <wp:posOffset>1576070</wp:posOffset>
+              <wp:posOffset>954405</wp:posOffset>
             </wp:positionH>
             <wp:positionV relativeFrom="paragraph">
-              <wp:posOffset>671830</wp:posOffset>
+              <wp:posOffset>549910</wp:posOffset>
             </wp:positionV>
-            <wp:extent cx="2018665" cy="194310"/>
-            <wp:effectExtent l="0" t="0" r="635" b="0"/>
+            <wp:extent cx="3518535" cy="338455"/>
+            <wp:effectExtent l="0" t="0" r="5715" b="4445"/>
             <wp:wrapTopAndBottom/>
             <wp:docPr id="28" name="Picture 28"/>
             <wp:cNvGraphicFramePr>
@@ -6111,7 +6134,7 @@
                   <pic:spPr>
                     <a:xfrm>
                       <a:off x="0" y="0"/>
-                      <a:ext cx="2018665" cy="194310"/>
+                      <a:ext cx="3518535" cy="338455"/>
                     </a:xfrm>
                     <a:prstGeom prst="rect">
                       <a:avLst/>
@@ -6152,6 +6175,7 @@
         <w:rPr>
           <w:noProof/>
         </w:rPr>
+        <w:lastRenderedPageBreak/>
         <w:drawing>
           <wp:anchor distT="0" distB="0" distL="114300" distR="114300" simplePos="0" relativeHeight="251678720" behindDoc="0" locked="0" layoutInCell="1" allowOverlap="1" wp14:anchorId="517BD431" wp14:editId="38FC97AA">
             <wp:simplePos x="0" y="0"/>
@@ -6309,6 +6333,7 @@
         <w:rPr>
           <w:noProof/>
         </w:rPr>
+        <w:lastRenderedPageBreak/>
         <w:drawing>
           <wp:anchor distT="0" distB="0" distL="114300" distR="114300" simplePos="0" relativeHeight="251680768" behindDoc="0" locked="0" layoutInCell="1" allowOverlap="1" wp14:anchorId="3024C60D" wp14:editId="2B532BF9">
             <wp:simplePos x="0" y="0"/>
@@ -6534,7 +6559,6 @@
         <w:rPr>
           <w:noProof/>
         </w:rPr>
-        <w:lastRenderedPageBreak/>
         <w:drawing>
           <wp:anchor distT="0" distB="0" distL="114300" distR="114300" simplePos="0" relativeHeight="251683840" behindDoc="0" locked="0" layoutInCell="1" allowOverlap="1" wp14:anchorId="7667AFB6" wp14:editId="0D3F76F5">
             <wp:simplePos x="0" y="0"/>
@@ -6760,6 +6784,7 @@
     </w:p>
     <w:p>
       <w:r>
+        <w:lastRenderedPageBreak/>
         <w:t xml:space="preserve">There are a couple </w:t>
       </w:r>
       <w:r>
@@ -6924,7 +6949,6 @@
         <w:rPr>
           <w:noProof/>
         </w:rPr>
-        <w:lastRenderedPageBreak/>
         <w:drawing>
           <wp:anchor distT="0" distB="0" distL="114300" distR="114300" simplePos="0" relativeHeight="251693056" behindDoc="0" locked="0" layoutInCell="1" allowOverlap="1" wp14:anchorId="6C9269DE" wp14:editId="389CAE6E">
             <wp:simplePos x="0" y="0"/>
@@ -7429,6 +7453,7 @@
     </w:p>
     <w:p>
       <w:r>
+        <w:lastRenderedPageBreak/>
         <w:t xml:space="preserve">The fragment shader of the regular SSAO has </w:t>
       </w:r>
       <w:r>
@@ -7462,7 +7487,6 @@
         </w:numPr>
       </w:pPr>
       <w:r>
-        <w:lastRenderedPageBreak/>
         <w:t>Position map in view space</w:t>
       </w:r>
     </w:p>
@@ -7676,6 +7700,7 @@
     </w:p>
     <w:p>
       <w:r>
+        <w:lastRenderedPageBreak/>
         <w:t>For this measurement, I will be using Renderdoc[14]. Renderdoc is an open-source tool that is used to debug applications that use Vulkan, OpenGL, DirectX11, or DirectX12. You can do this by capturing a single frame, and Renderdoc will give you a complete breakdown of what happened in that screen, such as starting a renderpass, drawing geometry, binding a graphics pipeline, etc.</w:t>
       </w:r>
       <w:r>
@@ -7687,7 +7712,6 @@
         <w:rPr>
           <w:noProof/>
         </w:rPr>
-        <w:lastRenderedPageBreak/>
         <w:drawing>
           <wp:anchor distT="0" distB="0" distL="114300" distR="114300" simplePos="0" relativeHeight="251703296" behindDoc="0" locked="0" layoutInCell="1" allowOverlap="1" wp14:anchorId="23713A0E" wp14:editId="7512ED51">
             <wp:simplePos x="0" y="0"/>
@@ -7777,6 +7801,7 @@
         <w:rPr>
           <w:noProof/>
         </w:rPr>
+        <w:lastRenderedPageBreak/>
         <w:drawing>
           <wp:inline distT="0" distB="0" distL="0" distR="0" wp14:anchorId="07AC1430" wp14:editId="6F4D1EE1">
             <wp:extent cx="5943600" cy="1929130"/>
@@ -7826,11 +7851,7 @@
     </w:p>
     <w:p>
       <w:r>
-        <w:t xml:space="preserve">Querying the VRAM usage is a bit tricky. Vulkan does not give a direct way of querying Video memory or VRAM, but DirectX12 does. This means that we first have to save our VkPhysicalDevice to a variable, extract the specific ID, and then find the equivalent physical </w:t>
-      </w:r>
-      <w:r>
-        <w:lastRenderedPageBreak/>
-        <w:t>device in DirectX12. With the DirectX12 physical device or “</w:t>
+        <w:t>Querying the VRAM usage is a bit tricky. Vulkan does not give a direct way of querying Video memory or VRAM, but DirectX12 does. This means that we first have to save our VkPhysicalDevice to a variable, extract the specific ID, and then find the equivalent physical device in DirectX12. With the DirectX12 physical device or “</w:t>
       </w:r>
       <w:proofErr w:type="spellStart"/>
       <w:r>
@@ -7971,7 +7992,11 @@
         <w:t xml:space="preserve"> a simple question of which one looks the best to the subject. </w:t>
       </w:r>
       <w:r>
-        <w:t>There were 4 questions, each with a list of images. The first list of images consisted of a scene with only diffuse and ambient occlusion. One of each type and one image without any. The second list consisted of the same scene, but without the diffuse color, only AO. The image without AO was discarded, as this would just give a pure white image. The third and fourth lists of images were the same as the first two, but used a different scene.</w:t>
+        <w:t xml:space="preserve">There were 4 questions, each with a list of images. The first list of images consisted of a scene with only diffuse and ambient occlusion. One of each type and one image without any. The second list </w:t>
+      </w:r>
+      <w:r>
+        <w:lastRenderedPageBreak/>
+        <w:t>consisted of the same scene, but without the diffuse color, only AO. The image without AO was discarded, as this would just give a pure white image. The third and fourth lists of images were the same as the first two, but used a different scene.</w:t>
       </w:r>
     </w:p>
     <w:p>
@@ -8043,7 +8068,6 @@
         <w:rPr>
           <w:noProof/>
         </w:rPr>
-        <w:lastRenderedPageBreak/>
         <w:drawing>
           <wp:anchor distT="0" distB="0" distL="114300" distR="114300" simplePos="0" relativeHeight="251707392" behindDoc="0" locked="0" layoutInCell="1" allowOverlap="1" wp14:anchorId="3EAD04C4" wp14:editId="55845DBB">
             <wp:simplePos x="0" y="0"/>
@@ -10235,6 +10259,7 @@
     </w:p>
     <w:p>
       <w:r>
+        <w:lastRenderedPageBreak/>
         <w:t xml:space="preserve">D. </w:t>
       </w:r>
       <w:proofErr w:type="spellStart"/>
@@ -10259,7 +10284,6 @@
         <w:jc w:val="right"/>
       </w:pPr>
       <w:r>
-        <w:lastRenderedPageBreak/>
         <w:t>[8]</w:t>
       </w:r>
     </w:p>
@@ -10641,6 +10665,7 @@
     </w:p>
     <w:p>
       <w:r>
+        <w:lastRenderedPageBreak/>
         <w:t>‘</w:t>
       </w:r>
       <w:proofErr w:type="spellStart"/>
@@ -10671,7 +10696,6 @@
     <w:p>
       <w:proofErr w:type="spellStart"/>
       <w:r>
-        <w:lastRenderedPageBreak/>
         <w:t>karl</w:t>
       </w:r>
       <w:proofErr w:type="spellEnd"/>
@@ -10732,43 +10756,18 @@
       </w:r>
       <w:bookmarkEnd w:id="35"/>
     </w:p>
+    <w:p>
+      <w:r>
+        <w:t>I would like to thank my friend Matthias Ooms</w:t>
+      </w:r>
+      <w:r>
+        <w:t xml:space="preserve"> and my dad Jan </w:t>
+      </w:r>
+      <w:r>
+        <w:t xml:space="preserve"> for proofreading my paper.</w:t>
+      </w:r>
+    </w:p>
     <w:p/>
-    <w:p>
-      <w:pPr>
-        <w:rPr>
-          <w:rStyle w:val="SubtleEmphasis"/>
-          <w:b/>
-          <w:color w:val="auto"/>
-        </w:rPr>
-      </w:pPr>
-      <w:r>
-        <w:rPr>
-          <w:rStyle w:val="SubtleEmphasis"/>
-          <w:b/>
-          <w:color w:val="auto"/>
-          <w:highlight w:val="yellow"/>
-        </w:rPr>
-        <w:t xml:space="preserve">In this </w:t>
-      </w:r>
-      <w:r>
-        <w:rPr>
-          <w:rStyle w:val="SubtleEmphasis"/>
-          <w:b/>
-          <w:color w:val="auto"/>
-          <w:highlight w:val="yellow"/>
-        </w:rPr>
-        <w:t>section</w:t>
-      </w:r>
-      <w:r>
-        <w:rPr>
-          <w:rStyle w:val="SubtleEmphasis"/>
-          <w:b/>
-          <w:color w:val="auto"/>
-          <w:highlight w:val="yellow"/>
-        </w:rPr>
-        <w:t>, you can thank people who contributed to your work in a meaningful way.</w:t>
-      </w:r>
-    </w:p>
     <w:p>
       <w:pPr>
         <w:rPr>
@@ -10780,9 +10779,6 @@
         </w:rPr>
       </w:pPr>
       <w:r>
-        <w:t>I would like to thank my friend Matthias Ooms for proofreading my paper.</w:t>
-      </w:r>
-      <w:r>
         <w:br w:type="page"/>
       </w:r>
     </w:p>
@@ -10800,11 +10796,7 @@
     <w:p>
       <w:pPr>
         <w:rPr>
-          <w:rStyle w:val="SubtleEmphasis"/>
           <w:bCs/>
-          <w:i w:val="0"/>
-          <w:iCs w:val="0"/>
-          <w:color w:val="auto"/>
         </w:rPr>
       </w:pPr>
       <w:r>
@@ -10837,9 +10829,6 @@
         </w:r>
       </w:hyperlink>
     </w:p>
-    <w:p/>
-    <w:p/>
-    <w:p/>
     <w:sectPr>
       <w:headerReference w:type="default" r:id="rId63"/>
       <w:footerReference w:type="default" r:id="rId64"/>
@@ -14433,7 +14422,10 @@
   <w:style w:type="paragraph" w:default="1" w:styleId="Normal">
     <w:name w:val="Normal"/>
     <w:qFormat/>
-    <w:rsid w:val="00BC0811"/>
+    <w:rsid w:val="00D27FAB"/>
+    <w:pPr>
+      <w:spacing w:before="120" w:after="240"/>
+    </w:pPr>
     <w:rPr>
       <w:sz w:val="24"/>
     </w:rPr>
@@ -14445,8 +14437,9 @@
     <w:link w:val="Heading1Char"/>
     <w:uiPriority w:val="9"/>
     <w:qFormat/>
-    <w:rsid w:val="00886167"/>
+    <w:rsid w:val="00990C5A"/>
     <w:pPr>
+      <w:pageBreakBefore/>
       <w:pBdr>
         <w:top w:val="single" w:sz="24" w:space="0" w:color="5B9BD5" w:themeColor="accent1"/>
         <w:left w:val="single" w:sz="24" w:space="0" w:color="5B9BD5" w:themeColor="accent1"/>
@@ -14473,7 +14466,7 @@
     <w:uiPriority w:val="9"/>
     <w:unhideWhenUsed/>
     <w:qFormat/>
-    <w:rsid w:val="00886167"/>
+    <w:rsid w:val="00D27FAB"/>
     <w:pPr>
       <w:pBdr>
         <w:top w:val="single" w:sz="24" w:space="0" w:color="DEEAF6" w:themeColor="accent1" w:themeTint="33"/>
@@ -14482,7 +14475,7 @@
         <w:right w:val="single" w:sz="24" w:space="0" w:color="DEEAF6" w:themeColor="accent1" w:themeTint="33"/>
       </w:pBdr>
       <w:shd w:val="clear" w:color="auto" w:fill="DEEAF6" w:themeFill="accent1" w:themeFillTint="33"/>
-      <w:spacing w:after="0"/>
+      <w:spacing w:before="360" w:after="360"/>
       <w:outlineLvl w:val="1"/>
     </w:pPr>
     <w:rPr>
@@ -14498,12 +14491,12 @@
     <w:uiPriority w:val="9"/>
     <w:unhideWhenUsed/>
     <w:qFormat/>
-    <w:rsid w:val="00886167"/>
+    <w:rsid w:val="00D27FAB"/>
     <w:pPr>
       <w:pBdr>
         <w:top w:val="single" w:sz="6" w:space="2" w:color="5B9BD5" w:themeColor="accent1"/>
       </w:pBdr>
-      <w:spacing w:before="300" w:after="0"/>
+      <w:spacing w:before="360" w:after="360"/>
       <w:outlineLvl w:val="2"/>
     </w:pPr>
     <w:rPr>
@@ -14676,7 +14669,7 @@
     <w:basedOn w:val="DefaultParagraphFont"/>
     <w:link w:val="Heading1"/>
     <w:uiPriority w:val="9"/>
-    <w:rsid w:val="00886167"/>
+    <w:rsid w:val="00990C5A"/>
     <w:rPr>
       <w:caps/>
       <w:color w:val="FFFFFF" w:themeColor="background1"/>
@@ -14691,10 +14684,11 @@
     <w:basedOn w:val="DefaultParagraphFont"/>
     <w:link w:val="Heading2"/>
     <w:uiPriority w:val="9"/>
-    <w:rsid w:val="00886167"/>
+    <w:rsid w:val="00D27FAB"/>
     <w:rPr>
       <w:caps/>
       <w:spacing w:val="15"/>
+      <w:sz w:val="24"/>
       <w:shd w:val="clear" w:color="auto" w:fill="DEEAF6" w:themeFill="accent1" w:themeFillTint="33"/>
     </w:rPr>
   </w:style>
@@ -14703,11 +14697,12 @@
     <w:basedOn w:val="DefaultParagraphFont"/>
     <w:link w:val="Heading3"/>
     <w:uiPriority w:val="9"/>
-    <w:rsid w:val="00886167"/>
+    <w:rsid w:val="00D27FAB"/>
     <w:rPr>
       <w:caps/>
       <w:color w:val="1F4D78" w:themeColor="accent1" w:themeShade="7F"/>
       <w:spacing w:val="15"/>
+      <w:sz w:val="24"/>
     </w:rPr>
   </w:style>
   <w:style w:type="character" w:customStyle="1" w:styleId="Heading4Char">
@@ -14942,7 +14937,7 @@
     <w:qFormat/>
     <w:rsid w:val="00886167"/>
     <w:pPr>
-      <w:spacing w:before="240" w:after="240" w:line="240" w:lineRule="auto"/>
+      <w:spacing w:before="240" w:line="240" w:lineRule="auto"/>
       <w:ind w:left="1080" w:right="1080"/>
       <w:jc w:val="center"/>
     </w:pPr>
@@ -15239,6 +15234,25 @@
       <w:spacing w:after="0"/>
     </w:pPr>
   </w:style>
+  <w:style w:type="table" w:styleId="TableGrid">
+    <w:name w:val="Table Grid"/>
+    <w:basedOn w:val="TableNormal"/>
+    <w:uiPriority w:val="39"/>
+    <w:rsid w:val="00990C5A"/>
+    <w:pPr>
+      <w:spacing w:before="0" w:after="0" w:line="240" w:lineRule="auto"/>
+    </w:pPr>
+    <w:tblPr>
+      <w:tblBorders>
+        <w:top w:val="single" w:sz="4" w:space="0" w:color="auto"/>
+        <w:left w:val="single" w:sz="4" w:space="0" w:color="auto"/>
+        <w:bottom w:val="single" w:sz="4" w:space="0" w:color="auto"/>
+        <w:right w:val="single" w:sz="4" w:space="0" w:color="auto"/>
+        <w:insideH w:val="single" w:sz="4" w:space="0" w:color="auto"/>
+        <w:insideV w:val="single" w:sz="4" w:space="0" w:color="auto"/>
+      </w:tblBorders>
+    </w:tblPr>
+  </w:style>
 </w:styles>
 </file>
 
@@ -15347,6 +15361,7 @@
   <w:rsids>
     <w:rsidRoot w:val="008D3594"/>
     <w:rsid w:val="0005541A"/>
+    <w:rsid w:val="000A752F"/>
     <w:rsid w:val="0010107F"/>
     <w:rsid w:val="00106674"/>
     <w:rsid w:val="002E32D2"/>
@@ -16111,21 +16126,6 @@
 </file>
 
 <file path=customXml/item1.xml><?xml version="1.0" encoding="utf-8"?>
-<p:properties xmlns:p="http://schemas.microsoft.com/office/2006/metadata/properties" xmlns:xsi="http://www.w3.org/2001/XMLSchema-instance" xmlns:pc="http://schemas.microsoft.com/office/infopath/2007/PartnerControls">
-  <documentManagement>
-    <IconOverlay xmlns="http://schemas.microsoft.com/sharepoint/v4" xsi:nil="true"/>
-    <TaxCatchAll xmlns="128482ec-0431-40d5-ab26-89ea2a4f3ccd" xsi:nil="true"/>
-    <m99485b88215436a82099f8287cba0b0 xmlns="128482ec-0431-40d5-ab26-89ea2a4f3ccd">
-      <Terms xmlns="http://schemas.microsoft.com/office/infopath/2007/PartnerControls"/>
-    </m99485b88215436a82099f8287cba0b0>
-    <lcf76f155ced4ddcb4097134ff3c332f xmlns="60eb0cf4-ae2a-4762-800a-cb593b869ecb">
-      <Terms xmlns="http://schemas.microsoft.com/office/infopath/2007/PartnerControls"/>
-    </lcf76f155ced4ddcb4097134ff3c332f>
-  </documentManagement>
-</p:properties>
-</file>
-
-<file path=customXml/item2.xml><?xml version="1.0" encoding="utf-8"?>
 <ct:contentTypeSchema xmlns:ct="http://schemas.microsoft.com/office/2006/metadata/contentType" xmlns:ma="http://schemas.microsoft.com/office/2006/metadata/properties/metaAttributes" ct:_="" ma:_="" ma:contentTypeName="Document" ma:contentTypeID="0x010100723942CCEB3A674D8F1F6472CCEFB38E" ma:contentTypeVersion="11" ma:contentTypeDescription="Create a new document." ma:contentTypeScope="" ma:versionID="e4de40d148e029d40e3aaddc8bf68a5e">
   <xsd:schema xmlns:xsd="http://www.w3.org/2001/XMLSchema" xmlns:xs="http://www.w3.org/2001/XMLSchema" xmlns:p="http://schemas.microsoft.com/office/2006/metadata/properties" xmlns:ns2="128482ec-0431-40d5-ab26-89ea2a4f3ccd" xmlns:ns3="60eb0cf4-ae2a-4762-800a-cb593b869ecb" xmlns:ns4="http://schemas.microsoft.com/sharepoint/v4" xmlns:ns5="a2e691a9-fcfc-4d85-a390-1894fe98bd9e" targetNamespace="http://schemas.microsoft.com/office/2006/metadata/properties" ma:root="true" ma:fieldsID="fce8e8bd091658f3fe51b22d57dec109" ns2:_="" ns3:_="" ns4:_="" ns5:_="">
     <xsd:import namespace="128482ec-0431-40d5-ab26-89ea2a4f3ccd"/>
@@ -16398,7 +16398,7 @@
 </ct:contentTypeSchema>
 </file>
 
-<file path=customXml/item3.xml><?xml version="1.0" encoding="utf-8"?>
+<file path=customXml/item2.xml><?xml version="1.0" encoding="utf-8"?>
 <?mso-contentType ?>
 <FormTemplates xmlns="http://schemas.microsoft.com/sharepoint/v3/contenttype/forms">
   <Display>DocumentLibraryForm</Display>
@@ -16407,23 +16407,26 @@
 </FormTemplates>
 </file>
 
+<file path=customXml/item3.xml><?xml version="1.0" encoding="utf-8"?>
+<p:properties xmlns:p="http://schemas.microsoft.com/office/2006/metadata/properties" xmlns:xsi="http://www.w3.org/2001/XMLSchema-instance" xmlns:pc="http://schemas.microsoft.com/office/infopath/2007/PartnerControls">
+  <documentManagement>
+    <IconOverlay xmlns="http://schemas.microsoft.com/sharepoint/v4" xsi:nil="true"/>
+    <TaxCatchAll xmlns="128482ec-0431-40d5-ab26-89ea2a4f3ccd" xsi:nil="true"/>
+    <m99485b88215436a82099f8287cba0b0 xmlns="128482ec-0431-40d5-ab26-89ea2a4f3ccd">
+      <Terms xmlns="http://schemas.microsoft.com/office/infopath/2007/PartnerControls"/>
+    </m99485b88215436a82099f8287cba0b0>
+    <lcf76f155ced4ddcb4097134ff3c332f xmlns="60eb0cf4-ae2a-4762-800a-cb593b869ecb">
+      <Terms xmlns="http://schemas.microsoft.com/office/infopath/2007/PartnerControls"/>
+    </lcf76f155ced4ddcb4097134ff3c332f>
+  </documentManagement>
+</p:properties>
+</file>
+
 <file path=customXml/item4.xml><?xml version="1.0" encoding="utf-8"?>
 <b:Sources xmlns:b="http://schemas.openxmlformats.org/officeDocument/2006/bibliography" xmlns="http://schemas.openxmlformats.org/officeDocument/2006/bibliography" SelectedStyle="\APASixthEditionOfficeOnline.xsl" StyleName="APA" Version="6"/>
 </file>
 
 <file path=customXml/itemProps1.xml><?xml version="1.0" encoding="utf-8"?>
-<ds:datastoreItem xmlns:ds="http://schemas.openxmlformats.org/officeDocument/2006/customXml" ds:itemID="{0744C301-BA8E-4358-811D-299431B59409}">
-  <ds:schemaRefs>
-    <ds:schemaRef ds:uri="http://schemas.microsoft.com/office/2006/metadata/properties"/>
-    <ds:schemaRef ds:uri="http://schemas.microsoft.com/office/infopath/2007/PartnerControls"/>
-    <ds:schemaRef ds:uri="http://schemas.microsoft.com/sharepoint/v4"/>
-    <ds:schemaRef ds:uri="128482ec-0431-40d5-ab26-89ea2a4f3ccd"/>
-    <ds:schemaRef ds:uri="60eb0cf4-ae2a-4762-800a-cb593b869ecb"/>
-  </ds:schemaRefs>
-</ds:datastoreItem>
-</file>
-
-<file path=customXml/itemProps2.xml><?xml version="1.0" encoding="utf-8"?>
 <ds:datastoreItem xmlns:ds="http://schemas.openxmlformats.org/officeDocument/2006/customXml" ds:itemID="{6AD6E667-9FE3-44F6-AA83-894C6D5E44A5}">
   <ds:schemaRefs>
     <ds:schemaRef ds:uri="http://schemas.microsoft.com/office/2006/metadata/contentType"/>
@@ -16444,10 +16447,22 @@
 </ds:datastoreItem>
 </file>
 
-<file path=customXml/itemProps3.xml><?xml version="1.0" encoding="utf-8"?>
+<file path=customXml/itemProps2.xml><?xml version="1.0" encoding="utf-8"?>
 <ds:datastoreItem xmlns:ds="http://schemas.openxmlformats.org/officeDocument/2006/customXml" ds:itemID="{5EBBBFF2-2B1E-4E2A-81ED-02FB13488392}">
   <ds:schemaRefs>
     <ds:schemaRef ds:uri="http://schemas.microsoft.com/sharepoint/v3/contenttype/forms"/>
+  </ds:schemaRefs>
+</ds:datastoreItem>
+</file>
+
+<file path=customXml/itemProps3.xml><?xml version="1.0" encoding="utf-8"?>
+<ds:datastoreItem xmlns:ds="http://schemas.openxmlformats.org/officeDocument/2006/customXml" ds:itemID="{0744C301-BA8E-4358-811D-299431B59409}">
+  <ds:schemaRefs>
+    <ds:schemaRef ds:uri="http://schemas.microsoft.com/office/2006/metadata/properties"/>
+    <ds:schemaRef ds:uri="http://schemas.microsoft.com/office/infopath/2007/PartnerControls"/>
+    <ds:schemaRef ds:uri="http://schemas.microsoft.com/sharepoint/v4"/>
+    <ds:schemaRef ds:uri="128482ec-0431-40d5-ab26-89ea2a4f3ccd"/>
+    <ds:schemaRef ds:uri="60eb0cf4-ae2a-4762-800a-cb593b869ecb"/>
   </ds:schemaRefs>
 </ds:datastoreItem>
 </file>

</xml_diff>

<commit_message>
Moved shader stages chapter into table
</commit_message>
<xml_diff>
--- a/Paper/GW2425_Demaecker_Daan_NL_Paper.docx
+++ b/Paper/GW2425_Demaecker_Daan_NL_Paper.docx
@@ -17,7 +17,7 @@
           <w:szCs w:val="36"/>
         </w:rPr>
         <w:drawing>
-          <wp:anchor distT="0" distB="0" distL="114300" distR="114300" simplePos="0" relativeHeight="251659264" behindDoc="0" locked="0" layoutInCell="1" allowOverlap="1" wp14:anchorId="17BFABE8" wp14:editId="552DBCAB">
+          <wp:anchor distT="0" distB="0" distL="114300" distR="114300" simplePos="0" relativeHeight="251651072" behindDoc="0" locked="0" layoutInCell="1" allowOverlap="1" wp14:anchorId="17BFABE8" wp14:editId="69BF8BEC">
             <wp:simplePos x="0" y="0"/>
             <wp:positionH relativeFrom="margin">
               <wp:posOffset>4544060</wp:posOffset>
@@ -246,7 +246,7 @@
         </w:rPr>
         <w:lastRenderedPageBreak/>
         <w:drawing>
-          <wp:anchor distT="0" distB="0" distL="114300" distR="114300" simplePos="0" relativeHeight="251661312" behindDoc="1" locked="0" layoutInCell="1" allowOverlap="1" wp14:anchorId="326D3556" wp14:editId="773E9556">
+          <wp:anchor distT="0" distB="0" distL="114300" distR="114300" simplePos="0" relativeHeight="251653120" behindDoc="1" locked="0" layoutInCell="1" allowOverlap="1" wp14:anchorId="326D3556" wp14:editId="7467C003">
             <wp:simplePos x="0" y="0"/>
             <wp:positionH relativeFrom="margin">
               <wp:posOffset>5003165</wp:posOffset>
@@ -358,7 +358,7 @@
           <w:r>
             <w:fldChar w:fldCharType="separate"/>
           </w:r>
-          <w:hyperlink w:anchor="_Toc206280094" w:history="1">
+          <w:hyperlink w:anchor="_Toc206448589" w:history="1">
             <w:r>
               <w:rPr>
                 <w:rStyle w:val="Hyperlink"/>
@@ -385,7 +385,7 @@
                 <w:noProof/>
                 <w:webHidden/>
               </w:rPr>
-              <w:instrText xml:space="preserve"> PAGEREF _Toc206280094 \h </w:instrText>
+              <w:instrText xml:space="preserve"> PAGEREF _Toc206448589 \h </w:instrText>
             </w:r>
             <w:r>
               <w:rPr>
@@ -405,7 +405,7 @@
                 <w:noProof/>
                 <w:webHidden/>
               </w:rPr>
-              <w:t>3</w:t>
+              <w:t>4</w:t>
             </w:r>
             <w:r>
               <w:rPr>
@@ -429,7 +429,7 @@
               <w:lang w:val="en-GB" w:eastAsia="en-GB"/>
             </w:rPr>
           </w:pPr>
-          <w:hyperlink w:anchor="_Toc206280095" w:history="1">
+          <w:hyperlink w:anchor="_Toc206448590" w:history="1">
             <w:r>
               <w:rPr>
                 <w:rStyle w:val="Hyperlink"/>
@@ -456,7 +456,7 @@
                 <w:noProof/>
                 <w:webHidden/>
               </w:rPr>
-              <w:instrText xml:space="preserve"> PAGEREF _Toc206280095 \h </w:instrText>
+              <w:instrText xml:space="preserve"> PAGEREF _Toc206448590 \h </w:instrText>
             </w:r>
             <w:r>
               <w:rPr>
@@ -476,7 +476,7 @@
                 <w:noProof/>
                 <w:webHidden/>
               </w:rPr>
-              <w:t>4</w:t>
+              <w:t>5</w:t>
             </w:r>
             <w:r>
               <w:rPr>
@@ -500,7 +500,7 @@
               <w:lang w:val="en-GB" w:eastAsia="en-GB"/>
             </w:rPr>
           </w:pPr>
-          <w:hyperlink w:anchor="_Toc206280096" w:history="1">
+          <w:hyperlink w:anchor="_Toc206448591" w:history="1">
             <w:r>
               <w:rPr>
                 <w:rStyle w:val="Hyperlink"/>
@@ -527,7 +527,7 @@
                 <w:noProof/>
                 <w:webHidden/>
               </w:rPr>
-              <w:instrText xml:space="preserve"> PAGEREF _Toc206280096 \h </w:instrText>
+              <w:instrText xml:space="preserve"> PAGEREF _Toc206448591 \h </w:instrText>
             </w:r>
             <w:r>
               <w:rPr>
@@ -547,7 +547,7 @@
                 <w:noProof/>
                 <w:webHidden/>
               </w:rPr>
-              <w:t>5</w:t>
+              <w:t>6</w:t>
             </w:r>
             <w:r>
               <w:rPr>
@@ -571,7 +571,7 @@
               <w:lang w:val="en-GB" w:eastAsia="en-GB"/>
             </w:rPr>
           </w:pPr>
-          <w:hyperlink w:anchor="_Toc206280097" w:history="1">
+          <w:hyperlink w:anchor="_Toc206448592" w:history="1">
             <w:r>
               <w:rPr>
                 <w:rStyle w:val="Hyperlink"/>
@@ -598,7 +598,7 @@
                 <w:noProof/>
                 <w:webHidden/>
               </w:rPr>
-              <w:instrText xml:space="preserve"> PAGEREF _Toc206280097 \h </w:instrText>
+              <w:instrText xml:space="preserve"> PAGEREF _Toc206448592 \h </w:instrText>
             </w:r>
             <w:r>
               <w:rPr>
@@ -618,7 +618,7 @@
                 <w:noProof/>
                 <w:webHidden/>
               </w:rPr>
-              <w:t>6</w:t>
+              <w:t>7</w:t>
             </w:r>
             <w:r>
               <w:rPr>
@@ -642,7 +642,7 @@
               <w:lang w:val="en-GB" w:eastAsia="en-GB"/>
             </w:rPr>
           </w:pPr>
-          <w:hyperlink w:anchor="_Toc206280098" w:history="1">
+          <w:hyperlink w:anchor="_Toc206448593" w:history="1">
             <w:r>
               <w:rPr>
                 <w:rStyle w:val="Hyperlink"/>
@@ -669,7 +669,7 @@
                 <w:noProof/>
                 <w:webHidden/>
               </w:rPr>
-              <w:instrText xml:space="preserve"> PAGEREF _Toc206280098 \h </w:instrText>
+              <w:instrText xml:space="preserve"> PAGEREF _Toc206448593 \h </w:instrText>
             </w:r>
             <w:r>
               <w:rPr>
@@ -689,7 +689,7 @@
                 <w:noProof/>
                 <w:webHidden/>
               </w:rPr>
-              <w:t>7</w:t>
+              <w:t>9</w:t>
             </w:r>
             <w:r>
               <w:rPr>
@@ -713,7 +713,7 @@
               <w:lang w:val="en-GB" w:eastAsia="en-GB"/>
             </w:rPr>
           </w:pPr>
-          <w:hyperlink w:anchor="_Toc206280099" w:history="1">
+          <w:hyperlink w:anchor="_Toc206448594" w:history="1">
             <w:r>
               <w:rPr>
                 <w:rStyle w:val="Hyperlink"/>
@@ -740,7 +740,7 @@
                 <w:noProof/>
                 <w:webHidden/>
               </w:rPr>
-              <w:instrText xml:space="preserve"> PAGEREF _Toc206280099 \h </w:instrText>
+              <w:instrText xml:space="preserve"> PAGEREF _Toc206448594 \h </w:instrText>
             </w:r>
             <w:r>
               <w:rPr>
@@ -760,7 +760,7 @@
                 <w:noProof/>
                 <w:webHidden/>
               </w:rPr>
-              <w:t>7</w:t>
+              <w:t>9</w:t>
             </w:r>
             <w:r>
               <w:rPr>
@@ -784,7 +784,7 @@
               <w:lang w:val="en-GB" w:eastAsia="en-GB"/>
             </w:rPr>
           </w:pPr>
-          <w:hyperlink w:anchor="_Toc206280100" w:history="1">
+          <w:hyperlink w:anchor="_Toc206448595" w:history="1">
             <w:r>
               <w:rPr>
                 <w:rStyle w:val="Hyperlink"/>
@@ -811,7 +811,7 @@
                 <w:noProof/>
                 <w:webHidden/>
               </w:rPr>
-              <w:instrText xml:space="preserve"> PAGEREF _Toc206280100 \h </w:instrText>
+              <w:instrText xml:space="preserve"> PAGEREF _Toc206448595 \h </w:instrText>
             </w:r>
             <w:r>
               <w:rPr>
@@ -831,7 +831,7 @@
                 <w:noProof/>
                 <w:webHidden/>
               </w:rPr>
-              <w:t>7</w:t>
+              <w:t>9</w:t>
             </w:r>
             <w:r>
               <w:rPr>
@@ -855,13 +855,13 @@
               <w:lang w:val="en-GB" w:eastAsia="en-GB"/>
             </w:rPr>
           </w:pPr>
-          <w:hyperlink w:anchor="_Toc206280101" w:history="1">
+          <w:hyperlink w:anchor="_Toc206448596" w:history="1">
             <w:r>
               <w:rPr>
                 <w:rStyle w:val="Hyperlink"/>
                 <w:noProof/>
               </w:rPr>
-              <w:t>1.2 Shader stages</w:t>
+              <w:t>1.2 Shader stages [4]</w:t>
             </w:r>
             <w:r>
               <w:rPr>
@@ -882,7 +882,7 @@
                 <w:noProof/>
                 <w:webHidden/>
               </w:rPr>
-              <w:instrText xml:space="preserve"> PAGEREF _Toc206280101 \h </w:instrText>
+              <w:instrText xml:space="preserve"> PAGEREF _Toc206448596 \h </w:instrText>
             </w:r>
             <w:r>
               <w:rPr>
@@ -902,7 +902,151 @@
                 <w:noProof/>
                 <w:webHidden/>
               </w:rPr>
-              <w:t>7</w:t>
+              <w:t>9</w:t>
+            </w:r>
+            <w:r>
+              <w:rPr>
+                <w:noProof/>
+                <w:webHidden/>
+              </w:rPr>
+              <w:fldChar w:fldCharType="end"/>
+            </w:r>
+          </w:hyperlink>
+        </w:p>
+        <w:p>
+          <w:pPr>
+            <w:pStyle w:val="TOC3"/>
+            <w:tabs>
+              <w:tab w:val="right" w:leader="dot" w:pos="9350"/>
+            </w:tabs>
+            <w:rPr>
+              <w:noProof/>
+              <w:sz w:val="22"/>
+              <w:szCs w:val="22"/>
+              <w:lang w:val="en-GB" w:eastAsia="en-GB"/>
+            </w:rPr>
+          </w:pPr>
+          <w:hyperlink w:anchor="_Toc206448597" w:history="1">
+            <w:r>
+              <w:rPr>
+                <w:rStyle w:val="Hyperlink"/>
+                <w:noProof/>
+                <w:lang w:val="en-GB"/>
+              </w:rPr>
+              <w:t>1.3 Renderpasses [3]</w:t>
+            </w:r>
+            <w:r>
+              <w:rPr>
+                <w:noProof/>
+                <w:webHidden/>
+              </w:rPr>
+              <w:tab/>
+            </w:r>
+            <w:r>
+              <w:rPr>
+                <w:noProof/>
+                <w:webHidden/>
+              </w:rPr>
+              <w:fldChar w:fldCharType="begin"/>
+            </w:r>
+            <w:r>
+              <w:rPr>
+                <w:noProof/>
+                <w:webHidden/>
+              </w:rPr>
+              <w:instrText xml:space="preserve"> PAGEREF _Toc206448597 \h </w:instrText>
+            </w:r>
+            <w:r>
+              <w:rPr>
+                <w:noProof/>
+                <w:webHidden/>
+              </w:rPr>
+            </w:r>
+            <w:r>
+              <w:rPr>
+                <w:noProof/>
+                <w:webHidden/>
+              </w:rPr>
+              <w:fldChar w:fldCharType="separate"/>
+            </w:r>
+            <w:r>
+              <w:rPr>
+                <w:noProof/>
+                <w:webHidden/>
+              </w:rPr>
+              <w:t>10</w:t>
+            </w:r>
+            <w:r>
+              <w:rPr>
+                <w:noProof/>
+                <w:webHidden/>
+              </w:rPr>
+              <w:fldChar w:fldCharType="end"/>
+            </w:r>
+          </w:hyperlink>
+        </w:p>
+        <w:p>
+          <w:pPr>
+            <w:pStyle w:val="TOC3"/>
+            <w:tabs>
+              <w:tab w:val="right" w:leader="dot" w:pos="9350"/>
+            </w:tabs>
+            <w:rPr>
+              <w:noProof/>
+              <w:sz w:val="22"/>
+              <w:szCs w:val="22"/>
+              <w:lang w:val="en-GB" w:eastAsia="en-GB"/>
+            </w:rPr>
+          </w:pPr>
+          <w:hyperlink w:anchor="_Toc206448598" w:history="1">
+            <w:r>
+              <w:rPr>
+                <w:rStyle w:val="Hyperlink"/>
+                <w:noProof/>
+                <w:lang w:val="en-GB"/>
+              </w:rPr>
+              <w:t>1.4 Attachments [3]</w:t>
+            </w:r>
+            <w:r>
+              <w:rPr>
+                <w:noProof/>
+                <w:webHidden/>
+              </w:rPr>
+              <w:tab/>
+            </w:r>
+            <w:r>
+              <w:rPr>
+                <w:noProof/>
+                <w:webHidden/>
+              </w:rPr>
+              <w:fldChar w:fldCharType="begin"/>
+            </w:r>
+            <w:r>
+              <w:rPr>
+                <w:noProof/>
+                <w:webHidden/>
+              </w:rPr>
+              <w:instrText xml:space="preserve"> PAGEREF _Toc206448598 \h </w:instrText>
+            </w:r>
+            <w:r>
+              <w:rPr>
+                <w:noProof/>
+                <w:webHidden/>
+              </w:rPr>
+            </w:r>
+            <w:r>
+              <w:rPr>
+                <w:noProof/>
+                <w:webHidden/>
+              </w:rPr>
+              <w:fldChar w:fldCharType="separate"/>
+            </w:r>
+            <w:r>
+              <w:rPr>
+                <w:noProof/>
+                <w:webHidden/>
+              </w:rPr>
+              <w:t>10</w:t>
             </w:r>
             <w:r>
               <w:rPr>
@@ -926,7 +1070,7 @@
               <w:lang w:val="en-GB" w:eastAsia="en-GB"/>
             </w:rPr>
           </w:pPr>
-          <w:hyperlink w:anchor="_Toc206280102" w:history="1">
+          <w:hyperlink w:anchor="_Toc206448599" w:history="1">
             <w:r>
               <w:rPr>
                 <w:rStyle w:val="Hyperlink"/>
@@ -954,7 +1098,7 @@
                 <w:noProof/>
                 <w:webHidden/>
               </w:rPr>
-              <w:instrText xml:space="preserve"> PAGEREF _Toc206280102 \h </w:instrText>
+              <w:instrText xml:space="preserve"> PAGEREF _Toc206448599 \h </w:instrText>
             </w:r>
             <w:r>
               <w:rPr>
@@ -974,7 +1118,364 @@
                 <w:noProof/>
                 <w:webHidden/>
               </w:rPr>
-              <w:t>7</w:t>
+              <w:t>11</w:t>
+            </w:r>
+            <w:r>
+              <w:rPr>
+                <w:noProof/>
+                <w:webHidden/>
+              </w:rPr>
+              <w:fldChar w:fldCharType="end"/>
+            </w:r>
+          </w:hyperlink>
+        </w:p>
+        <w:p>
+          <w:pPr>
+            <w:pStyle w:val="TOC3"/>
+            <w:tabs>
+              <w:tab w:val="right" w:leader="dot" w:pos="9350"/>
+            </w:tabs>
+            <w:rPr>
+              <w:noProof/>
+              <w:sz w:val="22"/>
+              <w:szCs w:val="22"/>
+              <w:lang w:val="en-GB" w:eastAsia="en-GB"/>
+            </w:rPr>
+          </w:pPr>
+          <w:hyperlink w:anchor="_Toc206448600" w:history="1">
+            <w:r>
+              <w:rPr>
+                <w:rStyle w:val="Hyperlink"/>
+                <w:noProof/>
+                <w:lang w:val="en-GB"/>
+              </w:rPr>
+              <w:t>2.1 Rasterization vs raytracing [5]</w:t>
+            </w:r>
+            <w:r>
+              <w:rPr>
+                <w:noProof/>
+                <w:webHidden/>
+              </w:rPr>
+              <w:tab/>
+            </w:r>
+            <w:r>
+              <w:rPr>
+                <w:noProof/>
+                <w:webHidden/>
+              </w:rPr>
+              <w:fldChar w:fldCharType="begin"/>
+            </w:r>
+            <w:r>
+              <w:rPr>
+                <w:noProof/>
+                <w:webHidden/>
+              </w:rPr>
+              <w:instrText xml:space="preserve"> PAGEREF _Toc206448600 \h </w:instrText>
+            </w:r>
+            <w:r>
+              <w:rPr>
+                <w:noProof/>
+                <w:webHidden/>
+              </w:rPr>
+            </w:r>
+            <w:r>
+              <w:rPr>
+                <w:noProof/>
+                <w:webHidden/>
+              </w:rPr>
+              <w:fldChar w:fldCharType="separate"/>
+            </w:r>
+            <w:r>
+              <w:rPr>
+                <w:noProof/>
+                <w:webHidden/>
+              </w:rPr>
+              <w:t>11</w:t>
+            </w:r>
+            <w:r>
+              <w:rPr>
+                <w:noProof/>
+                <w:webHidden/>
+              </w:rPr>
+              <w:fldChar w:fldCharType="end"/>
+            </w:r>
+          </w:hyperlink>
+        </w:p>
+        <w:p>
+          <w:pPr>
+            <w:pStyle w:val="TOC3"/>
+            <w:tabs>
+              <w:tab w:val="right" w:leader="dot" w:pos="9350"/>
+            </w:tabs>
+            <w:rPr>
+              <w:noProof/>
+              <w:sz w:val="22"/>
+              <w:szCs w:val="22"/>
+              <w:lang w:val="en-GB" w:eastAsia="en-GB"/>
+            </w:rPr>
+          </w:pPr>
+          <w:hyperlink w:anchor="_Toc206448601" w:history="1">
+            <w:r>
+              <w:rPr>
+                <w:rStyle w:val="Hyperlink"/>
+                <w:noProof/>
+                <w:lang w:val="en-GB"/>
+              </w:rPr>
+              <w:t>2.2 Forward vs deferred rendering</w:t>
+            </w:r>
+            <w:r>
+              <w:rPr>
+                <w:noProof/>
+                <w:webHidden/>
+              </w:rPr>
+              <w:tab/>
+            </w:r>
+            <w:r>
+              <w:rPr>
+                <w:noProof/>
+                <w:webHidden/>
+              </w:rPr>
+              <w:fldChar w:fldCharType="begin"/>
+            </w:r>
+            <w:r>
+              <w:rPr>
+                <w:noProof/>
+                <w:webHidden/>
+              </w:rPr>
+              <w:instrText xml:space="preserve"> PAGEREF _Toc206448601 \h </w:instrText>
+            </w:r>
+            <w:r>
+              <w:rPr>
+                <w:noProof/>
+                <w:webHidden/>
+              </w:rPr>
+            </w:r>
+            <w:r>
+              <w:rPr>
+                <w:noProof/>
+                <w:webHidden/>
+              </w:rPr>
+              <w:fldChar w:fldCharType="separate"/>
+            </w:r>
+            <w:r>
+              <w:rPr>
+                <w:noProof/>
+                <w:webHidden/>
+              </w:rPr>
+              <w:t>12</w:t>
+            </w:r>
+            <w:r>
+              <w:rPr>
+                <w:noProof/>
+                <w:webHidden/>
+              </w:rPr>
+              <w:fldChar w:fldCharType="end"/>
+            </w:r>
+          </w:hyperlink>
+        </w:p>
+        <w:p>
+          <w:pPr>
+            <w:pStyle w:val="TOC3"/>
+            <w:tabs>
+              <w:tab w:val="right" w:leader="dot" w:pos="9350"/>
+            </w:tabs>
+            <w:rPr>
+              <w:noProof/>
+              <w:sz w:val="22"/>
+              <w:szCs w:val="22"/>
+              <w:lang w:val="en-GB" w:eastAsia="en-GB"/>
+            </w:rPr>
+          </w:pPr>
+          <w:hyperlink w:anchor="_Toc206448602" w:history="1">
+            <w:r>
+              <w:rPr>
+                <w:rStyle w:val="Hyperlink"/>
+                <w:noProof/>
+              </w:rPr>
+              <w:t>2.3 Depth prepass [8]</w:t>
+            </w:r>
+            <w:r>
+              <w:rPr>
+                <w:noProof/>
+                <w:webHidden/>
+              </w:rPr>
+              <w:tab/>
+            </w:r>
+            <w:r>
+              <w:rPr>
+                <w:noProof/>
+                <w:webHidden/>
+              </w:rPr>
+              <w:fldChar w:fldCharType="begin"/>
+            </w:r>
+            <w:r>
+              <w:rPr>
+                <w:noProof/>
+                <w:webHidden/>
+              </w:rPr>
+              <w:instrText xml:space="preserve"> PAGEREF _Toc206448602 \h </w:instrText>
+            </w:r>
+            <w:r>
+              <w:rPr>
+                <w:noProof/>
+                <w:webHidden/>
+              </w:rPr>
+            </w:r>
+            <w:r>
+              <w:rPr>
+                <w:noProof/>
+                <w:webHidden/>
+              </w:rPr>
+              <w:fldChar w:fldCharType="separate"/>
+            </w:r>
+            <w:r>
+              <w:rPr>
+                <w:noProof/>
+                <w:webHidden/>
+              </w:rPr>
+              <w:t>13</w:t>
+            </w:r>
+            <w:r>
+              <w:rPr>
+                <w:noProof/>
+                <w:webHidden/>
+              </w:rPr>
+              <w:fldChar w:fldCharType="end"/>
+            </w:r>
+          </w:hyperlink>
+        </w:p>
+        <w:p>
+          <w:pPr>
+            <w:pStyle w:val="TOC3"/>
+            <w:tabs>
+              <w:tab w:val="right" w:leader="dot" w:pos="9350"/>
+            </w:tabs>
+            <w:rPr>
+              <w:noProof/>
+              <w:sz w:val="22"/>
+              <w:szCs w:val="22"/>
+              <w:lang w:val="en-GB" w:eastAsia="en-GB"/>
+            </w:rPr>
+          </w:pPr>
+          <w:hyperlink w:anchor="_Toc206448603" w:history="1">
+            <w:r>
+              <w:rPr>
+                <w:rStyle w:val="Hyperlink"/>
+                <w:noProof/>
+              </w:rPr>
+              <w:t>2.4 Transparency pass</w:t>
+            </w:r>
+            <w:r>
+              <w:rPr>
+                <w:noProof/>
+                <w:webHidden/>
+              </w:rPr>
+              <w:tab/>
+            </w:r>
+            <w:r>
+              <w:rPr>
+                <w:noProof/>
+                <w:webHidden/>
+              </w:rPr>
+              <w:fldChar w:fldCharType="begin"/>
+            </w:r>
+            <w:r>
+              <w:rPr>
+                <w:noProof/>
+                <w:webHidden/>
+              </w:rPr>
+              <w:instrText xml:space="preserve"> PAGEREF _Toc206448603 \h </w:instrText>
+            </w:r>
+            <w:r>
+              <w:rPr>
+                <w:noProof/>
+                <w:webHidden/>
+              </w:rPr>
+            </w:r>
+            <w:r>
+              <w:rPr>
+                <w:noProof/>
+                <w:webHidden/>
+              </w:rPr>
+              <w:fldChar w:fldCharType="separate"/>
+            </w:r>
+            <w:r>
+              <w:rPr>
+                <w:noProof/>
+                <w:webHidden/>
+              </w:rPr>
+              <w:t>13</w:t>
+            </w:r>
+            <w:r>
+              <w:rPr>
+                <w:noProof/>
+                <w:webHidden/>
+              </w:rPr>
+              <w:fldChar w:fldCharType="end"/>
+            </w:r>
+          </w:hyperlink>
+        </w:p>
+        <w:p>
+          <w:pPr>
+            <w:pStyle w:val="TOC3"/>
+            <w:tabs>
+              <w:tab w:val="right" w:leader="dot" w:pos="9350"/>
+            </w:tabs>
+            <w:rPr>
+              <w:noProof/>
+              <w:sz w:val="22"/>
+              <w:szCs w:val="22"/>
+              <w:lang w:val="en-GB" w:eastAsia="en-GB"/>
+            </w:rPr>
+          </w:pPr>
+          <w:hyperlink w:anchor="_Toc206448604" w:history="1">
+            <w:r>
+              <w:rPr>
+                <w:rStyle w:val="Hyperlink"/>
+                <w:noProof/>
+              </w:rPr>
+              <w:t>2.5 Full pipeline</w:t>
+            </w:r>
+            <w:r>
+              <w:rPr>
+                <w:noProof/>
+                <w:webHidden/>
+              </w:rPr>
+              <w:tab/>
+            </w:r>
+            <w:r>
+              <w:rPr>
+                <w:noProof/>
+                <w:webHidden/>
+              </w:rPr>
+              <w:fldChar w:fldCharType="begin"/>
+            </w:r>
+            <w:r>
+              <w:rPr>
+                <w:noProof/>
+                <w:webHidden/>
+              </w:rPr>
+              <w:instrText xml:space="preserve"> PAGEREF _Toc206448604 \h </w:instrText>
+            </w:r>
+            <w:r>
+              <w:rPr>
+                <w:noProof/>
+                <w:webHidden/>
+              </w:rPr>
+            </w:r>
+            <w:r>
+              <w:rPr>
+                <w:noProof/>
+                <w:webHidden/>
+              </w:rPr>
+              <w:fldChar w:fldCharType="separate"/>
+            </w:r>
+            <w:r>
+              <w:rPr>
+                <w:noProof/>
+                <w:webHidden/>
+              </w:rPr>
+              <w:t>14</w:t>
             </w:r>
             <w:r>
               <w:rPr>
@@ -998,7 +1499,7 @@
               <w:lang w:val="en-GB" w:eastAsia="en-GB"/>
             </w:rPr>
           </w:pPr>
-          <w:hyperlink w:anchor="_Toc206280103" w:history="1">
+          <w:hyperlink w:anchor="_Toc206448605" w:history="1">
             <w:r>
               <w:rPr>
                 <w:rStyle w:val="Hyperlink"/>
@@ -1025,7 +1526,7 @@
                 <w:noProof/>
                 <w:webHidden/>
               </w:rPr>
-              <w:instrText xml:space="preserve"> PAGEREF _Toc206280103 \h </w:instrText>
+              <w:instrText xml:space="preserve"> PAGEREF _Toc206448605 \h </w:instrText>
             </w:r>
             <w:r>
               <w:rPr>
@@ -1045,7 +1546,78 @@
                 <w:noProof/>
                 <w:webHidden/>
               </w:rPr>
-              <w:t>8</w:t>
+              <w:t>14</w:t>
+            </w:r>
+            <w:r>
+              <w:rPr>
+                <w:noProof/>
+                <w:webHidden/>
+              </w:rPr>
+              <w:fldChar w:fldCharType="end"/>
+            </w:r>
+          </w:hyperlink>
+        </w:p>
+        <w:p>
+          <w:pPr>
+            <w:pStyle w:val="TOC3"/>
+            <w:tabs>
+              <w:tab w:val="right" w:leader="dot" w:pos="9350"/>
+            </w:tabs>
+            <w:rPr>
+              <w:noProof/>
+              <w:sz w:val="22"/>
+              <w:szCs w:val="22"/>
+              <w:lang w:val="en-GB" w:eastAsia="en-GB"/>
+            </w:rPr>
+          </w:pPr>
+          <w:hyperlink w:anchor="_Toc206448606" w:history="1">
+            <w:r>
+              <w:rPr>
+                <w:rStyle w:val="Hyperlink"/>
+                <w:noProof/>
+              </w:rPr>
+              <w:t>4. Ambient occlusion</w:t>
+            </w:r>
+            <w:r>
+              <w:rPr>
+                <w:noProof/>
+                <w:webHidden/>
+              </w:rPr>
+              <w:tab/>
+            </w:r>
+            <w:r>
+              <w:rPr>
+                <w:noProof/>
+                <w:webHidden/>
+              </w:rPr>
+              <w:fldChar w:fldCharType="begin"/>
+            </w:r>
+            <w:r>
+              <w:rPr>
+                <w:noProof/>
+                <w:webHidden/>
+              </w:rPr>
+              <w:instrText xml:space="preserve"> PAGEREF _Toc206448606 \h </w:instrText>
+            </w:r>
+            <w:r>
+              <w:rPr>
+                <w:noProof/>
+                <w:webHidden/>
+              </w:rPr>
+            </w:r>
+            <w:r>
+              <w:rPr>
+                <w:noProof/>
+                <w:webHidden/>
+              </w:rPr>
+              <w:fldChar w:fldCharType="separate"/>
+            </w:r>
+            <w:r>
+              <w:rPr>
+                <w:noProof/>
+                <w:webHidden/>
+              </w:rPr>
+              <w:t>15</w:t>
             </w:r>
             <w:r>
               <w:rPr>
@@ -1069,13 +1641,13 @@
               <w:lang w:val="en-GB" w:eastAsia="en-GB"/>
             </w:rPr>
           </w:pPr>
-          <w:hyperlink w:anchor="_Toc206280104" w:history="1">
+          <w:hyperlink w:anchor="_Toc206448607" w:history="1">
             <w:r>
               <w:rPr>
                 <w:rStyle w:val="Hyperlink"/>
                 <w:noProof/>
               </w:rPr>
-              <w:t>4. Ambient occlusion</w:t>
+              <w:t>5. Screen space ambient occlusion</w:t>
             </w:r>
             <w:r>
               <w:rPr>
@@ -1096,7 +1668,7 @@
                 <w:noProof/>
                 <w:webHidden/>
               </w:rPr>
-              <w:instrText xml:space="preserve"> PAGEREF _Toc206280104 \h </w:instrText>
+              <w:instrText xml:space="preserve"> PAGEREF _Toc206448607 \h </w:instrText>
             </w:r>
             <w:r>
               <w:rPr>
@@ -1116,78 +1688,7 @@
                 <w:noProof/>
                 <w:webHidden/>
               </w:rPr>
-              <w:t>10</w:t>
-            </w:r>
-            <w:r>
-              <w:rPr>
-                <w:noProof/>
-                <w:webHidden/>
-              </w:rPr>
-              <w:fldChar w:fldCharType="end"/>
-            </w:r>
-          </w:hyperlink>
-        </w:p>
-        <w:p>
-          <w:pPr>
-            <w:pStyle w:val="TOC2"/>
-            <w:tabs>
-              <w:tab w:val="right" w:leader="dot" w:pos="9350"/>
-            </w:tabs>
-            <w:rPr>
-              <w:noProof/>
-              <w:sz w:val="22"/>
-              <w:szCs w:val="22"/>
-              <w:lang w:val="en-GB" w:eastAsia="en-GB"/>
-            </w:rPr>
-          </w:pPr>
-          <w:hyperlink w:anchor="_Toc206280105" w:history="1">
-            <w:r>
-              <w:rPr>
-                <w:rStyle w:val="Hyperlink"/>
-                <w:noProof/>
-              </w:rPr>
-              <w:t>5. Screen space ambient occlusion</w:t>
-            </w:r>
-            <w:r>
-              <w:rPr>
-                <w:noProof/>
-                <w:webHidden/>
-              </w:rPr>
-              <w:tab/>
-            </w:r>
-            <w:r>
-              <w:rPr>
-                <w:noProof/>
-                <w:webHidden/>
-              </w:rPr>
-              <w:fldChar w:fldCharType="begin"/>
-            </w:r>
-            <w:r>
-              <w:rPr>
-                <w:noProof/>
-                <w:webHidden/>
-              </w:rPr>
-              <w:instrText xml:space="preserve"> PAGEREF _Toc206280105 \h </w:instrText>
-            </w:r>
-            <w:r>
-              <w:rPr>
-                <w:noProof/>
-                <w:webHidden/>
-              </w:rPr>
-            </w:r>
-            <w:r>
-              <w:rPr>
-                <w:noProof/>
-                <w:webHidden/>
-              </w:rPr>
-              <w:fldChar w:fldCharType="separate"/>
-            </w:r>
-            <w:r>
-              <w:rPr>
-                <w:noProof/>
-                <w:webHidden/>
-              </w:rPr>
-              <w:t>10</w:t>
+              <w:t>16</w:t>
             </w:r>
             <w:r>
               <w:rPr>
@@ -1211,7 +1712,7 @@
               <w:lang w:val="en-GB" w:eastAsia="en-GB"/>
             </w:rPr>
           </w:pPr>
-          <w:hyperlink w:anchor="_Toc206280106" w:history="1">
+          <w:hyperlink w:anchor="_Toc206448608" w:history="1">
             <w:r>
               <w:rPr>
                 <w:rStyle w:val="Hyperlink"/>
@@ -1238,7 +1739,7 @@
                 <w:noProof/>
                 <w:webHidden/>
               </w:rPr>
-              <w:instrText xml:space="preserve"> PAGEREF _Toc206280106 \h </w:instrText>
+              <w:instrText xml:space="preserve"> PAGEREF _Toc206448608 \h </w:instrText>
             </w:r>
             <w:r>
               <w:rPr>
@@ -1258,7 +1759,7 @@
                 <w:noProof/>
                 <w:webHidden/>
               </w:rPr>
-              <w:t>12</w:t>
+              <w:t>17</w:t>
             </w:r>
             <w:r>
               <w:rPr>
@@ -1282,7 +1783,7 @@
               <w:lang w:val="en-GB" w:eastAsia="en-GB"/>
             </w:rPr>
           </w:pPr>
-          <w:hyperlink w:anchor="_Toc206280107" w:history="1">
+          <w:hyperlink w:anchor="_Toc206448609" w:history="1">
             <w:r>
               <w:rPr>
                 <w:rStyle w:val="Hyperlink"/>
@@ -1309,7 +1810,7 @@
                 <w:noProof/>
                 <w:webHidden/>
               </w:rPr>
-              <w:instrText xml:space="preserve"> PAGEREF _Toc206280107 \h </w:instrText>
+              <w:instrText xml:space="preserve"> PAGEREF _Toc206448609 \h </w:instrText>
             </w:r>
             <w:r>
               <w:rPr>
@@ -1329,7 +1830,7 @@
                 <w:noProof/>
                 <w:webHidden/>
               </w:rPr>
-              <w:t>12</w:t>
+              <w:t>19</w:t>
             </w:r>
             <w:r>
               <w:rPr>
@@ -1353,7 +1854,7 @@
               <w:lang w:val="en-GB" w:eastAsia="en-GB"/>
             </w:rPr>
           </w:pPr>
-          <w:hyperlink w:anchor="_Toc206280108" w:history="1">
+          <w:hyperlink w:anchor="_Toc206448610" w:history="1">
             <w:r>
               <w:rPr>
                 <w:rStyle w:val="Hyperlink"/>
@@ -1380,7 +1881,7 @@
                 <w:noProof/>
                 <w:webHidden/>
               </w:rPr>
-              <w:instrText xml:space="preserve"> PAGEREF _Toc206280108 \h </w:instrText>
+              <w:instrText xml:space="preserve"> PAGEREF _Toc206448610 \h </w:instrText>
             </w:r>
             <w:r>
               <w:rPr>
@@ -1400,7 +1901,7 @@
                 <w:noProof/>
                 <w:webHidden/>
               </w:rPr>
-              <w:t>16</w:t>
+              <w:t>22</w:t>
             </w:r>
             <w:r>
               <w:rPr>
@@ -1424,7 +1925,7 @@
               <w:lang w:val="en-GB" w:eastAsia="en-GB"/>
             </w:rPr>
           </w:pPr>
-          <w:hyperlink w:anchor="_Toc206280109" w:history="1">
+          <w:hyperlink w:anchor="_Toc206448611" w:history="1">
             <w:r>
               <w:rPr>
                 <w:rStyle w:val="Hyperlink"/>
@@ -1451,7 +1952,7 @@
                 <w:noProof/>
                 <w:webHidden/>
               </w:rPr>
-              <w:instrText xml:space="preserve"> PAGEREF _Toc206280109 \h </w:instrText>
+              <w:instrText xml:space="preserve"> PAGEREF _Toc206448611 \h </w:instrText>
             </w:r>
             <w:r>
               <w:rPr>
@@ -1471,7 +1972,7 @@
                 <w:noProof/>
                 <w:webHidden/>
               </w:rPr>
-              <w:t>17</w:t>
+              <w:t>23</w:t>
             </w:r>
             <w:r>
               <w:rPr>
@@ -1496,7 +1997,7 @@
               <w:lang w:val="en-GB" w:eastAsia="en-GB"/>
             </w:rPr>
           </w:pPr>
-          <w:hyperlink w:anchor="_Toc206280110" w:history="1">
+          <w:hyperlink w:anchor="_Toc206448612" w:history="1">
             <w:r>
               <w:rPr>
                 <w:rStyle w:val="Hyperlink"/>
@@ -1518,7 +2019,7 @@
                 <w:rStyle w:val="Hyperlink"/>
                 <w:noProof/>
               </w:rPr>
-              <w:t>Implementing the different techniques</w:t>
+              <w:t>Implementing the different techniques.</w:t>
             </w:r>
             <w:r>
               <w:rPr>
@@ -1539,7 +2040,7 @@
                 <w:noProof/>
                 <w:webHidden/>
               </w:rPr>
-              <w:instrText xml:space="preserve"> PAGEREF _Toc206280110 \h </w:instrText>
+              <w:instrText xml:space="preserve"> PAGEREF _Toc206448612 \h </w:instrText>
             </w:r>
             <w:r>
               <w:rPr>
@@ -1559,7 +2060,7 @@
                 <w:noProof/>
                 <w:webHidden/>
               </w:rPr>
-              <w:t>17</w:t>
+              <w:t>23</w:t>
             </w:r>
             <w:r>
               <w:rPr>
@@ -1584,7 +2085,7 @@
               <w:lang w:val="en-GB" w:eastAsia="en-GB"/>
             </w:rPr>
           </w:pPr>
-          <w:hyperlink w:anchor="_Toc206280111" w:history="1">
+          <w:hyperlink w:anchor="_Toc206448613" w:history="1">
             <w:r>
               <w:rPr>
                 <w:rStyle w:val="Hyperlink"/>
@@ -1627,7 +2128,7 @@
                 <w:noProof/>
                 <w:webHidden/>
               </w:rPr>
-              <w:instrText xml:space="preserve"> PAGEREF _Toc206280111 \h </w:instrText>
+              <w:instrText xml:space="preserve"> PAGEREF _Toc206448613 \h </w:instrText>
             </w:r>
             <w:r>
               <w:rPr>
@@ -1647,7 +2148,7 @@
                 <w:noProof/>
                 <w:webHidden/>
               </w:rPr>
-              <w:t>17</w:t>
+              <w:t>23</w:t>
             </w:r>
             <w:r>
               <w:rPr>
@@ -1672,7 +2173,7 @@
               <w:lang w:val="en-GB" w:eastAsia="en-GB"/>
             </w:rPr>
           </w:pPr>
-          <w:hyperlink w:anchor="_Toc206280112" w:history="1">
+          <w:hyperlink w:anchor="_Toc206448614" w:history="1">
             <w:r>
               <w:rPr>
                 <w:rStyle w:val="Hyperlink"/>
@@ -1715,7 +2216,7 @@
                 <w:noProof/>
                 <w:webHidden/>
               </w:rPr>
-              <w:instrText xml:space="preserve"> PAGEREF _Toc206280112 \h </w:instrText>
+              <w:instrText xml:space="preserve"> PAGEREF _Toc206448614 \h </w:instrText>
             </w:r>
             <w:r>
               <w:rPr>
@@ -1735,7 +2236,7 @@
                 <w:noProof/>
                 <w:webHidden/>
               </w:rPr>
-              <w:t>17</w:t>
+              <w:t>24</w:t>
             </w:r>
             <w:r>
               <w:rPr>
@@ -1759,7 +2260,7 @@
               <w:lang w:val="en-GB" w:eastAsia="en-GB"/>
             </w:rPr>
           </w:pPr>
-          <w:hyperlink w:anchor="_Toc206280113" w:history="1">
+          <w:hyperlink w:anchor="_Toc206448615" w:history="1">
             <w:r>
               <w:rPr>
                 <w:rStyle w:val="Hyperlink"/>
@@ -1786,7 +2287,7 @@
                 <w:noProof/>
                 <w:webHidden/>
               </w:rPr>
-              <w:instrText xml:space="preserve"> PAGEREF _Toc206280113 \h </w:instrText>
+              <w:instrText xml:space="preserve"> PAGEREF _Toc206448615 \h </w:instrText>
             </w:r>
             <w:r>
               <w:rPr>
@@ -1806,7 +2307,7 @@
                 <w:noProof/>
                 <w:webHidden/>
               </w:rPr>
-              <w:t>17</w:t>
+              <w:t>24</w:t>
             </w:r>
             <w:r>
               <w:rPr>
@@ -1831,7 +2332,7 @@
               <w:lang w:val="en-GB" w:eastAsia="en-GB"/>
             </w:rPr>
           </w:pPr>
-          <w:hyperlink w:anchor="_Toc206280114" w:history="1">
+          <w:hyperlink w:anchor="_Toc206448616" w:history="1">
             <w:r>
               <w:rPr>
                 <w:rStyle w:val="Hyperlink"/>
@@ -1874,7 +2375,7 @@
                 <w:noProof/>
                 <w:webHidden/>
               </w:rPr>
-              <w:instrText xml:space="preserve"> PAGEREF _Toc206280114 \h </w:instrText>
+              <w:instrText xml:space="preserve"> PAGEREF _Toc206448616 \h </w:instrText>
             </w:r>
             <w:r>
               <w:rPr>
@@ -1894,7 +2395,7 @@
                 <w:noProof/>
                 <w:webHidden/>
               </w:rPr>
-              <w:t>17</w:t>
+              <w:t>24</w:t>
             </w:r>
             <w:r>
               <w:rPr>
@@ -1918,7 +2419,7 @@
               <w:lang w:val="en-GB" w:eastAsia="en-GB"/>
             </w:rPr>
           </w:pPr>
-          <w:hyperlink w:anchor="_Toc206280115" w:history="1">
+          <w:hyperlink w:anchor="_Toc206448617" w:history="1">
             <w:r>
               <w:rPr>
                 <w:rStyle w:val="Hyperlink"/>
@@ -1945,7 +2446,7 @@
                 <w:noProof/>
                 <w:webHidden/>
               </w:rPr>
-              <w:instrText xml:space="preserve"> PAGEREF _Toc206280115 \h </w:instrText>
+              <w:instrText xml:space="preserve"> PAGEREF _Toc206448617 \h </w:instrText>
             </w:r>
             <w:r>
               <w:rPr>
@@ -1965,7 +2466,7 @@
                 <w:noProof/>
                 <w:webHidden/>
               </w:rPr>
-              <w:t>17</w:t>
+              <w:t>24</w:t>
             </w:r>
             <w:r>
               <w:rPr>
@@ -1989,7 +2490,7 @@
               <w:lang w:val="en-GB" w:eastAsia="en-GB"/>
             </w:rPr>
           </w:pPr>
-          <w:hyperlink w:anchor="_Toc206280116" w:history="1">
+          <w:hyperlink w:anchor="_Toc206448618" w:history="1">
             <w:r>
               <w:rPr>
                 <w:rStyle w:val="Hyperlink"/>
@@ -2016,7 +2517,7 @@
                 <w:noProof/>
                 <w:webHidden/>
               </w:rPr>
-              <w:instrText xml:space="preserve"> PAGEREF _Toc206280116 \h </w:instrText>
+              <w:instrText xml:space="preserve"> PAGEREF _Toc206448618 \h </w:instrText>
             </w:r>
             <w:r>
               <w:rPr>
@@ -2036,7 +2537,7 @@
                 <w:noProof/>
                 <w:webHidden/>
               </w:rPr>
-              <w:t>17</w:t>
+              <w:t>25</w:t>
             </w:r>
             <w:r>
               <w:rPr>
@@ -2060,7 +2561,7 @@
               <w:lang w:val="en-GB" w:eastAsia="en-GB"/>
             </w:rPr>
           </w:pPr>
-          <w:hyperlink w:anchor="_Toc206280117" w:history="1">
+          <w:hyperlink w:anchor="_Toc206448619" w:history="1">
             <w:r>
               <w:rPr>
                 <w:rStyle w:val="Hyperlink"/>
@@ -2087,7 +2588,7 @@
                 <w:noProof/>
                 <w:webHidden/>
               </w:rPr>
-              <w:instrText xml:space="preserve"> PAGEREF _Toc206280117 \h </w:instrText>
+              <w:instrText xml:space="preserve"> PAGEREF _Toc206448619 \h </w:instrText>
             </w:r>
             <w:r>
               <w:rPr>
@@ -2107,7 +2608,7 @@
                 <w:noProof/>
                 <w:webHidden/>
               </w:rPr>
-              <w:t>18</w:t>
+              <w:t>26</w:t>
             </w:r>
             <w:r>
               <w:rPr>
@@ -2131,7 +2632,7 @@
               <w:lang w:val="en-GB" w:eastAsia="en-GB"/>
             </w:rPr>
           </w:pPr>
-          <w:hyperlink w:anchor="_Toc206280118" w:history="1">
+          <w:hyperlink w:anchor="_Toc206448620" w:history="1">
             <w:r>
               <w:rPr>
                 <w:rStyle w:val="Hyperlink"/>
@@ -2158,7 +2659,7 @@
                 <w:noProof/>
                 <w:webHidden/>
               </w:rPr>
-              <w:instrText xml:space="preserve"> PAGEREF _Toc206280118 \h </w:instrText>
+              <w:instrText xml:space="preserve"> PAGEREF _Toc206448620 \h </w:instrText>
             </w:r>
             <w:r>
               <w:rPr>
@@ -2178,7 +2679,7 @@
                 <w:noProof/>
                 <w:webHidden/>
               </w:rPr>
-              <w:t>18</w:t>
+              <w:t>26</w:t>
             </w:r>
             <w:r>
               <w:rPr>
@@ -2203,7 +2704,7 @@
               <w:lang w:val="en-GB" w:eastAsia="en-GB"/>
             </w:rPr>
           </w:pPr>
-          <w:hyperlink w:anchor="_Toc206280119" w:history="1">
+          <w:hyperlink w:anchor="_Toc206448621" w:history="1">
             <w:r>
               <w:rPr>
                 <w:rStyle w:val="Hyperlink"/>
@@ -2246,7 +2747,7 @@
                 <w:noProof/>
                 <w:webHidden/>
               </w:rPr>
-              <w:instrText xml:space="preserve"> PAGEREF _Toc206280119 \h </w:instrText>
+              <w:instrText xml:space="preserve"> PAGEREF _Toc206448621 \h </w:instrText>
             </w:r>
             <w:r>
               <w:rPr>
@@ -2266,7 +2767,7 @@
                 <w:noProof/>
                 <w:webHidden/>
               </w:rPr>
-              <w:t>18</w:t>
+              <w:t>27</w:t>
             </w:r>
             <w:r>
               <w:rPr>
@@ -2290,7 +2791,7 @@
               <w:lang w:val="en-GB" w:eastAsia="en-GB"/>
             </w:rPr>
           </w:pPr>
-          <w:hyperlink w:anchor="_Toc206280120" w:history="1">
+          <w:hyperlink w:anchor="_Toc206448622" w:history="1">
             <w:r>
               <w:rPr>
                 <w:rStyle w:val="Hyperlink"/>
@@ -2317,7 +2818,7 @@
                 <w:noProof/>
                 <w:webHidden/>
               </w:rPr>
-              <w:instrText xml:space="preserve"> PAGEREF _Toc206280120 \h </w:instrText>
+              <w:instrText xml:space="preserve"> PAGEREF _Toc206448622 \h </w:instrText>
             </w:r>
             <w:r>
               <w:rPr>
@@ -2337,7 +2838,7 @@
                 <w:noProof/>
                 <w:webHidden/>
               </w:rPr>
-              <w:t>18</w:t>
+              <w:t>27</w:t>
             </w:r>
             <w:r>
               <w:rPr>
@@ -2361,7 +2862,7 @@
               <w:lang w:val="en-GB" w:eastAsia="en-GB"/>
             </w:rPr>
           </w:pPr>
-          <w:hyperlink w:anchor="_Toc206280121" w:history="1">
+          <w:hyperlink w:anchor="_Toc206448623" w:history="1">
             <w:r>
               <w:rPr>
                 <w:rStyle w:val="Hyperlink"/>
@@ -2389,7 +2890,7 @@
                 <w:noProof/>
                 <w:webHidden/>
               </w:rPr>
-              <w:instrText xml:space="preserve"> PAGEREF _Toc206280121 \h </w:instrText>
+              <w:instrText xml:space="preserve"> PAGEREF _Toc206448623 \h </w:instrText>
             </w:r>
             <w:r>
               <w:rPr>
@@ -2409,7 +2910,7 @@
                 <w:noProof/>
                 <w:webHidden/>
               </w:rPr>
-              <w:t>18</w:t>
+              <w:t>27</w:t>
             </w:r>
             <w:r>
               <w:rPr>
@@ -2433,7 +2934,7 @@
               <w:lang w:val="en-GB" w:eastAsia="en-GB"/>
             </w:rPr>
           </w:pPr>
-          <w:hyperlink w:anchor="_Toc206280122" w:history="1">
+          <w:hyperlink w:anchor="_Toc206448624" w:history="1">
             <w:r>
               <w:rPr>
                 <w:rStyle w:val="Hyperlink"/>
@@ -2461,7 +2962,7 @@
                 <w:noProof/>
                 <w:webHidden/>
               </w:rPr>
-              <w:instrText xml:space="preserve"> PAGEREF _Toc206280122 \h </w:instrText>
+              <w:instrText xml:space="preserve"> PAGEREF _Toc206448624 \h </w:instrText>
             </w:r>
             <w:r>
               <w:rPr>
@@ -2481,7 +2982,7 @@
                 <w:noProof/>
                 <w:webHidden/>
               </w:rPr>
-              <w:t>18</w:t>
+              <w:t>28</w:t>
             </w:r>
             <w:r>
               <w:rPr>
@@ -2505,7 +3006,7 @@
               <w:lang w:val="en-GB" w:eastAsia="en-GB"/>
             </w:rPr>
           </w:pPr>
-          <w:hyperlink w:anchor="_Toc206280123" w:history="1">
+          <w:hyperlink w:anchor="_Toc206448625" w:history="1">
             <w:r>
               <w:rPr>
                 <w:rStyle w:val="Hyperlink"/>
@@ -2533,7 +3034,7 @@
                 <w:noProof/>
                 <w:webHidden/>
               </w:rPr>
-              <w:instrText xml:space="preserve"> PAGEREF _Toc206280123 \h </w:instrText>
+              <w:instrText xml:space="preserve"> PAGEREF _Toc206448625 \h </w:instrText>
             </w:r>
             <w:r>
               <w:rPr>
@@ -2553,7 +3054,7 @@
                 <w:noProof/>
                 <w:webHidden/>
               </w:rPr>
-              <w:t>18</w:t>
+              <w:t>28</w:t>
             </w:r>
             <w:r>
               <w:rPr>
@@ -2577,7 +3078,7 @@
               <w:lang w:val="en-GB" w:eastAsia="en-GB"/>
             </w:rPr>
           </w:pPr>
-          <w:hyperlink w:anchor="_Toc206280124" w:history="1">
+          <w:hyperlink w:anchor="_Toc206448626" w:history="1">
             <w:r>
               <w:rPr>
                 <w:rStyle w:val="Hyperlink"/>
@@ -2604,7 +3105,7 @@
                 <w:noProof/>
                 <w:webHidden/>
               </w:rPr>
-              <w:instrText xml:space="preserve"> PAGEREF _Toc206280124 \h </w:instrText>
+              <w:instrText xml:space="preserve"> PAGEREF _Toc206448626 \h </w:instrText>
             </w:r>
             <w:r>
               <w:rPr>
@@ -2624,7 +3125,7 @@
                 <w:noProof/>
                 <w:webHidden/>
               </w:rPr>
-              <w:t>19</w:t>
+              <w:t>29</w:t>
             </w:r>
             <w:r>
               <w:rPr>
@@ -2648,7 +3149,7 @@
               <w:lang w:val="en-GB" w:eastAsia="en-GB"/>
             </w:rPr>
           </w:pPr>
-          <w:hyperlink w:anchor="_Toc206280125" w:history="1">
+          <w:hyperlink w:anchor="_Toc206448627" w:history="1">
             <w:r>
               <w:rPr>
                 <w:rStyle w:val="Hyperlink"/>
@@ -2675,7 +3176,7 @@
                 <w:noProof/>
                 <w:webHidden/>
               </w:rPr>
-              <w:instrText xml:space="preserve"> PAGEREF _Toc206280125 \h </w:instrText>
+              <w:instrText xml:space="preserve"> PAGEREF _Toc206448627 \h </w:instrText>
             </w:r>
             <w:r>
               <w:rPr>
@@ -2695,7 +3196,7 @@
                 <w:noProof/>
                 <w:webHidden/>
               </w:rPr>
-              <w:t>20</w:t>
+              <w:t>30</w:t>
             </w:r>
             <w:r>
               <w:rPr>
@@ -2719,7 +3220,7 @@
               <w:lang w:val="en-GB" w:eastAsia="en-GB"/>
             </w:rPr>
           </w:pPr>
-          <w:hyperlink w:anchor="_Toc206280126" w:history="1">
+          <w:hyperlink w:anchor="_Toc206448628" w:history="1">
             <w:r>
               <w:rPr>
                 <w:rStyle w:val="Hyperlink"/>
@@ -2746,7 +3247,7 @@
                 <w:noProof/>
                 <w:webHidden/>
               </w:rPr>
-              <w:instrText xml:space="preserve"> PAGEREF _Toc206280126 \h </w:instrText>
+              <w:instrText xml:space="preserve"> PAGEREF _Toc206448628 \h </w:instrText>
             </w:r>
             <w:r>
               <w:rPr>
@@ -2766,7 +3267,7 @@
                 <w:noProof/>
                 <w:webHidden/>
               </w:rPr>
-              <w:t>21</w:t>
+              <w:t>31</w:t>
             </w:r>
             <w:r>
               <w:rPr>
@@ -2790,7 +3291,7 @@
               <w:lang w:val="en-GB" w:eastAsia="en-GB"/>
             </w:rPr>
           </w:pPr>
-          <w:hyperlink w:anchor="_Toc206280127" w:history="1">
+          <w:hyperlink w:anchor="_Toc206448629" w:history="1">
             <w:r>
               <w:rPr>
                 <w:rStyle w:val="Hyperlink"/>
@@ -2817,7 +3318,7 @@
                 <w:noProof/>
                 <w:webHidden/>
               </w:rPr>
-              <w:instrText xml:space="preserve"> PAGEREF _Toc206280127 \h </w:instrText>
+              <w:instrText xml:space="preserve"> PAGEREF _Toc206448629 \h </w:instrText>
             </w:r>
             <w:r>
               <w:rPr>
@@ -2837,7 +3338,7 @@
                 <w:noProof/>
                 <w:webHidden/>
               </w:rPr>
-              <w:t>22</w:t>
+              <w:t>32</w:t>
             </w:r>
             <w:r>
               <w:rPr>
@@ -2861,7 +3362,7 @@
               <w:lang w:val="en-GB" w:eastAsia="en-GB"/>
             </w:rPr>
           </w:pPr>
-          <w:hyperlink w:anchor="_Toc206280128" w:history="1">
+          <w:hyperlink w:anchor="_Toc206448630" w:history="1">
             <w:r>
               <w:rPr>
                 <w:rStyle w:val="Hyperlink"/>
@@ -2888,7 +3389,7 @@
                 <w:noProof/>
                 <w:webHidden/>
               </w:rPr>
-              <w:instrText xml:space="preserve"> PAGEREF _Toc206280128 \h </w:instrText>
+              <w:instrText xml:space="preserve"> PAGEREF _Toc206448630 \h </w:instrText>
             </w:r>
             <w:r>
               <w:rPr>
@@ -2908,7 +3409,7 @@
                 <w:noProof/>
                 <w:webHidden/>
               </w:rPr>
-              <w:t>23</w:t>
+              <w:t>33</w:t>
             </w:r>
             <w:r>
               <w:rPr>
@@ -2932,7 +3433,7 @@
               <w:lang w:val="en-GB" w:eastAsia="en-GB"/>
             </w:rPr>
           </w:pPr>
-          <w:hyperlink w:anchor="_Toc206280129" w:history="1">
+          <w:hyperlink w:anchor="_Toc206448631" w:history="1">
             <w:r>
               <w:rPr>
                 <w:rStyle w:val="Hyperlink"/>
@@ -2959,7 +3460,7 @@
                 <w:noProof/>
                 <w:webHidden/>
               </w:rPr>
-              <w:instrText xml:space="preserve"> PAGEREF _Toc206280129 \h </w:instrText>
+              <w:instrText xml:space="preserve"> PAGEREF _Toc206448631 \h </w:instrText>
             </w:r>
             <w:r>
               <w:rPr>
@@ -2979,7 +3480,7 @@
                 <w:noProof/>
                 <w:webHidden/>
               </w:rPr>
-              <w:t>25</w:t>
+              <w:t>36</w:t>
             </w:r>
             <w:r>
               <w:rPr>
@@ -3003,7 +3504,7 @@
               <w:lang w:val="en-GB" w:eastAsia="en-GB"/>
             </w:rPr>
           </w:pPr>
-          <w:hyperlink w:anchor="_Toc206280130" w:history="1">
+          <w:hyperlink w:anchor="_Toc206448632" w:history="1">
             <w:r>
               <w:rPr>
                 <w:rStyle w:val="Hyperlink"/>
@@ -3030,7 +3531,7 @@
                 <w:noProof/>
                 <w:webHidden/>
               </w:rPr>
-              <w:instrText xml:space="preserve"> PAGEREF _Toc206280130 \h </w:instrText>
+              <w:instrText xml:space="preserve"> PAGEREF _Toc206448632 \h </w:instrText>
             </w:r>
             <w:r>
               <w:rPr>
@@ -3050,7 +3551,7 @@
                 <w:noProof/>
                 <w:webHidden/>
               </w:rPr>
-              <w:t>26</w:t>
+              <w:t>37</w:t>
             </w:r>
             <w:r>
               <w:rPr>
@@ -3095,7 +3596,7 @@
       <w:pPr>
         <w:pStyle w:val="Heading1"/>
       </w:pPr>
-      <w:bookmarkStart w:id="0" w:name="_Toc206280094"/>
+      <w:bookmarkStart w:id="0" w:name="_Toc206448589"/>
       <w:r>
         <w:lastRenderedPageBreak/>
         <w:t>Abstract</w:t>
@@ -3395,7 +3896,7 @@
       <w:pPr>
         <w:pStyle w:val="Heading1"/>
       </w:pPr>
-      <w:bookmarkStart w:id="1" w:name="_Toc206280095"/>
+      <w:bookmarkStart w:id="1" w:name="_Toc206448590"/>
       <w:r>
         <w:lastRenderedPageBreak/>
         <w:t>Preface</w:t>
@@ -3540,7 +4041,7 @@
       <w:pPr>
         <w:pStyle w:val="Heading1"/>
       </w:pPr>
-      <w:bookmarkStart w:id="2" w:name="_Toc206280096"/>
+      <w:bookmarkStart w:id="2" w:name="_Toc206448591"/>
       <w:r>
         <w:lastRenderedPageBreak/>
         <w:t>List of Figures</w:t>
@@ -3549,8 +4050,312 @@
     </w:p>
     <w:p>
       <w:pPr>
+        <w:pStyle w:val="TableofFigures"/>
+        <w:tabs>
+          <w:tab w:val="right" w:leader="dot" w:pos="9350"/>
+        </w:tabs>
+      </w:pPr>
+    </w:p>
+    <w:p>
+      <w:pPr>
+        <w:pStyle w:val="TableofFigures"/>
+        <w:tabs>
+          <w:tab w:val="right" w:leader="dot" w:pos="9350"/>
+        </w:tabs>
+        <w:rPr>
+          <w:noProof/>
+          <w:sz w:val="22"/>
+          <w:szCs w:val="22"/>
+          <w:lang w:val="en-GB" w:eastAsia="en-GB"/>
+        </w:rPr>
+      </w:pPr>
+      <w:r>
+        <w:fldChar w:fldCharType="begin"/>
+      </w:r>
+      <w:r>
+        <w:instrText xml:space="preserve"> TOC \h \z \c "Figure" </w:instrText>
+      </w:r>
+      <w:r>
+        <w:fldChar w:fldCharType="separate"/>
+      </w:r>
+      <w:hyperlink r:id="rId13" w:anchor="_Toc206448894" w:history="1">
+        <w:r>
+          <w:rPr>
+            <w:rStyle w:val="Hyperlink"/>
+            <w:noProof/>
+          </w:rPr>
+          <w:t>Figure 1: Shader stages</w:t>
+        </w:r>
+        <w:r>
+          <w:rPr>
+            <w:noProof/>
+            <w:webHidden/>
+          </w:rPr>
+          <w:tab/>
+        </w:r>
+        <w:r>
+          <w:rPr>
+            <w:noProof/>
+            <w:webHidden/>
+          </w:rPr>
+          <w:fldChar w:fldCharType="begin"/>
+        </w:r>
+        <w:r>
+          <w:rPr>
+            <w:noProof/>
+            <w:webHidden/>
+          </w:rPr>
+          <w:instrText xml:space="preserve"> PAGEREF _Toc206448894 \h </w:instrText>
+        </w:r>
+        <w:r>
+          <w:rPr>
+            <w:noProof/>
+            <w:webHidden/>
+          </w:rPr>
+        </w:r>
+        <w:r>
+          <w:rPr>
+            <w:noProof/>
+            <w:webHidden/>
+          </w:rPr>
+          <w:fldChar w:fldCharType="separate"/>
+        </w:r>
+        <w:r>
+          <w:rPr>
+            <w:noProof/>
+            <w:webHidden/>
+          </w:rPr>
+          <w:t>10</w:t>
+        </w:r>
+        <w:r>
+          <w:rPr>
+            <w:noProof/>
+            <w:webHidden/>
+          </w:rPr>
+          <w:fldChar w:fldCharType="end"/>
+        </w:r>
+      </w:hyperlink>
+    </w:p>
+    <w:p>
+      <w:pPr>
+        <w:pStyle w:val="TableofFigures"/>
+        <w:tabs>
+          <w:tab w:val="right" w:leader="dot" w:pos="9350"/>
+        </w:tabs>
+        <w:rPr>
+          <w:noProof/>
+          <w:sz w:val="22"/>
+          <w:szCs w:val="22"/>
+          <w:lang w:val="en-GB" w:eastAsia="en-GB"/>
+        </w:rPr>
+      </w:pPr>
+      <w:hyperlink r:id="rId14" w:anchor="_Toc206448895" w:history="1">
+        <w:r>
+          <w:rPr>
+            <w:rStyle w:val="Hyperlink"/>
+            <w:noProof/>
+          </w:rPr>
+          <w:t>Figure 2: Rasterization versus ray tracing</w:t>
+        </w:r>
+        <w:r>
+          <w:rPr>
+            <w:noProof/>
+            <w:webHidden/>
+          </w:rPr>
+          <w:tab/>
+        </w:r>
+        <w:r>
+          <w:rPr>
+            <w:noProof/>
+            <w:webHidden/>
+          </w:rPr>
+          <w:fldChar w:fldCharType="begin"/>
+        </w:r>
+        <w:r>
+          <w:rPr>
+            <w:noProof/>
+            <w:webHidden/>
+          </w:rPr>
+          <w:instrText xml:space="preserve"> PAGEREF _Toc206448895 \h </w:instrText>
+        </w:r>
+        <w:r>
+          <w:rPr>
+            <w:noProof/>
+            <w:webHidden/>
+          </w:rPr>
+        </w:r>
+        <w:r>
+          <w:rPr>
+            <w:noProof/>
+            <w:webHidden/>
+          </w:rPr>
+          <w:fldChar w:fldCharType="separate"/>
+        </w:r>
+        <w:r>
+          <w:rPr>
+            <w:noProof/>
+            <w:webHidden/>
+          </w:rPr>
+          <w:t>12</w:t>
+        </w:r>
+        <w:r>
+          <w:rPr>
+            <w:noProof/>
+            <w:webHidden/>
+          </w:rPr>
+          <w:fldChar w:fldCharType="end"/>
+        </w:r>
+      </w:hyperlink>
+    </w:p>
+    <w:p>
+      <w:pPr>
+        <w:pStyle w:val="TableofFigures"/>
+        <w:tabs>
+          <w:tab w:val="right" w:leader="dot" w:pos="9350"/>
+        </w:tabs>
+        <w:rPr>
+          <w:noProof/>
+          <w:sz w:val="22"/>
+          <w:szCs w:val="22"/>
+          <w:lang w:val="en-GB" w:eastAsia="en-GB"/>
+        </w:rPr>
+      </w:pPr>
+      <w:hyperlink r:id="rId15" w:anchor="_Toc206448896" w:history="1">
+        <w:r>
+          <w:rPr>
+            <w:rStyle w:val="Hyperlink"/>
+            <w:noProof/>
+          </w:rPr>
+          <w:t>Figure 3: Forward versus deferred rendering</w:t>
+        </w:r>
+        <w:r>
+          <w:rPr>
+            <w:noProof/>
+            <w:webHidden/>
+          </w:rPr>
+          <w:tab/>
+        </w:r>
+        <w:r>
+          <w:rPr>
+            <w:noProof/>
+            <w:webHidden/>
+          </w:rPr>
+          <w:fldChar w:fldCharType="begin"/>
+        </w:r>
+        <w:r>
+          <w:rPr>
+            <w:noProof/>
+            <w:webHidden/>
+          </w:rPr>
+          <w:instrText xml:space="preserve"> PAGEREF _Toc206448896 \h </w:instrText>
+        </w:r>
+        <w:r>
+          <w:rPr>
+            <w:noProof/>
+            <w:webHidden/>
+          </w:rPr>
+        </w:r>
+        <w:r>
+          <w:rPr>
+            <w:noProof/>
+            <w:webHidden/>
+          </w:rPr>
+          <w:fldChar w:fldCharType="separate"/>
+        </w:r>
+        <w:r>
+          <w:rPr>
+            <w:noProof/>
+            <w:webHidden/>
+          </w:rPr>
+          <w:t>13</w:t>
+        </w:r>
+        <w:r>
+          <w:rPr>
+            <w:noProof/>
+            <w:webHidden/>
+          </w:rPr>
+          <w:fldChar w:fldCharType="end"/>
+        </w:r>
+      </w:hyperlink>
+    </w:p>
+    <w:p>
+      <w:pPr>
+        <w:pStyle w:val="TableofFigures"/>
+        <w:tabs>
+          <w:tab w:val="right" w:leader="dot" w:pos="9350"/>
+        </w:tabs>
+        <w:rPr>
+          <w:noProof/>
+          <w:sz w:val="22"/>
+          <w:szCs w:val="22"/>
+          <w:lang w:val="en-GB" w:eastAsia="en-GB"/>
+        </w:rPr>
+      </w:pPr>
+      <w:hyperlink r:id="rId16" w:anchor="_Toc206448897" w:history="1">
+        <w:r>
+          <w:rPr>
+            <w:rStyle w:val="Hyperlink"/>
+            <w:noProof/>
+          </w:rPr>
+          <w:t>Figure 4: Example of a G-buffer</w:t>
+        </w:r>
+        <w:r>
+          <w:rPr>
+            <w:noProof/>
+            <w:webHidden/>
+          </w:rPr>
+          <w:tab/>
+        </w:r>
+        <w:r>
+          <w:rPr>
+            <w:noProof/>
+            <w:webHidden/>
+          </w:rPr>
+          <w:fldChar w:fldCharType="begin"/>
+        </w:r>
+        <w:r>
+          <w:rPr>
+            <w:noProof/>
+            <w:webHidden/>
+          </w:rPr>
+          <w:instrText xml:space="preserve"> PAGEREF _Toc206448897 \h </w:instrText>
+        </w:r>
+        <w:r>
+          <w:rPr>
+            <w:noProof/>
+            <w:webHidden/>
+          </w:rPr>
+        </w:r>
+        <w:r>
+          <w:rPr>
+            <w:noProof/>
+            <w:webHidden/>
+          </w:rPr>
+          <w:fldChar w:fldCharType="separate"/>
+        </w:r>
+        <w:r>
+          <w:rPr>
+            <w:noProof/>
+            <w:webHidden/>
+          </w:rPr>
+          <w:t>13</w:t>
+        </w:r>
+        <w:r>
+          <w:rPr>
+            <w:noProof/>
+            <w:webHidden/>
+          </w:rPr>
+          <w:fldChar w:fldCharType="end"/>
+        </w:r>
+      </w:hyperlink>
+    </w:p>
+    <w:p>
+      <w:pPr>
         <w:spacing w:line="240" w:lineRule="auto"/>
       </w:pPr>
+      <w:r>
+        <w:fldChar w:fldCharType="end"/>
+      </w:r>
     </w:p>
     <w:p>
       <w:pPr>
@@ -3573,7 +4378,7 @@
           <w:color w:val="FFFFFF" w:themeColor="background1"/>
         </w:rPr>
       </w:pPr>
-      <w:bookmarkStart w:id="3" w:name="_Toc206280097"/>
+      <w:bookmarkStart w:id="3" w:name="_Toc206448592"/>
       <w:r>
         <w:lastRenderedPageBreak/>
         <w:t>Introduction</w:t>
@@ -3872,7 +4677,7 @@
       <w:pPr>
         <w:pStyle w:val="Heading1"/>
       </w:pPr>
-      <w:bookmarkStart w:id="4" w:name="_Toc206280098"/>
+      <w:bookmarkStart w:id="4" w:name="_Toc206448593"/>
       <w:r>
         <w:lastRenderedPageBreak/>
         <w:t>Literature Study / Theoretical Framework</w:t>
@@ -3883,7 +4688,7 @@
       <w:pPr>
         <w:pStyle w:val="Heading2"/>
       </w:pPr>
-      <w:bookmarkStart w:id="5" w:name="_Toc206280099"/>
+      <w:bookmarkStart w:id="5" w:name="_Toc206448594"/>
       <w:r>
         <w:rPr>
           <w:caps w:val="0"/>
@@ -3924,7 +4729,7 @@
       <w:pPr>
         <w:pStyle w:val="Heading3"/>
       </w:pPr>
-      <w:bookmarkStart w:id="6" w:name="_Toc206280100"/>
+      <w:bookmarkStart w:id="6" w:name="_Toc206448595"/>
       <w:r>
         <w:t>1.1 Physical</w:t>
       </w:r>
@@ -3945,18 +4750,18 @@
       <w:pPr>
         <w:pStyle w:val="Heading3"/>
       </w:pPr>
-      <w:bookmarkStart w:id="7" w:name="_Toc206280101"/>
+      <w:bookmarkStart w:id="7" w:name="_Toc206448596"/>
       <w:r>
         <w:t xml:space="preserve">1.2 </w:t>
       </w:r>
       <w:r>
         <w:t>Shader stages</w:t>
       </w:r>
+      <w:r>
+        <w:t xml:space="preserve"> [4]</w:t>
+      </w:r>
       <w:bookmarkEnd w:id="7"/>
       <w:r>
-        <w:t xml:space="preserve"> [4]</w:t>
-      </w:r>
-      <w:r>
         <w:rPr>
           <w:lang w:val="en-GB"/>
         </w:rPr>
@@ -3988,6 +4793,229 @@
         <w:t>. Some of these stages are fixed functions that the user can’t change, while others are programmable functions that give the user the freedom to customize. Here is a list of the shader stages in order of execution:</w:t>
       </w:r>
     </w:p>
+    <w:tbl>
+      <w:tblPr>
+        <w:tblStyle w:val="TableGrid"/>
+        <w:tblW w:w="0" w:type="auto"/>
+        <w:tblBorders>
+          <w:top w:val="none" w:sz="0" w:space="0" w:color="auto"/>
+          <w:left w:val="none" w:sz="0" w:space="0" w:color="auto"/>
+          <w:bottom w:val="none" w:sz="0" w:space="0" w:color="auto"/>
+          <w:right w:val="none" w:sz="0" w:space="0" w:color="auto"/>
+          <w:insideH w:val="none" w:sz="0" w:space="0" w:color="auto"/>
+          <w:insideV w:val="none" w:sz="0" w:space="0" w:color="auto"/>
+        </w:tblBorders>
+        <w:tblLook w:val="04A0" w:firstRow="1" w:lastRow="0" w:firstColumn="1" w:lastColumn="0" w:noHBand="0" w:noVBand="1"/>
+      </w:tblPr>
+      <w:tblGrid>
+        <w:gridCol w:w="6516"/>
+        <w:gridCol w:w="2834"/>
+      </w:tblGrid>
+      <w:tr>
+        <w:tc>
+          <w:tcPr>
+            <w:tcW w:w="6516" w:type="dxa"/>
+          </w:tcPr>
+          <w:p>
+            <w:pPr>
+              <w:pStyle w:val="ListParagraph"/>
+              <w:numPr>
+                <w:ilvl w:val="0"/>
+                <w:numId w:val="33"/>
+              </w:numPr>
+              <w:rPr>
+                <w:lang w:val="en-GB"/>
+              </w:rPr>
+            </w:pPr>
+            <w:r>
+              <w:rPr>
+                <w:lang w:val="en-GB"/>
+              </w:rPr>
+              <w:lastRenderedPageBreak/>
+              <w:t xml:space="preserve">Input assembler: A fixed-function stage that collects raw data from the vertex and index buffers. </w:t>
+            </w:r>
+          </w:p>
+          <w:p>
+            <w:pPr>
+              <w:pStyle w:val="ListParagraph"/>
+              <w:numPr>
+                <w:ilvl w:val="0"/>
+                <w:numId w:val="33"/>
+              </w:numPr>
+              <w:rPr>
+                <w:lang w:val="en-GB"/>
+              </w:rPr>
+            </w:pPr>
+            <w:r>
+              <w:rPr>
+                <w:lang w:val="en-GB"/>
+              </w:rPr>
+              <w:t>Vertex shader: This programmable shader stage is executed for every vertex; usually, this is used to transform each vertex from model space to screen space. This is the only mandatory programmable stage.</w:t>
+            </w:r>
+          </w:p>
+          <w:p>
+            <w:pPr>
+              <w:pStyle w:val="ListParagraph"/>
+              <w:numPr>
+                <w:ilvl w:val="0"/>
+                <w:numId w:val="33"/>
+              </w:numPr>
+              <w:rPr>
+                <w:lang w:val="en-GB"/>
+              </w:rPr>
+            </w:pPr>
+            <w:r>
+              <w:rPr>
+                <w:lang w:val="en-GB"/>
+              </w:rPr>
+              <w:t>Tessellation stage: This programmable shader stage allows the user to subdivide the geometry to increase mesh quality.</w:t>
+            </w:r>
+          </w:p>
+          <w:p>
+            <w:pPr>
+              <w:pStyle w:val="ListParagraph"/>
+              <w:numPr>
+                <w:ilvl w:val="0"/>
+                <w:numId w:val="33"/>
+              </w:numPr>
+              <w:rPr>
+                <w:lang w:val="en-GB"/>
+              </w:rPr>
+            </w:pPr>
+            <w:r>
+              <w:rPr>
+                <w:lang w:val="en-GB"/>
+              </w:rPr>
+              <w:t>Geometry shader: This programmable shader stage is executed for every primitive (triangle, line, or point). It can be used to discard primitives or output extra primitives.</w:t>
+            </w:r>
+          </w:p>
+          <w:p>
+            <w:pPr>
+              <w:pStyle w:val="ListParagraph"/>
+              <w:numPr>
+                <w:ilvl w:val="0"/>
+                <w:numId w:val="33"/>
+              </w:numPr>
+              <w:rPr>
+                <w:lang w:val="en-GB"/>
+              </w:rPr>
+            </w:pPr>
+            <w:r>
+              <w:rPr>
+                <w:lang w:val="en-GB"/>
+              </w:rPr>
+              <w:t>Rasterization stage: This fixed-function stage discretises the primitives into fragments. Fragments are equivalent to pixels on your screen; one fragment is one pixel. Any pixel outside of the screen is discarded. When depth testing is enabled, pixels behind previously rendered pixels are also discarded.</w:t>
+            </w:r>
+          </w:p>
+          <w:p>
+            <w:pPr>
+              <w:pStyle w:val="ListParagraph"/>
+              <w:numPr>
+                <w:ilvl w:val="0"/>
+                <w:numId w:val="33"/>
+              </w:numPr>
+              <w:rPr>
+                <w:lang w:val="en-GB"/>
+              </w:rPr>
+            </w:pPr>
+            <w:r>
+              <w:rPr>
+                <w:lang w:val="en-GB"/>
+              </w:rPr>
+              <w:t>Fragment shader stage: This stage is the final programmable shader stage, and also known as the pixel shader in other graphics API’s like OpenGL and DirectX. It is executed for every rendered fragment or pixel. It is often used to calculate textures and lighting using the interpolated data from the vertex shader.</w:t>
+            </w:r>
+          </w:p>
+          <w:p>
+            <w:pPr>
+              <w:pStyle w:val="ListParagraph"/>
+              <w:numPr>
+                <w:ilvl w:val="0"/>
+                <w:numId w:val="33"/>
+              </w:numPr>
+              <w:rPr>
+                <w:lang w:val="en-GB"/>
+              </w:rPr>
+            </w:pPr>
+            <w:r>
+              <w:rPr>
+                <w:lang w:val="en-GB"/>
+              </w:rPr>
+              <w:t>Colour blending stage: This is the final stage and a fixed function. It applies an operation to mix different fragments that happened to be rendered to the same pixel.</w:t>
+            </w:r>
+          </w:p>
+          <w:p>
+            <w:pPr>
+              <w:rPr>
+                <w:lang w:val="en-GB"/>
+              </w:rPr>
+            </w:pPr>
+          </w:p>
+        </w:tc>
+        <w:tc>
+          <w:tcPr>
+            <w:tcW w:w="2834" w:type="dxa"/>
+          </w:tcPr>
+          <w:p>
+            <w:pPr>
+              <w:ind w:left="-103"/>
+              <w:jc w:val="right"/>
+              <w:rPr>
+                <w:lang w:val="en-GB"/>
+              </w:rPr>
+            </w:pPr>
+            <w:r>
+              <w:rPr>
+                <w:noProof/>
+                <w:lang w:val="en-GB"/>
+              </w:rPr>
+              <w:drawing>
+                <wp:inline distT="0" distB="0" distL="0" distR="0" wp14:anchorId="711800C4" wp14:editId="31E9AA7A">
+                  <wp:extent cx="1682115" cy="4132339"/>
+                  <wp:effectExtent l="0" t="0" r="0" b="1905"/>
+                  <wp:docPr id="44" name="Picture 44" descr="A diagram of a diagram&#10;&#10;Description automatically generated with medium confidence"/>
+                  <wp:cNvGraphicFramePr>
+                    <a:graphicFrameLocks xmlns:a="http://schemas.openxmlformats.org/drawingml/2006/main" noChangeAspect="1"/>
+                  </wp:cNvGraphicFramePr>
+                  <a:graphic xmlns:a="http://schemas.openxmlformats.org/drawingml/2006/main">
+                    <a:graphicData uri="http://schemas.openxmlformats.org/drawingml/2006/picture">
+                      <pic:pic xmlns:pic="http://schemas.openxmlformats.org/drawingml/2006/picture">
+                        <pic:nvPicPr>
+                          <pic:cNvPr id="44" name="Picture 44" descr="A diagram of a diagram&#10;&#10;Description automatically generated with medium confidence"/>
+                          <pic:cNvPicPr>
+                            <a:picLocks noChangeAspect="1"/>
+                          </pic:cNvPicPr>
+                        </pic:nvPicPr>
+                        <pic:blipFill>
+                          <a:blip r:embed="rId17" cstate="print">
+                            <a:extLst>
+                              <a:ext uri="{28A0092B-C50C-407E-A947-70E740481C1C}">
+                                <a14:useLocalDpi xmlns:a14="http://schemas.microsoft.com/office/drawing/2010/main" val="0"/>
+                              </a:ext>
+                            </a:extLst>
+                          </a:blip>
+                          <a:stretch>
+                            <a:fillRect/>
+                          </a:stretch>
+                        </pic:blipFill>
+                        <pic:spPr>
+                          <a:xfrm>
+                            <a:off x="0" y="0"/>
+                            <a:ext cx="1695648" cy="4165585"/>
+                          </a:xfrm>
+                          <a:prstGeom prst="rect">
+                            <a:avLst/>
+                          </a:prstGeom>
+                        </pic:spPr>
+                      </pic:pic>
+                    </a:graphicData>
+                  </a:graphic>
+                </wp:inline>
+              </w:drawing>
+            </w:r>
+          </w:p>
+        </w:tc>
+      </w:tr>
+    </w:tbl>
     <w:p>
       <w:pPr>
         <w:rPr>
@@ -3997,113 +5025,409 @@
     </w:p>
     <w:p>
       <w:pPr>
-        <w:pStyle w:val="ListParagraph"/>
-        <w:numPr>
-          <w:ilvl w:val="0"/>
-          <w:numId w:val="33"/>
-        </w:numPr>
+        <w:pStyle w:val="Heading3"/>
         <w:rPr>
           <w:lang w:val="en-GB"/>
         </w:rPr>
       </w:pPr>
+      <w:bookmarkStart w:id="8" w:name="_Toc206448597"/>
       <w:r>
         <w:rPr>
           <w:lang w:val="en-GB"/>
         </w:rPr>
-        <w:t xml:space="preserve">Input assembler: </w:t>
+        <w:t xml:space="preserve">1.3 </w:t>
       </w:r>
       <w:r>
         <w:rPr>
           <w:lang w:val="en-GB"/>
         </w:rPr>
-        <w:t>A fixed</w:t>
+        <w:t>Renderpasses</w:t>
       </w:r>
       <w:r>
         <w:rPr>
           <w:lang w:val="en-GB"/>
         </w:rPr>
-        <w:t>-</w:t>
-      </w:r>
-      <w:r>
+        <w:t xml:space="preserve"> [3]</w:t>
+      </w:r>
+      <w:bookmarkEnd w:id="8"/>
+    </w:p>
+    <w:p>
+      <w:pPr>
         <w:rPr>
           <w:lang w:val="en-GB"/>
         </w:rPr>
-        <w:t>function</w:t>
-      </w:r>
+      </w:pPr>
       <w:r>
         <w:rPr>
           <w:lang w:val="en-GB"/>
         </w:rPr>
-        <w:t xml:space="preserve"> stage</w:t>
+        <w:t>In complex graphics applications, an image is built over a series of different passes, where each pass is responsible for a different part of the scene</w:t>
       </w:r>
       <w:r>
         <w:rPr>
           <w:lang w:val="en-GB"/>
         </w:rPr>
-        <w:t xml:space="preserve"> that </w:t>
+        <w:t>,</w:t>
       </w:r>
       <w:r>
         <w:rPr>
           <w:lang w:val="en-GB"/>
         </w:rPr>
-        <w:t xml:space="preserve">collects raw data from the vertex and index buffers. </w:t>
-      </w:r>
-    </w:p>
-    <w:p>
-      <w:pPr>
-        <w:pStyle w:val="ListParagraph"/>
-        <w:numPr>
-          <w:ilvl w:val="0"/>
-          <w:numId w:val="33"/>
-        </w:numPr>
+        <w:t xml:space="preserve"> such as the rendering of the scene, Post-processing effects, composition, etc.</w:t>
+      </w:r>
+      <w:r>
         <w:rPr>
           <w:lang w:val="en-GB"/>
         </w:rPr>
-      </w:pPr>
+        <w:br/>
+        <w:t xml:space="preserve">These passes are represented in Vulkan using a renderpass. A single renderpass can contain </w:t>
+      </w:r>
       <w:r>
         <w:rPr>
           <w:lang w:val="en-GB"/>
         </w:rPr>
-        <w:t>Vertex shader: This</w:t>
+        <w:lastRenderedPageBreak/>
+        <w:t>multiple passes or rendering phases over a single set of output images. Each pass within a renderpass is called a subpass.</w:t>
       </w:r>
       <w:r>
         <w:rPr>
           <w:lang w:val="en-GB"/>
         </w:rPr>
-        <w:t xml:space="preserve"> programmable</w:t>
+        <w:t xml:space="preserve"> Renderpass objects can contain many subpasses, but even in a simple application with a simple subpass, rendering to a single output image, the renderpass will contain information </w:t>
       </w:r>
       <w:r>
         <w:rPr>
           <w:lang w:val="en-GB"/>
         </w:rPr>
-        <w:t xml:space="preserve"> shader</w:t>
+        <w:t>about</w:t>
       </w:r>
       <w:r>
         <w:rPr>
           <w:lang w:val="en-GB"/>
         </w:rPr>
-        <w:t xml:space="preserve"> stage</w:t>
+        <w:t xml:space="preserve"> this output image.</w:t>
       </w:r>
       <w:r>
         <w:rPr>
           <w:lang w:val="en-GB"/>
         </w:rPr>
-        <w:t xml:space="preserve"> is executed for every vertex; usually, this is used to transform each vertex from model space to screen space.</w:t>
+        <w:br/>
+        <w:t xml:space="preserve">All </w:t>
       </w:r>
       <w:r>
         <w:rPr>
           <w:lang w:val="en-GB"/>
         </w:rPr>
-        <w:t xml:space="preserve"> This is the only mandatory programmable stage.</w:t>
-      </w:r>
-    </w:p>
-    <w:p>
-      <w:pPr>
-        <w:pStyle w:val="ListParagraph"/>
-        <w:numPr>
-          <w:ilvl w:val="0"/>
-          <w:numId w:val="33"/>
-        </w:numPr>
+        <w:t>drawings</w:t>
+      </w:r>
+      <w:r>
+        <w:rPr>
+          <w:lang w:val="en-GB"/>
+        </w:rPr>
+        <w:t xml:space="preserve"> must be contained within a renderpass. Before setting up a graphics pipeline, you must create a </w:t>
+      </w:r>
+      <w:r>
+        <w:rPr>
+          <w:lang w:val="en-GB"/>
+        </w:rPr>
+        <w:t>renderpass</w:t>
+      </w:r>
+      <w:r>
+        <w:rPr>
+          <w:lang w:val="en-GB"/>
+        </w:rPr>
+        <w:t xml:space="preserve"> since the pipeline must know where </w:t>
+      </w:r>
+      <w:r>
+        <w:rPr>
+          <w:lang w:val="en-GB"/>
+        </w:rPr>
+        <w:t>it’s</w:t>
+      </w:r>
+      <w:r>
+        <w:rPr>
+          <w:lang w:val="en-GB"/>
+        </w:rPr>
+        <w:t xml:space="preserve"> rendering to.</w:t>
+      </w:r>
+    </w:p>
+    <w:p>
+      <w:pPr>
+        <w:pStyle w:val="Heading3"/>
+        <w:rPr>
+          <w:lang w:val="en-GB"/>
+        </w:rPr>
+      </w:pPr>
+      <w:bookmarkStart w:id="9" w:name="_Toc206448598"/>
+      <w:r>
+        <w:rPr>
+          <w:lang w:val="en-GB"/>
+        </w:rPr>
+        <w:t>1.4 Attachments [3]</w:t>
+      </w:r>
+      <w:bookmarkEnd w:id="9"/>
+    </w:p>
+    <w:p>
+      <w:pPr>
+        <w:rPr>
+          <w:lang w:val="en-GB"/>
+        </w:rPr>
+      </w:pPr>
+      <w:r>
+        <w:rPr>
+          <w:lang w:val="en-GB"/>
+        </w:rPr>
+        <w:t xml:space="preserve">An attachment is an image associated with a renderpass that can be used as an input or output of one or more of its subpasses. This means that you can render to an image in one subpass and then sample from that image in </w:t>
+      </w:r>
+      <w:r>
+        <w:rPr>
+          <w:lang w:val="en-GB"/>
+        </w:rPr>
+        <w:t>the</w:t>
+      </w:r>
+      <w:r>
+        <w:rPr>
+          <w:lang w:val="en-GB"/>
+        </w:rPr>
+        <w:t xml:space="preserve"> next pass. Every subpass needs a reference to all the attachments it will need and in what format they have to be. To avoid undefined behaviour when you have a complicated structure of subpasses and attachments, dependencies are set up so that some subpasses are only executed after others are completed.</w:t>
+      </w:r>
+      <w:r>
+        <w:rPr>
+          <w:lang w:val="en-GB"/>
+        </w:rPr>
+        <w:br/>
+        <w:t>The collection of all images or attachments that the graphics pipelines will render into t</w:t>
+      </w:r>
+      <w:r>
+        <w:rPr>
+          <w:lang w:val="en-GB"/>
+        </w:rPr>
+        <w:t>h</w:t>
+      </w:r>
+      <w:r>
+        <w:rPr>
+          <w:lang w:val="en-GB"/>
+        </w:rPr>
+        <w:t xml:space="preserve">rough this renderpass </w:t>
+      </w:r>
+      <w:r>
+        <w:rPr>
+          <w:lang w:val="en-GB"/>
+        </w:rPr>
+        <w:t xml:space="preserve">is called the </w:t>
+      </w:r>
+      <w:r>
+        <w:rPr>
+          <w:lang w:val="en-GB"/>
+        </w:rPr>
+        <w:t>framebuffer</w:t>
+      </w:r>
+      <w:r>
+        <w:rPr>
+          <w:lang w:val="en-GB"/>
+        </w:rPr>
+        <w:t>.</w:t>
+      </w:r>
+    </w:p>
+    <w:p>
+      <w:pPr>
+        <w:pStyle w:val="Heading2"/>
+        <w:rPr>
+          <w:lang w:val="en-GB"/>
+        </w:rPr>
+      </w:pPr>
+      <w:bookmarkStart w:id="10" w:name="_Toc206448599"/>
+      <w:r>
+        <w:rPr>
+          <w:lang w:val="en-GB"/>
+        </w:rPr>
+        <w:t>2</w:t>
+      </w:r>
+      <w:r>
+        <w:rPr>
+          <w:lang w:val="en-GB"/>
+        </w:rPr>
+        <w:t xml:space="preserve">. </w:t>
+      </w:r>
+      <w:r>
+        <w:rPr>
+          <w:lang w:val="en-GB"/>
+        </w:rPr>
+        <w:t>Rendering pipeline</w:t>
+      </w:r>
+      <w:bookmarkEnd w:id="10"/>
+    </w:p>
+    <w:p>
+      <w:r>
+        <w:t>Now that we are familiar with the necessary Vulkan terms, I will provide a more detailed explanation of the rendering pipeline we will be using.</w:t>
+      </w:r>
+    </w:p>
+    <w:p>
+      <w:pPr>
+        <w:pStyle w:val="Heading3"/>
+        <w:rPr>
+          <w:lang w:val="en-GB"/>
+        </w:rPr>
+      </w:pPr>
+      <w:bookmarkStart w:id="11" w:name="_Toc206448600"/>
+      <w:r>
+        <w:rPr>
+          <w:lang w:val="en-GB"/>
+        </w:rPr>
+        <w:t>2.1 Rasterization vs raytracing</w:t>
+      </w:r>
+      <w:r>
+        <w:rPr>
+          <w:lang w:val="en-GB"/>
+        </w:rPr>
+        <w:t xml:space="preserve"> [5]</w:t>
+      </w:r>
+      <w:bookmarkEnd w:id="11"/>
+    </w:p>
+    <w:p>
+      <w:pPr>
+        <w:rPr>
+          <w:lang w:val="en-GB"/>
+        </w:rPr>
+      </w:pPr>
+      <w:r>
+        <w:rPr>
+          <w:lang w:val="en-GB"/>
+        </w:rPr>
+        <w:t>In real-time rendering, there are 2 main types of rendering</w:t>
+      </w:r>
+      <w:r>
+        <w:rPr>
+          <w:lang w:val="en-GB"/>
+        </w:rPr>
+        <w:t>:</w:t>
+      </w:r>
+      <w:r>
+        <w:rPr>
+          <w:lang w:val="en-GB"/>
+        </w:rPr>
+        <w:t xml:space="preserve"> rasterization and </w:t>
+      </w:r>
+      <w:r>
+        <w:rPr>
+          <w:lang w:val="en-GB"/>
+        </w:rPr>
+        <w:t>ray tracing</w:t>
+      </w:r>
+      <w:r>
+        <w:rPr>
+          <w:lang w:val="en-GB"/>
+        </w:rPr>
+        <w:t>.</w:t>
+      </w:r>
+    </w:p>
+    <w:p>
+      <w:pPr>
+        <w:rPr>
+          <w:lang w:val="en-GB"/>
+        </w:rPr>
+      </w:pPr>
+      <w:r>
+        <w:rPr>
+          <w:lang w:val="en-GB"/>
+        </w:rPr>
+        <w:t xml:space="preserve">In </w:t>
+      </w:r>
+      <w:r>
+        <w:rPr>
+          <w:lang w:val="en-GB"/>
+        </w:rPr>
+        <w:t>ray tracing</w:t>
+      </w:r>
+      <w:r>
+        <w:rPr>
+          <w:lang w:val="en-GB"/>
+        </w:rPr>
+        <w:t>, we shoot a ray into the scene for every pixel of the screen. When hitting an object in the scene, we get information about the material it is made of</w:t>
+      </w:r>
+      <w:r>
+        <w:rPr>
+          <w:lang w:val="en-GB"/>
+        </w:rPr>
+        <w:t>. T</w:t>
+      </w:r>
+      <w:r>
+        <w:rPr>
+          <w:lang w:val="en-GB"/>
+        </w:rPr>
+        <w:t>his material can then give us the information on how to proceed with shading. You can shoot more rays from that point to account for reflections, lights, shadows</w:t>
+      </w:r>
+      <w:r>
+        <w:rPr>
+          <w:lang w:val="en-GB"/>
+        </w:rPr>
+        <w:t>,</w:t>
+      </w:r>
+      <w:r>
+        <w:rPr>
+          <w:lang w:val="en-GB"/>
+        </w:rPr>
+        <w:t xml:space="preserve"> etc.</w:t>
+      </w:r>
+    </w:p>
+    <w:p>
+      <w:pPr>
+        <w:rPr>
+          <w:lang w:val="en-GB"/>
+        </w:rPr>
+      </w:pPr>
+      <w:r>
+        <w:rPr>
+          <w:lang w:val="en-GB"/>
+        </w:rPr>
+        <w:t>In rasterization</w:t>
+      </w:r>
+      <w:r>
+        <w:rPr>
+          <w:lang w:val="en-GB"/>
+        </w:rPr>
+        <w:t>,</w:t>
+      </w:r>
+      <w:r>
+        <w:rPr>
+          <w:lang w:val="en-GB"/>
+        </w:rPr>
+        <w:t xml:space="preserve"> however, we render objects by projecting</w:t>
+      </w:r>
+      <w:r>
+        <w:rPr>
+          <w:lang w:val="en-GB"/>
+        </w:rPr>
+        <w:t xml:space="preserve"> the triangles of a 3D mesh </w:t>
+      </w:r>
+      <w:r>
+        <w:rPr>
+          <w:lang w:val="en-GB"/>
+        </w:rPr>
+        <w:t xml:space="preserve">on a 2D </w:t>
+      </w:r>
+      <w:r>
+        <w:rPr>
+          <w:lang w:val="en-GB"/>
+        </w:rPr>
+        <w:t>raster. A raster or bitmap image is a dot matrix data structure that represents a generally rectangular grid of pixels, viewable via a monitor or other display medium.</w:t>
+      </w:r>
+    </w:p>
+    <w:p>
+      <w:pPr>
+        <w:rPr>
+          <w:lang w:val="en-GB"/>
+        </w:rPr>
+      </w:pPr>
+      <w:r>
+        <w:rPr>
+          <w:lang w:val="en-GB"/>
+        </w:rPr>
+        <w:t>We will be using rasterization.</w:t>
+      </w:r>
+    </w:p>
+    <w:p>
+      <w:pPr>
         <w:rPr>
           <w:lang w:val="en-GB"/>
         </w:rPr>
@@ -4115,588 +5439,13 @@
         </w:rPr>
         <w:lastRenderedPageBreak/>
         <w:drawing>
-          <wp:anchor distT="0" distB="0" distL="114300" distR="114300" simplePos="0" relativeHeight="251708416" behindDoc="1" locked="0" layoutInCell="1" allowOverlap="1" wp14:anchorId="71B9DDF6" wp14:editId="04B290F4">
+          <wp:anchor distT="0" distB="0" distL="114300" distR="114300" simplePos="0" relativeHeight="251708416" behindDoc="0" locked="0" layoutInCell="1" allowOverlap="1" wp14:anchorId="6DF093C5" wp14:editId="2A628B84">
             <wp:simplePos x="0" y="0"/>
             <wp:positionH relativeFrom="column">
-              <wp:posOffset>5015865</wp:posOffset>
+              <wp:posOffset>822960</wp:posOffset>
             </wp:positionH>
             <wp:positionV relativeFrom="paragraph">
-              <wp:posOffset>0</wp:posOffset>
-            </wp:positionV>
-            <wp:extent cx="1493520" cy="3669030"/>
-            <wp:effectExtent l="0" t="0" r="0" b="7620"/>
-            <wp:wrapTight wrapText="bothSides">
-              <wp:wrapPolygon edited="0">
-                <wp:start x="0" y="0"/>
-                <wp:lineTo x="0" y="21533"/>
-                <wp:lineTo x="21214" y="21533"/>
-                <wp:lineTo x="21214" y="0"/>
-                <wp:lineTo x="0" y="0"/>
-              </wp:wrapPolygon>
-            </wp:wrapTight>
-            <wp:docPr id="44" name="Picture 44" descr="A diagram of a diagram&#10;&#10;Description automatically generated with medium confidence"/>
-            <wp:cNvGraphicFramePr>
-              <a:graphicFrameLocks xmlns:a="http://schemas.openxmlformats.org/drawingml/2006/main" noChangeAspect="1"/>
-            </wp:cNvGraphicFramePr>
-            <a:graphic xmlns:a="http://schemas.openxmlformats.org/drawingml/2006/main">
-              <a:graphicData uri="http://schemas.openxmlformats.org/drawingml/2006/picture">
-                <pic:pic xmlns:pic="http://schemas.openxmlformats.org/drawingml/2006/picture">
-                  <pic:nvPicPr>
-                    <pic:cNvPr id="44" name="Picture 44" descr="A diagram of a diagram&#10;&#10;Description automatically generated with medium confidence"/>
-                    <pic:cNvPicPr/>
-                  </pic:nvPicPr>
-                  <pic:blipFill>
-                    <a:blip r:embed="rId13" cstate="print">
-                      <a:extLst>
-                        <a:ext uri="{28A0092B-C50C-407E-A947-70E740481C1C}">
-                          <a14:useLocalDpi xmlns:a14="http://schemas.microsoft.com/office/drawing/2010/main" val="0"/>
-                        </a:ext>
-                      </a:extLst>
-                    </a:blip>
-                    <a:stretch>
-                      <a:fillRect/>
-                    </a:stretch>
-                  </pic:blipFill>
-                  <pic:spPr>
-                    <a:xfrm>
-                      <a:off x="0" y="0"/>
-                      <a:ext cx="1493520" cy="3669030"/>
-                    </a:xfrm>
-                    <a:prstGeom prst="rect">
-                      <a:avLst/>
-                    </a:prstGeom>
-                  </pic:spPr>
-                </pic:pic>
-              </a:graphicData>
-            </a:graphic>
-          </wp:anchor>
-        </w:drawing>
-      </w:r>
-      <w:r>
-        <w:rPr>
-          <w:lang w:val="en-GB"/>
-        </w:rPr>
-        <w:t>Tessellation stage: This programmable shader stage allows the user to subdivide the geometry to increase mesh quality.</w:t>
-      </w:r>
-    </w:p>
-    <w:p>
-      <w:pPr>
-        <w:pStyle w:val="ListParagraph"/>
-        <w:numPr>
-          <w:ilvl w:val="0"/>
-          <w:numId w:val="33"/>
-        </w:numPr>
-        <w:rPr>
-          <w:lang w:val="en-GB"/>
-        </w:rPr>
-      </w:pPr>
-      <w:r>
-        <w:rPr>
-          <w:lang w:val="en-GB"/>
-        </w:rPr>
-        <w:t>Geometry shader: This programmable shader stage is executed for every primitive (triangle, line, or point). It can be used to discard primitives or output extra primitives.</w:t>
-      </w:r>
-    </w:p>
-    <w:p>
-      <w:pPr>
-        <w:pStyle w:val="ListParagraph"/>
-        <w:numPr>
-          <w:ilvl w:val="0"/>
-          <w:numId w:val="33"/>
-        </w:numPr>
-        <w:rPr>
-          <w:lang w:val="en-GB"/>
-        </w:rPr>
-      </w:pPr>
-      <w:r>
-        <w:rPr>
-          <w:lang w:val="en-GB"/>
-        </w:rPr>
-        <w:t>Rasterization stage: This</w:t>
-      </w:r>
-      <w:r>
-        <w:rPr>
-          <w:lang w:val="en-GB"/>
-        </w:rPr>
-        <w:t xml:space="preserve"> fixed-function stage discretises the primitives into fragments. Fragments are equivalent to pixels on your screen; one fragment is one pixel. Any pixel outside of the screen is discarded. When depth testing is enabled, pixels behind previously rendered pixels are also discarded.</w:t>
-      </w:r>
-    </w:p>
-    <w:p>
-      <w:pPr>
-        <w:pStyle w:val="ListParagraph"/>
-        <w:numPr>
-          <w:ilvl w:val="0"/>
-          <w:numId w:val="33"/>
-        </w:numPr>
-        <w:rPr>
-          <w:lang w:val="en-GB"/>
-        </w:rPr>
-      </w:pPr>
-      <w:r>
-        <w:rPr>
-          <w:lang w:val="en-GB"/>
-        </w:rPr>
-        <w:t>Fragment shader</w:t>
-      </w:r>
-      <w:r>
-        <w:rPr>
-          <w:lang w:val="en-GB"/>
-        </w:rPr>
-        <w:t xml:space="preserve"> stage</w:t>
-      </w:r>
-      <w:r>
-        <w:rPr>
-          <w:lang w:val="en-GB"/>
-        </w:rPr>
-        <w:t>: This stage</w:t>
-      </w:r>
-      <w:r>
-        <w:rPr>
-          <w:lang w:val="en-GB"/>
-        </w:rPr>
-        <w:t xml:space="preserve"> is the final programmable shader stage, and</w:t>
-      </w:r>
-      <w:r>
-        <w:rPr>
-          <w:lang w:val="en-GB"/>
-        </w:rPr>
-        <w:t xml:space="preserve"> also known as the pixel shader in other graphics API’s like OpenGL and DirectX. It is executed for every rendered fragment or pixel. It is often used to calculate textures and lighting using the interpolated data from the vertex shader.</w:t>
-      </w:r>
-    </w:p>
-    <w:p>
-      <w:pPr>
-        <w:pStyle w:val="ListParagraph"/>
-        <w:numPr>
-          <w:ilvl w:val="0"/>
-          <w:numId w:val="33"/>
-        </w:numPr>
-        <w:rPr>
-          <w:lang w:val="en-GB"/>
-        </w:rPr>
-      </w:pPr>
-      <w:r>
-        <w:rPr>
-          <w:lang w:val="en-GB"/>
-        </w:rPr>
-        <w:t>Colour blending stage: This is the final stage and a fixed function. It applies an operation to mix different fragments that happened to be rendered to the same pixel.</w:t>
-      </w:r>
-    </w:p>
-    <w:p>
-      <w:pPr>
-        <w:pStyle w:val="Heading3"/>
-        <w:rPr>
-          <w:lang w:val="en-GB"/>
-        </w:rPr>
-      </w:pPr>
-      <w:r>
-        <w:rPr>
-          <w:lang w:val="en-GB"/>
-        </w:rPr>
-        <w:t xml:space="preserve">1.3 </w:t>
-      </w:r>
-      <w:r>
-        <w:rPr>
-          <w:lang w:val="en-GB"/>
-        </w:rPr>
-        <w:t>Renderpasses</w:t>
-      </w:r>
-      <w:r>
-        <w:rPr>
-          <w:lang w:val="en-GB"/>
-        </w:rPr>
-        <w:t xml:space="preserve"> [3]</w:t>
-      </w:r>
-    </w:p>
-    <w:p>
-      <w:pPr>
-        <w:rPr>
-          <w:lang w:val="en-GB"/>
-        </w:rPr>
-      </w:pPr>
-      <w:r>
-        <w:rPr>
-          <w:lang w:val="en-GB"/>
-        </w:rPr>
-        <w:t>In complex graphics applications, an image is built over a series of different passes, where each pass is responsible for a different part of the scene</w:t>
-      </w:r>
-      <w:r>
-        <w:rPr>
-          <w:lang w:val="en-GB"/>
-        </w:rPr>
-        <w:t>,</w:t>
-      </w:r>
-      <w:r>
-        <w:rPr>
-          <w:lang w:val="en-GB"/>
-        </w:rPr>
-        <w:t xml:space="preserve"> such as the rendering of the scene, Post-processing effects, composition, etc.</w:t>
-      </w:r>
-      <w:r>
-        <w:rPr>
-          <w:lang w:val="en-GB"/>
-        </w:rPr>
-        <w:br/>
-        <w:t>These passes are represented in Vulkan using a renderpass. A single renderpass can contain multiple passes or rendering phases over a single set of output images. Each pass within a renderpass is called a subpass.</w:t>
-      </w:r>
-      <w:r>
-        <w:rPr>
-          <w:lang w:val="en-GB"/>
-        </w:rPr>
-        <w:t xml:space="preserve"> Renderpass objects can contain many subpasses, but even in a simple application with a simple subpass, rendering to a single output image, the renderpass will contain information </w:t>
-      </w:r>
-      <w:r>
-        <w:rPr>
-          <w:lang w:val="en-GB"/>
-        </w:rPr>
-        <w:t>about</w:t>
-      </w:r>
-      <w:r>
-        <w:rPr>
-          <w:lang w:val="en-GB"/>
-        </w:rPr>
-        <w:t xml:space="preserve"> this output image.</w:t>
-      </w:r>
-      <w:r>
-        <w:rPr>
-          <w:lang w:val="en-GB"/>
-        </w:rPr>
-        <w:br/>
-        <w:t xml:space="preserve">All </w:t>
-      </w:r>
-      <w:r>
-        <w:rPr>
-          <w:lang w:val="en-GB"/>
-        </w:rPr>
-        <w:t>drawings</w:t>
-      </w:r>
-      <w:r>
-        <w:rPr>
-          <w:lang w:val="en-GB"/>
-        </w:rPr>
-        <w:t xml:space="preserve"> must be contained within a renderpass. Before setting up a graphics pipeline, you must create a </w:t>
-      </w:r>
-      <w:r>
-        <w:rPr>
-          <w:lang w:val="en-GB"/>
-        </w:rPr>
-        <w:t>renderpass</w:t>
-      </w:r>
-      <w:r>
-        <w:rPr>
-          <w:lang w:val="en-GB"/>
-        </w:rPr>
-        <w:t xml:space="preserve"> since the pipeline must know where </w:t>
-      </w:r>
-      <w:r>
-        <w:rPr>
-          <w:lang w:val="en-GB"/>
-        </w:rPr>
-        <w:t>it’s</w:t>
-      </w:r>
-      <w:r>
-        <w:rPr>
-          <w:lang w:val="en-GB"/>
-        </w:rPr>
-        <w:t xml:space="preserve"> rendering to.</w:t>
-      </w:r>
-    </w:p>
-    <w:p>
-      <w:pPr>
-        <w:pStyle w:val="Heading3"/>
-        <w:rPr>
-          <w:lang w:val="en-GB"/>
-        </w:rPr>
-      </w:pPr>
-      <w:r>
-        <w:rPr>
-          <w:lang w:val="en-GB"/>
-        </w:rPr>
-        <w:t>1.4 Attachments [3]</w:t>
-      </w:r>
-    </w:p>
-    <w:p>
-      <w:pPr>
-        <w:rPr>
-          <w:lang w:val="en-GB"/>
-        </w:rPr>
-      </w:pPr>
-      <w:r>
-        <w:rPr>
-          <w:lang w:val="en-GB"/>
-        </w:rPr>
-        <w:t xml:space="preserve">An attachment is an image associated with a renderpass that can be used as an input or output of one or more of its subpasses. This means that you can render to an image in one subpass and </w:t>
-      </w:r>
-      <w:r>
-        <w:rPr>
-          <w:lang w:val="en-GB"/>
-        </w:rPr>
-        <w:lastRenderedPageBreak/>
-        <w:t xml:space="preserve">then sample from that image in </w:t>
-      </w:r>
-      <w:r>
-        <w:rPr>
-          <w:lang w:val="en-GB"/>
-        </w:rPr>
-        <w:t>the</w:t>
-      </w:r>
-      <w:r>
-        <w:rPr>
-          <w:lang w:val="en-GB"/>
-        </w:rPr>
-        <w:t xml:space="preserve"> next pass. Every subpass needs a reference to all the attachments it will need and in what format they have to be. To avoid undefined behaviour when you have a complicated structure of subpasses and attachments, dependencies are set up so that some subpasses are only executed after others are completed.</w:t>
-      </w:r>
-      <w:r>
-        <w:rPr>
-          <w:lang w:val="en-GB"/>
-        </w:rPr>
-        <w:br/>
-        <w:t>The collection of all images or attachments that the graphics pipelines will render into t</w:t>
-      </w:r>
-      <w:r>
-        <w:rPr>
-          <w:lang w:val="en-GB"/>
-        </w:rPr>
-        <w:t>h</w:t>
-      </w:r>
-      <w:r>
-        <w:rPr>
-          <w:lang w:val="en-GB"/>
-        </w:rPr>
-        <w:t xml:space="preserve">rough this renderpass </w:t>
-      </w:r>
-      <w:r>
-        <w:rPr>
-          <w:lang w:val="en-GB"/>
-        </w:rPr>
-        <w:t xml:space="preserve">is called the </w:t>
-      </w:r>
-      <w:r>
-        <w:rPr>
-          <w:lang w:val="en-GB"/>
-        </w:rPr>
-        <w:t>framebuffer</w:t>
-      </w:r>
-      <w:r>
-        <w:rPr>
-          <w:lang w:val="en-GB"/>
-        </w:rPr>
-        <w:t>.</w:t>
-      </w:r>
-    </w:p>
-    <w:p>
-      <w:pPr>
-        <w:pStyle w:val="Heading2"/>
-        <w:rPr>
-          <w:lang w:val="en-GB"/>
-        </w:rPr>
-      </w:pPr>
-      <w:bookmarkStart w:id="8" w:name="_Toc206280102"/>
-      <w:r>
-        <w:rPr>
-          <w:lang w:val="en-GB"/>
-        </w:rPr>
-        <w:t>2</w:t>
-      </w:r>
-      <w:r>
-        <w:rPr>
-          <w:lang w:val="en-GB"/>
-        </w:rPr>
-        <w:t xml:space="preserve">. </w:t>
-      </w:r>
-      <w:r>
-        <w:rPr>
-          <w:lang w:val="en-GB"/>
-        </w:rPr>
-        <w:t>Rendering pipeline</w:t>
-      </w:r>
-      <w:bookmarkEnd w:id="8"/>
-    </w:p>
-    <w:p>
-      <w:r>
-        <w:t>Now that we are familiar with the necessary Vulkan terms, I will provide a more detailed explanation of the rendering pipeline we will be using.</w:t>
-      </w:r>
-    </w:p>
-    <w:p>
-      <w:pPr>
-        <w:pStyle w:val="Heading3"/>
-        <w:rPr>
-          <w:lang w:val="en-GB"/>
-        </w:rPr>
-      </w:pPr>
-      <w:r>
-        <w:rPr>
-          <w:lang w:val="en-GB"/>
-        </w:rPr>
-        <w:t>2.1 Rasterization vs raytracing</w:t>
-      </w:r>
-      <w:r>
-        <w:rPr>
-          <w:lang w:val="en-GB"/>
-        </w:rPr>
-        <w:t xml:space="preserve"> [5]</w:t>
-      </w:r>
-    </w:p>
-    <w:p>
-      <w:pPr>
-        <w:rPr>
-          <w:lang w:val="en-GB"/>
-        </w:rPr>
-      </w:pPr>
-      <w:r>
-        <w:rPr>
-          <w:lang w:val="en-GB"/>
-        </w:rPr>
-        <w:t>In real-time rendering, there are 2 main types of rendering</w:t>
-      </w:r>
-      <w:r>
-        <w:rPr>
-          <w:lang w:val="en-GB"/>
-        </w:rPr>
-        <w:t>:</w:t>
-      </w:r>
-      <w:r>
-        <w:rPr>
-          <w:lang w:val="en-GB"/>
-        </w:rPr>
-        <w:t xml:space="preserve"> rasterization and </w:t>
-      </w:r>
-      <w:r>
-        <w:rPr>
-          <w:lang w:val="en-GB"/>
-        </w:rPr>
-        <w:t>ray tracing</w:t>
-      </w:r>
-      <w:r>
-        <w:rPr>
-          <w:lang w:val="en-GB"/>
-        </w:rPr>
-        <w:t>.</w:t>
-      </w:r>
-    </w:p>
-    <w:p>
-      <w:pPr>
-        <w:rPr>
-          <w:lang w:val="en-GB"/>
-        </w:rPr>
-      </w:pPr>
-      <w:r>
-        <w:rPr>
-          <w:lang w:val="en-GB"/>
-        </w:rPr>
-        <w:t xml:space="preserve">In </w:t>
-      </w:r>
-      <w:r>
-        <w:rPr>
-          <w:lang w:val="en-GB"/>
-        </w:rPr>
-        <w:t>ray tracing</w:t>
-      </w:r>
-      <w:r>
-        <w:rPr>
-          <w:lang w:val="en-GB"/>
-        </w:rPr>
-        <w:t>, we shoot a ray into the scene for every pixel of the screen. When hitting an object in the scene, we get information about the material it is made of</w:t>
-      </w:r>
-      <w:r>
-        <w:rPr>
-          <w:lang w:val="en-GB"/>
-        </w:rPr>
-        <w:t>. T</w:t>
-      </w:r>
-      <w:r>
-        <w:rPr>
-          <w:lang w:val="en-GB"/>
-        </w:rPr>
-        <w:t>his material can then give us the information on how to proceed with shading. You can shoot more rays from that point to account for reflections, lights, shadows</w:t>
-      </w:r>
-      <w:r>
-        <w:rPr>
-          <w:lang w:val="en-GB"/>
-        </w:rPr>
-        <w:t>,</w:t>
-      </w:r>
-      <w:r>
-        <w:rPr>
-          <w:lang w:val="en-GB"/>
-        </w:rPr>
-        <w:t xml:space="preserve"> etc.</w:t>
-      </w:r>
-    </w:p>
-    <w:p>
-      <w:pPr>
-        <w:rPr>
-          <w:lang w:val="en-GB"/>
-        </w:rPr>
-      </w:pPr>
-      <w:r>
-        <w:rPr>
-          <w:lang w:val="en-GB"/>
-        </w:rPr>
-        <w:t>In rasterization</w:t>
-      </w:r>
-      <w:r>
-        <w:rPr>
-          <w:lang w:val="en-GB"/>
-        </w:rPr>
-        <w:t>,</w:t>
-      </w:r>
-      <w:r>
-        <w:rPr>
-          <w:lang w:val="en-GB"/>
-        </w:rPr>
-        <w:t xml:space="preserve"> however, we render objects by projecting</w:t>
-      </w:r>
-      <w:r>
-        <w:rPr>
-          <w:lang w:val="en-GB"/>
-        </w:rPr>
-        <w:t xml:space="preserve"> the triangles of a 3D mesh </w:t>
-      </w:r>
-      <w:r>
-        <w:rPr>
-          <w:lang w:val="en-GB"/>
-        </w:rPr>
-        <w:t xml:space="preserve">on a 2D </w:t>
-      </w:r>
-      <w:r>
-        <w:rPr>
-          <w:lang w:val="en-GB"/>
-        </w:rPr>
-        <w:t>raster. A raster or bitmap image is a dot matrix data structure that represents a generally rectangular grid of pixels, viewable via a monitor or other display medium.</w:t>
-      </w:r>
-    </w:p>
-    <w:p>
-      <w:pPr>
-        <w:rPr>
-          <w:lang w:val="en-GB"/>
-        </w:rPr>
-      </w:pPr>
-      <w:r>
-        <w:rPr>
-          <w:lang w:val="en-GB"/>
-        </w:rPr>
-        <w:t>We will be using rasterization.</w:t>
-      </w:r>
-    </w:p>
-    <w:p>
-      <w:pPr>
-        <w:rPr>
-          <w:lang w:val="en-GB"/>
-        </w:rPr>
-      </w:pPr>
-      <w:r>
-        <w:rPr>
-          <w:noProof/>
-        </w:rPr>
-        <w:lastRenderedPageBreak/>
-        <w:drawing>
-          <wp:anchor distT="0" distB="0" distL="114300" distR="114300" simplePos="0" relativeHeight="251699200" behindDoc="0" locked="0" layoutInCell="1" allowOverlap="1" wp14:anchorId="3C86F89B" wp14:editId="2A338F6F">
-            <wp:simplePos x="0" y="0"/>
-            <wp:positionH relativeFrom="margin">
-              <wp:align>center</wp:align>
-            </wp:positionH>
-            <wp:positionV relativeFrom="paragraph">
-              <wp:posOffset>454660</wp:posOffset>
+              <wp:posOffset>453390</wp:posOffset>
             </wp:positionV>
             <wp:extent cx="4297680" cy="2750820"/>
             <wp:effectExtent l="0" t="0" r="7620" b="0"/>
@@ -4711,11 +5460,11 @@
                   <pic:nvPicPr>
                     <pic:cNvPr id="3" name="Picture 3" descr="A graphic design process of teacups&#10;&#10;Description automatically generated"/>
                     <pic:cNvPicPr>
-                      <a:picLocks noChangeAspect="1" noChangeArrowheads="1"/>
+                      <a:picLocks noChangeAspect="1"/>
                     </pic:cNvPicPr>
                   </pic:nvPicPr>
                   <pic:blipFill>
-                    <a:blip r:embed="rId14">
+                    <a:blip r:embed="rId18">
                       <a:extLst>
                         <a:ext uri="{28A0092B-C50C-407E-A947-70E740481C1C}">
                           <a14:useLocalDpi xmlns:a14="http://schemas.microsoft.com/office/drawing/2010/main" val="0"/>
@@ -4761,12 +5510,14 @@
           <w:lang w:val="en-GB"/>
         </w:rPr>
       </w:pPr>
+      <w:bookmarkStart w:id="12" w:name="_Toc206448601"/>
       <w:r>
         <w:rPr>
           <w:lang w:val="en-GB"/>
         </w:rPr>
         <w:t>2.2 Forward vs deferred rendering</w:t>
       </w:r>
+      <w:bookmarkEnd w:id="12"/>
     </w:p>
     <w:p>
       <w:r>
@@ -4838,13 +5589,13 @@
         </w:rPr>
         <w:lastRenderedPageBreak/>
         <w:drawing>
-          <wp:anchor distT="0" distB="0" distL="114300" distR="114300" simplePos="0" relativeHeight="251697152" behindDoc="0" locked="0" layoutInCell="1" allowOverlap="1" wp14:anchorId="51901B0D" wp14:editId="0785B829">
+          <wp:anchor distT="0" distB="0" distL="114300" distR="114300" simplePos="0" relativeHeight="251716608" behindDoc="0" locked="0" layoutInCell="1" allowOverlap="1" wp14:anchorId="41D05AE2" wp14:editId="218F1E06">
             <wp:simplePos x="0" y="0"/>
-            <wp:positionH relativeFrom="margin">
-              <wp:posOffset>2796540</wp:posOffset>
+            <wp:positionH relativeFrom="column">
+              <wp:posOffset>-175260</wp:posOffset>
             </wp:positionH>
             <wp:positionV relativeFrom="paragraph">
-              <wp:posOffset>171450</wp:posOffset>
+              <wp:posOffset>361950</wp:posOffset>
             </wp:positionV>
             <wp:extent cx="2781300" cy="2091690"/>
             <wp:effectExtent l="0" t="0" r="0" b="3810"/>
@@ -4858,10 +5609,12 @@
                 <pic:pic xmlns:pic="http://schemas.openxmlformats.org/drawingml/2006/picture">
                   <pic:nvPicPr>
                     <pic:cNvPr id="35" name="Picture 35" descr="A collage of images of different types of objects&#10;&#10;Description automatically generated"/>
-                    <pic:cNvPicPr/>
+                    <pic:cNvPicPr>
+                      <a:picLocks noChangeAspect="1"/>
+                    </pic:cNvPicPr>
                   </pic:nvPicPr>
                   <pic:blipFill>
-                    <a:blip r:embed="rId15" cstate="print">
+                    <a:blip r:embed="rId19" cstate="print">
                       <a:extLst>
                         <a:ext uri="{28A0092B-C50C-407E-A947-70E740481C1C}">
                           <a14:useLocalDpi xmlns:a14="http://schemas.microsoft.com/office/drawing/2010/main" val="0"/>
@@ -4884,12 +5637,6 @@
                 </pic:pic>
               </a:graphicData>
             </a:graphic>
-            <wp14:sizeRelH relativeFrom="margin">
-              <wp14:pctWidth>0</wp14:pctWidth>
-            </wp14:sizeRelH>
-            <wp14:sizeRelV relativeFrom="margin">
-              <wp14:pctHeight>0</wp14:pctHeight>
-            </wp14:sizeRelV>
           </wp:anchor>
         </w:drawing>
       </w:r>
@@ -4898,13 +5645,13 @@
           <w:noProof/>
         </w:rPr>
         <w:drawing>
-          <wp:anchor distT="0" distB="0" distL="114300" distR="114300" simplePos="0" relativeHeight="251671552" behindDoc="0" locked="0" layoutInCell="1" allowOverlap="1" wp14:anchorId="77586F00" wp14:editId="784F7658">
+          <wp:anchor distT="0" distB="0" distL="114300" distR="114300" simplePos="0" relativeHeight="251712512" behindDoc="0" locked="0" layoutInCell="1" allowOverlap="1" wp14:anchorId="77150B95" wp14:editId="0A7F8235">
             <wp:simplePos x="0" y="0"/>
-            <wp:positionH relativeFrom="margin">
-              <wp:posOffset>-38100</wp:posOffset>
+            <wp:positionH relativeFrom="column">
+              <wp:posOffset>2987040</wp:posOffset>
             </wp:positionH>
             <wp:positionV relativeFrom="paragraph">
-              <wp:posOffset>210820</wp:posOffset>
+              <wp:posOffset>400050</wp:posOffset>
             </wp:positionV>
             <wp:extent cx="2743835" cy="2057400"/>
             <wp:effectExtent l="0" t="0" r="0" b="0"/>
@@ -4917,13 +5664,13 @@
               <a:graphicData uri="http://schemas.openxmlformats.org/drawingml/2006/picture">
                 <pic:pic xmlns:pic="http://schemas.openxmlformats.org/drawingml/2006/picture">
                   <pic:nvPicPr>
-                    <pic:cNvPr id="0" name="Picture 1" descr="Deferred vs Forward"/>
+                    <pic:cNvPr id="1" name="Picture 1" descr="Deferred vs Forward"/>
                     <pic:cNvPicPr>
-                      <a:picLocks noChangeAspect="1" noChangeArrowheads="1"/>
+                      <a:picLocks noChangeAspect="1"/>
                     </pic:cNvPicPr>
                   </pic:nvPicPr>
                   <pic:blipFill>
-                    <a:blip r:embed="rId16" cstate="print">
+                    <a:blip r:embed="rId20" cstate="print">
                       <a:extLst>
                         <a:ext uri="{28A0092B-C50C-407E-A947-70E740481C1C}">
                           <a14:useLocalDpi xmlns:a14="http://schemas.microsoft.com/office/drawing/2010/main" val="0"/>
@@ -4951,12 +5698,6 @@
                 </pic:pic>
               </a:graphicData>
             </a:graphic>
-            <wp14:sizeRelH relativeFrom="margin">
-              <wp14:pctWidth>0</wp14:pctWidth>
-            </wp14:sizeRelH>
-            <wp14:sizeRelV relativeFrom="margin">
-              <wp14:pctHeight>0</wp14:pctHeight>
-            </wp14:sizeRelV>
           </wp:anchor>
         </w:drawing>
       </w:r>
@@ -4972,12 +5713,14 @@
       <w:pPr>
         <w:pStyle w:val="Heading3"/>
       </w:pPr>
+      <w:bookmarkStart w:id="13" w:name="_Toc206448602"/>
       <w:r>
         <w:t>2.3 Depth prepass</w:t>
       </w:r>
       <w:r>
         <w:t xml:space="preserve"> [8]</w:t>
       </w:r>
+      <w:bookmarkEnd w:id="13"/>
     </w:p>
     <w:p>
       <w:r>
@@ -4999,9 +5742,11 @@
       <w:pPr>
         <w:pStyle w:val="Heading3"/>
       </w:pPr>
+      <w:bookmarkStart w:id="14" w:name="_Toc206448603"/>
       <w:r>
         <w:t>2.4 Transparency pass</w:t>
       </w:r>
+      <w:bookmarkEnd w:id="14"/>
     </w:p>
     <w:p>
       <w:r>
@@ -5012,13 +5757,15 @@
       <w:pPr>
         <w:pStyle w:val="Heading3"/>
       </w:pPr>
+      <w:bookmarkStart w:id="15" w:name="_Toc206448604"/>
+      <w:r>
+        <w:t>2.5 Full pipeline</w:t>
+      </w:r>
+      <w:bookmarkEnd w:id="15"/>
+    </w:p>
+    <w:p>
       <w:r>
         <w:lastRenderedPageBreak/>
-        <w:t>2.5 Full pipeline</w:t>
-      </w:r>
-    </w:p>
-    <w:p>
-      <w:r>
         <w:t>Now that we have covered all this, we only need 2 more pieces of the puzzle, the ambient occlusion map generation and the ambient occlusion map blur, but I will delve deeper into those later. Right now, this is our overview of the pipeline.</w:t>
       </w:r>
     </w:p>
@@ -5028,7 +5775,7 @@
           <w:noProof/>
         </w:rPr>
         <w:drawing>
-          <wp:inline distT="0" distB="0" distL="0" distR="0" wp14:anchorId="638DC8C7" wp14:editId="65A463FA">
+          <wp:inline distT="0" distB="0" distL="0" distR="0" wp14:anchorId="638DC8C7" wp14:editId="58B2DD4E">
             <wp:extent cx="5455920" cy="2476148"/>
             <wp:effectExtent l="0" t="0" r="0" b="635"/>
             <wp:docPr id="8" name="Picture 8"/>
@@ -5045,7 +5792,7 @@
                     </pic:cNvPicPr>
                   </pic:nvPicPr>
                   <pic:blipFill>
-                    <a:blip r:embed="rId17" cstate="print">
+                    <a:blip r:embed="rId21" cstate="print">
                       <a:extLst>
                         <a:ext uri="{28A0092B-C50C-407E-A947-70E740481C1C}">
                           <a14:useLocalDpi xmlns:a14="http://schemas.microsoft.com/office/drawing/2010/main" val="0"/>
@@ -5098,7 +5845,7 @@
       <w:pPr>
         <w:pStyle w:val="Heading2"/>
       </w:pPr>
-      <w:bookmarkStart w:id="9" w:name="_Toc206280103"/>
+      <w:bookmarkStart w:id="16" w:name="_Toc206448605"/>
       <w:r>
         <w:t>3</w:t>
       </w:r>
@@ -5108,7 +5855,7 @@
       <w:r>
         <w:t>Global illumination</w:t>
       </w:r>
-      <w:bookmarkEnd w:id="9"/>
+      <w:bookmarkEnd w:id="16"/>
     </w:p>
     <w:p>
       <w:r>
@@ -5171,7 +5918,7 @@
         </w:rPr>
         <w:lastRenderedPageBreak/>
         <w:drawing>
-          <wp:anchor distT="0" distB="0" distL="114300" distR="114300" simplePos="0" relativeHeight="251665408" behindDoc="1" locked="0" layoutInCell="1" allowOverlap="1" wp14:anchorId="4DFB6262" wp14:editId="092E14CF">
+          <wp:anchor distT="0" distB="0" distL="114300" distR="114300" simplePos="0" relativeHeight="251657216" behindDoc="1" locked="0" layoutInCell="1" allowOverlap="1" wp14:anchorId="4DFB6262" wp14:editId="60E0E010">
             <wp:simplePos x="0" y="0"/>
             <wp:positionH relativeFrom="column">
               <wp:posOffset>1417320</wp:posOffset>
@@ -5194,7 +5941,7 @@
                     <pic:cNvPicPr/>
                   </pic:nvPicPr>
                   <pic:blipFill>
-                    <a:blip r:embed="rId18" cstate="print">
+                    <a:blip r:embed="rId22" cstate="print">
                       <a:extLst>
                         <a:ext uri="{28A0092B-C50C-407E-A947-70E740481C1C}">
                           <a14:useLocalDpi xmlns:a14="http://schemas.microsoft.com/office/drawing/2010/main" val="0"/>
@@ -5249,7 +5996,7 @@
           <w:noProof/>
         </w:rPr>
         <w:drawing>
-          <wp:anchor distT="0" distB="0" distL="114300" distR="114300" simplePos="0" relativeHeight="251662336" behindDoc="1" locked="0" layoutInCell="1" allowOverlap="1" wp14:anchorId="60DD45FA" wp14:editId="514BF437">
+          <wp:anchor distT="0" distB="0" distL="114300" distR="114300" simplePos="0" relativeHeight="251654144" behindDoc="1" locked="0" layoutInCell="1" allowOverlap="1" wp14:anchorId="60DD45FA" wp14:editId="2E00A0C7">
             <wp:simplePos x="0" y="0"/>
             <wp:positionH relativeFrom="column">
               <wp:posOffset>1303020</wp:posOffset>
@@ -5272,7 +6019,7 @@
                     <pic:cNvPicPr/>
                   </pic:nvPicPr>
                   <pic:blipFill>
-                    <a:blip r:embed="rId19" cstate="print">
+                    <a:blip r:embed="rId23" cstate="print">
                       <a:extLst>
                         <a:ext uri="{28A0092B-C50C-407E-A947-70E740481C1C}">
                           <a14:useLocalDpi xmlns:a14="http://schemas.microsoft.com/office/drawing/2010/main" val="0"/>
@@ -5315,14 +6062,14 @@
       <w:pPr>
         <w:pStyle w:val="Heading3"/>
       </w:pPr>
-      <w:bookmarkStart w:id="10" w:name="_Toc206280104"/>
+      <w:bookmarkStart w:id="17" w:name="_Toc206448606"/>
       <w:r>
         <w:t>4</w:t>
       </w:r>
       <w:r>
         <w:t>. Ambient occlusion</w:t>
       </w:r>
-      <w:bookmarkEnd w:id="10"/>
+      <w:bookmarkEnd w:id="17"/>
     </w:p>
     <w:p>
       <w:r>
@@ -5375,7 +6122,7 @@
           <w:noProof/>
         </w:rPr>
         <w:drawing>
-          <wp:anchor distT="0" distB="0" distL="114300" distR="114300" simplePos="0" relativeHeight="251668480" behindDoc="0" locked="0" layoutInCell="1" allowOverlap="1" wp14:anchorId="36E8C349" wp14:editId="7EA00233">
+          <wp:anchor distT="0" distB="0" distL="114300" distR="114300" simplePos="0" relativeHeight="251660288" behindDoc="0" locked="0" layoutInCell="1" allowOverlap="1" wp14:anchorId="36E8C349" wp14:editId="6924B966">
             <wp:simplePos x="0" y="0"/>
             <wp:positionH relativeFrom="column">
               <wp:posOffset>0</wp:posOffset>
@@ -5400,7 +6147,7 @@
                     </pic:cNvPicPr>
                   </pic:nvPicPr>
                   <pic:blipFill>
-                    <a:blip r:embed="rId20">
+                    <a:blip r:embed="rId24">
                       <a:extLst>
                         <a:ext uri="{28A0092B-C50C-407E-A947-70E740481C1C}">
                           <a14:useLocalDpi xmlns:a14="http://schemas.microsoft.com/office/drawing/2010/main" val="0"/>
@@ -5502,14 +6249,14 @@
       <w:pPr>
         <w:pStyle w:val="Heading2"/>
       </w:pPr>
-      <w:bookmarkStart w:id="11" w:name="_Toc206280105"/>
+      <w:bookmarkStart w:id="18" w:name="_Toc206448607"/>
       <w:r>
         <w:t>5</w:t>
       </w:r>
       <w:r>
         <w:t>. Screen space ambient occlusion</w:t>
       </w:r>
-      <w:bookmarkEnd w:id="11"/>
+      <w:bookmarkEnd w:id="18"/>
     </w:p>
     <w:p>
       <w:r>
@@ -5558,7 +6305,7 @@
           <w:noProof/>
         </w:rPr>
         <w:drawing>
-          <wp:inline distT="0" distB="0" distL="0" distR="0" wp14:anchorId="280ABD2D" wp14:editId="450E4CB5">
+          <wp:inline distT="0" distB="0" distL="0" distR="0" wp14:anchorId="280ABD2D" wp14:editId="40E9665B">
             <wp:extent cx="2882956" cy="2174229"/>
             <wp:effectExtent l="0" t="0" r="0" b="0"/>
             <wp:docPr id="13" name="Picture 13" descr="A green and red object in a box&#10;&#10;Description automatically generated"/>
@@ -5573,7 +6320,7 @@
                     <pic:cNvPicPr/>
                   </pic:nvPicPr>
                   <pic:blipFill>
-                    <a:blip r:embed="rId21"/>
+                    <a:blip r:embed="rId25"/>
                     <a:stretch>
                       <a:fillRect/>
                     </a:stretch>
@@ -5604,7 +6351,7 @@
           <w:noProof/>
         </w:rPr>
         <w:drawing>
-          <wp:inline distT="0" distB="0" distL="0" distR="0" wp14:anchorId="254371AB" wp14:editId="49E50908">
+          <wp:inline distT="0" distB="0" distL="0" distR="0" wp14:anchorId="254371AB" wp14:editId="550884E7">
             <wp:extent cx="2923936" cy="2180143"/>
             <wp:effectExtent l="0" t="0" r="0" b="0"/>
             <wp:docPr id="14" name="Picture 14" descr="A group of rocks in a box&#10;&#10;Description automatically generated with medium confidence"/>
@@ -5619,7 +6366,7 @@
                     <pic:cNvPicPr/>
                   </pic:nvPicPr>
                   <pic:blipFill>
-                    <a:blip r:embed="rId22"/>
+                    <a:blip r:embed="rId26"/>
                     <a:stretch>
                       <a:fillRect/>
                     </a:stretch>
@@ -5673,7 +6420,7 @@
           <w:noProof/>
         </w:rPr>
         <w:drawing>
-          <wp:anchor distT="0" distB="0" distL="114300" distR="114300" simplePos="0" relativeHeight="251677696" behindDoc="0" locked="0" layoutInCell="1" allowOverlap="1" wp14:anchorId="027E9CF9" wp14:editId="1469EF34">
+          <wp:anchor distT="0" distB="0" distL="114300" distR="114300" simplePos="0" relativeHeight="251669504" behindDoc="0" locked="0" layoutInCell="1" allowOverlap="1" wp14:anchorId="027E9CF9" wp14:editId="42DF7593">
             <wp:simplePos x="0" y="0"/>
             <wp:positionH relativeFrom="margin">
               <wp:align>right</wp:align>
@@ -5696,7 +6443,7 @@
                     <pic:cNvPicPr/>
                   </pic:nvPicPr>
                   <pic:blipFill>
-                    <a:blip r:embed="rId23" cstate="print">
+                    <a:blip r:embed="rId27" cstate="print">
                       <a:extLst>
                         <a:ext uri="{28A0092B-C50C-407E-A947-70E740481C1C}">
                           <a14:useLocalDpi xmlns:a14="http://schemas.microsoft.com/office/drawing/2010/main" val="0"/>
@@ -5733,7 +6480,7 @@
           <w:noProof/>
         </w:rPr>
         <w:drawing>
-          <wp:anchor distT="0" distB="0" distL="114300" distR="114300" simplePos="0" relativeHeight="251676672" behindDoc="0" locked="0" layoutInCell="1" allowOverlap="1" wp14:anchorId="70B3888B" wp14:editId="28123C3E">
+          <wp:anchor distT="0" distB="0" distL="114300" distR="114300" simplePos="0" relativeHeight="251668480" behindDoc="0" locked="0" layoutInCell="1" allowOverlap="1" wp14:anchorId="70B3888B" wp14:editId="11AE5236">
             <wp:simplePos x="0" y="0"/>
             <wp:positionH relativeFrom="column">
               <wp:posOffset>0</wp:posOffset>
@@ -5756,7 +6503,7 @@
                     <pic:cNvPicPr/>
                   </pic:nvPicPr>
                   <pic:blipFill>
-                    <a:blip r:embed="rId24" cstate="print">
+                    <a:blip r:embed="rId28" cstate="print">
                       <a:extLst>
                         <a:ext uri="{28A0092B-C50C-407E-A947-70E740481C1C}">
                           <a14:useLocalDpi xmlns:a14="http://schemas.microsoft.com/office/drawing/2010/main" val="0"/>
@@ -5787,7 +6534,7 @@
       <w:pPr>
         <w:pStyle w:val="Heading3"/>
       </w:pPr>
-      <w:bookmarkStart w:id="12" w:name="_Toc206280106"/>
+      <w:bookmarkStart w:id="19" w:name="_Toc206448608"/>
       <w:r>
         <w:t>4</w:t>
       </w:r>
@@ -5803,7 +6550,7 @@
       <w:r>
         <w:t>Screen-based ambient occlusion</w:t>
       </w:r>
-      <w:bookmarkEnd w:id="12"/>
+      <w:bookmarkEnd w:id="19"/>
     </w:p>
     <w:p>
       <w:r>
@@ -5832,7 +6579,7 @@
           <w:noProof/>
         </w:rPr>
         <w:drawing>
-          <wp:inline distT="0" distB="0" distL="0" distR="0" wp14:anchorId="563F1A1F" wp14:editId="7C24F6DF">
+          <wp:inline distT="0" distB="0" distL="0" distR="0" wp14:anchorId="563F1A1F" wp14:editId="679491DE">
             <wp:extent cx="4789552" cy="2403475"/>
             <wp:effectExtent l="0" t="0" r="0" b="0"/>
             <wp:docPr id="15" name="Picture 15" descr="A diagram of a vehicle&#10;&#10;Description automatically generated"/>
@@ -5847,7 +6594,7 @@
                     <pic:cNvPicPr/>
                   </pic:nvPicPr>
                   <pic:blipFill>
-                    <a:blip r:embed="rId25"/>
+                    <a:blip r:embed="rId29"/>
                     <a:stretch>
                       <a:fillRect/>
                     </a:stretch>
@@ -5877,7 +6624,7 @@
           <w:noProof/>
         </w:rPr>
         <w:drawing>
-          <wp:anchor distT="0" distB="0" distL="114300" distR="114300" simplePos="0" relativeHeight="251702272" behindDoc="0" locked="0" layoutInCell="1" allowOverlap="1" wp14:anchorId="74D83993" wp14:editId="15E8C00C">
+          <wp:anchor distT="0" distB="0" distL="114300" distR="114300" simplePos="0" relativeHeight="251694080" behindDoc="0" locked="0" layoutInCell="1" allowOverlap="1" wp14:anchorId="74D83993" wp14:editId="49ACF0F4">
             <wp:simplePos x="0" y="0"/>
             <wp:positionH relativeFrom="column">
               <wp:posOffset>472440</wp:posOffset>
@@ -5902,7 +6649,7 @@
                     </pic:cNvPicPr>
                   </pic:nvPicPr>
                   <pic:blipFill>
-                    <a:blip r:embed="rId26">
+                    <a:blip r:embed="rId30">
                       <a:extLst>
                         <a:ext uri="{28A0092B-C50C-407E-A947-70E740481C1C}">
                           <a14:useLocalDpi xmlns:a14="http://schemas.microsoft.com/office/drawing/2010/main" val="0"/>
@@ -5942,14 +6689,14 @@
       <w:pPr>
         <w:pStyle w:val="Heading3"/>
       </w:pPr>
-      <w:bookmarkStart w:id="13" w:name="_Toc206280107"/>
+      <w:bookmarkStart w:id="20" w:name="_Toc206448609"/>
       <w:r>
         <w:t>4</w:t>
       </w:r>
       <w:r>
         <w:t>.2 Horizon-based ambient occlusion</w:t>
       </w:r>
-      <w:bookmarkEnd w:id="13"/>
+      <w:bookmarkEnd w:id="20"/>
     </w:p>
     <w:p>
       <w:r>
@@ -5976,7 +6723,7 @@
           <w:noProof/>
         </w:rPr>
         <w:drawing>
-          <wp:anchor distT="0" distB="0" distL="114300" distR="114300" simplePos="0" relativeHeight="251685888" behindDoc="0" locked="0" layoutInCell="1" allowOverlap="1" wp14:anchorId="3EEE5E85" wp14:editId="0FAE7000">
+          <wp:anchor distT="0" distB="0" distL="114300" distR="114300" simplePos="0" relativeHeight="251677696" behindDoc="0" locked="0" layoutInCell="1" allowOverlap="1" wp14:anchorId="3EEE5E85" wp14:editId="0AA48B6C">
             <wp:simplePos x="0" y="0"/>
             <wp:positionH relativeFrom="column">
               <wp:posOffset>1051560</wp:posOffset>
@@ -5999,7 +6746,7 @@
                     <pic:cNvPicPr/>
                   </pic:nvPicPr>
                   <pic:blipFill>
-                    <a:blip r:embed="rId27">
+                    <a:blip r:embed="rId31">
                       <a:extLst>
                         <a:ext uri="{28A0092B-C50C-407E-A947-70E740481C1C}">
                           <a14:useLocalDpi xmlns:a14="http://schemas.microsoft.com/office/drawing/2010/main" val="0"/>
@@ -6032,7 +6779,7 @@
           <w:noProof/>
         </w:rPr>
         <w:drawing>
-          <wp:anchor distT="0" distB="0" distL="114300" distR="114300" simplePos="0" relativeHeight="251686912" behindDoc="0" locked="0" layoutInCell="1" allowOverlap="1" wp14:anchorId="48FF1C5B" wp14:editId="454D95B3">
+          <wp:anchor distT="0" distB="0" distL="114300" distR="114300" simplePos="0" relativeHeight="251678720" behindDoc="0" locked="0" layoutInCell="1" allowOverlap="1" wp14:anchorId="48FF1C5B" wp14:editId="65856C59">
             <wp:simplePos x="0" y="0"/>
             <wp:positionH relativeFrom="column">
               <wp:posOffset>788035</wp:posOffset>
@@ -6055,7 +6802,7 @@
                     <pic:cNvPicPr/>
                   </pic:nvPicPr>
                   <pic:blipFill>
-                    <a:blip r:embed="rId28">
+                    <a:blip r:embed="rId32">
                       <a:extLst>
                         <a:ext uri="{28A0092B-C50C-407E-A947-70E740481C1C}">
                           <a14:useLocalDpi xmlns:a14="http://schemas.microsoft.com/office/drawing/2010/main" val="0"/>
@@ -6097,7 +6844,7 @@
           <w:noProof/>
         </w:rPr>
         <w:drawing>
-          <wp:anchor distT="0" distB="0" distL="114300" distR="114300" simplePos="0" relativeHeight="251687936" behindDoc="0" locked="0" layoutInCell="1" allowOverlap="1" wp14:anchorId="5ACCDD11" wp14:editId="4858DBEF">
+          <wp:anchor distT="0" distB="0" distL="114300" distR="114300" simplePos="0" relativeHeight="251679744" behindDoc="0" locked="0" layoutInCell="1" allowOverlap="1" wp14:anchorId="5ACCDD11" wp14:editId="4A9A826D">
             <wp:simplePos x="0" y="0"/>
             <wp:positionH relativeFrom="column">
               <wp:posOffset>954405</wp:posOffset>
@@ -6120,7 +6867,7 @@
                     <pic:cNvPicPr/>
                   </pic:nvPicPr>
                   <pic:blipFill>
-                    <a:blip r:embed="rId29">
+                    <a:blip r:embed="rId33">
                       <a:extLst>
                         <a:ext uri="{28A0092B-C50C-407E-A947-70E740481C1C}">
                           <a14:useLocalDpi xmlns:a14="http://schemas.microsoft.com/office/drawing/2010/main" val="0"/>
@@ -6177,7 +6924,7 @@
         </w:rPr>
         <w:lastRenderedPageBreak/>
         <w:drawing>
-          <wp:anchor distT="0" distB="0" distL="114300" distR="114300" simplePos="0" relativeHeight="251678720" behindDoc="0" locked="0" layoutInCell="1" allowOverlap="1" wp14:anchorId="517BD431" wp14:editId="38FC97AA">
+          <wp:anchor distT="0" distB="0" distL="114300" distR="114300" simplePos="0" relativeHeight="251670528" behindDoc="0" locked="0" layoutInCell="1" allowOverlap="1" wp14:anchorId="517BD431" wp14:editId="248A5F40">
             <wp:simplePos x="0" y="0"/>
             <wp:positionH relativeFrom="margin">
               <wp:posOffset>868680</wp:posOffset>
@@ -6202,7 +6949,7 @@
                     </pic:cNvPicPr>
                   </pic:nvPicPr>
                   <pic:blipFill>
-                    <a:blip r:embed="rId30" cstate="print">
+                    <a:blip r:embed="rId34" cstate="print">
                       <a:extLst>
                         <a:ext uri="{28A0092B-C50C-407E-A947-70E740481C1C}">
                           <a14:useLocalDpi xmlns:a14="http://schemas.microsoft.com/office/drawing/2010/main" val="0"/>
@@ -6256,7 +7003,7 @@
           <w:lang w:val="en-GB"/>
         </w:rPr>
         <w:drawing>
-          <wp:anchor distT="0" distB="0" distL="114300" distR="114300" simplePos="0" relativeHeight="251679744" behindDoc="0" locked="0" layoutInCell="1" allowOverlap="1" wp14:anchorId="7E49CF5A" wp14:editId="610F9DAD">
+          <wp:anchor distT="0" distB="0" distL="114300" distR="114300" simplePos="0" relativeHeight="251671552" behindDoc="0" locked="0" layoutInCell="1" allowOverlap="1" wp14:anchorId="7E49CF5A" wp14:editId="6B74D0F2">
             <wp:simplePos x="0" y="0"/>
             <wp:positionH relativeFrom="column">
               <wp:posOffset>571500</wp:posOffset>
@@ -6279,7 +7026,7 @@
                     <pic:cNvPicPr/>
                   </pic:nvPicPr>
                   <pic:blipFill>
-                    <a:blip r:embed="rId31" cstate="print">
+                    <a:blip r:embed="rId35" cstate="print">
                       <a:extLst>
                         <a:ext uri="{28A0092B-C50C-407E-A947-70E740481C1C}">
                           <a14:useLocalDpi xmlns:a14="http://schemas.microsoft.com/office/drawing/2010/main" val="0"/>
@@ -6335,7 +7082,7 @@
         </w:rPr>
         <w:lastRenderedPageBreak/>
         <w:drawing>
-          <wp:anchor distT="0" distB="0" distL="114300" distR="114300" simplePos="0" relativeHeight="251680768" behindDoc="0" locked="0" layoutInCell="1" allowOverlap="1" wp14:anchorId="3024C60D" wp14:editId="2B532BF9">
+          <wp:anchor distT="0" distB="0" distL="114300" distR="114300" simplePos="0" relativeHeight="251672576" behindDoc="0" locked="0" layoutInCell="1" allowOverlap="1" wp14:anchorId="3024C60D" wp14:editId="7B80C4AE">
             <wp:simplePos x="0" y="0"/>
             <wp:positionH relativeFrom="margin">
               <wp:posOffset>2994660</wp:posOffset>
@@ -6358,7 +7105,7 @@
                     <pic:cNvPicPr/>
                   </pic:nvPicPr>
                   <pic:blipFill>
-                    <a:blip r:embed="rId32" cstate="print">
+                    <a:blip r:embed="rId36" cstate="print">
                       <a:extLst>
                         <a:ext uri="{28A0092B-C50C-407E-A947-70E740481C1C}">
                           <a14:useLocalDpi xmlns:a14="http://schemas.microsoft.com/office/drawing/2010/main" val="0"/>
@@ -6395,7 +7142,7 @@
           <w:noProof/>
         </w:rPr>
         <w:drawing>
-          <wp:anchor distT="0" distB="0" distL="114300" distR="114300" simplePos="0" relativeHeight="251681792" behindDoc="0" locked="0" layoutInCell="1" allowOverlap="1" wp14:anchorId="3845BD9A" wp14:editId="1344B74D">
+          <wp:anchor distT="0" distB="0" distL="114300" distR="114300" simplePos="0" relativeHeight="251673600" behindDoc="0" locked="0" layoutInCell="1" allowOverlap="1" wp14:anchorId="3845BD9A" wp14:editId="16062F4A">
             <wp:simplePos x="0" y="0"/>
             <wp:positionH relativeFrom="column">
               <wp:posOffset>0</wp:posOffset>
@@ -6418,7 +7165,7 @@
                     <pic:cNvPicPr/>
                   </pic:nvPicPr>
                   <pic:blipFill>
-                    <a:blip r:embed="rId33" cstate="print">
+                    <a:blip r:embed="rId37" cstate="print">
                       <a:extLst>
                         <a:ext uri="{28A0092B-C50C-407E-A947-70E740481C1C}">
                           <a14:useLocalDpi xmlns:a14="http://schemas.microsoft.com/office/drawing/2010/main" val="0"/>
@@ -6482,7 +7229,7 @@
           <w:noProof/>
         </w:rPr>
         <w:drawing>
-          <wp:anchor distT="0" distB="0" distL="114300" distR="114300" simplePos="0" relativeHeight="251682816" behindDoc="0" locked="0" layoutInCell="1" allowOverlap="1" wp14:anchorId="5A1F7C0F" wp14:editId="198CF27D">
+          <wp:anchor distT="0" distB="0" distL="114300" distR="114300" simplePos="0" relativeHeight="251674624" behindDoc="0" locked="0" layoutInCell="1" allowOverlap="1" wp14:anchorId="5A1F7C0F" wp14:editId="0650E8E7">
             <wp:simplePos x="0" y="0"/>
             <wp:positionH relativeFrom="margin">
               <wp:align>right</wp:align>
@@ -6507,7 +7254,7 @@
                     </pic:cNvPicPr>
                   </pic:nvPicPr>
                   <pic:blipFill>
-                    <a:blip r:embed="rId34">
+                    <a:blip r:embed="rId38">
                       <a:extLst>
                         <a:ext uri="{28A0092B-C50C-407E-A947-70E740481C1C}">
                           <a14:useLocalDpi xmlns:a14="http://schemas.microsoft.com/office/drawing/2010/main" val="0"/>
@@ -6560,7 +7307,7 @@
           <w:noProof/>
         </w:rPr>
         <w:drawing>
-          <wp:anchor distT="0" distB="0" distL="114300" distR="114300" simplePos="0" relativeHeight="251683840" behindDoc="0" locked="0" layoutInCell="1" allowOverlap="1" wp14:anchorId="7667AFB6" wp14:editId="0D3F76F5">
+          <wp:anchor distT="0" distB="0" distL="114300" distR="114300" simplePos="0" relativeHeight="251675648" behindDoc="0" locked="0" layoutInCell="1" allowOverlap="1" wp14:anchorId="7667AFB6" wp14:editId="6903902D">
             <wp:simplePos x="0" y="0"/>
             <wp:positionH relativeFrom="margin">
               <wp:align>right</wp:align>
@@ -6585,7 +7332,7 @@
                     </pic:cNvPicPr>
                   </pic:nvPicPr>
                   <pic:blipFill>
-                    <a:blip r:embed="rId35">
+                    <a:blip r:embed="rId39">
                       <a:extLst>
                         <a:ext uri="{28A0092B-C50C-407E-A947-70E740481C1C}">
                           <a14:useLocalDpi xmlns:a14="http://schemas.microsoft.com/office/drawing/2010/main" val="0"/>
@@ -6646,7 +7393,7 @@
           <w:noProof/>
         </w:rPr>
         <w:drawing>
-          <wp:anchor distT="0" distB="0" distL="114300" distR="114300" simplePos="0" relativeHeight="251684864" behindDoc="0" locked="0" layoutInCell="1" allowOverlap="1" wp14:anchorId="6341D385" wp14:editId="2FAD4CC3">
+          <wp:anchor distT="0" distB="0" distL="114300" distR="114300" simplePos="0" relativeHeight="251676672" behindDoc="0" locked="0" layoutInCell="1" allowOverlap="1" wp14:anchorId="6341D385" wp14:editId="48BEF945">
             <wp:simplePos x="0" y="0"/>
             <wp:positionH relativeFrom="margin">
               <wp:align>right</wp:align>
@@ -6671,7 +7418,7 @@
                     </pic:cNvPicPr>
                   </pic:nvPicPr>
                   <pic:blipFill>
-                    <a:blip r:embed="rId36">
+                    <a:blip r:embed="rId40">
                       <a:extLst>
                         <a:ext uri="{28A0092B-C50C-407E-A947-70E740481C1C}">
                           <a14:useLocalDpi xmlns:a14="http://schemas.microsoft.com/office/drawing/2010/main" val="0"/>
@@ -6720,7 +7467,7 @@
           <w:noProof/>
         </w:rPr>
         <w:drawing>
-          <wp:inline distT="0" distB="0" distL="0" distR="0" wp14:anchorId="0F24FD42" wp14:editId="2399BB78">
+          <wp:inline distT="0" distB="0" distL="0" distR="0" wp14:anchorId="0F24FD42" wp14:editId="616DAD9F">
             <wp:extent cx="5943600" cy="342900"/>
             <wp:effectExtent l="0" t="0" r="0" b="0"/>
             <wp:docPr id="24" name="Picture 24"/>
@@ -6737,7 +7484,7 @@
                     </pic:cNvPicPr>
                   </pic:nvPicPr>
                   <pic:blipFill>
-                    <a:blip r:embed="rId37">
+                    <a:blip r:embed="rId41">
                       <a:extLst>
                         <a:ext uri="{28A0092B-C50C-407E-A947-70E740481C1C}">
                           <a14:useLocalDpi xmlns:a14="http://schemas.microsoft.com/office/drawing/2010/main" val="0"/>
@@ -6807,7 +7554,7 @@
           <w:noProof/>
         </w:rPr>
         <w:drawing>
-          <wp:anchor distT="0" distB="0" distL="114300" distR="114300" simplePos="0" relativeHeight="251689984" behindDoc="0" locked="0" layoutInCell="1" allowOverlap="1" wp14:anchorId="0021B6D3" wp14:editId="590CE4D1">
+          <wp:anchor distT="0" distB="0" distL="114300" distR="114300" simplePos="0" relativeHeight="251681792" behindDoc="0" locked="0" layoutInCell="1" allowOverlap="1" wp14:anchorId="0021B6D3" wp14:editId="47AA99A2">
             <wp:simplePos x="0" y="0"/>
             <wp:positionH relativeFrom="column">
               <wp:posOffset>3101340</wp:posOffset>
@@ -6830,7 +7577,7 @@
                     <pic:cNvPicPr/>
                   </pic:nvPicPr>
                   <pic:blipFill>
-                    <a:blip r:embed="rId38" cstate="print">
+                    <a:blip r:embed="rId42" cstate="print">
                       <a:extLst>
                         <a:ext uri="{28A0092B-C50C-407E-A947-70E740481C1C}">
                           <a14:useLocalDpi xmlns:a14="http://schemas.microsoft.com/office/drawing/2010/main" val="0"/>
@@ -6861,7 +7608,7 @@
           <w:noProof/>
         </w:rPr>
         <w:drawing>
-          <wp:anchor distT="0" distB="0" distL="114300" distR="114300" simplePos="0" relativeHeight="251688960" behindDoc="0" locked="0" layoutInCell="1" allowOverlap="1" wp14:anchorId="790FC08B" wp14:editId="74D34618">
+          <wp:anchor distT="0" distB="0" distL="114300" distR="114300" simplePos="0" relativeHeight="251680768" behindDoc="0" locked="0" layoutInCell="1" allowOverlap="1" wp14:anchorId="790FC08B" wp14:editId="76D4B2C4">
             <wp:simplePos x="0" y="0"/>
             <wp:positionH relativeFrom="column">
               <wp:posOffset>289560</wp:posOffset>
@@ -6884,7 +7631,7 @@
                     <pic:cNvPicPr/>
                   </pic:nvPicPr>
                   <pic:blipFill>
-                    <a:blip r:embed="rId39" cstate="print">
+                    <a:blip r:embed="rId43" cstate="print">
                       <a:extLst>
                         <a:ext uri="{28A0092B-C50C-407E-A947-70E740481C1C}">
                           <a14:useLocalDpi xmlns:a14="http://schemas.microsoft.com/office/drawing/2010/main" val="0"/>
@@ -6950,7 +7697,7 @@
           <w:noProof/>
         </w:rPr>
         <w:drawing>
-          <wp:anchor distT="0" distB="0" distL="114300" distR="114300" simplePos="0" relativeHeight="251693056" behindDoc="0" locked="0" layoutInCell="1" allowOverlap="1" wp14:anchorId="6C9269DE" wp14:editId="389CAE6E">
+          <wp:anchor distT="0" distB="0" distL="114300" distR="114300" simplePos="0" relativeHeight="251684864" behindDoc="0" locked="0" layoutInCell="1" allowOverlap="1" wp14:anchorId="6C9269DE" wp14:editId="58DAFE04">
             <wp:simplePos x="0" y="0"/>
             <wp:positionH relativeFrom="column">
               <wp:posOffset>3131820</wp:posOffset>
@@ -6973,7 +7720,7 @@
                     <pic:cNvPicPr/>
                   </pic:nvPicPr>
                   <pic:blipFill>
-                    <a:blip r:embed="rId38" cstate="print">
+                    <a:blip r:embed="rId42" cstate="print">
                       <a:extLst>
                         <a:ext uri="{28A0092B-C50C-407E-A947-70E740481C1C}">
                           <a14:useLocalDpi xmlns:a14="http://schemas.microsoft.com/office/drawing/2010/main" val="0"/>
@@ -7004,7 +7751,7 @@
           <w:noProof/>
         </w:rPr>
         <w:drawing>
-          <wp:anchor distT="0" distB="0" distL="114300" distR="114300" simplePos="0" relativeHeight="251691008" behindDoc="0" locked="0" layoutInCell="1" allowOverlap="1" wp14:anchorId="531EAD98" wp14:editId="00A27FF0">
+          <wp:anchor distT="0" distB="0" distL="114300" distR="114300" simplePos="0" relativeHeight="251682816" behindDoc="0" locked="0" layoutInCell="1" allowOverlap="1" wp14:anchorId="531EAD98" wp14:editId="644FC02F">
             <wp:simplePos x="0" y="0"/>
             <wp:positionH relativeFrom="column">
               <wp:posOffset>670560</wp:posOffset>
@@ -7027,7 +7774,7 @@
                     <pic:cNvPicPr/>
                   </pic:nvPicPr>
                   <pic:blipFill>
-                    <a:blip r:embed="rId40" cstate="print">
+                    <a:blip r:embed="rId44" cstate="print">
                       <a:extLst>
                         <a:ext uri="{28A0092B-C50C-407E-A947-70E740481C1C}">
                           <a14:useLocalDpi xmlns:a14="http://schemas.microsoft.com/office/drawing/2010/main" val="0"/>
@@ -7083,7 +7830,7 @@
           <w:noProof/>
         </w:rPr>
         <w:drawing>
-          <wp:anchor distT="0" distB="0" distL="114300" distR="114300" simplePos="0" relativeHeight="251696128" behindDoc="0" locked="0" layoutInCell="1" allowOverlap="1" wp14:anchorId="4FE50E8B" wp14:editId="249F9135">
+          <wp:anchor distT="0" distB="0" distL="114300" distR="114300" simplePos="0" relativeHeight="251687936" behindDoc="0" locked="0" layoutInCell="1" allowOverlap="1" wp14:anchorId="4FE50E8B" wp14:editId="628CB805">
             <wp:simplePos x="0" y="0"/>
             <wp:positionH relativeFrom="column">
               <wp:posOffset>3009900</wp:posOffset>
@@ -7106,7 +7853,7 @@
                     <pic:cNvPicPr/>
                   </pic:nvPicPr>
                   <pic:blipFill>
-                    <a:blip r:embed="rId38" cstate="print">
+                    <a:blip r:embed="rId42" cstate="print">
                       <a:extLst>
                         <a:ext uri="{28A0092B-C50C-407E-A947-70E740481C1C}">
                           <a14:useLocalDpi xmlns:a14="http://schemas.microsoft.com/office/drawing/2010/main" val="0"/>
@@ -7137,7 +7884,7 @@
           <w:noProof/>
         </w:rPr>
         <w:drawing>
-          <wp:anchor distT="0" distB="0" distL="114300" distR="114300" simplePos="0" relativeHeight="251694080" behindDoc="0" locked="0" layoutInCell="1" allowOverlap="1" wp14:anchorId="33073B3E" wp14:editId="6B11FBDF">
+          <wp:anchor distT="0" distB="0" distL="114300" distR="114300" simplePos="0" relativeHeight="251685888" behindDoc="0" locked="0" layoutInCell="1" allowOverlap="1" wp14:anchorId="33073B3E" wp14:editId="4B7C75B4">
             <wp:simplePos x="0" y="0"/>
             <wp:positionH relativeFrom="column">
               <wp:posOffset>701040</wp:posOffset>
@@ -7160,7 +7907,7 @@
                     <pic:cNvPicPr/>
                   </pic:nvPicPr>
                   <pic:blipFill>
-                    <a:blip r:embed="rId41" cstate="print">
+                    <a:blip r:embed="rId45" cstate="print">
                       <a:extLst>
                         <a:ext uri="{28A0092B-C50C-407E-A947-70E740481C1C}">
                           <a14:useLocalDpi xmlns:a14="http://schemas.microsoft.com/office/drawing/2010/main" val="0"/>
@@ -7209,14 +7956,14 @@
       <w:pPr>
         <w:pStyle w:val="Heading3"/>
       </w:pPr>
-      <w:bookmarkStart w:id="14" w:name="_Toc206280108"/>
+      <w:bookmarkStart w:id="21" w:name="_Toc206448610"/>
       <w:r>
         <w:t>4</w:t>
       </w:r>
       <w:r>
         <w:t>.3 Ground-truth ambient occlusion</w:t>
       </w:r>
-      <w:bookmarkEnd w:id="14"/>
+      <w:bookmarkEnd w:id="21"/>
       <w:r>
         <w:br w:type="page"/>
       </w:r>
@@ -7225,12 +7972,12 @@
       <w:pPr>
         <w:pStyle w:val="Heading1"/>
       </w:pPr>
-      <w:bookmarkStart w:id="15" w:name="_Toc206280109"/>
+      <w:bookmarkStart w:id="22" w:name="_Toc206448611"/>
       <w:r>
         <w:lastRenderedPageBreak/>
         <w:t>Research</w:t>
       </w:r>
-      <w:bookmarkEnd w:id="15"/>
+      <w:bookmarkEnd w:id="22"/>
     </w:p>
     <w:p>
       <w:r>
@@ -7368,14 +8115,14 @@
           <w:numId w:val="21"/>
         </w:numPr>
       </w:pPr>
-      <w:bookmarkStart w:id="16" w:name="_Toc206280110"/>
+      <w:bookmarkStart w:id="23" w:name="_Toc206448612"/>
       <w:r>
         <w:t>Implementing the different techniques</w:t>
       </w:r>
-      <w:bookmarkEnd w:id="16"/>
       <w:r>
         <w:t>.</w:t>
       </w:r>
+      <w:bookmarkEnd w:id="23"/>
     </w:p>
     <w:p>
       <w:r>
@@ -7388,7 +8135,7 @@
           <w:noProof/>
         </w:rPr>
         <w:drawing>
-          <wp:inline distT="0" distB="0" distL="0" distR="0" wp14:anchorId="09D90C03" wp14:editId="66AE8F74">
+          <wp:inline distT="0" distB="0" distL="0" distR="0" wp14:anchorId="09D90C03" wp14:editId="00BC44B9">
             <wp:extent cx="5455920" cy="2476148"/>
             <wp:effectExtent l="0" t="0" r="0" b="635"/>
             <wp:docPr id="10" name="Picture 10" descr="A diagram of a flowchart&#10;&#10;Description automatically generated"/>
@@ -7405,7 +8152,7 @@
                     </pic:cNvPicPr>
                   </pic:nvPicPr>
                   <pic:blipFill>
-                    <a:blip r:embed="rId17" cstate="print">
+                    <a:blip r:embed="rId21" cstate="print">
                       <a:extLst>
                         <a:ext uri="{28A0092B-C50C-407E-A947-70E740481C1C}">
                           <a14:useLocalDpi xmlns:a14="http://schemas.microsoft.com/office/drawing/2010/main" val="0"/>
@@ -7445,11 +8192,11 @@
           <w:numId w:val="31"/>
         </w:numPr>
       </w:pPr>
-      <w:bookmarkStart w:id="17" w:name="_Toc206280111"/>
+      <w:bookmarkStart w:id="24" w:name="_Toc206448613"/>
       <w:r>
         <w:t>Screen space ambient occlusion</w:t>
       </w:r>
-      <w:bookmarkEnd w:id="17"/>
+      <w:bookmarkEnd w:id="24"/>
     </w:p>
     <w:p>
       <w:r>
@@ -7539,11 +8286,11 @@
           <w:numId w:val="31"/>
         </w:numPr>
       </w:pPr>
-      <w:bookmarkStart w:id="18" w:name="_Toc206280112"/>
+      <w:bookmarkStart w:id="25" w:name="_Toc206448614"/>
       <w:r>
         <w:t>Horizon-based ambient occlusion</w:t>
       </w:r>
-      <w:bookmarkEnd w:id="18"/>
+      <w:bookmarkEnd w:id="25"/>
     </w:p>
     <w:p>
       <w:r>
@@ -7581,11 +8328,11 @@
       <w:pPr>
         <w:pStyle w:val="Heading3"/>
       </w:pPr>
-      <w:bookmarkStart w:id="19" w:name="_Toc206280113"/>
+      <w:bookmarkStart w:id="26" w:name="_Toc206448615"/>
       <w:r>
         <w:t>1.3 Ground truth ambient occlusion</w:t>
       </w:r>
-      <w:bookmarkEnd w:id="19"/>
+      <w:bookmarkEnd w:id="26"/>
     </w:p>
     <w:p>
       <w:r>
@@ -7606,11 +8353,11 @@
           <w:numId w:val="21"/>
         </w:numPr>
       </w:pPr>
-      <w:bookmarkStart w:id="20" w:name="_Toc206280114"/>
+      <w:bookmarkStart w:id="27" w:name="_Toc206448616"/>
       <w:r>
         <w:t>Taking the necessary measurements</w:t>
       </w:r>
-      <w:bookmarkEnd w:id="20"/>
+      <w:bookmarkEnd w:id="27"/>
     </w:p>
     <w:p>
       <w:r>
@@ -7692,11 +8439,11 @@
       <w:pPr>
         <w:pStyle w:val="Heading3"/>
       </w:pPr>
-      <w:bookmarkStart w:id="21" w:name="_Toc206280115"/>
+      <w:bookmarkStart w:id="28" w:name="_Toc206448617"/>
       <w:r>
         <w:t>2.1 Time needed for AO generation</w:t>
       </w:r>
-      <w:bookmarkEnd w:id="21"/>
+      <w:bookmarkEnd w:id="28"/>
     </w:p>
     <w:p>
       <w:r>
@@ -7713,7 +8460,7 @@
           <w:noProof/>
         </w:rPr>
         <w:drawing>
-          <wp:anchor distT="0" distB="0" distL="114300" distR="114300" simplePos="0" relativeHeight="251703296" behindDoc="0" locked="0" layoutInCell="1" allowOverlap="1" wp14:anchorId="23713A0E" wp14:editId="7512ED51">
+          <wp:anchor distT="0" distB="0" distL="114300" distR="114300" simplePos="0" relativeHeight="251695104" behindDoc="0" locked="0" layoutInCell="1" allowOverlap="1" wp14:anchorId="23713A0E" wp14:editId="51A527E0">
             <wp:simplePos x="0" y="0"/>
             <wp:positionH relativeFrom="margin">
               <wp:align>left</wp:align>
@@ -7736,7 +8483,7 @@
                     <pic:cNvPicPr/>
                   </pic:nvPicPr>
                   <pic:blipFill>
-                    <a:blip r:embed="rId42" cstate="print">
+                    <a:blip r:embed="rId46" cstate="print">
                       <a:extLst>
                         <a:ext uri="{28A0092B-C50C-407E-A947-70E740481C1C}">
                           <a14:useLocalDpi xmlns:a14="http://schemas.microsoft.com/office/drawing/2010/main" val="0"/>
@@ -7773,11 +8520,11 @@
       <w:pPr>
         <w:pStyle w:val="Heading3"/>
       </w:pPr>
-      <w:bookmarkStart w:id="22" w:name="_Toc206280116"/>
+      <w:bookmarkStart w:id="29" w:name="_Toc206448618"/>
       <w:r>
         <w:t>2.2 CPU Usage</w:t>
       </w:r>
-      <w:bookmarkEnd w:id="22"/>
+      <w:bookmarkEnd w:id="29"/>
     </w:p>
     <w:p>
       <w:r>
@@ -7803,7 +8550,7 @@
         </w:rPr>
         <w:lastRenderedPageBreak/>
         <w:drawing>
-          <wp:inline distT="0" distB="0" distL="0" distR="0" wp14:anchorId="07AC1430" wp14:editId="6F4D1EE1">
+          <wp:inline distT="0" distB="0" distL="0" distR="0" wp14:anchorId="07AC1430" wp14:editId="47F79ED5">
             <wp:extent cx="5943600" cy="1929130"/>
             <wp:effectExtent l="0" t="0" r="0" b="0"/>
             <wp:docPr id="36" name="Picture 36" descr="A computer screen shot of a program code&#10;&#10;Description automatically generated"/>
@@ -7818,7 +8565,7 @@
                     <pic:cNvPicPr/>
                   </pic:nvPicPr>
                   <pic:blipFill>
-                    <a:blip r:embed="rId43"/>
+                    <a:blip r:embed="rId47"/>
                     <a:stretch>
                       <a:fillRect/>
                     </a:stretch>
@@ -7843,11 +8590,11 @@
       <w:pPr>
         <w:pStyle w:val="Heading3"/>
       </w:pPr>
-      <w:bookmarkStart w:id="23" w:name="_Toc206280117"/>
+      <w:bookmarkStart w:id="30" w:name="_Toc206448619"/>
       <w:r>
         <w:t>2.3 VRam usage</w:t>
       </w:r>
-      <w:bookmarkEnd w:id="23"/>
+      <w:bookmarkEnd w:id="30"/>
     </w:p>
     <w:p>
       <w:r>
@@ -7868,7 +8615,7 @@
           <w:noProof/>
         </w:rPr>
         <w:drawing>
-          <wp:inline distT="0" distB="0" distL="0" distR="0" wp14:anchorId="1CC828D1" wp14:editId="539DBAAB">
+          <wp:inline distT="0" distB="0" distL="0" distR="0" wp14:anchorId="1CC828D1" wp14:editId="01952A3F">
             <wp:extent cx="5943600" cy="1348740"/>
             <wp:effectExtent l="0" t="0" r="0" b="3810"/>
             <wp:docPr id="37" name="Picture 37" descr="A computer screen with white text&#10;&#10;Description automatically generated"/>
@@ -7883,7 +8630,7 @@
                     <pic:cNvPicPr/>
                   </pic:nvPicPr>
                   <pic:blipFill>
-                    <a:blip r:embed="rId44"/>
+                    <a:blip r:embed="rId48"/>
                     <a:stretch>
                       <a:fillRect/>
                     </a:stretch>
@@ -7908,11 +8655,11 @@
       <w:pPr>
         <w:pStyle w:val="Heading3"/>
       </w:pPr>
-      <w:bookmarkStart w:id="24" w:name="_Toc206280118"/>
+      <w:bookmarkStart w:id="31" w:name="_Toc206448620"/>
       <w:r>
         <w:t>2.4 Visuals</w:t>
       </w:r>
-      <w:bookmarkEnd w:id="24"/>
+      <w:bookmarkEnd w:id="31"/>
     </w:p>
     <w:p>
       <w:r>
@@ -7920,7 +8667,7 @@
           <w:noProof/>
         </w:rPr>
         <w:drawing>
-          <wp:anchor distT="0" distB="0" distL="114300" distR="114300" simplePos="0" relativeHeight="251705344" behindDoc="0" locked="0" layoutInCell="1" allowOverlap="1" wp14:anchorId="7F37557D" wp14:editId="01AC0D82">
+          <wp:anchor distT="0" distB="0" distL="114300" distR="114300" simplePos="0" relativeHeight="251697152" behindDoc="0" locked="0" layoutInCell="1" allowOverlap="1" wp14:anchorId="7F37557D" wp14:editId="528276B2">
             <wp:simplePos x="0" y="0"/>
             <wp:positionH relativeFrom="margin">
               <wp:align>right</wp:align>
@@ -7945,7 +8692,7 @@
                     </pic:cNvPicPr>
                   </pic:nvPicPr>
                   <pic:blipFill>
-                    <a:blip r:embed="rId45">
+                    <a:blip r:embed="rId49">
                       <a:extLst>
                         <a:ext uri="{28A0092B-C50C-407E-A947-70E740481C1C}">
                           <a14:useLocalDpi xmlns:a14="http://schemas.microsoft.com/office/drawing/2010/main" val="0"/>
@@ -8005,7 +8752,7 @@
           <w:noProof/>
         </w:rPr>
         <w:drawing>
-          <wp:anchor distT="0" distB="0" distL="114300" distR="114300" simplePos="0" relativeHeight="251704320" behindDoc="0" locked="0" layoutInCell="1" allowOverlap="1" wp14:anchorId="548C4E60" wp14:editId="21D47B8E">
+          <wp:anchor distT="0" distB="0" distL="114300" distR="114300" simplePos="0" relativeHeight="251696128" behindDoc="0" locked="0" layoutInCell="1" allowOverlap="1" wp14:anchorId="548C4E60" wp14:editId="72107343">
             <wp:simplePos x="0" y="0"/>
             <wp:positionH relativeFrom="column">
               <wp:posOffset>0</wp:posOffset>
@@ -8030,7 +8777,7 @@
                     </pic:cNvPicPr>
                   </pic:nvPicPr>
                   <pic:blipFill>
-                    <a:blip r:embed="rId46">
+                    <a:blip r:embed="rId50">
                       <a:extLst>
                         <a:ext uri="{28A0092B-C50C-407E-A947-70E740481C1C}">
                           <a14:useLocalDpi xmlns:a14="http://schemas.microsoft.com/office/drawing/2010/main" val="0"/>
@@ -8069,7 +8816,7 @@
           <w:noProof/>
         </w:rPr>
         <w:drawing>
-          <wp:anchor distT="0" distB="0" distL="114300" distR="114300" simplePos="0" relativeHeight="251707392" behindDoc="0" locked="0" layoutInCell="1" allowOverlap="1" wp14:anchorId="3EAD04C4" wp14:editId="55845DBB">
+          <wp:anchor distT="0" distB="0" distL="114300" distR="114300" simplePos="0" relativeHeight="251699200" behindDoc="0" locked="0" layoutInCell="1" allowOverlap="1" wp14:anchorId="3EAD04C4" wp14:editId="7C22CC85">
             <wp:simplePos x="0" y="0"/>
             <wp:positionH relativeFrom="margin">
               <wp:posOffset>1493520</wp:posOffset>
@@ -8094,7 +8841,7 @@
                     </pic:cNvPicPr>
                   </pic:nvPicPr>
                   <pic:blipFill>
-                    <a:blip r:embed="rId47">
+                    <a:blip r:embed="rId51">
                       <a:extLst>
                         <a:ext uri="{28A0092B-C50C-407E-A947-70E740481C1C}">
                           <a14:useLocalDpi xmlns:a14="http://schemas.microsoft.com/office/drawing/2010/main" val="0"/>
@@ -8136,7 +8883,7 @@
           <w:noProof/>
         </w:rPr>
         <w:drawing>
-          <wp:anchor distT="0" distB="0" distL="114300" distR="114300" simplePos="0" relativeHeight="251706368" behindDoc="0" locked="0" layoutInCell="1" allowOverlap="1" wp14:anchorId="7FEB2F26" wp14:editId="0B1A0BB4">
+          <wp:anchor distT="0" distB="0" distL="114300" distR="114300" simplePos="0" relativeHeight="251698176" behindDoc="0" locked="0" layoutInCell="1" allowOverlap="1" wp14:anchorId="7FEB2F26" wp14:editId="5E0CFBD5">
             <wp:simplePos x="0" y="0"/>
             <wp:positionH relativeFrom="column">
               <wp:posOffset>0</wp:posOffset>
@@ -8161,7 +8908,7 @@
                     </pic:cNvPicPr>
                   </pic:nvPicPr>
                   <pic:blipFill>
-                    <a:blip r:embed="rId48">
+                    <a:blip r:embed="rId52">
                       <a:extLst>
                         <a:ext uri="{28A0092B-C50C-407E-A947-70E740481C1C}">
                           <a14:useLocalDpi xmlns:a14="http://schemas.microsoft.com/office/drawing/2010/main" val="0"/>
@@ -8203,21 +8950,21 @@
           <w:numId w:val="21"/>
         </w:numPr>
       </w:pPr>
-      <w:bookmarkStart w:id="25" w:name="_Toc206280119"/>
+      <w:bookmarkStart w:id="32" w:name="_Toc206448621"/>
       <w:r>
         <w:t>Comparing results</w:t>
       </w:r>
-      <w:bookmarkEnd w:id="25"/>
+      <w:bookmarkEnd w:id="32"/>
     </w:p>
     <w:p>
       <w:pPr>
         <w:pStyle w:val="Heading3"/>
       </w:pPr>
-      <w:bookmarkStart w:id="26" w:name="_Toc206280120"/>
+      <w:bookmarkStart w:id="33" w:name="_Toc206448622"/>
       <w:r>
         <w:t>3.1 Time needed for AO generation</w:t>
       </w:r>
-      <w:bookmarkEnd w:id="26"/>
+      <w:bookmarkEnd w:id="33"/>
     </w:p>
     <w:p/>
     <w:p>
@@ -8227,14 +8974,14 @@
           <w:lang w:val="fr-BE"/>
         </w:rPr>
       </w:pPr>
-      <w:bookmarkStart w:id="27" w:name="_Toc206280121"/>
+      <w:bookmarkStart w:id="34" w:name="_Toc206448623"/>
       <w:r>
         <w:rPr>
           <w:lang w:val="fr-BE"/>
         </w:rPr>
         <w:t>3.2 CPU Usage</w:t>
       </w:r>
-      <w:bookmarkEnd w:id="27"/>
+      <w:bookmarkEnd w:id="34"/>
     </w:p>
     <w:p>
       <w:pPr>
@@ -8250,14 +8997,14 @@
           <w:lang w:val="fr-BE"/>
         </w:rPr>
       </w:pPr>
-      <w:bookmarkStart w:id="28" w:name="_Toc206280122"/>
+      <w:bookmarkStart w:id="35" w:name="_Toc206448624"/>
       <w:r>
         <w:rPr>
           <w:lang w:val="fr-BE"/>
         </w:rPr>
         <w:t>3.3 VRam usage</w:t>
       </w:r>
-      <w:bookmarkEnd w:id="28"/>
+      <w:bookmarkEnd w:id="35"/>
     </w:p>
     <w:p>
       <w:pPr>
@@ -8273,14 +9020,14 @@
           <w:lang w:val="fr-BE"/>
         </w:rPr>
       </w:pPr>
-      <w:bookmarkStart w:id="29" w:name="_Toc206280123"/>
+      <w:bookmarkStart w:id="36" w:name="_Toc206448625"/>
       <w:r>
         <w:rPr>
           <w:lang w:val="fr-BE"/>
         </w:rPr>
         <w:t>3.4 Visuals</w:t>
       </w:r>
-      <w:bookmarkEnd w:id="29"/>
+      <w:bookmarkEnd w:id="36"/>
     </w:p>
     <w:p>
       <w:pPr>
@@ -8311,12 +9058,12 @@
       <w:pPr>
         <w:pStyle w:val="Heading1"/>
       </w:pPr>
-      <w:bookmarkStart w:id="30" w:name="_Toc206280124"/>
+      <w:bookmarkStart w:id="37" w:name="_Toc206448626"/>
       <w:r>
         <w:lastRenderedPageBreak/>
         <w:t>Discussion</w:t>
       </w:r>
-      <w:bookmarkEnd w:id="30"/>
+      <w:bookmarkEnd w:id="37"/>
     </w:p>
     <w:p/>
     <w:p>
@@ -8383,12 +9130,12 @@
       <w:pPr>
         <w:pStyle w:val="Heading1"/>
       </w:pPr>
-      <w:bookmarkStart w:id="31" w:name="_Toc206280125"/>
+      <w:bookmarkStart w:id="38" w:name="_Toc206448627"/>
       <w:r>
         <w:lastRenderedPageBreak/>
         <w:t>Conclusion</w:t>
       </w:r>
-      <w:bookmarkEnd w:id="31"/>
+      <w:bookmarkEnd w:id="38"/>
     </w:p>
     <w:p/>
     <w:p>
@@ -8500,12 +9247,12 @@
       <w:pPr>
         <w:pStyle w:val="Heading1"/>
       </w:pPr>
-      <w:bookmarkStart w:id="32" w:name="_Toc206280126"/>
+      <w:bookmarkStart w:id="39" w:name="_Toc206448628"/>
       <w:r>
         <w:lastRenderedPageBreak/>
         <w:t>Future work</w:t>
       </w:r>
-      <w:bookmarkEnd w:id="32"/>
+      <w:bookmarkEnd w:id="39"/>
     </w:p>
     <w:p/>
     <w:p>
@@ -8580,7 +9327,7 @@
       <w:pPr>
         <w:pStyle w:val="Heading1"/>
       </w:pPr>
-      <w:bookmarkStart w:id="33" w:name="_Toc206280127"/>
+      <w:bookmarkStart w:id="40" w:name="_Toc206448629"/>
       <w:r>
         <w:lastRenderedPageBreak/>
         <w:t xml:space="preserve">Critical </w:t>
@@ -8588,7 +9335,7 @@
       <w:r>
         <w:t>Reflection</w:t>
       </w:r>
-      <w:bookmarkEnd w:id="33"/>
+      <w:bookmarkEnd w:id="40"/>
     </w:p>
     <w:p/>
     <w:p>
@@ -9892,12 +10639,12 @@
       <w:pPr>
         <w:pStyle w:val="Heading1"/>
       </w:pPr>
-      <w:bookmarkStart w:id="34" w:name="_Toc206280128"/>
+      <w:bookmarkStart w:id="41" w:name="_Toc206448630"/>
       <w:r>
         <w:lastRenderedPageBreak/>
         <w:t>References</w:t>
       </w:r>
-      <w:bookmarkEnd w:id="34"/>
+      <w:bookmarkEnd w:id="41"/>
     </w:p>
     <w:p/>
     <w:p>
@@ -9983,7 +10730,7 @@
         </w:rPr>
         <w:t xml:space="preserve">: </w:t>
       </w:r>
-      <w:hyperlink r:id="rId49" w:history="1">
+      <w:hyperlink r:id="rId53" w:history="1">
         <w:r>
           <w:rPr>
             <w:rStyle w:val="Hyperlink"/>
@@ -10034,7 +10781,7 @@
         </w:rPr>
         <w:t xml:space="preserve">: </w:t>
       </w:r>
-      <w:hyperlink r:id="rId50" w:history="1">
+      <w:hyperlink r:id="rId54" w:history="1">
         <w:r>
           <w:rPr>
             <w:rStyle w:val="Hyperlink"/>
@@ -10140,7 +10887,7 @@
         </w:rPr>
         <w:t xml:space="preserve">: </w:t>
       </w:r>
-      <w:hyperlink r:id="rId51" w:history="1">
+      <w:hyperlink r:id="rId55" w:history="1">
         <w:r>
           <w:rPr>
             <w:rStyle w:val="Hyperlink"/>
@@ -10178,7 +10925,7 @@
       <w:r>
         <w:t xml:space="preserve">’. Accessed: Aug. 17, 2025. [Online]. Available: </w:t>
       </w:r>
-      <w:hyperlink r:id="rId52" w:history="1">
+      <w:hyperlink r:id="rId56" w:history="1">
         <w:r>
           <w:rPr>
             <w:rStyle w:val="Hyperlink"/>
@@ -10239,7 +10986,7 @@
         </w:rPr>
         <w:t xml:space="preserve">: </w:t>
       </w:r>
-      <w:hyperlink r:id="rId53" w:history="1">
+      <w:hyperlink r:id="rId57" w:history="1">
         <w:r>
           <w:rPr>
             <w:rStyle w:val="Hyperlink"/>
@@ -10270,7 +11017,7 @@
       <w:r>
         <w:t xml:space="preserve">, ‘Deferred Rendering | 3D Game Shaders For Beginners’. Accessed: Aug. 17, 2025. [Online]. Available: </w:t>
       </w:r>
-      <w:hyperlink r:id="rId54" w:history="1">
+      <w:hyperlink r:id="rId58" w:history="1">
         <w:r>
           <w:rPr>
             <w:rStyle w:val="Hyperlink"/>
@@ -10314,7 +11061,7 @@
       <w:r>
         <w:t xml:space="preserve">, (June 14, 2023). Accessed: Aug. 17, 2025. [Online Video]. Available: </w:t>
       </w:r>
-      <w:hyperlink r:id="rId55" w:history="1">
+      <w:hyperlink r:id="rId59" w:history="1">
         <w:r>
           <w:rPr>
             <w:rStyle w:val="Hyperlink"/>
@@ -10380,7 +11127,7 @@
         </w:rPr>
         <w:t xml:space="preserve">: </w:t>
       </w:r>
-      <w:hyperlink r:id="rId56" w:history="1">
+      <w:hyperlink r:id="rId60" w:history="1">
         <w:r>
           <w:rPr>
             <w:rStyle w:val="Hyperlink"/>
@@ -10514,7 +11261,7 @@
         </w:rPr>
         <w:t xml:space="preserve">: </w:t>
       </w:r>
-      <w:hyperlink r:id="rId57" w:anchor="cite_note-6" w:history="1">
+      <w:hyperlink r:id="rId61" w:anchor="cite_note-6" w:history="1">
         <w:r>
           <w:rPr>
             <w:rStyle w:val="Hyperlink"/>
@@ -10545,7 +11292,7 @@
       <w:r>
         <w:t xml:space="preserve">‘Figure 4: Comparison of the soft shadow mapping problem to the...’, ResearchGate. Accessed: Aug. 15, 2025. [Online]. Available: </w:t>
       </w:r>
-      <w:hyperlink r:id="rId58" w:history="1">
+      <w:hyperlink r:id="rId62" w:history="1">
         <w:r>
           <w:rPr>
             <w:rStyle w:val="Hyperlink"/>
@@ -10646,7 +11393,7 @@
       <w:r>
         <w:t xml:space="preserve">Apr. 14, 2025. Accessed: Aug. 15, 2025. [Online]. Available: </w:t>
       </w:r>
-      <w:hyperlink r:id="rId59" w:history="1">
+      <w:hyperlink r:id="rId63" w:history="1">
         <w:r>
           <w:rPr>
             <w:rStyle w:val="Hyperlink"/>
@@ -10676,7 +11423,7 @@
       <w:r>
         <w:t xml:space="preserve">’. Accessed: Aug. 17, 2025. [Online]. Available: </w:t>
       </w:r>
-      <w:hyperlink r:id="rId60" w:history="1">
+      <w:hyperlink r:id="rId64" w:history="1">
         <w:r>
           <w:rPr>
             <w:rStyle w:val="Hyperlink"/>
@@ -10718,7 +11465,7 @@
       <w:r>
         <w:t xml:space="preserve">) - Win32 apps’. Accessed: Aug. 17, 2025. [Online]. Available: </w:t>
       </w:r>
-      <w:hyperlink r:id="rId61" w:history="1">
+      <w:hyperlink r:id="rId65" w:history="1">
         <w:r>
           <w:rPr>
             <w:rStyle w:val="Hyperlink"/>
@@ -10749,12 +11496,12 @@
       <w:pPr>
         <w:pStyle w:val="Heading1"/>
       </w:pPr>
-      <w:bookmarkStart w:id="35" w:name="_Toc206280129"/>
+      <w:bookmarkStart w:id="42" w:name="_Toc206448631"/>
       <w:r>
         <w:lastRenderedPageBreak/>
         <w:t>Acknowledgements</w:t>
       </w:r>
-      <w:bookmarkEnd w:id="35"/>
+      <w:bookmarkEnd w:id="42"/>
     </w:p>
     <w:p>
       <w:r>
@@ -10786,12 +11533,12 @@
       <w:pPr>
         <w:pStyle w:val="Heading1"/>
       </w:pPr>
-      <w:bookmarkStart w:id="36" w:name="_Toc206280130"/>
+      <w:bookmarkStart w:id="43" w:name="_Toc206448632"/>
       <w:r>
         <w:lastRenderedPageBreak/>
         <w:t>Appendices</w:t>
       </w:r>
-      <w:bookmarkEnd w:id="36"/>
+      <w:bookmarkEnd w:id="43"/>
     </w:p>
     <w:p>
       <w:pPr>
@@ -10819,7 +11566,7 @@
         </w:rPr>
         <w:br/>
       </w:r>
-      <w:hyperlink r:id="rId62" w:history="1">
+      <w:hyperlink r:id="rId66" w:history="1">
         <w:r>
           <w:rPr>
             <w:rStyle w:val="Hyperlink"/>
@@ -10830,8 +11577,8 @@
       </w:hyperlink>
     </w:p>
     <w:sectPr>
-      <w:headerReference w:type="default" r:id="rId63"/>
-      <w:footerReference w:type="default" r:id="rId64"/>
+      <w:headerReference w:type="default" r:id="rId67"/>
+      <w:footerReference w:type="default" r:id="rId68"/>
       <w:pgSz w:w="12240" w:h="15840"/>
       <w:pgMar w:top="1440" w:right="1440" w:bottom="1440" w:left="1440" w:header="720" w:footer="720" w:gutter="0"/>
       <w:pgNumType w:start="0"/>
@@ -13035,7 +13782,7 @@
       <w:lvlText w:val="-"/>
       <w:lvlJc w:val="left"/>
       <w:pPr>
-        <w:ind w:left="1080" w:hanging="360"/>
+        <w:ind w:left="644" w:hanging="360"/>
       </w:pPr>
       <w:rPr>
         <w:rFonts w:ascii="Calibri" w:eastAsiaTheme="minorHAnsi" w:hAnsi="Calibri" w:cs="Calibri" w:hint="default"/>
@@ -15391,11 +16138,13 @@
     <w:rsid w:val="00D869C4"/>
     <w:rsid w:val="00E019B4"/>
     <w:rsid w:val="00E14E7D"/>
+    <w:rsid w:val="00E42F98"/>
     <w:rsid w:val="00E842E1"/>
     <w:rsid w:val="00E86D88"/>
     <w:rsid w:val="00E978A2"/>
     <w:rsid w:val="00F52E0F"/>
     <w:rsid w:val="00F974D9"/>
+    <w:rsid w:val="00FC2530"/>
   </w:rsids>
   <m:mathPr>
     <m:mathFont m:val="Cambria Math"/>
@@ -16125,7 +16874,49 @@
 </a:theme>
 </file>
 
+<file path=word/webextensions/taskpanes.xml><?xml version="1.0" encoding="utf-8"?>
+<wetp:taskpanes xmlns:wetp="http://schemas.microsoft.com/office/webextensions/taskpanes/2010/11">
+  <wetp:taskpane dockstate="right" visibility="0" width="438" row="0">
+    <wetp:webextensionref xmlns:r="http://schemas.openxmlformats.org/officeDocument/2006/relationships" r:id="rId1"/>
+  </wetp:taskpane>
+</wetp:taskpanes>
+</file>
+
+<file path=word/webextensions/webextension1.xml><?xml version="1.0" encoding="utf-8"?>
+<we:webextension xmlns:we="http://schemas.microsoft.com/office/webextensions/webextension/2010/11" id="{E62D242D-34DA-4B75-A7BA-64D3921C1C51}">
+  <we:reference id="wa104099688" version="1.3.0.0" store="en-GB" storeType="OMEX"/>
+  <we:alternateReferences/>
+  <we:properties/>
+  <we:bindings/>
+  <we:snapshot xmlns:r="http://schemas.openxmlformats.org/officeDocument/2006/relationships"/>
+</we:webextension>
+</file>
+
 <file path=customXml/item1.xml><?xml version="1.0" encoding="utf-8"?>
+<?mso-contentType ?>
+<FormTemplates xmlns="http://schemas.microsoft.com/sharepoint/v3/contenttype/forms">
+  <Display>DocumentLibraryForm</Display>
+  <Edit>DocumentLibraryForm</Edit>
+  <New>DocumentLibraryForm</New>
+</FormTemplates>
+</file>
+
+<file path=customXml/item2.xml><?xml version="1.0" encoding="utf-8"?>
+<p:properties xmlns:p="http://schemas.microsoft.com/office/2006/metadata/properties" xmlns:xsi="http://www.w3.org/2001/XMLSchema-instance" xmlns:pc="http://schemas.microsoft.com/office/infopath/2007/PartnerControls">
+  <documentManagement>
+    <IconOverlay xmlns="http://schemas.microsoft.com/sharepoint/v4" xsi:nil="true"/>
+    <TaxCatchAll xmlns="128482ec-0431-40d5-ab26-89ea2a4f3ccd" xsi:nil="true"/>
+    <m99485b88215436a82099f8287cba0b0 xmlns="128482ec-0431-40d5-ab26-89ea2a4f3ccd">
+      <Terms xmlns="http://schemas.microsoft.com/office/infopath/2007/PartnerControls"/>
+    </m99485b88215436a82099f8287cba0b0>
+    <lcf76f155ced4ddcb4097134ff3c332f xmlns="60eb0cf4-ae2a-4762-800a-cb593b869ecb">
+      <Terms xmlns="http://schemas.microsoft.com/office/infopath/2007/PartnerControls"/>
+    </lcf76f155ced4ddcb4097134ff3c332f>
+  </documentManagement>
+</p:properties>
+</file>
+
+<file path=customXml/item3.xml><?xml version="1.0" encoding="utf-8"?>
 <ct:contentTypeSchema xmlns:ct="http://schemas.microsoft.com/office/2006/metadata/contentType" xmlns:ma="http://schemas.microsoft.com/office/2006/metadata/properties/metaAttributes" ct:_="" ma:_="" ma:contentTypeName="Document" ma:contentTypeID="0x010100723942CCEB3A674D8F1F6472CCEFB38E" ma:contentTypeVersion="11" ma:contentTypeDescription="Create a new document." ma:contentTypeScope="" ma:versionID="e4de40d148e029d40e3aaddc8bf68a5e">
   <xsd:schema xmlns:xsd="http://www.w3.org/2001/XMLSchema" xmlns:xs="http://www.w3.org/2001/XMLSchema" xmlns:p="http://schemas.microsoft.com/office/2006/metadata/properties" xmlns:ns2="128482ec-0431-40d5-ab26-89ea2a4f3ccd" xmlns:ns3="60eb0cf4-ae2a-4762-800a-cb593b869ecb" xmlns:ns4="http://schemas.microsoft.com/sharepoint/v4" xmlns:ns5="a2e691a9-fcfc-4d85-a390-1894fe98bd9e" targetNamespace="http://schemas.microsoft.com/office/2006/metadata/properties" ma:root="true" ma:fieldsID="fce8e8bd091658f3fe51b22d57dec109" ns2:_="" ns3:_="" ns4:_="" ns5:_="">
     <xsd:import namespace="128482ec-0431-40d5-ab26-89ea2a4f3ccd"/>
@@ -16398,35 +17189,31 @@
 </ct:contentTypeSchema>
 </file>
 
-<file path=customXml/item2.xml><?xml version="1.0" encoding="utf-8"?>
-<?mso-contentType ?>
-<FormTemplates xmlns="http://schemas.microsoft.com/sharepoint/v3/contenttype/forms">
-  <Display>DocumentLibraryForm</Display>
-  <Edit>DocumentLibraryForm</Edit>
-  <New>DocumentLibraryForm</New>
-</FormTemplates>
-</file>
-
-<file path=customXml/item3.xml><?xml version="1.0" encoding="utf-8"?>
-<p:properties xmlns:p="http://schemas.microsoft.com/office/2006/metadata/properties" xmlns:xsi="http://www.w3.org/2001/XMLSchema-instance" xmlns:pc="http://schemas.microsoft.com/office/infopath/2007/PartnerControls">
-  <documentManagement>
-    <IconOverlay xmlns="http://schemas.microsoft.com/sharepoint/v4" xsi:nil="true"/>
-    <TaxCatchAll xmlns="128482ec-0431-40d5-ab26-89ea2a4f3ccd" xsi:nil="true"/>
-    <m99485b88215436a82099f8287cba0b0 xmlns="128482ec-0431-40d5-ab26-89ea2a4f3ccd">
-      <Terms xmlns="http://schemas.microsoft.com/office/infopath/2007/PartnerControls"/>
-    </m99485b88215436a82099f8287cba0b0>
-    <lcf76f155ced4ddcb4097134ff3c332f xmlns="60eb0cf4-ae2a-4762-800a-cb593b869ecb">
-      <Terms xmlns="http://schemas.microsoft.com/office/infopath/2007/PartnerControls"/>
-    </lcf76f155ced4ddcb4097134ff3c332f>
-  </documentManagement>
-</p:properties>
-</file>
-
 <file path=customXml/item4.xml><?xml version="1.0" encoding="utf-8"?>
 <b:Sources xmlns:b="http://schemas.openxmlformats.org/officeDocument/2006/bibliography" xmlns="http://schemas.openxmlformats.org/officeDocument/2006/bibliography" SelectedStyle="\APASixthEditionOfficeOnline.xsl" StyleName="APA" Version="6"/>
 </file>
 
 <file path=customXml/itemProps1.xml><?xml version="1.0" encoding="utf-8"?>
+<ds:datastoreItem xmlns:ds="http://schemas.openxmlformats.org/officeDocument/2006/customXml" ds:itemID="{5EBBBFF2-2B1E-4E2A-81ED-02FB13488392}">
+  <ds:schemaRefs>
+    <ds:schemaRef ds:uri="http://schemas.microsoft.com/sharepoint/v3/contenttype/forms"/>
+  </ds:schemaRefs>
+</ds:datastoreItem>
+</file>
+
+<file path=customXml/itemProps2.xml><?xml version="1.0" encoding="utf-8"?>
+<ds:datastoreItem xmlns:ds="http://schemas.openxmlformats.org/officeDocument/2006/customXml" ds:itemID="{0744C301-BA8E-4358-811D-299431B59409}">
+  <ds:schemaRefs>
+    <ds:schemaRef ds:uri="http://schemas.microsoft.com/office/2006/metadata/properties"/>
+    <ds:schemaRef ds:uri="http://schemas.microsoft.com/office/infopath/2007/PartnerControls"/>
+    <ds:schemaRef ds:uri="http://schemas.microsoft.com/sharepoint/v4"/>
+    <ds:schemaRef ds:uri="128482ec-0431-40d5-ab26-89ea2a4f3ccd"/>
+    <ds:schemaRef ds:uri="60eb0cf4-ae2a-4762-800a-cb593b869ecb"/>
+  </ds:schemaRefs>
+</ds:datastoreItem>
+</file>
+
+<file path=customXml/itemProps3.xml><?xml version="1.0" encoding="utf-8"?>
 <ds:datastoreItem xmlns:ds="http://schemas.openxmlformats.org/officeDocument/2006/customXml" ds:itemID="{6AD6E667-9FE3-44F6-AA83-894C6D5E44A5}">
   <ds:schemaRefs>
     <ds:schemaRef ds:uri="http://schemas.microsoft.com/office/2006/metadata/contentType"/>
@@ -16447,26 +17234,6 @@
 </ds:datastoreItem>
 </file>
 
-<file path=customXml/itemProps2.xml><?xml version="1.0" encoding="utf-8"?>
-<ds:datastoreItem xmlns:ds="http://schemas.openxmlformats.org/officeDocument/2006/customXml" ds:itemID="{5EBBBFF2-2B1E-4E2A-81ED-02FB13488392}">
-  <ds:schemaRefs>
-    <ds:schemaRef ds:uri="http://schemas.microsoft.com/sharepoint/v3/contenttype/forms"/>
-  </ds:schemaRefs>
-</ds:datastoreItem>
-</file>
-
-<file path=customXml/itemProps3.xml><?xml version="1.0" encoding="utf-8"?>
-<ds:datastoreItem xmlns:ds="http://schemas.openxmlformats.org/officeDocument/2006/customXml" ds:itemID="{0744C301-BA8E-4358-811D-299431B59409}">
-  <ds:schemaRefs>
-    <ds:schemaRef ds:uri="http://schemas.microsoft.com/office/2006/metadata/properties"/>
-    <ds:schemaRef ds:uri="http://schemas.microsoft.com/office/infopath/2007/PartnerControls"/>
-    <ds:schemaRef ds:uri="http://schemas.microsoft.com/sharepoint/v4"/>
-    <ds:schemaRef ds:uri="128482ec-0431-40d5-ab26-89ea2a4f3ccd"/>
-    <ds:schemaRef ds:uri="60eb0cf4-ae2a-4762-800a-cb593b869ecb"/>
-  </ds:schemaRefs>
-</ds:datastoreItem>
-</file>
-
 <file path=customXml/itemProps4.xml><?xml version="1.0" encoding="utf-8"?>
 <ds:datastoreItem xmlns:ds="http://schemas.openxmlformats.org/officeDocument/2006/customXml" ds:itemID="{9FB24B6F-1995-495D-B4E9-64B4DC9866CE}">
   <ds:schemaRefs>

</xml_diff>